<commit_message>
add new logo blocks to templates
</commit_message>
<xml_diff>
--- a/_extensions/aagi/docx-report/template.docx
+++ b/_extensions/aagi/docx-report/template.docx
@@ -361,7 +361,7 @@
         <w:rPr>
           <w:noProof/>
         </w:rPr>
-        <w:t>0 XXX 0000</w:t>
+        <w:t>19 November 2025</w:t>
       </w:r>
       <w:r>
         <w:fldChar w:fldCharType="end"/>
@@ -383,18 +383,18 @@
           <w:noProof/>
         </w:rPr>
         <w:drawing>
-          <wp:anchor distT="0" distB="0" distL="114300" distR="114300" simplePos="0" relativeHeight="251660288" behindDoc="0" locked="1" layoutInCell="1" allowOverlap="1" wp14:anchorId="2D76FECE" wp14:editId="4919EE31">
+          <wp:anchor distT="0" distB="0" distL="114300" distR="114300" simplePos="0" relativeHeight="251660288" behindDoc="0" locked="1" layoutInCell="1" allowOverlap="1" wp14:anchorId="2D76FECE" wp14:editId="0628E1AF">
             <wp:simplePos x="0" y="0"/>
             <wp:positionH relativeFrom="column">
               <wp:posOffset>-882650</wp:posOffset>
             </wp:positionH>
             <wp:positionV relativeFrom="page">
-              <wp:posOffset>9592310</wp:posOffset>
+              <wp:posOffset>9678035</wp:posOffset>
             </wp:positionV>
-            <wp:extent cx="7499350" cy="1067435"/>
+            <wp:extent cx="7499350" cy="889635"/>
             <wp:effectExtent l="0" t="0" r="0" b="0"/>
             <wp:wrapNone/>
-            <wp:docPr id="1499448599" name="Picture 3" descr="A black and purple logo&#10;&#10;Description automatically generated"/>
+            <wp:docPr id="1499448599" name="Picture 3"/>
             <wp:cNvGraphicFramePr>
               <a:graphicFrameLocks xmlns:a="http://schemas.openxmlformats.org/drawingml/2006/main" noChangeAspect="1"/>
             </wp:cNvGraphicFramePr>
@@ -402,17 +402,11 @@
               <a:graphicData uri="http://schemas.openxmlformats.org/drawingml/2006/picture">
                 <pic:pic xmlns:pic="http://schemas.openxmlformats.org/drawingml/2006/picture">
                   <pic:nvPicPr>
-                    <pic:cNvPr id="1499448599" name="Picture 3" descr="A black and purple logo&#10;&#10;Description automatically generated"/>
+                    <pic:cNvPr id="1499448599" name="Picture 3"/>
                     <pic:cNvPicPr/>
                   </pic:nvPicPr>
                   <pic:blipFill>
-                    <a:blip r:embed="rId11" cstate="print">
-                      <a:extLst>
-                        <a:ext uri="{28A0092B-C50C-407E-A947-70E740481C1C}">
-                          <a14:useLocalDpi xmlns:a14="http://schemas.microsoft.com/office/drawing/2010/main" val="0"/>
-                        </a:ext>
-                      </a:extLst>
-                    </a:blip>
+                    <a:blip r:embed="rId11"/>
                     <a:stretch>
                       <a:fillRect/>
                     </a:stretch>
@@ -420,7 +414,7 @@
                   <pic:spPr>
                     <a:xfrm>
                       <a:off x="0" y="0"/>
-                      <a:ext cx="7499350" cy="1067435"/>
+                      <a:ext cx="7499350" cy="889635"/>
                     </a:xfrm>
                     <a:prstGeom prst="rect">
                       <a:avLst/>
@@ -1838,7 +1832,15 @@
     </w:p>
     <w:p>
       <w:r>
-        <w:t>Include the trial layout, type, and the experimental design, such as treatments, number of replicates, blocking, etc. Include graphics and pictures where useful.</w:t>
+        <w:t xml:space="preserve">Include the trial layout, type, and the experimental design, such as treatments, number of replicates, blocking, etc. Include graphics and pictures </w:t>
+      </w:r>
+      <w:proofErr w:type="gramStart"/>
+      <w:r>
+        <w:t>where</w:t>
+      </w:r>
+      <w:proofErr w:type="gramEnd"/>
+      <w:r>
+        <w:t xml:space="preserve"> useful.</w:t>
       </w:r>
     </w:p>
     <w:p>
@@ -1914,7 +1916,23 @@
     </w:p>
     <w:p>
       <w:r>
-        <w:t>Include all of the results of the analytical work, and discuss the findings and their implications with respect to the research question.</w:t>
+        <w:t xml:space="preserve">Include </w:t>
+      </w:r>
+      <w:proofErr w:type="gramStart"/>
+      <w:r>
+        <w:t>all of</w:t>
+      </w:r>
+      <w:proofErr w:type="gramEnd"/>
+      <w:r>
+        <w:t xml:space="preserve"> the results of the analytical </w:t>
+      </w:r>
+      <w:proofErr w:type="gramStart"/>
+      <w:r>
+        <w:t>work, and</w:t>
+      </w:r>
+      <w:proofErr w:type="gramEnd"/>
+      <w:r>
+        <w:t xml:space="preserve"> discuss the findings and their implications with respect to the research question.</w:t>
       </w:r>
     </w:p>
     <w:p/>
@@ -2225,7 +2243,7 @@
         <w:rPr>
           <w:noProof/>
         </w:rPr>
-        <w:t>B</w:t>
+        <w:t>5</w:t>
       </w:r>
     </w:fldSimple>
     <w:r>
@@ -2236,7 +2254,7 @@
         <w:rPr>
           <w:noProof/>
         </w:rPr>
-        <w:t>This is another appendix</w:t>
+        <w:t>Results and discussion</w:t>
       </w:r>
     </w:fldSimple>
   </w:p>

</xml_diff>

<commit_message>
resave docx files to see if I can fix corruptiuon
</commit_message>
<xml_diff>
--- a/_extensions/aagi/docx-report/template.docx
+++ b/_extensions/aagi/docx-report/template.docx
@@ -315,6 +315,7 @@
     <w:p>
       <w:pPr>
         <w:pStyle w:val="Normal"/>
+        <w:spacing w:before="0" w:after="160"/>
         <w:rPr/>
       </w:pPr>
       <w:r>
@@ -431,6 +432,7 @@
           <w:r>
             <w:rPr>
               <w:rStyle w:val="IndexLink"/>
+              <w:vanish w:val="false"/>
               <w:webHidden/>
             </w:rPr>
             <w:instrText xml:space="preserve"> TOC \z \o "1-3" \u \h</w:instrText>
@@ -438,6 +440,7 @@
           <w:r>
             <w:rPr>
               <w:rStyle w:val="IndexLink"/>
+              <w:vanish w:val="false"/>
               <w:webHidden/>
             </w:rPr>
             <w:fldChar w:fldCharType="separate"/>
@@ -446,6 +449,7 @@
             <w:r>
               <w:rPr>
                 <w:rStyle w:val="IndexLink"/>
+                <w:vanish w:val="false"/>
                 <w:webHidden/>
               </w:rPr>
               <w:t>Executive Summary</w:t>
@@ -503,6 +507,7 @@
             <w:r>
               <w:rPr>
                 <w:rStyle w:val="IndexLink"/>
+                <w:vanish w:val="false"/>
                 <w:webHidden/>
               </w:rPr>
               <w:t>1</w:t>
@@ -575,6 +580,7 @@
             <w:r>
               <w:rPr>
                 <w:rStyle w:val="IndexLink"/>
+                <w:vanish w:val="false"/>
                 <w:webHidden/>
               </w:rPr>
               <w:t>1.1</w:t>
@@ -648,6 +654,7 @@
             <w:r>
               <w:rPr>
                 <w:rStyle w:val="IndexLink"/>
+                <w:vanish w:val="false"/>
                 <w:webHidden/>
               </w:rPr>
               <w:t>1.1.1</w:t>
@@ -721,6 +728,7 @@
             <w:r>
               <w:rPr>
                 <w:rStyle w:val="IndexLink"/>
+                <w:vanish w:val="false"/>
                 <w:webHidden/>
               </w:rPr>
               <w:t>2</w:t>
@@ -794,6 +802,7 @@
             <w:r>
               <w:rPr>
                 <w:rStyle w:val="IndexLink"/>
+                <w:vanish w:val="false"/>
                 <w:webHidden/>
               </w:rPr>
               <w:t>3</w:t>
@@ -867,6 +876,7 @@
             <w:r>
               <w:rPr>
                 <w:rStyle w:val="IndexLink"/>
+                <w:vanish w:val="false"/>
                 <w:webHidden/>
               </w:rPr>
               <w:t>4</w:t>
@@ -940,6 +950,7 @@
             <w:r>
               <w:rPr>
                 <w:rStyle w:val="IndexLink"/>
+                <w:vanish w:val="false"/>
                 <w:webHidden/>
               </w:rPr>
               <w:t>5</w:t>
@@ -1013,6 +1024,7 @@
             <w:r>
               <w:rPr>
                 <w:rStyle w:val="IndexLink"/>
+                <w:vanish w:val="false"/>
                 <w:webHidden/>
               </w:rPr>
               <w:t>6</w:t>
@@ -1086,6 +1098,7 @@
             <w:r>
               <w:rPr>
                 <w:rStyle w:val="IndexLink"/>
+                <w:vanish w:val="false"/>
                 <w:webHidden/>
               </w:rPr>
               <w:t>7</w:t>
@@ -1159,6 +1172,7 @@
             <w:r>
               <w:rPr>
                 <w:rStyle w:val="IndexLink"/>
+                <w:vanish w:val="false"/>
                 <w:webHidden/>
               </w:rPr>
               <w:t>8</w:t>
@@ -1232,6 +1246,7 @@
             <w:r>
               <w:rPr>
                 <w:rStyle w:val="IndexLink"/>
+                <w:vanish w:val="false"/>
                 <w:webHidden/>
               </w:rPr>
               <w:t>A</w:t>
@@ -1305,6 +1320,7 @@
             <w:r>
               <w:rPr>
                 <w:rStyle w:val="IndexLink"/>
+                <w:vanish w:val="false"/>
                 <w:webHidden/>
               </w:rPr>
               <w:t>B</w:t>
@@ -1362,6 +1378,7 @@
         <w:p>
           <w:pPr>
             <w:pStyle w:val="Normal"/>
+            <w:spacing w:before="0" w:after="160"/>
             <w:rPr/>
           </w:pPr>
           <w:r>
@@ -1372,32 +1389,26 @@
             <w:fldChar w:fldCharType="end"/>
           </w:r>
         </w:p>
+        <w:p>
+          <w:pPr>
+            <w:sectPr>
+              <w:footerReference w:type="even" r:id="rId8"/>
+              <w:footerReference w:type="default" r:id="rId9"/>
+              <w:footerReference w:type="first" r:id="rId10"/>
+              <w:type w:val="nextPage"/>
+              <w:pgSz w:w="11906" w:h="16838"/>
+              <w:pgMar w:left="1440" w:right="1440" w:gutter="0" w:header="0" w:top="1440" w:footer="708" w:bottom="1440"/>
+              <w:pgNumType w:start="1" w:fmt="decimal"/>
+              <w:formProt w:val="false"/>
+              <w:textDirection w:val="lrTb"/>
+              <w:docGrid w:type="default" w:linePitch="360" w:charSpace="0"/>
+            </w:sectPr>
+          </w:pPr>
+        </w:p>
       </w:sdtContent>
     </w:sdt>
     <w:p>
       <w:pPr>
-        <w:pStyle w:val="Normal"/>
-        <w:spacing w:before="0" w:after="160"/>
-        <w:rPr/>
-        <w:sectPr>
-          <w:footerReference w:type="even" r:id="rId8"/>
-          <w:footerReference w:type="default" r:id="rId9"/>
-          <w:footerReference w:type="first" r:id="rId10"/>
-          <w:type w:val="nextPage"/>
-          <w:pgSz w:w="11906" w:h="16838"/>
-          <w:pgMar w:left="1440" w:right="1440" w:gutter="0" w:header="0" w:top="1440" w:footer="708" w:bottom="1440"/>
-          <w:pgNumType w:start="1" w:fmt="decimal"/>
-          <w:formProt w:val="false"/>
-          <w:textDirection w:val="lrTb"/>
-          <w:docGrid w:type="default" w:linePitch="360" w:charSpace="0"/>
-        </w:sectPr>
-      </w:pPr>
-      <w:r>
-        <w:rPr/>
-      </w:r>
-    </w:p>
-    <w:p>
-      <w:pPr>
         <w:pStyle w:val="Heading1"/>
         <w:rPr/>
       </w:pPr>
@@ -1416,15 +1427,6 @@
       <w:r>
         <w:rPr/>
         <w:t>Executive summary goes here. Summarise the work that was provided by AAGI and the main results. (Try to limit this to a single page.)</w:t>
-      </w:r>
-    </w:p>
-    <w:p>
-      <w:pPr>
-        <w:pStyle w:val="Normal"/>
-        <w:rPr/>
-      </w:pPr>
-      <w:r>
-        <w:rPr/>
       </w:r>
     </w:p>
     <w:p>
@@ -1627,6 +1629,7 @@
           <w:ilvl w:val="0"/>
           <w:numId w:val="1"/>
         </w:numPr>
+        <w:spacing w:before="0" w:after="80"/>
         <w:rPr/>
       </w:pPr>
       <w:bookmarkStart w:id="4" w:name="_Toc213146624"/>
@@ -1684,6 +1687,7 @@
           <w:ilvl w:val="0"/>
           <w:numId w:val="1"/>
         </w:numPr>
+        <w:spacing w:before="0" w:after="80"/>
         <w:rPr/>
       </w:pPr>
       <w:bookmarkStart w:id="5" w:name="_Toc213146625"/>
@@ -1731,6 +1735,7 @@
           <w:ilvl w:val="0"/>
           <w:numId w:val="1"/>
         </w:numPr>
+        <w:spacing w:before="0" w:after="80"/>
         <w:rPr/>
       </w:pPr>
       <w:bookmarkStart w:id="6" w:name="_Toc213146626"/>
@@ -1788,6 +1793,7 @@
           <w:ilvl w:val="0"/>
           <w:numId w:val="1"/>
         </w:numPr>
+        <w:spacing w:before="0" w:after="80"/>
         <w:rPr/>
       </w:pPr>
       <w:bookmarkStart w:id="7" w:name="_Toc213146627"/>
@@ -1835,6 +1841,7 @@
           <w:ilvl w:val="0"/>
           <w:numId w:val="1"/>
         </w:numPr>
+        <w:spacing w:before="0" w:after="80"/>
         <w:rPr/>
       </w:pPr>
       <w:bookmarkStart w:id="8" w:name="_Toc213146628"/>
@@ -1892,6 +1899,7 @@
           <w:ilvl w:val="0"/>
           <w:numId w:val="1"/>
         </w:numPr>
+        <w:spacing w:before="0" w:after="80"/>
         <w:rPr/>
       </w:pPr>
       <w:bookmarkStart w:id="9" w:name="_Toc213146629"/>
@@ -1939,6 +1947,7 @@
           <w:ilvl w:val="0"/>
           <w:numId w:val="1"/>
         </w:numPr>
+        <w:spacing w:before="0" w:after="80"/>
         <w:rPr/>
       </w:pPr>
       <w:bookmarkStart w:id="10" w:name="_Toc213146630"/>
@@ -1986,6 +1995,7 @@
           <w:ilvl w:val="0"/>
           <w:numId w:val="2"/>
         </w:numPr>
+        <w:spacing w:before="0" w:after="80"/>
         <w:rPr/>
       </w:pPr>
       <w:bookmarkStart w:id="11" w:name="_Toc213146631"/>
@@ -2033,6 +2043,7 @@
           <w:ilvl w:val="0"/>
           <w:numId w:val="2"/>
         </w:numPr>
+        <w:spacing w:before="0" w:after="80"/>
         <w:rPr/>
       </w:pPr>
       <w:bookmarkStart w:id="12" w:name="_Toc213146632"/>
@@ -2078,8 +2089,9 @@
       <w:headerReference w:type="even" r:id="rId17"/>
       <w:headerReference w:type="default" r:id="rId18"/>
       <w:headerReference w:type="first" r:id="rId19"/>
-      <w:footerReference w:type="default" r:id="rId20"/>
-      <w:footerReference w:type="first" r:id="rId21"/>
+      <w:footerReference w:type="even" r:id="rId20"/>
+      <w:footerReference w:type="default" r:id="rId21"/>
+      <w:footerReference w:type="first" r:id="rId22"/>
       <w:type w:val="nextPage"/>
       <w:pgSz w:w="11906" w:h="16838"/>
       <w:pgMar w:left="1440" w:right="1440" w:gutter="0" w:header="708" w:top="1440" w:footer="708" w:bottom="1440"/>
@@ -2111,28 +2123,10 @@
   <w:p>
     <w:pPr>
       <w:pStyle w:val="Footer"/>
-      <w:jc w:val="end"/>
-      <w:rPr/>
-    </w:pPr>
-    <w:r>
-      <w:rPr/>
-      <w:fldChar w:fldCharType="begin"/>
-    </w:r>
-    <w:r>
-      <w:rPr/>
-      <w:instrText xml:space="preserve"> PAGE </w:instrText>
-    </w:r>
-    <w:r>
-      <w:rPr/>
-      <w:fldChar w:fldCharType="separate"/>
-    </w:r>
-    <w:r>
-      <w:rPr/>
-      <w:t>12</w:t>
-    </w:r>
-    <w:r>
-      <w:rPr/>
-      <w:fldChar w:fldCharType="end"/>
+      <w:rPr/>
+    </w:pPr>
+    <w:r>
+      <w:rPr/>
     </w:r>
   </w:p>
 </w:ftr>
@@ -2140,7 +2134,65 @@
 
 <file path=word/footer11.xml><?xml version="1.0" encoding="utf-8"?>
 <w:ftr xmlns:o="urn:schemas-microsoft-com:office:office" xmlns:r="http://schemas.openxmlformats.org/officeDocument/2006/relationships" xmlns:v="urn:schemas-microsoft-com:vml" xmlns:w="http://schemas.openxmlformats.org/wordprocessingml/2006/main" xmlns:w10="urn:schemas-microsoft-com:office:word" xmlns:wp="http://schemas.openxmlformats.org/drawingml/2006/wordprocessingDrawing" xmlns:pic="http://schemas.openxmlformats.org/drawingml/2006/picture" xmlns:wps="http://schemas.microsoft.com/office/word/2010/wordprocessingShape" xmlns:wpg="http://schemas.microsoft.com/office/word/2010/wordprocessingGroup" xmlns:mc="http://schemas.openxmlformats.org/markup-compatibility/2006" xmlns:wp14="http://schemas.microsoft.com/office/word/2010/wordprocessingDrawing" xmlns:w14="http://schemas.microsoft.com/office/word/2010/wordml" xmlns:w15="http://schemas.microsoft.com/office/word/2012/wordml" mc:Ignorable="w14 wp14 w15">
-  <w:p/>
+  <w:p>
+    <w:pPr>
+      <w:pStyle w:val="Footer"/>
+      <w:jc w:val="end"/>
+      <w:rPr/>
+    </w:pPr>
+    <w:r>
+      <w:rPr/>
+      <w:fldChar w:fldCharType="begin"/>
+    </w:r>
+    <w:r>
+      <w:rPr/>
+      <w:instrText xml:space="preserve"> PAGE </w:instrText>
+    </w:r>
+    <w:r>
+      <w:rPr/>
+      <w:fldChar w:fldCharType="separate"/>
+    </w:r>
+    <w:r>
+      <w:rPr/>
+      <w:t>12</w:t>
+    </w:r>
+    <w:r>
+      <w:rPr/>
+      <w:fldChar w:fldCharType="end"/>
+    </w:r>
+  </w:p>
+</w:ftr>
+</file>
+
+<file path=word/footer12.xml><?xml version="1.0" encoding="utf-8"?>
+<w:ftr xmlns:o="urn:schemas-microsoft-com:office:office" xmlns:r="http://schemas.openxmlformats.org/officeDocument/2006/relationships" xmlns:v="urn:schemas-microsoft-com:vml" xmlns:w="http://schemas.openxmlformats.org/wordprocessingml/2006/main" xmlns:w10="urn:schemas-microsoft-com:office:word" xmlns:wp="http://schemas.openxmlformats.org/drawingml/2006/wordprocessingDrawing" xmlns:pic="http://schemas.openxmlformats.org/drawingml/2006/picture" xmlns:wps="http://schemas.microsoft.com/office/word/2010/wordprocessingShape" xmlns:wpg="http://schemas.microsoft.com/office/word/2010/wordprocessingGroup" xmlns:mc="http://schemas.openxmlformats.org/markup-compatibility/2006" xmlns:wp14="http://schemas.microsoft.com/office/word/2010/wordprocessingDrawing" xmlns:w14="http://schemas.microsoft.com/office/word/2010/wordml" xmlns:w15="http://schemas.microsoft.com/office/word/2012/wordml" mc:Ignorable="w14 wp14 w15">
+  <w:p>
+    <w:pPr>
+      <w:pStyle w:val="Footer"/>
+      <w:jc w:val="end"/>
+      <w:rPr/>
+    </w:pPr>
+    <w:r>
+      <w:rPr/>
+      <w:fldChar w:fldCharType="begin"/>
+    </w:r>
+    <w:r>
+      <w:rPr/>
+      <w:instrText xml:space="preserve"> PAGE </w:instrText>
+    </w:r>
+    <w:r>
+      <w:rPr/>
+      <w:fldChar w:fldCharType="separate"/>
+    </w:r>
+    <w:r>
+      <w:rPr/>
+      <w:t>12</w:t>
+    </w:r>
+    <w:r>
+      <w:rPr/>
+      <w:fldChar w:fldCharType="end"/>
+    </w:r>
+  </w:p>
 </w:ftr>
 </file>
 
@@ -3212,6 +3264,7 @@
     <w:rsid w:val="002127d5"/>
     <w:pPr>
       <w:widowControl/>
+      <w:suppressAutoHyphens w:val="true"/>
       <w:bidi w:val="0"/>
       <w:spacing w:lineRule="auto" w:line="259" w:before="0" w:after="160"/>
       <w:jc w:val="both"/>
@@ -3926,6 +3979,7 @@
     <w:rsid w:val="00a55c2e"/>
     <w:pPr>
       <w:widowControl/>
+      <w:suppressAutoHyphens w:val="true"/>
       <w:bidi w:val="0"/>
       <w:spacing w:lineRule="auto" w:line="240" w:before="0" w:after="0"/>
       <w:jc w:val="both"/>

</xml_diff>

<commit_message>
check binary file formats for validity, recreate
</commit_message>
<xml_diff>
--- a/_extensions/aagi/docx-report/template.docx
+++ b/_extensions/aagi/docx-report/template.docx
@@ -1,8 +1,8 @@
 
 <file path=word/document.xml><?xml version="1.0" encoding="utf-8"?>
-<w:document xmlns:o="urn:schemas-microsoft-com:office:office" xmlns:r="http://schemas.openxmlformats.org/officeDocument/2006/relationships" xmlns:v="urn:schemas-microsoft-com:vml" xmlns:w="http://schemas.openxmlformats.org/wordprocessingml/2006/main" xmlns:w10="urn:schemas-microsoft-com:office:word" xmlns:wp="http://schemas.openxmlformats.org/drawingml/2006/wordprocessingDrawing" xmlns:pic="http://schemas.openxmlformats.org/drawingml/2006/picture" xmlns:wps="http://schemas.microsoft.com/office/word/2010/wordprocessingShape" xmlns:wpg="http://schemas.microsoft.com/office/word/2010/wordprocessingGroup" xmlns:mc="http://schemas.openxmlformats.org/markup-compatibility/2006" xmlns:wp14="http://schemas.microsoft.com/office/word/2010/wordprocessingDrawing" xmlns:w14="http://schemas.microsoft.com/office/word/2010/wordml" xmlns:w15="http://schemas.microsoft.com/office/word/2012/wordml" mc:Ignorable="w14 wp14 w15">
+<w:document xmlns:o="urn:schemas-microsoft-com:office:office" xmlns:r="http://schemas.openxmlformats.org/officeDocument/2006/relationships" xmlns:v="urn:schemas-microsoft-com:vml" xmlns:w="http://schemas.openxmlformats.org/wordprocessingml/2006/main" xmlns:w10="urn:schemas-microsoft-com:office:word" xmlns:wp="http://schemas.openxmlformats.org/drawingml/2006/wordprocessingDrawing" xmlns:pic="http://schemas.openxmlformats.org/drawingml/2006/picture" xmlns:wps="http://schemas.microsoft.com/office/word/2010/wordprocessingShape" xmlns:wpg="http://schemas.microsoft.com/office/word/2010/wordprocessingGroup" xmlns:mc="http://schemas.openxmlformats.org/markup-compatibility/2006" xmlns:wp14="http://schemas.microsoft.com/office/word/2010/wordprocessingDrawing" xmlns:w14="http://schemas.microsoft.com/office/word/2010/wordml" xmlns:w15="http://schemas.microsoft.com/office/word/2012/wordml" xmlns:a="http://schemas.openxmlformats.org/drawingml/2006/main" xmlns:asvg="http://schemas.microsoft.com/office/drawing/2016/SVG/main" mc:Ignorable="w14 wp14 w15">
   <w:body>
-    <w:p>
+    <w:p xmlns:wp14="http://schemas.microsoft.com/office/word/2010/wordml" wp14:textId="77777777">
       <w:pPr>
         <w:pStyle w:val="Normal"/>
         <w:jc w:val="center"/>
@@ -11,7 +11,7 @@
       <w:r>
         <w:rPr/>
         <w:drawing>
-          <wp:anchor distT="0" distB="0" distL="0" distR="0" simplePos="0" relativeHeight="2" behindDoc="0" locked="0" layoutInCell="1" allowOverlap="1">
+          <wp:anchor xmlns:wp14="http://schemas.microsoft.com/office/word/2010/wordprocessingDrawing" distT="0" distB="0" distL="0" distR="0" simplePos="0" relativeHeight="5" behindDoc="0" locked="0" layoutInCell="1" allowOverlap="1" wp14:anchorId="428686F0" wp14:editId="7777777">
             <wp:simplePos x="0" y="0"/>
             <wp:positionH relativeFrom="column">
               <wp:posOffset>1711325</wp:posOffset>
@@ -58,56 +58,56 @@
         </w:drawing>
       </w:r>
     </w:p>
-    <w:p>
-      <w:pPr>
-        <w:pStyle w:val="Normal"/>
-        <w:rPr/>
-      </w:pPr>
-      <w:r>
-        <w:rPr/>
-      </w:r>
-    </w:p>
-    <w:p>
-      <w:pPr>
-        <w:pStyle w:val="Normal"/>
-        <w:rPr/>
-      </w:pPr>
-      <w:r>
-        <w:rPr/>
-      </w:r>
-    </w:p>
-    <w:p>
-      <w:pPr>
-        <w:pStyle w:val="Normal"/>
-        <w:rPr/>
-      </w:pPr>
-      <w:r>
-        <w:rPr/>
-      </w:r>
-    </w:p>
-    <w:p>
-      <w:pPr>
-        <w:pStyle w:val="Normal"/>
-        <w:rPr/>
-      </w:pPr>
-      <w:r>
-        <w:rPr/>
-      </w:r>
-    </w:p>
-    <w:p>
-      <w:pPr>
-        <w:pStyle w:val="Normal"/>
-        <w:rPr/>
-      </w:pPr>
-      <w:r>
-        <w:rPr/>
-      </w:r>
-    </w:p>
-    <w:p>
+    <w:p xmlns:wp14="http://schemas.microsoft.com/office/word/2010/wordml" wp14:textId="77777777">
+      <w:pPr>
+        <w:pStyle w:val="Normal"/>
+        <w:rPr/>
+      </w:pPr>
+      <w:r>
+        <w:rPr/>
+      </w:r>
+    </w:p>
+    <w:p xmlns:wp14="http://schemas.microsoft.com/office/word/2010/wordml" wp14:textId="77777777">
+      <w:pPr>
+        <w:pStyle w:val="Normal"/>
+        <w:rPr/>
+      </w:pPr>
+      <w:r>
+        <w:rPr/>
+      </w:r>
+    </w:p>
+    <w:p xmlns:wp14="http://schemas.microsoft.com/office/word/2010/wordml" wp14:textId="77777777">
+      <w:pPr>
+        <w:pStyle w:val="Normal"/>
+        <w:rPr/>
+      </w:pPr>
+      <w:r>
+        <w:rPr/>
+      </w:r>
+    </w:p>
+    <w:p xmlns:wp14="http://schemas.microsoft.com/office/word/2010/wordml" wp14:textId="77777777">
+      <w:pPr>
+        <w:pStyle w:val="Normal"/>
+        <w:rPr/>
+      </w:pPr>
+      <w:r>
+        <w:rPr/>
+      </w:r>
+    </w:p>
+    <w:p xmlns:wp14="http://schemas.microsoft.com/office/word/2010/wordml" wp14:textId="77777777">
+      <w:pPr>
+        <w:pStyle w:val="Normal"/>
+        <w:rPr/>
+      </w:pPr>
+      <w:r>
+        <w:rPr/>
+      </w:r>
+    </w:p>
+    <w:p xmlns:wp14="http://schemas.microsoft.com/office/word/2010/wordml" wp14:textId="77777777">
       <w:pPr>
         <w:pStyle w:val="Normal"/>
         <w:pBdr>
-          <w:bottom w:val="single" w:sz="18" w:space="1" w:color="000000"/>
+          <w:bottom w:val="single" w:color="000000" w:sz="18" w:space="1"/>
         </w:pBdr>
         <w:jc w:val="end"/>
         <w:rPr/>
@@ -116,7 +116,7 @@
         <w:rPr/>
       </w:r>
     </w:p>
-    <w:p>
+    <w:p xmlns:wp14="http://schemas.microsoft.com/office/word/2010/wordml" wp14:textId="77777777">
       <w:pPr>
         <w:pStyle w:val="Title"/>
         <w:spacing w:before="240" w:after="80"/>
@@ -133,7 +133,7 @@
         <w:t>Analytics for the Australian Grains Industry</w:t>
       </w:r>
     </w:p>
-    <w:p>
+    <w:p xmlns:wp14="http://schemas.microsoft.com/office/word/2010/wordml" wp14:textId="77777777">
       <w:pPr>
         <w:pStyle w:val="Title"/>
         <w:jc w:val="end"/>
@@ -148,10 +148,10 @@
         <w:t>&lt;University Name&gt; (AAGI-&lt;XX&gt;)</w:t>
       </w:r>
     </w:p>
-    <w:p>
+    <w:p xmlns:wp14="http://schemas.microsoft.com/office/word/2010/wordml" wp14:textId="77777777">
       <w:pPr>
         <w:pStyle w:val="Title"/>
-        <w:spacing w:lineRule="auto" w:line="360"/>
+        <w:spacing w:line="360" w:lineRule="auto"/>
         <w:jc w:val="end"/>
         <w:rPr>
           <w:szCs w:val="48"/>
@@ -164,7 +164,7 @@
         <w:t>&lt;AAGI Program&gt; Report</w:t>
       </w:r>
     </w:p>
-    <w:p>
+    <w:p xmlns:wp14="http://schemas.microsoft.com/office/word/2010/wordml" wp14:textId="77777777">
       <w:pPr>
         <w:pStyle w:val="Title"/>
         <w:jc w:val="end"/>
@@ -181,10 +181,10 @@
         <w:t>&lt;Informative title for report&gt;</w:t>
       </w:r>
     </w:p>
-    <w:p>
+    <w:p xmlns:wp14="http://schemas.microsoft.com/office/word/2010/wordml" wp14:textId="77777777">
       <w:pPr>
         <w:pStyle w:val="Title"/>
-        <w:spacing w:lineRule="auto" w:line="360"/>
+        <w:spacing w:line="360" w:lineRule="auto"/>
         <w:jc w:val="end"/>
         <w:rPr>
           <w:color w:val="auto"/>
@@ -201,7 +201,7 @@
         <w:t>Report for &lt;GRDC/AAGI Project Code&gt;</w:t>
       </w:r>
     </w:p>
-    <w:p>
+    <w:p xmlns:wp14="http://schemas.microsoft.com/office/word/2010/wordml" wp14:textId="77777777">
       <w:pPr>
         <w:pStyle w:val="Normal"/>
         <w:jc w:val="end"/>
@@ -221,11 +221,17 @@
       <w:r>
         <w:rPr/>
         <w:t xml:space="preserve"> (&lt;Client Organisation&gt;)</w:t>
+      </w:r>
+      <w:r>
+        <w:rPr/>
         <w:br/>
+      </w:r>
+      <w:r>
+        <w:rPr/>
         <w:t>&lt;Name 2&gt; (&lt;Organisation 2&gt;)</w:t>
       </w:r>
     </w:p>
-    <w:p>
+    <w:p xmlns:wp14="http://schemas.microsoft.com/office/word/2010/wordml" wp14:textId="77777777">
       <w:pPr>
         <w:pStyle w:val="Normal"/>
         <w:spacing w:before="240" w:after="160"/>
@@ -242,19 +248,31 @@
           <w:bCs/>
         </w:rPr>
         <w:t xml:space="preserve"> &lt;Your Name&gt;</w:t>
+      </w:r>
+      <w:r>
+        <w:rPr>
+          <w:b/>
+          <w:bCs/>
+        </w:rPr>
         <w:br/>
       </w:r>
       <w:r>
         <w:rPr/>
         <w:t>&lt;Name 2&gt;</w:t>
+      </w:r>
+      <w:r>
+        <w:rPr/>
         <w:br/>
+      </w:r>
+      <w:r>
+        <w:rPr/>
         <w:t>&lt;Name 3&gt;</w:t>
       </w:r>
     </w:p>
-    <w:p>
-      <w:pPr>
-        <w:pStyle w:val="Normal"/>
-        <w:spacing w:lineRule="auto" w:line="360"/>
+    <w:p xmlns:wp14="http://schemas.microsoft.com/office/word/2010/wordml" wp14:textId="77777777">
+      <w:pPr>
+        <w:pStyle w:val="Normal"/>
+        <w:spacing w:line="360" w:lineRule="auto"/>
         <w:jc w:val="end"/>
         <w:rPr/>
       </w:pPr>
@@ -272,13 +290,13 @@
         </w:r>
       </w:hyperlink>
     </w:p>
-    <w:p>
+    <w:p xmlns:wp14="http://schemas.microsoft.com/office/word/2010/wordml" wp14:textId="77777777">
       <w:pPr>
         <w:pStyle w:val="Normal"/>
         <w:pBdr>
-          <w:bottom w:val="single" w:sz="18" w:space="1" w:color="000000"/>
+          <w:bottom w:val="single" w:color="000000" w:sz="18" w:space="1"/>
         </w:pBdr>
-        <w:spacing w:lineRule="auto" w:line="276" w:before="240" w:after="160"/>
+        <w:spacing w:before="240" w:after="160" w:line="276" w:lineRule="auto"/>
         <w:jc w:val="end"/>
         <w:rPr/>
       </w:pPr>
@@ -296,43 +314,42 @@
       </w:r>
       <w:r>
         <w:rPr/>
-        <w:t>26 March 2026</w:t>
+        <w:t>7 November 2025</w:t>
       </w:r>
       <w:r>
         <w:rPr/>
         <w:fldChar w:fldCharType="end"/>
       </w:r>
     </w:p>
-    <w:p>
-      <w:pPr>
-        <w:pStyle w:val="Normal"/>
-        <w:rPr/>
-      </w:pPr>
-      <w:r>
-        <w:rPr/>
-      </w:r>
-    </w:p>
-    <w:p>
-      <w:pPr>
-        <w:pStyle w:val="Normal"/>
-        <w:spacing w:before="0" w:after="160"/>
+    <w:p xmlns:wp14="http://schemas.microsoft.com/office/word/2010/wordml" wp14:textId="77777777">
+      <w:pPr>
+        <w:pStyle w:val="Normal"/>
+        <w:rPr/>
+      </w:pPr>
+      <w:r>
+        <w:rPr/>
+      </w:r>
+    </w:p>
+    <w:p xmlns:wp14="http://schemas.microsoft.com/office/word/2010/wordml" wp14:textId="77777777">
+      <w:pPr>
+        <w:pStyle w:val="Normal"/>
         <w:rPr/>
       </w:pPr>
       <w:r>
         <w:rPr/>
         <w:drawing>
-          <wp:anchor distT="0" distB="0" distL="0" distR="0" simplePos="0" relativeHeight="3" behindDoc="0" locked="0" layoutInCell="1" allowOverlap="1">
+          <wp:anchor xmlns:wp14="http://schemas.microsoft.com/office/word/2010/wordprocessingDrawing" distT="0" distB="0" distL="0" distR="0" simplePos="0" relativeHeight="6" behindDoc="0" locked="0" layoutInCell="1" allowOverlap="1" wp14:anchorId="5E6F0FE6" wp14:editId="7777777">
             <wp:simplePos x="0" y="0"/>
             <wp:positionH relativeFrom="column">
               <wp:posOffset>-882650</wp:posOffset>
             </wp:positionH>
             <wp:positionV relativeFrom="page">
-              <wp:posOffset>9678035</wp:posOffset>
+              <wp:posOffset>9592310</wp:posOffset>
             </wp:positionV>
-            <wp:extent cx="7499350" cy="889635"/>
+            <wp:extent cx="7499350" cy="1067435"/>
             <wp:effectExtent l="0" t="0" r="0" b="0"/>
             <wp:wrapNone/>
-            <wp:docPr id="2" name="Picture 3"/>
+            <wp:docPr id="2" name="Picture 3" descr="A black and purple logo&#10;&#10;Description automatically generated"/>
             <wp:cNvGraphicFramePr>
               <a:graphicFrameLocks xmlns:a="http://schemas.openxmlformats.org/drawingml/2006/main" noChangeAspect="1"/>
             </wp:cNvGraphicFramePr>
@@ -340,7 +357,7 @@
               <a:graphicData uri="http://schemas.openxmlformats.org/drawingml/2006/picture">
                 <pic:pic xmlns:pic="http://schemas.openxmlformats.org/drawingml/2006/picture">
                   <pic:nvPicPr>
-                    <pic:cNvPr id="2" name="Picture 3"/>
+                    <pic:cNvPr id="2" name="Picture 3" descr="A black and purple logo&#10;&#10;Description automatically generated"/>
                     <pic:cNvPicPr>
                       <a:picLocks noChangeAspect="1" noChangeArrowheads="1"/>
                     </pic:cNvPicPr>
@@ -354,7 +371,7 @@
                   <pic:spPr bwMode="auto">
                     <a:xfrm>
                       <a:off x="0" y="0"/>
-                      <a:ext cx="7499350" cy="889635"/>
+                      <a:ext cx="7499350" cy="1067435"/>
                     </a:xfrm>
                     <a:prstGeom prst="rect">
                       <a:avLst/>
@@ -368,31 +385,33 @@
         </w:drawing>
       </w:r>
     </w:p>
-    <w:p>
+    <w:p xmlns:wp14="http://schemas.microsoft.com/office/word/2010/wordml" wp14:textId="77777777">
       <w:pPr>
         <w:sectPr>
           <w:footerReference w:type="even" r:id="rId5"/>
           <w:footerReference w:type="default" r:id="rId6"/>
           <w:footerReference w:type="first" r:id="rId7"/>
           <w:type w:val="nextPage"/>
-          <w:pgSz w:w="11906" w:h="16838"/>
-          <w:pgMar w:left="1440" w:right="1440" w:gutter="0" w:header="0" w:top="1440" w:footer="708" w:bottom="1440"/>
+          <w:pgSz w:w="11906" w:h="16838" w:orient="portrait"/>
+          <w:pgMar w:top="1440" w:right="1440" w:bottom="1440" w:left="1440" w:header="0" w:footer="708" w:gutter="0"/>
           <w:pgNumType w:fmt="decimal"/>
           <w:formProt w:val="false"/>
           <w:textDirection w:val="lrTb"/>
           <w:docGrid w:type="default" w:linePitch="360" w:charSpace="0"/>
+          <w:cols w:num="1"/>
         </w:sectPr>
       </w:pPr>
     </w:p>
     <w:sdt>
       <w:sdtPr>
+        <w:id w:val="766479596"/>
         <w:docPartObj>
           <w:docPartGallery w:val="Table of Contents"/>
           <w:docPartUnique w:val="true"/>
         </w:docPartObj>
       </w:sdtPr>
       <w:sdtContent>
-        <w:p>
+        <w:p xmlns:wp14="http://schemas.microsoft.com/office/word/2010/wordml" wp14:textId="77777777">
           <w:pPr>
             <w:pStyle w:val="Normal"/>
             <w:rPr>
@@ -412,15 +431,15 @@
             <w:t>Contents</w:t>
           </w:r>
         </w:p>
-        <w:p>
+        <w:p xmlns:wp14="http://schemas.microsoft.com/office/word/2010/wordml" wp14:textId="77777777">
           <w:pPr>
             <w:pStyle w:val="TOC1"/>
             <w:tabs>
               <w:tab w:val="clear" w:pos="720"/>
-              <w:tab w:val="right" w:pos="9016" w:leader="dot"/>
+              <w:tab w:val="right" w:leader="dot" w:pos="9016"/>
             </w:tabs>
             <w:rPr>
-              <w:rFonts w:ascii="Aptos" w:hAnsi="Aptos" w:eastAsia="" w:asciiTheme="minorHAnsi" w:eastAsiaTheme="minorEastAsia" w:hAnsiTheme="minorHAnsi"/>
+              <w:rFonts w:ascii="Aptos" w:hAnsi="Aptos" w:eastAsia="" w:asciiTheme="minorHAnsi" w:hAnsiTheme="minorHAnsi" w:eastAsiaTheme="minorEastAsia"/>
               <w:sz w:val="24"/>
               <w:szCs w:val="24"/>
               <w:lang w:eastAsia="en-AU"/>
@@ -432,7 +451,6 @@
           <w:r>
             <w:rPr>
               <w:rStyle w:val="IndexLink"/>
-              <w:vanish w:val="false"/>
               <w:webHidden/>
             </w:rPr>
             <w:instrText xml:space="preserve"> TOC \z \o "1-3" \u \h</w:instrText>
@@ -440,44 +458,48 @@
           <w:r>
             <w:rPr>
               <w:rStyle w:val="IndexLink"/>
-              <w:vanish w:val="false"/>
               <w:webHidden/>
             </w:rPr>
             <w:fldChar w:fldCharType="separate"/>
           </w:r>
-          <w:hyperlink w:anchor="_Toc213146620">
+          <w:hyperlink w:anchor="_Toc213418598">
+            <w:r>
+              <w:rPr>
+                <w:rStyle w:val="IndexLink"/>
+                <w:webHidden/>
+              </w:rPr>
+              <w:t>Executive Summary</w:t>
+            </w:r>
+            <w:r>
+              <w:rPr>
+                <w:webHidden/>
+              </w:rPr>
+              <w:fldChar w:fldCharType="begin"/>
+            </w:r>
+            <w:r>
+              <w:rPr>
+                <w:webHidden/>
+              </w:rPr>
+              <w:instrText xml:space="preserve">PAGEREF _Toc213418598 \h</w:instrText>
+            </w:r>
+            <w:r>
+              <w:rPr>
+                <w:webHidden/>
+              </w:rPr>
+              <w:fldChar w:fldCharType="separate"/>
+            </w:r>
             <w:r>
               <w:rPr>
                 <w:rStyle w:val="IndexLink"/>
                 <w:vanish w:val="false"/>
-                <w:webHidden/>
-              </w:rPr>
-              <w:t>Executive Summary</w:t>
-            </w:r>
-            <w:r>
-              <w:rPr>
-                <w:webHidden/>
-              </w:rPr>
-              <w:fldChar w:fldCharType="begin"/>
-            </w:r>
-            <w:r>
-              <w:rPr>
-                <w:webHidden/>
-              </w:rPr>
-              <w:instrText xml:space="preserve">PAGEREF _Toc213146620 \h</w:instrText>
-            </w:r>
-            <w:r>
-              <w:rPr>
-                <w:webHidden/>
-              </w:rPr>
-              <w:fldChar w:fldCharType="separate"/>
+              </w:rPr>
+              <w:tab/>
             </w:r>
             <w:r>
               <w:rPr>
                 <w:rStyle w:val="IndexLink"/>
                 <w:vanish w:val="false"/>
               </w:rPr>
-              <w:tab/>
               <w:t>2</w:t>
             </w:r>
             <w:r>
@@ -488,26 +510,25 @@
             </w:r>
           </w:hyperlink>
         </w:p>
-        <w:p>
+        <w:p xmlns:wp14="http://schemas.microsoft.com/office/word/2010/wordml" wp14:textId="77777777">
           <w:pPr>
             <w:pStyle w:val="TOC1"/>
             <w:tabs>
               <w:tab w:val="clear" w:pos="720"/>
-              <w:tab w:val="left" w:pos="440" w:leader="none"/>
-              <w:tab w:val="right" w:pos="9016" w:leader="dot"/>
+              <w:tab w:val="left" w:leader="none" w:pos="440"/>
+              <w:tab w:val="right" w:leader="dot" w:pos="9016"/>
             </w:tabs>
             <w:rPr>
-              <w:rFonts w:ascii="Aptos" w:hAnsi="Aptos" w:eastAsia="" w:asciiTheme="minorHAnsi" w:eastAsiaTheme="minorEastAsia" w:hAnsiTheme="minorHAnsi"/>
+              <w:rFonts w:ascii="Aptos" w:hAnsi="Aptos" w:eastAsia="" w:asciiTheme="minorHAnsi" w:hAnsiTheme="minorHAnsi" w:eastAsiaTheme="minorEastAsia"/>
               <w:sz w:val="24"/>
               <w:szCs w:val="24"/>
               <w:lang w:eastAsia="en-AU"/>
             </w:rPr>
           </w:pPr>
-          <w:hyperlink w:anchor="_Toc213146621">
-            <w:r>
-              <w:rPr>
-                <w:rStyle w:val="IndexLink"/>
-                <w:vanish w:val="false"/>
+          <w:hyperlink w:anchor="_Toc213418599">
+            <w:r>
+              <w:rPr>
+                <w:rStyle w:val="IndexLink"/>
                 <w:webHidden/>
               </w:rPr>
               <w:t>1</w:t>
@@ -515,7 +536,7 @@
             <w:r>
               <w:rPr>
                 <w:rStyle w:val="IndexLink"/>
-                <w:rFonts w:eastAsia="" w:ascii="Aptos" w:hAnsi="Aptos" w:asciiTheme="minorHAnsi" w:eastAsiaTheme="minorEastAsia" w:hAnsiTheme="minorHAnsi"/>
+                <w:rFonts w:ascii="Aptos" w:hAnsi="Aptos" w:eastAsia="" w:asciiTheme="minorHAnsi" w:hAnsiTheme="minorHAnsi" w:eastAsiaTheme="minorEastAsia"/>
                 <w:sz w:val="24"/>
                 <w:szCs w:val="24"/>
                 <w:lang w:eastAsia="en-AU"/>
@@ -538,7 +559,7 @@
               <w:rPr>
                 <w:webHidden/>
               </w:rPr>
-              <w:instrText xml:space="preserve">PAGEREF _Toc213146621 \h</w:instrText>
+              <w:instrText xml:space="preserve">PAGEREF _Toc213418599 \h</w:instrText>
             </w:r>
             <w:r>
               <w:rPr>
@@ -552,6 +573,12 @@
                 <w:vanish w:val="false"/>
               </w:rPr>
               <w:tab/>
+            </w:r>
+            <w:r>
+              <w:rPr>
+                <w:rStyle w:val="IndexLink"/>
+                <w:vanish w:val="false"/>
+              </w:rPr>
               <w:t>3</w:t>
             </w:r>
             <w:r>
@@ -562,25 +589,24 @@
             </w:r>
           </w:hyperlink>
         </w:p>
-        <w:p>
+        <w:p xmlns:wp14="http://schemas.microsoft.com/office/word/2010/wordml" wp14:textId="77777777">
           <w:pPr>
             <w:pStyle w:val="TOC2"/>
             <w:tabs>
-              <w:tab w:val="left" w:pos="720" w:leader="none"/>
-              <w:tab w:val="right" w:pos="9016" w:leader="dot"/>
+              <w:tab w:val="left" w:leader="none" w:pos="720"/>
+              <w:tab w:val="right" w:leader="dot" w:pos="9016"/>
             </w:tabs>
             <w:rPr>
-              <w:rFonts w:ascii="Aptos" w:hAnsi="Aptos" w:eastAsia="" w:asciiTheme="minorHAnsi" w:eastAsiaTheme="minorEastAsia" w:hAnsiTheme="minorHAnsi"/>
+              <w:rFonts w:ascii="Aptos" w:hAnsi="Aptos" w:eastAsia="" w:asciiTheme="minorHAnsi" w:hAnsiTheme="minorHAnsi" w:eastAsiaTheme="minorEastAsia"/>
               <w:sz w:val="24"/>
               <w:szCs w:val="24"/>
               <w:lang w:eastAsia="en-AU"/>
             </w:rPr>
           </w:pPr>
-          <w:hyperlink w:anchor="_Toc213146622">
-            <w:r>
-              <w:rPr>
-                <w:rStyle w:val="IndexLink"/>
-                <w:vanish w:val="false"/>
+          <w:hyperlink w:anchor="_Toc213418600">
+            <w:r>
+              <w:rPr>
+                <w:rStyle w:val="IndexLink"/>
                 <w:webHidden/>
               </w:rPr>
               <w:t>1.1</w:t>
@@ -588,7 +614,7 @@
             <w:r>
               <w:rPr>
                 <w:rStyle w:val="IndexLink"/>
-                <w:rFonts w:eastAsia="" w:ascii="Aptos" w:hAnsi="Aptos" w:asciiTheme="minorHAnsi" w:eastAsiaTheme="minorEastAsia" w:hAnsiTheme="minorHAnsi"/>
+                <w:rFonts w:ascii="Aptos" w:hAnsi="Aptos" w:eastAsia="" w:asciiTheme="minorHAnsi" w:hAnsiTheme="minorHAnsi" w:eastAsiaTheme="minorEastAsia"/>
                 <w:sz w:val="24"/>
                 <w:szCs w:val="24"/>
                 <w:lang w:eastAsia="en-AU"/>
@@ -611,7 +637,7 @@
               <w:rPr>
                 <w:webHidden/>
               </w:rPr>
-              <w:instrText xml:space="preserve">PAGEREF _Toc213146622 \h</w:instrText>
+              <w:instrText xml:space="preserve">PAGEREF _Toc213418600 \h</w:instrText>
             </w:r>
             <w:r>
               <w:rPr>
@@ -625,6 +651,12 @@
                 <w:vanish w:val="false"/>
               </w:rPr>
               <w:tab/>
+            </w:r>
+            <w:r>
+              <w:rPr>
+                <w:rStyle w:val="IndexLink"/>
+                <w:vanish w:val="false"/>
+              </w:rPr>
               <w:t>3</w:t>
             </w:r>
             <w:r>
@@ -635,26 +667,25 @@
             </w:r>
           </w:hyperlink>
         </w:p>
-        <w:p>
+        <w:p xmlns:wp14="http://schemas.microsoft.com/office/word/2010/wordml" wp14:textId="77777777">
           <w:pPr>
             <w:pStyle w:val="TOC3"/>
             <w:tabs>
               <w:tab w:val="clear" w:pos="720"/>
-              <w:tab w:val="left" w:pos="1200" w:leader="none"/>
-              <w:tab w:val="right" w:pos="9016" w:leader="dot"/>
+              <w:tab w:val="left" w:leader="none" w:pos="1200"/>
+              <w:tab w:val="right" w:leader="dot" w:pos="9016"/>
             </w:tabs>
             <w:rPr>
-              <w:rFonts w:ascii="Aptos" w:hAnsi="Aptos" w:eastAsia="" w:asciiTheme="minorHAnsi" w:eastAsiaTheme="minorEastAsia" w:hAnsiTheme="minorHAnsi"/>
+              <w:rFonts w:ascii="Aptos" w:hAnsi="Aptos" w:eastAsia="" w:asciiTheme="minorHAnsi" w:hAnsiTheme="minorHAnsi" w:eastAsiaTheme="minorEastAsia"/>
               <w:sz w:val="24"/>
               <w:szCs w:val="24"/>
               <w:lang w:eastAsia="en-AU"/>
             </w:rPr>
           </w:pPr>
-          <w:hyperlink w:anchor="_Toc213146623">
-            <w:r>
-              <w:rPr>
-                <w:rStyle w:val="IndexLink"/>
-                <w:vanish w:val="false"/>
+          <w:hyperlink w:anchor="_Toc213418601">
+            <w:r>
+              <w:rPr>
+                <w:rStyle w:val="IndexLink"/>
                 <w:webHidden/>
               </w:rPr>
               <w:t>1.1.1</w:t>
@@ -662,7 +693,7 @@
             <w:r>
               <w:rPr>
                 <w:rStyle w:val="IndexLink"/>
-                <w:rFonts w:eastAsia="" w:ascii="Aptos" w:hAnsi="Aptos" w:asciiTheme="minorHAnsi" w:eastAsiaTheme="minorEastAsia" w:hAnsiTheme="minorHAnsi"/>
+                <w:rFonts w:ascii="Aptos" w:hAnsi="Aptos" w:eastAsia="" w:asciiTheme="minorHAnsi" w:hAnsiTheme="minorHAnsi" w:eastAsiaTheme="minorEastAsia"/>
                 <w:sz w:val="24"/>
                 <w:szCs w:val="24"/>
                 <w:lang w:eastAsia="en-AU"/>
@@ -685,7 +716,7 @@
               <w:rPr>
                 <w:webHidden/>
               </w:rPr>
-              <w:instrText xml:space="preserve">PAGEREF _Toc213146623 \h</w:instrText>
+              <w:instrText xml:space="preserve">PAGEREF _Toc213418601 \h</w:instrText>
             </w:r>
             <w:r>
               <w:rPr>
@@ -699,6 +730,12 @@
                 <w:vanish w:val="false"/>
               </w:rPr>
               <w:tab/>
+            </w:r>
+            <w:r>
+              <w:rPr>
+                <w:rStyle w:val="IndexLink"/>
+                <w:vanish w:val="false"/>
+              </w:rPr>
               <w:t>3</w:t>
             </w:r>
             <w:r>
@@ -709,26 +746,25 @@
             </w:r>
           </w:hyperlink>
         </w:p>
-        <w:p>
+        <w:p xmlns:wp14="http://schemas.microsoft.com/office/word/2010/wordml" wp14:textId="77777777">
           <w:pPr>
             <w:pStyle w:val="TOC1"/>
             <w:tabs>
               <w:tab w:val="clear" w:pos="720"/>
-              <w:tab w:val="left" w:pos="440" w:leader="none"/>
-              <w:tab w:val="right" w:pos="9016" w:leader="dot"/>
+              <w:tab w:val="left" w:leader="none" w:pos="440"/>
+              <w:tab w:val="right" w:leader="dot" w:pos="9016"/>
             </w:tabs>
             <w:rPr>
-              <w:rFonts w:ascii="Aptos" w:hAnsi="Aptos" w:eastAsia="" w:asciiTheme="minorHAnsi" w:eastAsiaTheme="minorEastAsia" w:hAnsiTheme="minorHAnsi"/>
+              <w:rFonts w:ascii="Aptos" w:hAnsi="Aptos" w:eastAsia="" w:asciiTheme="minorHAnsi" w:hAnsiTheme="minorHAnsi" w:eastAsiaTheme="minorEastAsia"/>
               <w:sz w:val="24"/>
               <w:szCs w:val="24"/>
               <w:lang w:eastAsia="en-AU"/>
             </w:rPr>
           </w:pPr>
-          <w:hyperlink w:anchor="_Toc213146624">
-            <w:r>
-              <w:rPr>
-                <w:rStyle w:val="IndexLink"/>
-                <w:vanish w:val="false"/>
+          <w:hyperlink w:anchor="_Toc213418602">
+            <w:r>
+              <w:rPr>
+                <w:rStyle w:val="IndexLink"/>
                 <w:webHidden/>
               </w:rPr>
               <w:t>2</w:t>
@@ -736,7 +772,7 @@
             <w:r>
               <w:rPr>
                 <w:rStyle w:val="IndexLink"/>
-                <w:rFonts w:eastAsia="" w:ascii="Aptos" w:hAnsi="Aptos" w:asciiTheme="minorHAnsi" w:eastAsiaTheme="minorEastAsia" w:hAnsiTheme="minorHAnsi"/>
+                <w:rFonts w:ascii="Aptos" w:hAnsi="Aptos" w:eastAsia="" w:asciiTheme="minorHAnsi" w:hAnsiTheme="minorHAnsi" w:eastAsiaTheme="minorEastAsia"/>
                 <w:sz w:val="24"/>
                 <w:szCs w:val="24"/>
                 <w:lang w:eastAsia="en-AU"/>
@@ -759,7 +795,7 @@
               <w:rPr>
                 <w:webHidden/>
               </w:rPr>
-              <w:instrText xml:space="preserve">PAGEREF _Toc213146624 \h</w:instrText>
+              <w:instrText xml:space="preserve">PAGEREF _Toc213418602 \h</w:instrText>
             </w:r>
             <w:r>
               <w:rPr>
@@ -773,6 +809,12 @@
                 <w:vanish w:val="false"/>
               </w:rPr>
               <w:tab/>
+            </w:r>
+            <w:r>
+              <w:rPr>
+                <w:rStyle w:val="IndexLink"/>
+                <w:vanish w:val="false"/>
+              </w:rPr>
               <w:t>4</w:t>
             </w:r>
             <w:r>
@@ -783,26 +825,25 @@
             </w:r>
           </w:hyperlink>
         </w:p>
-        <w:p>
+        <w:p xmlns:wp14="http://schemas.microsoft.com/office/word/2010/wordml" wp14:textId="77777777">
           <w:pPr>
             <w:pStyle w:val="TOC1"/>
             <w:tabs>
               <w:tab w:val="clear" w:pos="720"/>
-              <w:tab w:val="left" w:pos="440" w:leader="none"/>
-              <w:tab w:val="right" w:pos="9016" w:leader="dot"/>
+              <w:tab w:val="left" w:leader="none" w:pos="440"/>
+              <w:tab w:val="right" w:leader="dot" w:pos="9016"/>
             </w:tabs>
             <w:rPr>
-              <w:rFonts w:ascii="Aptos" w:hAnsi="Aptos" w:eastAsia="" w:asciiTheme="minorHAnsi" w:eastAsiaTheme="minorEastAsia" w:hAnsiTheme="minorHAnsi"/>
+              <w:rFonts w:ascii="Aptos" w:hAnsi="Aptos" w:eastAsia="" w:asciiTheme="minorHAnsi" w:hAnsiTheme="minorHAnsi" w:eastAsiaTheme="minorEastAsia"/>
               <w:sz w:val="24"/>
               <w:szCs w:val="24"/>
               <w:lang w:eastAsia="en-AU"/>
             </w:rPr>
           </w:pPr>
-          <w:hyperlink w:anchor="_Toc213146625">
-            <w:r>
-              <w:rPr>
-                <w:rStyle w:val="IndexLink"/>
-                <w:vanish w:val="false"/>
+          <w:hyperlink w:anchor="_Toc213418603">
+            <w:r>
+              <w:rPr>
+                <w:rStyle w:val="IndexLink"/>
                 <w:webHidden/>
               </w:rPr>
               <w:t>3</w:t>
@@ -810,7 +851,7 @@
             <w:r>
               <w:rPr>
                 <w:rStyle w:val="IndexLink"/>
-                <w:rFonts w:eastAsia="" w:ascii="Aptos" w:hAnsi="Aptos" w:asciiTheme="minorHAnsi" w:eastAsiaTheme="minorEastAsia" w:hAnsiTheme="minorHAnsi"/>
+                <w:rFonts w:ascii="Aptos" w:hAnsi="Aptos" w:eastAsia="" w:asciiTheme="minorHAnsi" w:hAnsiTheme="minorHAnsi" w:eastAsiaTheme="minorEastAsia"/>
                 <w:sz w:val="24"/>
                 <w:szCs w:val="24"/>
                 <w:lang w:eastAsia="en-AU"/>
@@ -833,7 +874,7 @@
               <w:rPr>
                 <w:webHidden/>
               </w:rPr>
-              <w:instrText xml:space="preserve">PAGEREF _Toc213146625 \h</w:instrText>
+              <w:instrText xml:space="preserve">PAGEREF _Toc213418603 \h</w:instrText>
             </w:r>
             <w:r>
               <w:rPr>
@@ -847,6 +888,12 @@
                 <w:vanish w:val="false"/>
               </w:rPr>
               <w:tab/>
+            </w:r>
+            <w:r>
+              <w:rPr>
+                <w:rStyle w:val="IndexLink"/>
+                <w:vanish w:val="false"/>
+              </w:rPr>
               <w:t>5</w:t>
             </w:r>
             <w:r>
@@ -857,26 +904,25 @@
             </w:r>
           </w:hyperlink>
         </w:p>
-        <w:p>
+        <w:p xmlns:wp14="http://schemas.microsoft.com/office/word/2010/wordml" wp14:textId="77777777">
           <w:pPr>
             <w:pStyle w:val="TOC1"/>
             <w:tabs>
               <w:tab w:val="clear" w:pos="720"/>
-              <w:tab w:val="left" w:pos="440" w:leader="none"/>
-              <w:tab w:val="right" w:pos="9016" w:leader="dot"/>
+              <w:tab w:val="left" w:leader="none" w:pos="440"/>
+              <w:tab w:val="right" w:leader="dot" w:pos="9016"/>
             </w:tabs>
             <w:rPr>
-              <w:rFonts w:ascii="Aptos" w:hAnsi="Aptos" w:eastAsia="" w:asciiTheme="minorHAnsi" w:eastAsiaTheme="minorEastAsia" w:hAnsiTheme="minorHAnsi"/>
+              <w:rFonts w:ascii="Aptos" w:hAnsi="Aptos" w:eastAsia="" w:asciiTheme="minorHAnsi" w:hAnsiTheme="minorHAnsi" w:eastAsiaTheme="minorEastAsia"/>
               <w:sz w:val="24"/>
               <w:szCs w:val="24"/>
               <w:lang w:eastAsia="en-AU"/>
             </w:rPr>
           </w:pPr>
-          <w:hyperlink w:anchor="_Toc213146626">
-            <w:r>
-              <w:rPr>
-                <w:rStyle w:val="IndexLink"/>
-                <w:vanish w:val="false"/>
+          <w:hyperlink w:anchor="_Toc213418604">
+            <w:r>
+              <w:rPr>
+                <w:rStyle w:val="IndexLink"/>
                 <w:webHidden/>
               </w:rPr>
               <w:t>4</w:t>
@@ -884,7 +930,7 @@
             <w:r>
               <w:rPr>
                 <w:rStyle w:val="IndexLink"/>
-                <w:rFonts w:eastAsia="" w:ascii="Aptos" w:hAnsi="Aptos" w:asciiTheme="minorHAnsi" w:eastAsiaTheme="minorEastAsia" w:hAnsiTheme="minorHAnsi"/>
+                <w:rFonts w:ascii="Aptos" w:hAnsi="Aptos" w:eastAsia="" w:asciiTheme="minorHAnsi" w:hAnsiTheme="minorHAnsi" w:eastAsiaTheme="minorEastAsia"/>
                 <w:sz w:val="24"/>
                 <w:szCs w:val="24"/>
                 <w:lang w:eastAsia="en-AU"/>
@@ -907,7 +953,7 @@
               <w:rPr>
                 <w:webHidden/>
               </w:rPr>
-              <w:instrText xml:space="preserve">PAGEREF _Toc213146626 \h</w:instrText>
+              <w:instrText xml:space="preserve">PAGEREF _Toc213418604 \h</w:instrText>
             </w:r>
             <w:r>
               <w:rPr>
@@ -921,6 +967,12 @@
                 <w:vanish w:val="false"/>
               </w:rPr>
               <w:tab/>
+            </w:r>
+            <w:r>
+              <w:rPr>
+                <w:rStyle w:val="IndexLink"/>
+                <w:vanish w:val="false"/>
+              </w:rPr>
               <w:t>6</w:t>
             </w:r>
             <w:r>
@@ -931,26 +983,25 @@
             </w:r>
           </w:hyperlink>
         </w:p>
-        <w:p>
+        <w:p xmlns:wp14="http://schemas.microsoft.com/office/word/2010/wordml" wp14:textId="77777777">
           <w:pPr>
             <w:pStyle w:val="TOC1"/>
             <w:tabs>
               <w:tab w:val="clear" w:pos="720"/>
-              <w:tab w:val="left" w:pos="440" w:leader="none"/>
-              <w:tab w:val="right" w:pos="9016" w:leader="dot"/>
+              <w:tab w:val="left" w:leader="none" w:pos="440"/>
+              <w:tab w:val="right" w:leader="dot" w:pos="9016"/>
             </w:tabs>
             <w:rPr>
-              <w:rFonts w:ascii="Aptos" w:hAnsi="Aptos" w:eastAsia="" w:asciiTheme="minorHAnsi" w:eastAsiaTheme="minorEastAsia" w:hAnsiTheme="minorHAnsi"/>
+              <w:rFonts w:ascii="Aptos" w:hAnsi="Aptos" w:eastAsia="" w:asciiTheme="minorHAnsi" w:hAnsiTheme="minorHAnsi" w:eastAsiaTheme="minorEastAsia"/>
               <w:sz w:val="24"/>
               <w:szCs w:val="24"/>
               <w:lang w:eastAsia="en-AU"/>
             </w:rPr>
           </w:pPr>
-          <w:hyperlink w:anchor="_Toc213146627">
-            <w:r>
-              <w:rPr>
-                <w:rStyle w:val="IndexLink"/>
-                <w:vanish w:val="false"/>
+          <w:hyperlink w:anchor="_Toc213418605">
+            <w:r>
+              <w:rPr>
+                <w:rStyle w:val="IndexLink"/>
                 <w:webHidden/>
               </w:rPr>
               <w:t>5</w:t>
@@ -958,7 +1009,7 @@
             <w:r>
               <w:rPr>
                 <w:rStyle w:val="IndexLink"/>
-                <w:rFonts w:eastAsia="" w:ascii="Aptos" w:hAnsi="Aptos" w:asciiTheme="minorHAnsi" w:eastAsiaTheme="minorEastAsia" w:hAnsiTheme="minorHAnsi"/>
+                <w:rFonts w:ascii="Aptos" w:hAnsi="Aptos" w:eastAsia="" w:asciiTheme="minorHAnsi" w:hAnsiTheme="minorHAnsi" w:eastAsiaTheme="minorEastAsia"/>
                 <w:sz w:val="24"/>
                 <w:szCs w:val="24"/>
                 <w:lang w:eastAsia="en-AU"/>
@@ -981,7 +1032,7 @@
               <w:rPr>
                 <w:webHidden/>
               </w:rPr>
-              <w:instrText xml:space="preserve">PAGEREF _Toc213146627 \h</w:instrText>
+              <w:instrText xml:space="preserve">PAGEREF _Toc213418605 \h</w:instrText>
             </w:r>
             <w:r>
               <w:rPr>
@@ -995,6 +1046,12 @@
                 <w:vanish w:val="false"/>
               </w:rPr>
               <w:tab/>
+            </w:r>
+            <w:r>
+              <w:rPr>
+                <w:rStyle w:val="IndexLink"/>
+                <w:vanish w:val="false"/>
+              </w:rPr>
               <w:t>7</w:t>
             </w:r>
             <w:r>
@@ -1005,26 +1062,25 @@
             </w:r>
           </w:hyperlink>
         </w:p>
-        <w:p>
+        <w:p xmlns:wp14="http://schemas.microsoft.com/office/word/2010/wordml" wp14:textId="77777777">
           <w:pPr>
             <w:pStyle w:val="TOC1"/>
             <w:tabs>
               <w:tab w:val="clear" w:pos="720"/>
-              <w:tab w:val="left" w:pos="440" w:leader="none"/>
-              <w:tab w:val="right" w:pos="9016" w:leader="dot"/>
+              <w:tab w:val="left" w:leader="none" w:pos="440"/>
+              <w:tab w:val="right" w:leader="dot" w:pos="9016"/>
             </w:tabs>
             <w:rPr>
-              <w:rFonts w:ascii="Aptos" w:hAnsi="Aptos" w:eastAsia="" w:asciiTheme="minorHAnsi" w:eastAsiaTheme="minorEastAsia" w:hAnsiTheme="minorHAnsi"/>
+              <w:rFonts w:ascii="Aptos" w:hAnsi="Aptos" w:eastAsia="" w:asciiTheme="minorHAnsi" w:hAnsiTheme="minorHAnsi" w:eastAsiaTheme="minorEastAsia"/>
               <w:sz w:val="24"/>
               <w:szCs w:val="24"/>
               <w:lang w:eastAsia="en-AU"/>
             </w:rPr>
           </w:pPr>
-          <w:hyperlink w:anchor="_Toc213146628">
-            <w:r>
-              <w:rPr>
-                <w:rStyle w:val="IndexLink"/>
-                <w:vanish w:val="false"/>
+          <w:hyperlink w:anchor="_Toc213418606">
+            <w:r>
+              <w:rPr>
+                <w:rStyle w:val="IndexLink"/>
                 <w:webHidden/>
               </w:rPr>
               <w:t>6</w:t>
@@ -1032,7 +1088,7 @@
             <w:r>
               <w:rPr>
                 <w:rStyle w:val="IndexLink"/>
-                <w:rFonts w:eastAsia="" w:ascii="Aptos" w:hAnsi="Aptos" w:asciiTheme="minorHAnsi" w:eastAsiaTheme="minorEastAsia" w:hAnsiTheme="minorHAnsi"/>
+                <w:rFonts w:ascii="Aptos" w:hAnsi="Aptos" w:eastAsia="" w:asciiTheme="minorHAnsi" w:hAnsiTheme="minorHAnsi" w:eastAsiaTheme="minorEastAsia"/>
                 <w:sz w:val="24"/>
                 <w:szCs w:val="24"/>
                 <w:lang w:eastAsia="en-AU"/>
@@ -1055,7 +1111,7 @@
               <w:rPr>
                 <w:webHidden/>
               </w:rPr>
-              <w:instrText xml:space="preserve">PAGEREF _Toc213146628 \h</w:instrText>
+              <w:instrText xml:space="preserve">PAGEREF _Toc213418606 \h</w:instrText>
             </w:r>
             <w:r>
               <w:rPr>
@@ -1069,6 +1125,12 @@
                 <w:vanish w:val="false"/>
               </w:rPr>
               <w:tab/>
+            </w:r>
+            <w:r>
+              <w:rPr>
+                <w:rStyle w:val="IndexLink"/>
+                <w:vanish w:val="false"/>
+              </w:rPr>
               <w:t>8</w:t>
             </w:r>
             <w:r>
@@ -1079,26 +1141,25 @@
             </w:r>
           </w:hyperlink>
         </w:p>
-        <w:p>
+        <w:p xmlns:wp14="http://schemas.microsoft.com/office/word/2010/wordml" wp14:textId="77777777">
           <w:pPr>
             <w:pStyle w:val="TOC1"/>
             <w:tabs>
               <w:tab w:val="clear" w:pos="720"/>
-              <w:tab w:val="left" w:pos="440" w:leader="none"/>
-              <w:tab w:val="right" w:pos="9016" w:leader="dot"/>
+              <w:tab w:val="left" w:leader="none" w:pos="440"/>
+              <w:tab w:val="right" w:leader="dot" w:pos="9016"/>
             </w:tabs>
             <w:rPr>
-              <w:rFonts w:ascii="Aptos" w:hAnsi="Aptos" w:eastAsia="" w:asciiTheme="minorHAnsi" w:eastAsiaTheme="minorEastAsia" w:hAnsiTheme="minorHAnsi"/>
+              <w:rFonts w:ascii="Aptos" w:hAnsi="Aptos" w:eastAsia="" w:asciiTheme="minorHAnsi" w:hAnsiTheme="minorHAnsi" w:eastAsiaTheme="minorEastAsia"/>
               <w:sz w:val="24"/>
               <w:szCs w:val="24"/>
               <w:lang w:eastAsia="en-AU"/>
             </w:rPr>
           </w:pPr>
-          <w:hyperlink w:anchor="_Toc213146629">
-            <w:r>
-              <w:rPr>
-                <w:rStyle w:val="IndexLink"/>
-                <w:vanish w:val="false"/>
+          <w:hyperlink w:anchor="_Toc213418607">
+            <w:r>
+              <w:rPr>
+                <w:rStyle w:val="IndexLink"/>
                 <w:webHidden/>
               </w:rPr>
               <w:t>7</w:t>
@@ -1106,7 +1167,7 @@
             <w:r>
               <w:rPr>
                 <w:rStyle w:val="IndexLink"/>
-                <w:rFonts w:eastAsia="" w:ascii="Aptos" w:hAnsi="Aptos" w:asciiTheme="minorHAnsi" w:eastAsiaTheme="minorEastAsia" w:hAnsiTheme="minorHAnsi"/>
+                <w:rFonts w:ascii="Aptos" w:hAnsi="Aptos" w:eastAsia="" w:asciiTheme="minorHAnsi" w:hAnsiTheme="minorHAnsi" w:eastAsiaTheme="minorEastAsia"/>
                 <w:sz w:val="24"/>
                 <w:szCs w:val="24"/>
                 <w:lang w:eastAsia="en-AU"/>
@@ -1129,7 +1190,7 @@
               <w:rPr>
                 <w:webHidden/>
               </w:rPr>
-              <w:instrText xml:space="preserve">PAGEREF _Toc213146629 \h</w:instrText>
+              <w:instrText xml:space="preserve">PAGEREF _Toc213418607 \h</w:instrText>
             </w:r>
             <w:r>
               <w:rPr>
@@ -1143,6 +1204,12 @@
                 <w:vanish w:val="false"/>
               </w:rPr>
               <w:tab/>
+            </w:r>
+            <w:r>
+              <w:rPr>
+                <w:rStyle w:val="IndexLink"/>
+                <w:vanish w:val="false"/>
+              </w:rPr>
               <w:t>9</w:t>
             </w:r>
             <w:r>
@@ -1153,26 +1220,25 @@
             </w:r>
           </w:hyperlink>
         </w:p>
-        <w:p>
+        <w:p xmlns:wp14="http://schemas.microsoft.com/office/word/2010/wordml" wp14:textId="77777777">
           <w:pPr>
             <w:pStyle w:val="TOC1"/>
             <w:tabs>
               <w:tab w:val="clear" w:pos="720"/>
-              <w:tab w:val="left" w:pos="440" w:leader="none"/>
-              <w:tab w:val="right" w:pos="9016" w:leader="dot"/>
+              <w:tab w:val="left" w:leader="none" w:pos="440"/>
+              <w:tab w:val="right" w:leader="dot" w:pos="9016"/>
             </w:tabs>
             <w:rPr>
-              <w:rFonts w:ascii="Aptos" w:hAnsi="Aptos" w:eastAsia="" w:asciiTheme="minorHAnsi" w:eastAsiaTheme="minorEastAsia" w:hAnsiTheme="minorHAnsi"/>
+              <w:rFonts w:ascii="Aptos" w:hAnsi="Aptos" w:eastAsia="" w:asciiTheme="minorHAnsi" w:hAnsiTheme="minorHAnsi" w:eastAsiaTheme="minorEastAsia"/>
               <w:sz w:val="24"/>
               <w:szCs w:val="24"/>
               <w:lang w:eastAsia="en-AU"/>
             </w:rPr>
           </w:pPr>
-          <w:hyperlink w:anchor="_Toc213146630">
-            <w:r>
-              <w:rPr>
-                <w:rStyle w:val="IndexLink"/>
-                <w:vanish w:val="false"/>
+          <w:hyperlink w:anchor="_Toc213418608">
+            <w:r>
+              <w:rPr>
+                <w:rStyle w:val="IndexLink"/>
                 <w:webHidden/>
               </w:rPr>
               <w:t>8</w:t>
@@ -1180,7 +1246,7 @@
             <w:r>
               <w:rPr>
                 <w:rStyle w:val="IndexLink"/>
-                <w:rFonts w:eastAsia="" w:ascii="Aptos" w:hAnsi="Aptos" w:asciiTheme="minorHAnsi" w:eastAsiaTheme="minorEastAsia" w:hAnsiTheme="minorHAnsi"/>
+                <w:rFonts w:ascii="Aptos" w:hAnsi="Aptos" w:eastAsia="" w:asciiTheme="minorHAnsi" w:hAnsiTheme="minorHAnsi" w:eastAsiaTheme="minorEastAsia"/>
                 <w:sz w:val="24"/>
                 <w:szCs w:val="24"/>
                 <w:lang w:eastAsia="en-AU"/>
@@ -1203,7 +1269,7 @@
               <w:rPr>
                 <w:webHidden/>
               </w:rPr>
-              <w:instrText xml:space="preserve">PAGEREF _Toc213146630 \h</w:instrText>
+              <w:instrText xml:space="preserve">PAGEREF _Toc213418608 \h</w:instrText>
             </w:r>
             <w:r>
               <w:rPr>
@@ -1217,6 +1283,12 @@
                 <w:vanish w:val="false"/>
               </w:rPr>
               <w:tab/>
+            </w:r>
+            <w:r>
+              <w:rPr>
+                <w:rStyle w:val="IndexLink"/>
+                <w:vanish w:val="false"/>
+              </w:rPr>
               <w:t>10</w:t>
             </w:r>
             <w:r>
@@ -1227,26 +1299,25 @@
             </w:r>
           </w:hyperlink>
         </w:p>
-        <w:p>
+        <w:p xmlns:wp14="http://schemas.microsoft.com/office/word/2010/wordml" wp14:textId="77777777">
           <w:pPr>
             <w:pStyle w:val="TOC1"/>
             <w:tabs>
               <w:tab w:val="clear" w:pos="720"/>
-              <w:tab w:val="left" w:pos="440" w:leader="none"/>
-              <w:tab w:val="right" w:pos="9016" w:leader="dot"/>
+              <w:tab w:val="left" w:leader="none" w:pos="440"/>
+              <w:tab w:val="right" w:leader="dot" w:pos="9016"/>
             </w:tabs>
             <w:rPr>
-              <w:rFonts w:ascii="Aptos" w:hAnsi="Aptos" w:eastAsia="" w:asciiTheme="minorHAnsi" w:eastAsiaTheme="minorEastAsia" w:hAnsiTheme="minorHAnsi"/>
+              <w:rFonts w:ascii="Aptos" w:hAnsi="Aptos" w:eastAsia="" w:asciiTheme="minorHAnsi" w:hAnsiTheme="minorHAnsi" w:eastAsiaTheme="minorEastAsia"/>
               <w:sz w:val="24"/>
               <w:szCs w:val="24"/>
               <w:lang w:eastAsia="en-AU"/>
             </w:rPr>
           </w:pPr>
-          <w:hyperlink w:anchor="_Toc213146631">
-            <w:r>
-              <w:rPr>
-                <w:rStyle w:val="IndexLink"/>
-                <w:vanish w:val="false"/>
+          <w:hyperlink w:anchor="_Toc213418609">
+            <w:r>
+              <w:rPr>
+                <w:rStyle w:val="IndexLink"/>
                 <w:webHidden/>
               </w:rPr>
               <w:t>A</w:t>
@@ -1254,7 +1325,7 @@
             <w:r>
               <w:rPr>
                 <w:rStyle w:val="IndexLink"/>
-                <w:rFonts w:eastAsia="" w:ascii="Aptos" w:hAnsi="Aptos" w:asciiTheme="minorHAnsi" w:eastAsiaTheme="minorEastAsia" w:hAnsiTheme="minorHAnsi"/>
+                <w:rFonts w:ascii="Aptos" w:hAnsi="Aptos" w:eastAsia="" w:asciiTheme="minorHAnsi" w:hAnsiTheme="minorHAnsi" w:eastAsiaTheme="minorEastAsia"/>
                 <w:sz w:val="24"/>
                 <w:szCs w:val="24"/>
                 <w:lang w:eastAsia="en-AU"/>
@@ -1277,7 +1348,7 @@
               <w:rPr>
                 <w:webHidden/>
               </w:rPr>
-              <w:instrText xml:space="preserve">PAGEREF _Toc213146631 \h</w:instrText>
+              <w:instrText xml:space="preserve">PAGEREF _Toc213418609 \h</w:instrText>
             </w:r>
             <w:r>
               <w:rPr>
@@ -1291,6 +1362,12 @@
                 <w:vanish w:val="false"/>
               </w:rPr>
               <w:tab/>
+            </w:r>
+            <w:r>
+              <w:rPr>
+                <w:rStyle w:val="IndexLink"/>
+                <w:vanish w:val="false"/>
+              </w:rPr>
               <w:t>11</w:t>
             </w:r>
             <w:r>
@@ -1301,26 +1378,25 @@
             </w:r>
           </w:hyperlink>
         </w:p>
-        <w:p>
+        <w:p xmlns:wp14="http://schemas.microsoft.com/office/word/2010/wordml" wp14:textId="77777777">
           <w:pPr>
             <w:pStyle w:val="TOC1"/>
             <w:tabs>
               <w:tab w:val="clear" w:pos="720"/>
-              <w:tab w:val="left" w:pos="440" w:leader="none"/>
-              <w:tab w:val="right" w:pos="9016" w:leader="dot"/>
+              <w:tab w:val="left" w:leader="none" w:pos="440"/>
+              <w:tab w:val="right" w:leader="dot" w:pos="9016"/>
             </w:tabs>
             <w:rPr>
-              <w:rFonts w:ascii="Aptos" w:hAnsi="Aptos" w:eastAsia="" w:asciiTheme="minorHAnsi" w:eastAsiaTheme="minorEastAsia" w:hAnsiTheme="minorHAnsi"/>
+              <w:rFonts w:ascii="Aptos" w:hAnsi="Aptos" w:eastAsia="" w:asciiTheme="minorHAnsi" w:hAnsiTheme="minorHAnsi" w:eastAsiaTheme="minorEastAsia"/>
               <w:sz w:val="24"/>
               <w:szCs w:val="24"/>
               <w:lang w:eastAsia="en-AU"/>
             </w:rPr>
           </w:pPr>
-          <w:hyperlink w:anchor="_Toc213146632">
-            <w:r>
-              <w:rPr>
-                <w:rStyle w:val="IndexLink"/>
-                <w:vanish w:val="false"/>
+          <w:hyperlink w:anchor="_Toc213418610">
+            <w:r>
+              <w:rPr>
+                <w:rStyle w:val="IndexLink"/>
                 <w:webHidden/>
               </w:rPr>
               <w:t>B</w:t>
@@ -1328,7 +1404,7 @@
             <w:r>
               <w:rPr>
                 <w:rStyle w:val="IndexLink"/>
-                <w:rFonts w:eastAsia="" w:ascii="Aptos" w:hAnsi="Aptos" w:asciiTheme="minorHAnsi" w:eastAsiaTheme="minorEastAsia" w:hAnsiTheme="minorHAnsi"/>
+                <w:rFonts w:ascii="Aptos" w:hAnsi="Aptos" w:eastAsia="" w:asciiTheme="minorHAnsi" w:hAnsiTheme="minorHAnsi" w:eastAsiaTheme="minorEastAsia"/>
                 <w:sz w:val="24"/>
                 <w:szCs w:val="24"/>
                 <w:lang w:eastAsia="en-AU"/>
@@ -1351,7 +1427,7 @@
               <w:rPr>
                 <w:webHidden/>
               </w:rPr>
-              <w:instrText xml:space="preserve">PAGEREF _Toc213146632 \h</w:instrText>
+              <w:instrText xml:space="preserve">PAGEREF _Toc213418610 \h</w:instrText>
             </w:r>
             <w:r>
               <w:rPr>
@@ -1365,6 +1441,12 @@
                 <w:vanish w:val="false"/>
               </w:rPr>
               <w:tab/>
+            </w:r>
+            <w:r>
+              <w:rPr>
+                <w:rStyle w:val="IndexLink"/>
+                <w:vanish w:val="false"/>
+              </w:rPr>
               <w:t>12</w:t>
             </w:r>
             <w:r>
@@ -1375,10 +1457,9 @@
             </w:r>
           </w:hyperlink>
         </w:p>
-        <w:p>
+        <w:p xmlns:wp14="http://schemas.microsoft.com/office/word/2010/wordml" wp14:textId="77777777">
           <w:pPr>
             <w:pStyle w:val="Normal"/>
-            <w:spacing w:before="0" w:after="160"/>
             <w:rPr/>
           </w:pPr>
           <w:r>
@@ -1389,37 +1470,44 @@
             <w:fldChar w:fldCharType="end"/>
           </w:r>
         </w:p>
-        <w:p>
-          <w:pPr>
-            <w:sectPr>
-              <w:footerReference w:type="even" r:id="rId8"/>
-              <w:footerReference w:type="default" r:id="rId9"/>
-              <w:footerReference w:type="first" r:id="rId10"/>
-              <w:type w:val="nextPage"/>
-              <w:pgSz w:w="11906" w:h="16838"/>
-              <w:pgMar w:left="1440" w:right="1440" w:gutter="0" w:header="0" w:top="1440" w:footer="708" w:bottom="1440"/>
-              <w:pgNumType w:start="1" w:fmt="decimal"/>
-              <w:formProt w:val="false"/>
-              <w:textDirection w:val="lrTb"/>
-              <w:docGrid w:type="default" w:linePitch="360" w:charSpace="0"/>
-            </w:sectPr>
-          </w:pPr>
-        </w:p>
       </w:sdtContent>
     </w:sdt>
-    <w:p>
+    <w:p xmlns:wp14="http://schemas.microsoft.com/office/word/2010/wordml" wp14:textId="77777777">
+      <w:pPr>
+        <w:pStyle w:val="Normal"/>
+        <w:spacing w:before="0" w:after="160"/>
+        <w:rPr/>
+        <w:sectPr>
+          <w:footerReference w:type="even" r:id="rId8"/>
+          <w:footerReference w:type="default" r:id="rId9"/>
+          <w:footerReference w:type="first" r:id="rId10"/>
+          <w:type w:val="nextPage"/>
+          <w:pgSz w:w="11906" w:h="16838" w:orient="portrait"/>
+          <w:pgMar w:top="1440" w:right="1440" w:bottom="1440" w:left="1440" w:header="0" w:footer="708" w:gutter="0"/>
+          <w:pgNumType w:fmt="decimal" w:start="1"/>
+          <w:formProt w:val="false"/>
+          <w:textDirection w:val="lrTb"/>
+          <w:docGrid w:type="default" w:linePitch="360" w:charSpace="0"/>
+          <w:cols w:num="1"/>
+        </w:sectPr>
+      </w:pPr>
+      <w:r>
+        <w:rPr/>
+      </w:r>
+    </w:p>
+    <w:p xmlns:wp14="http://schemas.microsoft.com/office/word/2010/wordml" wp14:textId="77777777">
       <w:pPr>
         <w:pStyle w:val="Heading1"/>
         <w:rPr/>
       </w:pPr>
-      <w:bookmarkStart w:id="0" w:name="_Toc213146620"/>
+      <w:bookmarkStart w:name="_Toc213418598" w:id="0"/>
       <w:r>
         <w:rPr/>
         <w:t>Executive Summary</w:t>
       </w:r>
       <w:bookmarkEnd w:id="0"/>
     </w:p>
-    <w:p>
+    <w:p xmlns:wp14="http://schemas.microsoft.com/office/word/2010/wordml" wp14:textId="77777777">
       <w:pPr>
         <w:pStyle w:val="Normal"/>
         <w:rPr/>
@@ -1429,7 +1517,16 @@
         <w:t>Executive summary goes here. Summarise the work that was provided by AAGI and the main results. (Try to limit this to a single page.)</w:t>
       </w:r>
     </w:p>
-    <w:p>
+    <w:p xmlns:wp14="http://schemas.microsoft.com/office/word/2010/wordml" wp14:textId="77777777">
+      <w:pPr>
+        <w:pStyle w:val="Normal"/>
+        <w:rPr/>
+      </w:pPr>
+      <w:r>
+        <w:rPr/>
+      </w:r>
+    </w:p>
+    <w:p xmlns:wp14="http://schemas.microsoft.com/office/word/2010/wordml" wp14:textId="77777777">
       <w:pPr>
         <w:pStyle w:val="Normal"/>
         <w:spacing w:before="0" w:after="160"/>
@@ -1442,19 +1539,20 @@
           <w:footerReference w:type="default" r:id="rId15"/>
           <w:footerReference w:type="first" r:id="rId16"/>
           <w:type w:val="nextPage"/>
-          <w:pgSz w:w="11906" w:h="16838"/>
-          <w:pgMar w:left="1440" w:right="1440" w:gutter="0" w:header="708" w:top="1440" w:footer="708" w:bottom="1440"/>
+          <w:pgSz w:w="11906" w:h="16838" w:orient="portrait"/>
+          <w:pgMar w:top="1440" w:right="1440" w:bottom="1440" w:left="1440" w:header="708" w:footer="708" w:gutter="0"/>
           <w:pgNumType w:fmt="decimal"/>
           <w:formProt w:val="false"/>
           <w:textDirection w:val="lrTb"/>
           <w:docGrid w:type="default" w:linePitch="360" w:charSpace="0"/>
+          <w:cols w:num="1"/>
         </w:sectPr>
       </w:pPr>
       <w:r>
         <w:rPr/>
       </w:r>
     </w:p>
-    <w:p>
+    <w:p xmlns:wp14="http://schemas.microsoft.com/office/word/2010/wordml" wp14:textId="77777777">
       <w:pPr>
         <w:pStyle w:val="Heading1"/>
         <w:numPr>
@@ -1463,14 +1561,14 @@
         </w:numPr>
         <w:rPr/>
       </w:pPr>
-      <w:bookmarkStart w:id="1" w:name="_Toc213146621"/>
+      <w:bookmarkStart w:name="_Toc213418599" w:id="1"/>
       <w:r>
         <w:rPr/>
         <w:t>Introduction</w:t>
       </w:r>
       <w:bookmarkEnd w:id="1"/>
     </w:p>
-    <w:p>
+    <w:p xmlns:wp14="http://schemas.microsoft.com/office/word/2010/wordml" wp14:textId="77777777">
       <w:pPr>
         <w:pStyle w:val="Normal"/>
         <w:rPr/>
@@ -1480,7 +1578,7 @@
         <w:t xml:space="preserve">The report body text goes here. </w:t>
       </w:r>
     </w:p>
-    <w:p>
+    <w:p xmlns:wp14="http://schemas.microsoft.com/office/word/2010/wordml" wp14:textId="77777777">
       <w:pPr>
         <w:pStyle w:val="Normal"/>
         <w:rPr/>
@@ -1490,7 +1588,7 @@
         <w:t>Note that the following section titles are provided as a guide, but feel free to modify them in any way that you like if they are not relevant to your work or if using a different set of titles enhances the readability of your report.</w:t>
       </w:r>
     </w:p>
-    <w:p>
+    <w:p xmlns:wp14="http://schemas.microsoft.com/office/word/2010/wordml" wp14:textId="77777777">
       <w:pPr>
         <w:pStyle w:val="Normal"/>
         <w:rPr/>
@@ -1530,7 +1628,782 @@
         <w:t>).</w:t>
       </w:r>
     </w:p>
-    <w:p>
+    <w:p xmlns:wp14="http://schemas.microsoft.com/office/word/2010/wordml" wp14:textId="77777777">
+      <w:pPr>
+        <w:pStyle w:val="Normal"/>
+        <w:rPr/>
+      </w:pPr>
+      <w:r>
+        <w:rPr/>
+        <w:t xml:space="preserve">Use the built-in Word Citation manager to handle parenthetical citations, e.g., </w:t>
+      </w:r>
+      <w:sdt>
+        <w:sdtPr>
+          <w:id w:val="1360608322"/>
+          <w:citation/>
+        </w:sdtPr>
+        <w:sdtContent>
+          <w:r>
+            <w:rPr/>
+            <w:fldChar w:fldCharType="begin"/>
+          </w:r>
+          <w:r>
+            <w:rPr/>
+            <w:instrText xml:space="preserve"> CITATION Per24 \l 3081 </w:instrText>
+          </w:r>
+          <w:r>
+            <w:rPr/>
+            <w:fldChar w:fldCharType="separate"/>
+          </w:r>
+          <w:r>
+            <w:rPr/>
+            <w:t>(Person, 2024)</w:t>
+          </w:r>
+          <w:r>
+            <w:rPr/>
+            <w:fldChar w:fldCharType="end"/>
+          </w:r>
+        </w:sdtContent>
+      </w:sdt>
+      <w:r>
+        <w:rPr/>
+        <w:t xml:space="preserve">, and in-text citations, e.g., Person </w:t>
+      </w:r>
+      <w:sdt>
+        <w:sdtPr>
+          <w:id w:val="2077282405"/>
+          <w:citation/>
+        </w:sdtPr>
+        <w:sdtContent>
+          <w:r>
+            <w:rPr/>
+            <w:fldChar w:fldCharType="begin"/>
+          </w:r>
+          <w:r>
+            <w:rPr/>
+            <w:instrText xml:space="preserve">CITATION Per24 \n  \t  \l 3081 </w:instrText>
+          </w:r>
+          <w:r>
+            <w:rPr/>
+            <w:fldChar w:fldCharType="separate"/>
+          </w:r>
+          <w:r>
+            <w:rPr/>
+            <w:t>(2024)</w:t>
+          </w:r>
+          <w:r>
+            <w:rPr/>
+            <w:fldChar w:fldCharType="end"/>
+          </w:r>
+        </w:sdtContent>
+      </w:sdt>
+      <w:r>
+        <w:rPr/>
+        <w:t>.</w:t>
+      </w:r>
+    </w:p>
+    <w:p xmlns:wp14="http://schemas.microsoft.com/office/word/2010/wordml" wp14:textId="77777777">
+      <w:pPr>
+        <w:pStyle w:val="Normal"/>
+        <w:rPr/>
+      </w:pPr>
+      <w:r>
+        <w:rPr/>
+        <w:t xml:space="preserve">A simple AAGI-themed table is the default new table created (via Insert → Table in the top ribbon), as shown in </w:t>
+      </w:r>
+      <w:r>
+        <w:rPr/>
+        <w:fldChar w:fldCharType="begin"/>
+      </w:r>
+      <w:r>
+        <w:rPr/>
+        <w:instrText xml:space="preserve"> REF _Ref213411494 \h </w:instrText>
+      </w:r>
+      <w:r>
+        <w:rPr/>
+        <w:fldChar w:fldCharType="separate"/>
+      </w:r>
+      <w:r>
+        <w:rPr/>
+        <w:t>Table 1</w:t>
+      </w:r>
+      <w:r>
+        <w:rPr/>
+        <w:fldChar w:fldCharType="end"/>
+      </w:r>
+      <w:r>
+        <w:rPr/>
+        <w:t>.</w:t>
+      </w:r>
+    </w:p>
+    <w:p xmlns:wp14="http://schemas.microsoft.com/office/word/2010/wordml" wp14:textId="77777777">
+      <w:pPr>
+        <w:pStyle w:val="Caption"/>
+        <w:jc w:val="center"/>
+        <w:rPr/>
+      </w:pPr>
+      <w:bookmarkStart w:name="_Ref213411494" w:id="2"/>
+      <w:r>
+        <w:rPr>
+          <w:color w:val="00808B"/>
+        </w:rPr>
+        <w:t xml:space="preserve">Table </w:t>
+      </w:r>
+      <w:r>
+        <w:rPr>
+          <w:color w:val="00808B"/>
+        </w:rPr>
+        <w:fldChar w:fldCharType="begin"/>
+      </w:r>
+      <w:r>
+        <w:rPr>
+          <w:color w:val="00808B"/>
+        </w:rPr>
+        <w:instrText xml:space="preserve"> SEQ Table \* ARABIC </w:instrText>
+      </w:r>
+      <w:r>
+        <w:rPr>
+          <w:color w:val="00808B"/>
+        </w:rPr>
+        <w:fldChar w:fldCharType="separate"/>
+      </w:r>
+      <w:r>
+        <w:rPr>
+          <w:color w:val="00808B"/>
+        </w:rPr>
+        <w:t>1</w:t>
+      </w:r>
+      <w:r>
+        <w:rPr>
+          <w:color w:val="00808B"/>
+        </w:rPr>
+        <w:fldChar w:fldCharType="end"/>
+      </w:r>
+      <w:bookmarkEnd w:id="2"/>
+      <w:r>
+        <w:rPr>
+          <w:color w:val="auto"/>
+        </w:rPr>
+        <w:t>:</w:t>
+      </w:r>
+      <w:r>
+        <w:rPr/>
+        <w:t xml:space="preserve"> An AAGI-themed table.</w:t>
+      </w:r>
+    </w:p>
+    <w:tbl>
+      <w:tblPr>
+        <w:tblStyle w:val="AAGITableStyle"/>
+        <w:tblW w:w="9016" w:type="dxa"/>
+        <w:jc w:val="start"/>
+        <w:tblInd w:w="0" w:type="dxa"/>
+        <w:tblLayout w:type="fixed"/>
+        <w:tblCellMar>
+          <w:top w:w="0" w:type="dxa"/>
+          <w:start w:w="108" w:type="dxa"/>
+          <w:bottom w:w="0" w:type="dxa"/>
+          <w:end w:w="108" w:type="dxa"/>
+        </w:tblCellMar>
+        <w:tblLook w:val="04a0" w:firstRow="1" w:lastRow="0" w:firstColumn="1" w:lastColumn="0" w:noHBand="0" w:noVBand="1"/>
+      </w:tblPr>
+      <w:tblGrid>
+        <w:gridCol w:w="4508"/>
+        <w:gridCol w:w="4508"/>
+      </w:tblGrid>
+      <w:tr xmlns:wp14="http://schemas.microsoft.com/office/word/2010/wordml" wp14:textId="77777777">
+        <w:trPr>
+          <w:cnfStyle w:val="100000000000" w:firstRow="1" w:lastRow="0" w:firstColumn="0" w:lastColumn="0" w:oddVBand="0" w:evenVBand="0" w:oddHBand="0" w:evenHBand="0" w:firstRowFirstColumn="0" w:firstRowLastColumn="0" w:lastRowFirstColumn="0" w:lastRowLastColumn="0"/>
+        </w:trPr>
+        <w:tc>
+          <w:tcPr>
+            <w:tcW w:w="4508" w:type="dxa"/>
+            <w:tcBorders/>
+            <w:shd w:val="clear" w:color="auto" w:fill="00808B"/>
+          </w:tcPr>
+          <w:p wp14:textId="77777777">
+            <w:pPr>
+              <w:pStyle w:val="Normal"/>
+              <w:widowControl/>
+              <w:spacing w:before="0" w:after="0" w:line="240" w:lineRule="auto"/>
+              <w:jc w:val="start"/>
+              <w:rPr>
+                <w:rFonts w:eastAsia="Aptos" w:cs=""/>
+                <w:color w:val="FFFFFF" w:themeColor="background1"/>
+                <w:kern w:val="2"/>
+                <w:sz w:val="22"/>
+                <w:szCs w:val="22"/>
+                <w:lang w:val="en-AU" w:eastAsia="en-US" w:bidi="ar-SA"/>
+              </w:rPr>
+            </w:pPr>
+            <w:r>
+              <w:rPr>
+                <w:rFonts w:eastAsia="Aptos" w:cs=""/>
+                <w:color w:val="FFFFFF" w:themeColor="background1"/>
+                <w:kern w:val="2"/>
+                <w:sz w:val="22"/>
+                <w:szCs w:val="22"/>
+                <w:lang w:val="en-AU" w:eastAsia="en-US" w:bidi="ar-SA"/>
+              </w:rPr>
+              <w:t>Table Heading</w:t>
+            </w:r>
+          </w:p>
+        </w:tc>
+        <w:tc>
+          <w:tcPr>
+            <w:tcW w:w="4508" w:type="dxa"/>
+            <w:tcBorders/>
+            <w:shd w:val="clear" w:color="auto" w:fill="00808B"/>
+          </w:tcPr>
+          <w:p wp14:textId="77777777">
+            <w:pPr>
+              <w:pStyle w:val="Normal"/>
+              <w:widowControl/>
+              <w:spacing w:before="0" w:after="0" w:line="240" w:lineRule="auto"/>
+              <w:jc w:val="start"/>
+              <w:rPr>
+                <w:rFonts w:eastAsia="Aptos" w:cs=""/>
+                <w:color w:val="FFFFFF" w:themeColor="background1"/>
+                <w:kern w:val="2"/>
+                <w:sz w:val="22"/>
+                <w:szCs w:val="22"/>
+                <w:lang w:val="en-AU" w:eastAsia="en-US" w:bidi="ar-SA"/>
+              </w:rPr>
+            </w:pPr>
+            <w:r>
+              <w:rPr>
+                <w:rFonts w:eastAsia="Aptos" w:cs=""/>
+                <w:color w:val="FFFFFF" w:themeColor="background1"/>
+                <w:kern w:val="2"/>
+                <w:sz w:val="22"/>
+                <w:szCs w:val="22"/>
+                <w:lang w:val="en-AU" w:eastAsia="en-US" w:bidi="ar-SA"/>
+              </w:rPr>
+              <w:t>Next Heading</w:t>
+            </w:r>
+          </w:p>
+        </w:tc>
+      </w:tr>
+      <w:tr xmlns:wp14="http://schemas.microsoft.com/office/word/2010/wordml" wp14:textId="77777777">
+        <w:trPr/>
+        <w:tc>
+          <w:tcPr>
+            <w:tcW w:w="4508" w:type="dxa"/>
+            <w:tcBorders/>
+          </w:tcPr>
+          <w:p wp14:textId="77777777">
+            <w:pPr>
+              <w:pStyle w:val="Normal"/>
+              <w:widowControl/>
+              <w:spacing w:before="0" w:after="0" w:line="240" w:lineRule="auto"/>
+              <w:jc w:val="start"/>
+              <w:rPr>
+                <w:rFonts w:eastAsia="Aptos" w:cs=""/>
+                <w:color w:val="000000" w:themeColor="text1"/>
+                <w:kern w:val="2"/>
+                <w:sz w:val="22"/>
+                <w:szCs w:val="22"/>
+                <w:lang w:val="en-AU" w:eastAsia="en-US" w:bidi="ar-SA"/>
+              </w:rPr>
+            </w:pPr>
+            <w:r>
+              <w:rPr>
+                <w:rFonts w:eastAsia="Aptos" w:cs=""/>
+                <w:color w:val="000000" w:themeColor="text1"/>
+                <w:kern w:val="2"/>
+                <w:sz w:val="22"/>
+                <w:szCs w:val="22"/>
+                <w:lang w:val="en-AU" w:eastAsia="en-US" w:bidi="ar-SA"/>
+              </w:rPr>
+              <w:t>blah</w:t>
+            </w:r>
+          </w:p>
+        </w:tc>
+        <w:tc>
+          <w:tcPr>
+            <w:tcW w:w="4508" w:type="dxa"/>
+            <w:tcBorders/>
+          </w:tcPr>
+          <w:p wp14:textId="77777777">
+            <w:pPr>
+              <w:pStyle w:val="Normal"/>
+              <w:widowControl/>
+              <w:spacing w:before="0" w:after="0" w:line="240" w:lineRule="auto"/>
+              <w:jc w:val="start"/>
+              <w:rPr>
+                <w:rFonts w:eastAsia="Aptos" w:cs=""/>
+                <w:color w:val="000000" w:themeColor="text1"/>
+                <w:kern w:val="2"/>
+                <w:sz w:val="22"/>
+                <w:szCs w:val="22"/>
+                <w:lang w:val="en-AU" w:eastAsia="en-US" w:bidi="ar-SA"/>
+              </w:rPr>
+            </w:pPr>
+            <w:r>
+              <w:rPr>
+                <w:rFonts w:eastAsia="Aptos" w:cs=""/>
+                <w:color w:val="000000" w:themeColor="text1"/>
+                <w:kern w:val="2"/>
+                <w:sz w:val="22"/>
+                <w:szCs w:val="22"/>
+                <w:lang w:val="en-AU" w:eastAsia="en-US" w:bidi="ar-SA"/>
+              </w:rPr>
+              <w:t>3</w:t>
+            </w:r>
+          </w:p>
+        </w:tc>
+      </w:tr>
+      <w:tr xmlns:wp14="http://schemas.microsoft.com/office/word/2010/wordml" wp14:textId="77777777">
+        <w:trPr/>
+        <w:tc>
+          <w:tcPr>
+            <w:tcW w:w="4508" w:type="dxa"/>
+            <w:tcBorders/>
+          </w:tcPr>
+          <w:p wp14:textId="77777777">
+            <w:pPr>
+              <w:pStyle w:val="Normal"/>
+              <w:widowControl/>
+              <w:spacing w:before="0" w:after="0" w:line="240" w:lineRule="auto"/>
+              <w:jc w:val="start"/>
+              <w:rPr>
+                <w:rFonts w:eastAsia="Aptos" w:cs=""/>
+                <w:color w:val="000000" w:themeColor="text1"/>
+                <w:kern w:val="2"/>
+                <w:sz w:val="22"/>
+                <w:szCs w:val="22"/>
+                <w:lang w:val="en-AU" w:eastAsia="en-US" w:bidi="ar-SA"/>
+              </w:rPr>
+            </w:pPr>
+            <w:r>
+              <w:rPr>
+                <w:rFonts w:eastAsia="Aptos" w:cs=""/>
+                <w:color w:val="000000" w:themeColor="text1"/>
+                <w:kern w:val="2"/>
+                <w:sz w:val="22"/>
+                <w:szCs w:val="22"/>
+                <w:lang w:val="en-AU" w:eastAsia="en-US" w:bidi="ar-SA"/>
+              </w:rPr>
+            </w:r>
+          </w:p>
+        </w:tc>
+        <w:tc>
+          <w:tcPr>
+            <w:tcW w:w="4508" w:type="dxa"/>
+            <w:tcBorders/>
+          </w:tcPr>
+          <w:p wp14:textId="77777777">
+            <w:pPr>
+              <w:pStyle w:val="Normal"/>
+              <w:widowControl/>
+              <w:spacing w:before="0" w:after="0" w:line="240" w:lineRule="auto"/>
+              <w:jc w:val="start"/>
+              <w:rPr>
+                <w:rFonts w:eastAsia="Aptos" w:cs=""/>
+                <w:color w:val="000000" w:themeColor="text1"/>
+                <w:kern w:val="2"/>
+                <w:sz w:val="22"/>
+                <w:szCs w:val="22"/>
+                <w:lang w:val="en-AU" w:eastAsia="en-US" w:bidi="ar-SA"/>
+              </w:rPr>
+            </w:pPr>
+            <w:r>
+              <w:rPr>
+                <w:rFonts w:eastAsia="Aptos" w:cs=""/>
+                <w:color w:val="000000" w:themeColor="text1"/>
+                <w:kern w:val="2"/>
+                <w:sz w:val="22"/>
+                <w:szCs w:val="22"/>
+                <w:lang w:val="en-AU" w:eastAsia="en-US" w:bidi="ar-SA"/>
+              </w:rPr>
+            </w:r>
+          </w:p>
+        </w:tc>
+      </w:tr>
+    </w:tbl>
+    <w:p xmlns:wp14="http://schemas.microsoft.com/office/word/2010/wordml" wp14:textId="77777777">
+      <w:pPr>
+        <w:pStyle w:val="Normal"/>
+        <w:rPr/>
+      </w:pPr>
+      <w:r>
+        <w:rPr/>
+      </w:r>
+    </w:p>
+    <w:p xmlns:wp14="http://schemas.microsoft.com/office/word/2010/wordml" wp14:textId="77777777">
+      <w:pPr>
+        <w:pStyle w:val="Normal"/>
+        <w:rPr/>
+      </w:pPr>
+      <w:r>
+        <w:rPr/>
+        <w:t>You can use the following shape template for emphatic notes throughout the report if you like:</w:t>
+      </w:r>
+    </w:p>
+    <w:p xmlns:wp14="http://schemas.microsoft.com/office/word/2010/wordml" wp14:textId="77777777">
+      <w:pPr>
+        <w:pStyle w:val="Normal"/>
+        <w:rPr/>
+      </w:pPr>
+      <w:r>
+        <w:rPr/>
+        <mc:AlternateContent>
+          <mc:Choice Requires="wpg">
+            <w:drawing>
+              <wp:inline xmlns:wp14="http://schemas.microsoft.com/office/word/2010/wordprocessingDrawing" distT="0" distB="0" distL="0" distR="0" wp14:anchorId="1FA85554" wp14:editId="7777777">
+                <wp:extent cx="5731510" cy="829310"/>
+                <wp:effectExtent l="0" t="0" r="2540" b="8890"/>
+                <wp:docPr id="3" name="Group 1"/>
+                <a:graphic xmlns:a="http://schemas.openxmlformats.org/drawingml/2006/main">
+                  <a:graphicData uri="http://schemas.microsoft.com/office/word/2010/wordprocessingGroup">
+                    <wpg:wgp>
+                      <wpg:cNvGrpSpPr/>
+                      <wpg:grpSpPr>
+                        <a:xfrm>
+                          <a:off x="0" y="0"/>
+                          <a:ext cx="5731560" cy="829440"/>
+                          <a:chOff x="0" y="0"/>
+                          <a:chExt cx="5731560" cy="829440"/>
+                        </a:xfrm>
+                      </wpg:grpSpPr>
+                      <wps:wsp>
+                        <wps:cNvPr id="4" name="Rectangle 1"/>
+                        <wps:cNvSpPr/>
+                        <wps:spPr>
+                          <a:xfrm>
+                            <a:off x="0" y="0"/>
+                            <a:ext cx="5731560" cy="829440"/>
+                          </a:xfrm>
+                          <a:prstGeom prst="rect">
+                            <a:avLst/>
+                          </a:prstGeom>
+                          <a:solidFill>
+                            <a:srgbClr val="F2FCF9"/>
+                          </a:solidFill>
+                          <a:ln>
+                            <a:noFill/>
+                          </a:ln>
+                        </wps:spPr>
+                        <wps:style>
+                          <a:lnRef idx="2">
+                            <a:schemeClr val="accent1">
+                              <a:shade val="15000"/>
+                            </a:schemeClr>
+                          </a:lnRef>
+                          <a:fillRef idx="1">
+                            <a:schemeClr val="accent1"/>
+                          </a:fillRef>
+                          <a:effectRef idx="0">
+                            <a:schemeClr val="accent1"/>
+                          </a:effectRef>
+                          <a:fontRef idx="minor"/>
+                        </wps:style>
+                        <wps:bodyPr/>
+                      </wps:wsp>
+                      <pic:pic xmlns:pic="http://schemas.openxmlformats.org/drawingml/2006/picture">
+                        <pic:nvPicPr>
+                          <pic:cNvPr id="5" name="Graphic 2"/>
+                          <pic:cNvPicPr/>
+                        </pic:nvPicPr>
+                        <pic:blipFill>
+                          <a:blip r:embed="rId17">
+                            <a:extLst>
+                              <a:ext uri="{96DAC541-7B7A-43D3-8B79-37D633B846F1}">
+                                <asvg:svgBlip xmlns:asvg="http://schemas.microsoft.com/office/drawing/2016/SVG/main" r:embed="rId18"/>
+                              </a:ext>
+                            </a:extLst>
+                          </a:blip>
+                          <a:stretch/>
+                        </pic:blipFill>
+                        <pic:spPr>
+                          <a:xfrm>
+                            <a:off x="95400" y="33120"/>
+                            <a:ext cx="233640" cy="233640"/>
+                          </a:xfrm>
+                          <a:prstGeom prst="rect">
+                            <a:avLst/>
+                          </a:prstGeom>
+                          <a:noFill/>
+                          <a:ln w="0">
+                            <a:noFill/>
+                          </a:ln>
+                        </pic:spPr>
+                      </pic:pic>
+                      <wps:wsp>
+                        <wps:cNvPr id="6" name="Rectangle 1"/>
+                        <wps:cNvSpPr/>
+                        <wps:spPr>
+                          <a:xfrm>
+                            <a:off x="5040" y="0"/>
+                            <a:ext cx="28080" cy="829440"/>
+                          </a:xfrm>
+                          <a:prstGeom prst="rect">
+                            <a:avLst/>
+                          </a:prstGeom>
+                          <a:solidFill>
+                            <a:srgbClr val="00808B"/>
+                          </a:solidFill>
+                          <a:ln>
+                            <a:noFill/>
+                          </a:ln>
+                        </wps:spPr>
+                        <wps:style>
+                          <a:lnRef idx="2">
+                            <a:schemeClr val="accent1">
+                              <a:shade val="15000"/>
+                            </a:schemeClr>
+                          </a:lnRef>
+                          <a:fillRef idx="1">
+                            <a:schemeClr val="accent1"/>
+                          </a:fillRef>
+                          <a:effectRef idx="0">
+                            <a:schemeClr val="accent1"/>
+                          </a:effectRef>
+                          <a:fontRef idx="minor"/>
+                        </wps:style>
+                        <wps:bodyPr/>
+                      </wps:wsp>
+                      <wps:wsp>
+                        <wps:cNvPr id="7" name="Text Box 2"/>
+                        <wps:cNvSpPr/>
+                        <wps:spPr>
+                          <a:xfrm>
+                            <a:off x="266760" y="28440"/>
+                            <a:ext cx="619920" cy="269280"/>
+                          </a:xfrm>
+                          <a:prstGeom prst="rect">
+                            <a:avLst/>
+                          </a:prstGeom>
+                          <a:noFill/>
+                          <a:ln w="9525">
+                            <a:noFill/>
+                          </a:ln>
+                        </wps:spPr>
+                        <wps:style>
+                          <a:lnRef idx="0"/>
+                          <a:fillRef idx="0"/>
+                          <a:effectRef idx="0"/>
+                          <a:fontRef idx="minor"/>
+                        </wps:style>
+                        <wps:txbx>
+                          <w:txbxContent>
+                            <w:p xmlns:wp14="http://schemas.microsoft.com/office/word/2010/wordml" wp14:textId="77777777">
+                              <w:pPr>
+                                <w:pStyle w:val="Normal"/>
+                                <w:spacing w:before="0" w:after="160"/>
+                                <w:rPr>
+                                  <w:b/>
+                                  <w:bCs/>
+                                  <w:color w:val="00808B"/>
+                                </w:rPr>
+                              </w:pPr>
+                              <w:r>
+                                <w:rPr>
+                                  <w:b/>
+                                  <w:bCs/>
+                                  <w:color w:val="00808B"/>
+                                </w:rPr>
+                                <w:t>NOTE</w:t>
+                              </w:r>
+                            </w:p>
+                          </w:txbxContent>
+                        </wps:txbx>
+                        <wps:bodyPr anchor="t">
+                          <a:noAutofit/>
+                        </wps:bodyPr>
+                      </wps:wsp>
+                      <wps:wsp>
+                        <wps:cNvPr id="8" name="Text Box 2"/>
+                        <wps:cNvSpPr/>
+                        <wps:spPr>
+                          <a:xfrm>
+                            <a:off x="95400" y="299880"/>
+                            <a:ext cx="5540400" cy="417960"/>
+                          </a:xfrm>
+                          <a:prstGeom prst="rect">
+                            <a:avLst/>
+                          </a:prstGeom>
+                          <a:noFill/>
+                          <a:ln w="9525">
+                            <a:noFill/>
+                          </a:ln>
+                        </wps:spPr>
+                        <wps:style>
+                          <a:lnRef idx="0"/>
+                          <a:fillRef idx="0"/>
+                          <a:effectRef idx="0"/>
+                          <a:fontRef idx="minor"/>
+                        </wps:style>
+                        <wps:txbx>
+                          <w:txbxContent>
+                            <w:p xmlns:wp14="http://schemas.microsoft.com/office/word/2010/wordml" wp14:textId="77777777">
+                              <w:pPr>
+                                <w:pStyle w:val="Normal"/>
+                                <w:widowControl/>
+                                <w:bidi w:val="0"/>
+                                <w:spacing w:before="0" w:after="160" w:line="259" w:lineRule="auto"/>
+                                <w:jc w:val="both"/>
+                                <w:rPr/>
+                              </w:pPr>
+                              <w:r>
+                                <w:rPr/>
+                                <w:t>This is an example of a note.</w:t>
+                              </w:r>
+                            </w:p>
+                          </w:txbxContent>
+                        </wps:txbx>
+                        <wps:bodyPr anchor="t">
+                          <a:noAutofit/>
+                        </wps:bodyPr>
+                      </wps:wsp>
+                      <wps:wsp>
+                        <wps:cNvPr id="9" name="Rectangle 1"/>
+                        <wps:cNvSpPr/>
+                        <wps:spPr>
+                          <a:xfrm>
+                            <a:off x="5702760" y="0"/>
+                            <a:ext cx="28080" cy="829440"/>
+                          </a:xfrm>
+                          <a:prstGeom prst="rect">
+                            <a:avLst/>
+                          </a:prstGeom>
+                          <a:solidFill>
+                            <a:srgbClr val="00808B"/>
+                          </a:solidFill>
+                          <a:ln>
+                            <a:noFill/>
+                          </a:ln>
+                        </wps:spPr>
+                        <wps:style>
+                          <a:lnRef idx="2">
+                            <a:schemeClr val="accent1">
+                              <a:shade val="15000"/>
+                            </a:schemeClr>
+                          </a:lnRef>
+                          <a:fillRef idx="1">
+                            <a:schemeClr val="accent1"/>
+                          </a:fillRef>
+                          <a:effectRef idx="0">
+                            <a:schemeClr val="accent1"/>
+                          </a:effectRef>
+                          <a:fontRef idx="minor"/>
+                        </wps:style>
+                        <wps:bodyPr/>
+                      </wps:wsp>
+                    </wpg:wgp>
+                  </a:graphicData>
+                </a:graphic>
+              </wp:inline>
+            </w:drawing>
+          </mc:Choice>
+          <mc:Fallback>
+            <w:pict w14:anchorId="11940D62">
+              <v:group id="shape_0" style="position:absolute;margin-left:0pt;margin-top:-66.05pt;width:451.3pt;height:65.3pt" alt="Group 1" coordsize="9026,1306" coordorigin="0,-1321">
+                <v:rect id="shape_0" style="position:absolute;left:0;top:-1321;width:9025;height:1305;mso-wrap-style:none;v-text-anchor:middle;mso-position-vertical:top" o:allowincell="f" fillcolor="#f2fcf9" stroked="f">
+                  <v:fill type="solid" color2="#0d0306" o:detectmouseclick="t"/>
+                  <v:stroke weight="12600" color="#3465a4" joinstyle="miter" endcap="flat"/>
+                  <w10:wrap type="square"/>
+                </v:rect>
+                <v:shapetype id="_x0000_t75" coordsize="21600,21600" filled="f" stroked="f" o:spt="75" o:preferrelative="t" path="m@4@5l@4@11@9@11@9@5xe">
+                  <v:stroke joinstyle="miter"/>
+                  <v:formulas>
+                    <v:f eqn="if lineDrawn pixelLineWidth 0"/>
+                    <v:f eqn="sum @0 1 0"/>
+                    <v:f eqn="sum 0 0 @1"/>
+                    <v:f eqn="prod @2 1 2"/>
+                    <v:f eqn="prod @3 21600 pixelWidth"/>
+                    <v:f eqn="prod @3 21600 pixelHeight"/>
+                    <v:f eqn="sum @0 0 1"/>
+                    <v:f eqn="prod @6 1 2"/>
+                    <v:f eqn="prod @7 21600 pixelWidth"/>
+                    <v:f eqn="sum @8 21600 0"/>
+                    <v:f eqn="prod @7 21600 pixelHeight"/>
+                    <v:f eqn="sum @10 21600 0"/>
+                  </v:formulas>
+                  <v:path gradientshapeok="t" o:connecttype="rect" o:extrusionok="f"/>
+                  <o:lock v:ext="edit" aspectratio="t"/>
+                </v:shapetype>
+                <v:shape id="shape_0" style="position:absolute;left:150;top:-1269;width:367;height:367;mso-wrap-style:none;v-text-anchor:middle;mso-position-vertical:top" o:allowincell="f" stroked="f" type="_x0000_t75">
+                  <v:imagedata o:detectmouseclick="t" r:id="rId19"/>
+                  <v:stroke color="#3465a4" joinstyle="round" endcap="flat"/>
+                  <w10:wrap type="square"/>
+                </v:shape>
+                <v:rect id="shape_0" style="position:absolute;left:8;top:-1321;width:43;height:1305;mso-wrap-style:none;v-text-anchor:middle;mso-position-vertical:top" o:allowincell="f" fillcolor="#00808b" stroked="f">
+                  <v:fill type="solid" color2="#ff7f74" o:detectmouseclick="t"/>
+                  <v:stroke weight="12600" color="#3465a4" joinstyle="miter" endcap="flat"/>
+                  <w10:wrap type="square"/>
+                </v:rect>
+                <v:rect id="shape_0" style="position:absolute;left:420;top:-1276;width:975;height:423;mso-wrap-style:square;v-text-anchor:top;mso-position-vertical:top" o:allowincell="f" stroked="f">
+                  <v:fill on="false" o:detectmouseclick="t"/>
+                  <v:stroke weight="9360" color="#3465a4" joinstyle="miter" endcap="flat"/>
+                  <v:textbox>
+                    <w:txbxContent>
+                      <w:p wp14:textId="77777777">
+                        <w:pPr>
+                          <w:pStyle w:val="Normal"/>
+                          <w:spacing w:before="0" w:after="160"/>
+                          <w:rPr>
+                            <w:b/>
+                            <w:bCs/>
+                            <w:color w:val="00808B"/>
+                          </w:rPr>
+                        </w:pPr>
+                        <w:r>
+                          <w:rPr>
+                            <w:b/>
+                            <w:bCs/>
+                            <w:color w:val="00808B"/>
+                          </w:rPr>
+                          <w:t>NOTE</w:t>
+                        </w:r>
+                      </w:p>
+                    </w:txbxContent>
+                  </v:textbox>
+                  <w10:wrap type="square"/>
+                </v:rect>
+                <v:rect id="shape_0" style="position:absolute;left:150;top:-849;width:8724;height:657;mso-wrap-style:square;v-text-anchor:top;mso-position-vertical:top" o:allowincell="f" stroked="f">
+                  <v:fill on="false" o:detectmouseclick="t"/>
+                  <v:stroke weight="9360" color="#3465a4" joinstyle="miter" endcap="flat"/>
+                  <v:textbox>
+                    <w:txbxContent>
+                      <w:p wp14:textId="77777777">
+                        <w:pPr>
+                          <w:pStyle w:val="Normal"/>
+                          <w:widowControl/>
+                          <w:bidi w:val="0"/>
+                          <w:spacing w:before="0" w:after="160" w:line="259" w:lineRule="auto"/>
+                          <w:jc w:val="both"/>
+                          <w:rPr/>
+                        </w:pPr>
+                        <w:r>
+                          <w:rPr/>
+                          <w:t>This is an example of a note.</w:t>
+                        </w:r>
+                      </w:p>
+                    </w:txbxContent>
+                  </v:textbox>
+                  <w10:wrap type="square"/>
+                </v:rect>
+                <v:rect id="shape_0" style="position:absolute;left:8981;top:-1321;width:43;height:1305;mso-wrap-style:none;v-text-anchor:middle;mso-position-vertical:top" o:allowincell="f" fillcolor="#00808b" stroked="f">
+                  <v:fill type="solid" color2="#ff7f74" o:detectmouseclick="t"/>
+                  <v:stroke weight="12600" color="#3465a4" joinstyle="miter" endcap="flat"/>
+                  <w10:wrap type="square"/>
+                </v:rect>
+              </v:group>
+            </w:pict>
+          </mc:Fallback>
+        </mc:AlternateContent>
+      </w:r>
+    </w:p>
+    <w:p xmlns:wp14="http://schemas.microsoft.com/office/word/2010/wordml" wp14:textId="77777777">
+      <w:pPr>
+        <w:pStyle w:val="Normal"/>
+        <w:rPr/>
+      </w:pPr>
+      <w:r>
+        <w:rPr/>
+      </w:r>
+    </w:p>
+    <w:p xmlns:wp14="http://schemas.microsoft.com/office/word/2010/wordml" wp14:textId="77777777">
       <w:pPr>
         <w:pStyle w:val="Normal"/>
         <w:rPr/>
@@ -1540,28 +2413,28 @@
         <w:t>In this Introduction section, outline the goals of the research project and any necessary background to provide contexts and rationale for the research/work.</w:t>
       </w:r>
     </w:p>
-    <w:p>
-      <w:pPr>
-        <w:pStyle w:val="Normal"/>
-        <w:rPr/>
-      </w:pPr>
-      <w:r>
-        <w:rPr/>
-      </w:r>
-    </w:p>
-    <w:p>
+    <w:p xmlns:wp14="http://schemas.microsoft.com/office/word/2010/wordml" wp14:textId="77777777">
+      <w:pPr>
+        <w:pStyle w:val="Normal"/>
+        <w:rPr/>
+      </w:pPr>
+      <w:r>
+        <w:rPr/>
+      </w:r>
+    </w:p>
+    <w:p xmlns:wp14="http://schemas.microsoft.com/office/word/2010/wordml" wp14:textId="77777777">
       <w:pPr>
         <w:pStyle w:val="Heading2"/>
         <w:rPr/>
       </w:pPr>
-      <w:bookmarkStart w:id="2" w:name="_Toc213146622"/>
+      <w:bookmarkStart w:name="_Toc213418600" w:id="3"/>
       <w:r>
         <w:rPr/>
         <w:t>This is a subsection</w:t>
       </w:r>
-      <w:bookmarkEnd w:id="2"/>
-    </w:p>
-    <w:p>
+      <w:bookmarkEnd w:id="3"/>
+    </w:p>
+    <w:p xmlns:wp14="http://schemas.microsoft.com/office/word/2010/wordml" wp14:textId="77777777">
       <w:pPr>
         <w:pStyle w:val="Normal"/>
         <w:rPr/>
@@ -1571,46 +2444,46 @@
         <w:t>Use subsections (and subsubsections) as much as you like to help structure your content.</w:t>
       </w:r>
     </w:p>
-    <w:p>
-      <w:pPr>
-        <w:pStyle w:val="Normal"/>
-        <w:rPr/>
-      </w:pPr>
-      <w:r>
-        <w:rPr/>
-      </w:r>
-    </w:p>
-    <w:p>
+    <w:p xmlns:wp14="http://schemas.microsoft.com/office/word/2010/wordml" wp14:textId="77777777">
+      <w:pPr>
+        <w:pStyle w:val="Normal"/>
+        <w:rPr/>
+      </w:pPr>
+      <w:r>
+        <w:rPr/>
+      </w:r>
+    </w:p>
+    <w:p xmlns:wp14="http://schemas.microsoft.com/office/word/2010/wordml" wp14:textId="77777777">
       <w:pPr>
         <w:pStyle w:val="Heading3"/>
         <w:rPr/>
       </w:pPr>
-      <w:bookmarkStart w:id="3" w:name="_Toc213146623"/>
+      <w:bookmarkStart w:name="_Toc213418601" w:id="4"/>
       <w:r>
         <w:rPr/>
         <w:t>This is a subsubsection</w:t>
       </w:r>
-      <w:bookmarkEnd w:id="3"/>
-    </w:p>
-    <w:p>
-      <w:pPr>
-        <w:pStyle w:val="Normal"/>
-        <w:rPr/>
-      </w:pPr>
-      <w:r>
-        <w:rPr/>
-      </w:r>
-    </w:p>
-    <w:p>
-      <w:pPr>
-        <w:pStyle w:val="Normal"/>
-        <w:rPr/>
-      </w:pPr>
-      <w:r>
-        <w:rPr/>
-      </w:r>
-    </w:p>
-    <w:p>
+      <w:bookmarkEnd w:id="4"/>
+    </w:p>
+    <w:p xmlns:wp14="http://schemas.microsoft.com/office/word/2010/wordml" wp14:textId="77777777">
+      <w:pPr>
+        <w:pStyle w:val="Normal"/>
+        <w:rPr/>
+      </w:pPr>
+      <w:r>
+        <w:rPr/>
+      </w:r>
+    </w:p>
+    <w:p xmlns:wp14="http://schemas.microsoft.com/office/word/2010/wordml" wp14:textId="77777777">
+      <w:pPr>
+        <w:pStyle w:val="Normal"/>
+        <w:rPr/>
+      </w:pPr>
+      <w:r>
+        <w:rPr/>
+      </w:r>
+    </w:p>
+    <w:p xmlns:wp14="http://schemas.microsoft.com/office/word/2010/wordml" wp14:textId="77777777">
       <w:pPr>
         <w:pStyle w:val="Normal"/>
         <w:rPr/>
@@ -1622,24 +2495,23 @@
         <w:br w:type="page"/>
       </w:r>
     </w:p>
-    <w:p>
+    <w:p xmlns:wp14="http://schemas.microsoft.com/office/word/2010/wordml" wp14:textId="77777777">
       <w:pPr>
         <w:pStyle w:val="Heading1"/>
         <w:numPr>
           <w:ilvl w:val="0"/>
           <w:numId w:val="1"/>
         </w:numPr>
-        <w:spacing w:before="0" w:after="80"/>
-        <w:rPr/>
-      </w:pPr>
-      <w:bookmarkStart w:id="4" w:name="_Toc213146624"/>
+        <w:rPr/>
+      </w:pPr>
+      <w:bookmarkStart w:name="_Toc213418602" w:id="5"/>
       <w:r>
         <w:rPr/>
         <w:t>Trial design</w:t>
       </w:r>
-      <w:bookmarkEnd w:id="4"/>
-    </w:p>
-    <w:p>
+      <w:bookmarkEnd w:id="5"/>
+    </w:p>
+    <w:p xmlns:wp14="http://schemas.microsoft.com/office/word/2010/wordml" wp14:textId="77777777">
       <w:pPr>
         <w:pStyle w:val="Normal"/>
         <w:rPr/>
@@ -1649,7 +2521,7 @@
         <w:t>Include the trial layout, type, and the experimental design, such as treatments, number of replicates, blocking, etc. Include graphics and pictures where useful.</w:t>
       </w:r>
     </w:p>
-    <w:p>
+    <w:p xmlns:wp14="http://schemas.microsoft.com/office/word/2010/wordml" wp14:textId="77777777">
       <w:pPr>
         <w:pStyle w:val="Normal"/>
         <w:rPr/>
@@ -1659,16 +2531,16 @@
         <w:t>Make sure to include notes about any specific considerations that must be kept in mind for the type of trial (e.g., small plots, glasshouse experiments, genetics, breeding trials, OFE projects, bioinformatics projects, and so on).</w:t>
       </w:r>
     </w:p>
-    <w:p>
-      <w:pPr>
-        <w:pStyle w:val="Normal"/>
-        <w:rPr/>
-      </w:pPr>
-      <w:r>
-        <w:rPr/>
-      </w:r>
-    </w:p>
-    <w:p>
+    <w:p xmlns:wp14="http://schemas.microsoft.com/office/word/2010/wordml" wp14:textId="77777777">
+      <w:pPr>
+        <w:pStyle w:val="Normal"/>
+        <w:rPr/>
+      </w:pPr>
+      <w:r>
+        <w:rPr/>
+      </w:r>
+    </w:p>
+    <w:p xmlns:wp14="http://schemas.microsoft.com/office/word/2010/wordml" wp14:textId="77777777">
       <w:pPr>
         <w:pStyle w:val="Normal"/>
         <w:rPr/>
@@ -1680,24 +2552,23 @@
         <w:br w:type="page"/>
       </w:r>
     </w:p>
-    <w:p>
+    <w:p xmlns:wp14="http://schemas.microsoft.com/office/word/2010/wordml" wp14:textId="77777777">
       <w:pPr>
         <w:pStyle w:val="Heading1"/>
         <w:numPr>
           <w:ilvl w:val="0"/>
           <w:numId w:val="1"/>
         </w:numPr>
-        <w:spacing w:before="0" w:after="80"/>
-        <w:rPr/>
-      </w:pPr>
-      <w:bookmarkStart w:id="5" w:name="_Toc213146625"/>
+        <w:rPr/>
+      </w:pPr>
+      <w:bookmarkStart w:name="_Toc213418603" w:id="6"/>
       <w:r>
         <w:rPr/>
         <w:t>Exploratory data analysis</w:t>
       </w:r>
-      <w:bookmarkEnd w:id="5"/>
-    </w:p>
-    <w:p>
+      <w:bookmarkEnd w:id="6"/>
+    </w:p>
+    <w:p xmlns:wp14="http://schemas.microsoft.com/office/word/2010/wordml" wp14:textId="77777777">
       <w:pPr>
         <w:pStyle w:val="Normal"/>
         <w:rPr/>
@@ -1707,16 +2578,16 @@
         <w:t>You can use a dedicated section here for the preliminary data exploration and dataset visualisation. This can be useful to aid in the interpretation of the data and graphs generated throughout the work, as well as for providing a rationale for the statistical methodologies used.</w:t>
       </w:r>
     </w:p>
-    <w:p>
-      <w:pPr>
-        <w:pStyle w:val="Normal"/>
-        <w:rPr/>
-      </w:pPr>
-      <w:r>
-        <w:rPr/>
-      </w:r>
-    </w:p>
-    <w:p>
+    <w:p xmlns:wp14="http://schemas.microsoft.com/office/word/2010/wordml" wp14:textId="77777777">
+      <w:pPr>
+        <w:pStyle w:val="Normal"/>
+        <w:rPr/>
+      </w:pPr>
+      <w:r>
+        <w:rPr/>
+      </w:r>
+    </w:p>
+    <w:p xmlns:wp14="http://schemas.microsoft.com/office/word/2010/wordml" wp14:textId="77777777">
       <w:pPr>
         <w:pStyle w:val="Normal"/>
         <w:rPr/>
@@ -1728,24 +2599,23 @@
         <w:br w:type="page"/>
       </w:r>
     </w:p>
-    <w:p>
+    <w:p xmlns:wp14="http://schemas.microsoft.com/office/word/2010/wordml" wp14:textId="77777777">
       <w:pPr>
         <w:pStyle w:val="Heading1"/>
         <w:numPr>
           <w:ilvl w:val="0"/>
           <w:numId w:val="1"/>
         </w:numPr>
-        <w:spacing w:before="0" w:after="80"/>
-        <w:rPr/>
-      </w:pPr>
-      <w:bookmarkStart w:id="6" w:name="_Toc213146626"/>
+        <w:rPr/>
+      </w:pPr>
+      <w:bookmarkStart w:name="_Toc213418604" w:id="7"/>
       <w:r>
         <w:rPr/>
         <w:t>Methods</w:t>
       </w:r>
-      <w:bookmarkEnd w:id="6"/>
-    </w:p>
-    <w:p>
+      <w:bookmarkEnd w:id="7"/>
+    </w:p>
+    <w:p xmlns:wp14="http://schemas.microsoft.com/office/word/2010/wordml" wp14:textId="77777777">
       <w:pPr>
         <w:pStyle w:val="Normal"/>
         <w:rPr/>
@@ -1755,7 +2625,7 @@
         <w:t>Use this section to include a detailed description of the procedures and methodologies used for the analysis. Include versions/commits on developed pipelines, code scripts, and input/output details as relevant.</w:t>
       </w:r>
     </w:p>
-    <w:p>
+    <w:p xmlns:wp14="http://schemas.microsoft.com/office/word/2010/wordml" wp14:textId="77777777">
       <w:pPr>
         <w:pStyle w:val="Normal"/>
         <w:rPr/>
@@ -1765,16 +2635,16 @@
         <w:t>Detail also the approach taken for the data analysis work here (or in a separate section).</w:t>
       </w:r>
     </w:p>
-    <w:p>
-      <w:pPr>
-        <w:pStyle w:val="Normal"/>
-        <w:rPr/>
-      </w:pPr>
-      <w:r>
-        <w:rPr/>
-      </w:r>
-    </w:p>
-    <w:p>
+    <w:p xmlns:wp14="http://schemas.microsoft.com/office/word/2010/wordml" wp14:textId="77777777">
+      <w:pPr>
+        <w:pStyle w:val="Normal"/>
+        <w:rPr/>
+      </w:pPr>
+      <w:r>
+        <w:rPr/>
+      </w:r>
+    </w:p>
+    <w:p xmlns:wp14="http://schemas.microsoft.com/office/word/2010/wordml" wp14:textId="77777777">
       <w:pPr>
         <w:pStyle w:val="Normal"/>
         <w:rPr/>
@@ -1786,24 +2656,23 @@
         <w:br w:type="page"/>
       </w:r>
     </w:p>
-    <w:p>
+    <w:p xmlns:wp14="http://schemas.microsoft.com/office/word/2010/wordml" wp14:textId="77777777">
       <w:pPr>
         <w:pStyle w:val="Heading1"/>
         <w:numPr>
           <w:ilvl w:val="0"/>
           <w:numId w:val="1"/>
         </w:numPr>
-        <w:spacing w:before="0" w:after="80"/>
-        <w:rPr/>
-      </w:pPr>
-      <w:bookmarkStart w:id="7" w:name="_Toc213146627"/>
+        <w:rPr/>
+      </w:pPr>
+      <w:bookmarkStart w:name="_Toc213418605" w:id="8"/>
       <w:r>
         <w:rPr/>
         <w:t>Results and discussion</w:t>
       </w:r>
-      <w:bookmarkEnd w:id="7"/>
-    </w:p>
-    <w:p>
+      <w:bookmarkEnd w:id="8"/>
+    </w:p>
+    <w:p xmlns:wp14="http://schemas.microsoft.com/office/word/2010/wordml" wp14:textId="77777777">
       <w:pPr>
         <w:pStyle w:val="Normal"/>
         <w:rPr/>
@@ -1813,16 +2682,16 @@
         <w:t>Include all of the results of the analytical work, and discuss the findings and their implications with respect to the research question.</w:t>
       </w:r>
     </w:p>
-    <w:p>
-      <w:pPr>
-        <w:pStyle w:val="Normal"/>
-        <w:rPr/>
-      </w:pPr>
-      <w:r>
-        <w:rPr/>
-      </w:r>
-    </w:p>
-    <w:p>
+    <w:p xmlns:wp14="http://schemas.microsoft.com/office/word/2010/wordml" wp14:textId="77777777">
+      <w:pPr>
+        <w:pStyle w:val="Normal"/>
+        <w:rPr/>
+      </w:pPr>
+      <w:r>
+        <w:rPr/>
+      </w:r>
+    </w:p>
+    <w:p xmlns:wp14="http://schemas.microsoft.com/office/word/2010/wordml" wp14:textId="77777777">
       <w:pPr>
         <w:pStyle w:val="Normal"/>
         <w:rPr/>
@@ -1834,24 +2703,23 @@
         <w:br w:type="page"/>
       </w:r>
     </w:p>
-    <w:p>
+    <w:p xmlns:wp14="http://schemas.microsoft.com/office/word/2010/wordml" wp14:textId="77777777">
       <w:pPr>
         <w:pStyle w:val="Heading1"/>
         <w:numPr>
           <w:ilvl w:val="0"/>
           <w:numId w:val="1"/>
         </w:numPr>
-        <w:spacing w:before="0" w:after="80"/>
-        <w:rPr/>
-      </w:pPr>
-      <w:bookmarkStart w:id="8" w:name="_Toc213146628"/>
+        <w:rPr/>
+      </w:pPr>
+      <w:bookmarkStart w:name="_Toc213418606" w:id="9"/>
       <w:r>
         <w:rPr/>
         <w:t>Datasets and metadata</w:t>
       </w:r>
-      <w:bookmarkEnd w:id="8"/>
-    </w:p>
-    <w:p>
+      <w:bookmarkEnd w:id="9"/>
+    </w:p>
+    <w:p xmlns:wp14="http://schemas.microsoft.com/office/word/2010/wordml" wp14:textId="77777777">
       <w:pPr>
         <w:pStyle w:val="Normal"/>
         <w:rPr/>
@@ -1861,7 +2729,7 @@
         <w:t>(Optional) Where useful, include descriptions of the datasets relevant to this research, including links and DOIs to enable findability of these datasets. (Often for GRDC projects these will have associated metadata entries in the GRDC Data Catalogue, which can be linked where appropriate.)</w:t>
       </w:r>
     </w:p>
-    <w:p>
+    <w:p xmlns:wp14="http://schemas.microsoft.com/office/word/2010/wordml" wp14:textId="77777777">
       <w:pPr>
         <w:pStyle w:val="Normal"/>
         <w:rPr/>
@@ -1871,16 +2739,16 @@
         <w:t>Where you have publicly available code on GitHub associated with the analytics (e.g., pipelines), you can include git commit numbers and tags. Including md5/sha256 checksums for input data and outputs is also useful for research reproducibility.</w:t>
       </w:r>
     </w:p>
-    <w:p>
-      <w:pPr>
-        <w:pStyle w:val="Normal"/>
-        <w:rPr/>
-      </w:pPr>
-      <w:r>
-        <w:rPr/>
-      </w:r>
-    </w:p>
-    <w:p>
+    <w:p xmlns:wp14="http://schemas.microsoft.com/office/word/2010/wordml" wp14:textId="77777777">
+      <w:pPr>
+        <w:pStyle w:val="Normal"/>
+        <w:rPr/>
+      </w:pPr>
+      <w:r>
+        <w:rPr/>
+      </w:r>
+    </w:p>
+    <w:p xmlns:wp14="http://schemas.microsoft.com/office/word/2010/wordml" wp14:textId="77777777">
       <w:pPr>
         <w:pStyle w:val="Normal"/>
         <w:rPr/>
@@ -1892,24 +2760,23 @@
         <w:br w:type="page"/>
       </w:r>
     </w:p>
-    <w:p>
+    <w:p xmlns:wp14="http://schemas.microsoft.com/office/word/2010/wordml" wp14:textId="77777777">
       <w:pPr>
         <w:pStyle w:val="Heading1"/>
         <w:numPr>
           <w:ilvl w:val="0"/>
           <w:numId w:val="1"/>
         </w:numPr>
-        <w:spacing w:before="0" w:after="80"/>
-        <w:rPr/>
-      </w:pPr>
-      <w:bookmarkStart w:id="9" w:name="_Toc213146629"/>
+        <w:rPr/>
+      </w:pPr>
+      <w:bookmarkStart w:name="_Toc213418607" w:id="10"/>
       <w:r>
         <w:rPr/>
         <w:t>Trial location maps</w:t>
       </w:r>
-      <w:bookmarkEnd w:id="9"/>
-    </w:p>
-    <w:p>
+      <w:bookmarkEnd w:id="10"/>
+    </w:p>
+    <w:p xmlns:wp14="http://schemas.microsoft.com/office/word/2010/wordml" wp14:textId="77777777">
       <w:pPr>
         <w:pStyle w:val="Normal"/>
         <w:rPr/>
@@ -1919,16 +2786,16 @@
         <w:t>(Optional) Include if relevant to the project.</w:t>
       </w:r>
     </w:p>
-    <w:p>
-      <w:pPr>
-        <w:pStyle w:val="Normal"/>
-        <w:rPr/>
-      </w:pPr>
-      <w:r>
-        <w:rPr/>
-      </w:r>
-    </w:p>
-    <w:p>
+    <w:p xmlns:wp14="http://schemas.microsoft.com/office/word/2010/wordml" wp14:textId="77777777">
+      <w:pPr>
+        <w:pStyle w:val="Normal"/>
+        <w:rPr/>
+      </w:pPr>
+      <w:r>
+        <w:rPr/>
+      </w:r>
+    </w:p>
+    <w:p xmlns:wp14="http://schemas.microsoft.com/office/word/2010/wordml" wp14:textId="77777777">
       <w:pPr>
         <w:pStyle w:val="Normal"/>
         <w:rPr/>
@@ -1940,43 +2807,102 @@
         <w:br w:type="page"/>
       </w:r>
     </w:p>
-    <w:p>
+    <w:p xmlns:wp14="http://schemas.microsoft.com/office/word/2010/wordml" wp14:textId="77777777">
       <w:pPr>
         <w:pStyle w:val="Heading1"/>
         <w:numPr>
           <w:ilvl w:val="0"/>
           <w:numId w:val="1"/>
         </w:numPr>
-        <w:spacing w:before="0" w:after="80"/>
-        <w:rPr/>
-      </w:pPr>
-      <w:bookmarkStart w:id="10" w:name="_Toc213146630"/>
+        <w:rPr/>
+      </w:pPr>
+      <w:bookmarkStart w:name="_Toc213418608" w:id="11"/>
       <w:r>
         <w:rPr/>
         <w:t>References</w:t>
       </w:r>
-      <w:bookmarkEnd w:id="10"/>
-    </w:p>
-    <w:p>
-      <w:pPr>
-        <w:pStyle w:val="Normal"/>
-        <w:rPr/>
-      </w:pPr>
-      <w:r>
-        <w:rPr/>
-        <w:t>Include a bibliography of cited works and literature at the end.</w:t>
-      </w:r>
-    </w:p>
-    <w:p>
-      <w:pPr>
-        <w:pStyle w:val="Normal"/>
-        <w:rPr/>
-      </w:pPr>
-      <w:r>
-        <w:rPr/>
-      </w:r>
-    </w:p>
-    <w:p>
+      <w:bookmarkEnd w:id="11"/>
+    </w:p>
+    <w:sdt>
+      <w:sdtPr>
+        <w:id w:val="-573587230"/>
+        <w:placeholder>
+          <w:docPart w:val="DefaultPlaceholder_1081868574"/>
+        </w:placeholder>
+      </w:sdtPr>
+      <w:sdtContent>
+        <w:p xmlns:wp14="http://schemas.microsoft.com/office/word/2010/wordml" wp14:textId="77777777">
+          <w:pPr>
+            <w:pStyle w:val="Bibliography"/>
+            <w:ind w:start="720" w:hanging="720"/>
+            <w:rPr>
+              <w:kern w:val="0"/>
+              <w:sz w:val="24"/>
+              <w:szCs w:val="24"/>
+              <w14:ligatures w14:val="none"/>
+            </w:rPr>
+          </w:pPr>
+          <w:r>
+            <w:fldChar w:fldCharType="begin"/>
+          </w:r>
+          <w:r>
+            <w:rPr/>
+            <w:instrText xml:space="preserve"> BIBLIOGRAPHY </w:instrText>
+          </w:r>
+          <w:r>
+            <w:rPr/>
+            <w:fldChar w:fldCharType="separate"/>
+          </w:r>
+          <w:r>
+            <w:rPr/>
+            <w:t xml:space="preserve">Person, M. (2024). My article title goes here. </w:t>
+          </w:r>
+          <w:r>
+            <w:rPr>
+              <w:i/>
+              <w:iCs/>
+            </w:rPr>
+            <w:t>My Journal, 13</w:t>
+          </w:r>
+          <w:r>
+            <w:rPr/>
+            <w:t>, pp. 12-34.</w:t>
+          </w:r>
+        </w:p>
+        <w:p xmlns:wp14="http://schemas.microsoft.com/office/word/2010/wordml" wp14:textId="77777777">
+          <w:pPr>
+            <w:pStyle w:val="Normal"/>
+            <w:rPr/>
+          </w:pPr>
+          <w:r>
+            <w:rPr/>
+          </w:r>
+          <w:r>
+            <w:rPr/>
+            <w:fldChar w:fldCharType="end"/>
+          </w:r>
+        </w:p>
+      </w:sdtContent>
+    </w:sdt>
+    <w:p xmlns:wp14="http://schemas.microsoft.com/office/word/2010/wordml" wp14:textId="77777777">
+      <w:pPr>
+        <w:pStyle w:val="Normal"/>
+        <w:rPr/>
+      </w:pPr>
+      <w:r>
+        <w:rPr/>
+      </w:r>
+    </w:p>
+    <w:p xmlns:wp14="http://schemas.microsoft.com/office/word/2010/wordml" wp14:textId="77777777">
+      <w:pPr>
+        <w:pStyle w:val="Normal"/>
+        <w:rPr/>
+      </w:pPr>
+      <w:r>
+        <w:rPr/>
+      </w:r>
+    </w:p>
+    <w:p xmlns:wp14="http://schemas.microsoft.com/office/word/2010/wordml" wp14:textId="77777777">
       <w:pPr>
         <w:pStyle w:val="Normal"/>
         <w:rPr/>
@@ -1988,24 +2914,23 @@
         <w:br w:type="page"/>
       </w:r>
     </w:p>
-    <w:p>
+    <w:p xmlns:wp14="http://schemas.microsoft.com/office/word/2010/wordml" wp14:textId="77777777">
       <w:pPr>
         <w:pStyle w:val="Heading1"/>
         <w:numPr>
           <w:ilvl w:val="0"/>
           <w:numId w:val="2"/>
         </w:numPr>
-        <w:spacing w:before="0" w:after="80"/>
-        <w:rPr/>
-      </w:pPr>
-      <w:bookmarkStart w:id="11" w:name="_Toc213146631"/>
+        <w:rPr/>
+      </w:pPr>
+      <w:bookmarkStart w:name="_Toc213418609" w:id="12"/>
       <w:r>
         <w:rPr/>
         <w:t>This is an appendix</w:t>
       </w:r>
-      <w:bookmarkEnd w:id="11"/>
-    </w:p>
-    <w:p>
+      <w:bookmarkEnd w:id="12"/>
+    </w:p>
+    <w:p xmlns:wp14="http://schemas.microsoft.com/office/word/2010/wordml" wp14:textId="77777777">
       <w:pPr>
         <w:pStyle w:val="Normal"/>
         <w:rPr/>
@@ -2015,16 +2940,16 @@
         <w:t>Include Appendices at the end of the report as necessary, to contain any additional supporting information of interest.</w:t>
       </w:r>
     </w:p>
-    <w:p>
-      <w:pPr>
-        <w:pStyle w:val="Normal"/>
-        <w:rPr/>
-      </w:pPr>
-      <w:r>
-        <w:rPr/>
-      </w:r>
-    </w:p>
-    <w:p>
+    <w:p xmlns:wp14="http://schemas.microsoft.com/office/word/2010/wordml" wp14:textId="77777777">
+      <w:pPr>
+        <w:pStyle w:val="Normal"/>
+        <w:rPr/>
+      </w:pPr>
+      <w:r>
+        <w:rPr/>
+      </w:r>
+    </w:p>
+    <w:p xmlns:wp14="http://schemas.microsoft.com/office/word/2010/wordml" wp14:textId="77777777">
       <w:pPr>
         <w:pStyle w:val="Normal"/>
         <w:rPr/>
@@ -2036,24 +2961,23 @@
         <w:br w:type="page"/>
       </w:r>
     </w:p>
-    <w:p>
+    <w:p xmlns:wp14="http://schemas.microsoft.com/office/word/2010/wordml" wp14:textId="77777777">
       <w:pPr>
         <w:pStyle w:val="Heading1"/>
         <w:numPr>
           <w:ilvl w:val="0"/>
           <w:numId w:val="2"/>
         </w:numPr>
-        <w:spacing w:before="0" w:after="80"/>
-        <w:rPr/>
-      </w:pPr>
-      <w:bookmarkStart w:id="12" w:name="_Toc213146632"/>
+        <w:rPr/>
+      </w:pPr>
+      <w:bookmarkStart w:name="_Toc213418610" w:id="13"/>
       <w:r>
         <w:rPr/>
         <w:t>This is another appendix</w:t>
       </w:r>
-      <w:bookmarkEnd w:id="12"/>
-    </w:p>
-    <w:p>
+      <w:bookmarkEnd w:id="13"/>
+    </w:p>
+    <w:p xmlns:wp14="http://schemas.microsoft.com/office/word/2010/wordml" wp14:textId="77777777">
       <w:pPr>
         <w:pStyle w:val="Normal"/>
         <w:rPr/>
@@ -2063,21 +2987,21 @@
         <w:t xml:space="preserve">Include as many appendices as you like. </w:t>
       </w:r>
     </w:p>
-    <w:p>
-      <w:pPr>
-        <w:pStyle w:val="Normal"/>
-        <w:rPr/>
-      </w:pPr>
-      <w:r>
-        <w:rPr/>
-      </w:r>
-    </w:p>
-    <w:p>
+    <w:p xmlns:wp14="http://schemas.microsoft.com/office/word/2010/wordml" wp14:textId="77777777">
+      <w:pPr>
+        <w:pStyle w:val="Normal"/>
+        <w:rPr/>
+      </w:pPr>
+      <w:r>
+        <w:rPr/>
+      </w:r>
+    </w:p>
+    <w:p xmlns:wp14="http://schemas.microsoft.com/office/word/2010/wordml" wp14:textId="77777777">
       <w:pPr>
         <w:pStyle w:val="Normal"/>
         <w:widowControl/>
         <w:bidi w:val="0"/>
-        <w:spacing w:lineRule="auto" w:line="259" w:before="0" w:after="160"/>
+        <w:spacing w:before="0" w:after="160" w:line="259" w:lineRule="auto"/>
         <w:jc w:val="both"/>
         <w:rPr/>
       </w:pPr>
@@ -2086,19 +3010,19 @@
       </w:r>
     </w:p>
     <w:sectPr>
-      <w:headerReference w:type="even" r:id="rId17"/>
-      <w:headerReference w:type="default" r:id="rId18"/>
-      <w:headerReference w:type="first" r:id="rId19"/>
-      <w:footerReference w:type="even" r:id="rId20"/>
-      <w:footerReference w:type="default" r:id="rId21"/>
-      <w:footerReference w:type="first" r:id="rId22"/>
+      <w:headerReference w:type="even" r:id="rId20"/>
+      <w:headerReference w:type="default" r:id="rId21"/>
+      <w:headerReference w:type="first" r:id="rId22"/>
+      <w:footerReference w:type="default" r:id="rId23"/>
+      <w:footerReference w:type="first" r:id="rId24"/>
       <w:type w:val="nextPage"/>
-      <w:pgSz w:w="11906" w:h="16838"/>
-      <w:pgMar w:left="1440" w:right="1440" w:gutter="0" w:header="708" w:top="1440" w:footer="708" w:bottom="1440"/>
+      <w:pgSz w:w="11906" w:h="16838" w:orient="portrait"/>
+      <w:pgMar w:top="1440" w:right="1440" w:bottom="1440" w:left="1440" w:header="708" w:footer="708" w:gutter="0"/>
       <w:pgNumType w:fmt="decimal"/>
       <w:formProt w:val="false"/>
       <w:textDirection w:val="lrTb"/>
       <w:docGrid w:type="default" w:linePitch="360" w:charSpace="0"/>
+      <w:cols w:num="1"/>
     </w:sectPr>
   </w:body>
 </w:document>
@@ -2106,7 +3030,7 @@
 
 <file path=word/footer1.xml><?xml version="1.0" encoding="utf-8"?>
 <w:ftr xmlns:o="urn:schemas-microsoft-com:office:office" xmlns:r="http://schemas.openxmlformats.org/officeDocument/2006/relationships" xmlns:v="urn:schemas-microsoft-com:vml" xmlns:w="http://schemas.openxmlformats.org/wordprocessingml/2006/main" xmlns:w10="urn:schemas-microsoft-com:office:word" xmlns:wp="http://schemas.openxmlformats.org/drawingml/2006/wordprocessingDrawing" xmlns:pic="http://schemas.openxmlformats.org/drawingml/2006/picture" xmlns:wps="http://schemas.microsoft.com/office/word/2010/wordprocessingShape" xmlns:wpg="http://schemas.microsoft.com/office/word/2010/wordprocessingGroup" xmlns:mc="http://schemas.openxmlformats.org/markup-compatibility/2006" xmlns:wp14="http://schemas.microsoft.com/office/word/2010/wordprocessingDrawing" xmlns:w14="http://schemas.microsoft.com/office/word/2010/wordml" xmlns:w15="http://schemas.microsoft.com/office/word/2012/wordml" mc:Ignorable="w14 wp14 w15">
-  <w:p>
+  <w:p xmlns:wp14="http://schemas.microsoft.com/office/word/2010/wordml" wp14:textId="77777777">
     <w:pPr>
       <w:pStyle w:val="Footer"/>
       <w:rPr/>
@@ -2120,13 +3044,31 @@
 
 <file path=word/footer10.xml><?xml version="1.0" encoding="utf-8"?>
 <w:ftr xmlns:o="urn:schemas-microsoft-com:office:office" xmlns:r="http://schemas.openxmlformats.org/officeDocument/2006/relationships" xmlns:v="urn:schemas-microsoft-com:vml" xmlns:w="http://schemas.openxmlformats.org/wordprocessingml/2006/main" xmlns:w10="urn:schemas-microsoft-com:office:word" xmlns:wp="http://schemas.openxmlformats.org/drawingml/2006/wordprocessingDrawing" xmlns:pic="http://schemas.openxmlformats.org/drawingml/2006/picture" xmlns:wps="http://schemas.microsoft.com/office/word/2010/wordprocessingShape" xmlns:wpg="http://schemas.microsoft.com/office/word/2010/wordprocessingGroup" xmlns:mc="http://schemas.openxmlformats.org/markup-compatibility/2006" xmlns:wp14="http://schemas.microsoft.com/office/word/2010/wordprocessingDrawing" xmlns:w14="http://schemas.microsoft.com/office/word/2010/wordml" xmlns:w15="http://schemas.microsoft.com/office/word/2012/wordml" mc:Ignorable="w14 wp14 w15">
-  <w:p>
+  <w:p xmlns:wp14="http://schemas.microsoft.com/office/word/2010/wordml" wp14:textId="77777777">
     <w:pPr>
       <w:pStyle w:val="Footer"/>
+      <w:jc w:val="end"/>
       <w:rPr/>
     </w:pPr>
     <w:r>
       <w:rPr/>
+      <w:fldChar w:fldCharType="begin"/>
+    </w:r>
+    <w:r>
+      <w:rPr/>
+      <w:instrText xml:space="preserve"> PAGE </w:instrText>
+    </w:r>
+    <w:r>
+      <w:rPr/>
+      <w:fldChar w:fldCharType="separate"/>
+    </w:r>
+    <w:r>
+      <w:rPr/>
+      <w:t>12</w:t>
+    </w:r>
+    <w:r>
+      <w:rPr/>
+      <w:fldChar w:fldCharType="end"/>
     </w:r>
   </w:p>
 </w:ftr>
@@ -2134,71 +3076,13 @@
 
 <file path=word/footer11.xml><?xml version="1.0" encoding="utf-8"?>
 <w:ftr xmlns:o="urn:schemas-microsoft-com:office:office" xmlns:r="http://schemas.openxmlformats.org/officeDocument/2006/relationships" xmlns:v="urn:schemas-microsoft-com:vml" xmlns:w="http://schemas.openxmlformats.org/wordprocessingml/2006/main" xmlns:w10="urn:schemas-microsoft-com:office:word" xmlns:wp="http://schemas.openxmlformats.org/drawingml/2006/wordprocessingDrawing" xmlns:pic="http://schemas.openxmlformats.org/drawingml/2006/picture" xmlns:wps="http://schemas.microsoft.com/office/word/2010/wordprocessingShape" xmlns:wpg="http://schemas.microsoft.com/office/word/2010/wordprocessingGroup" xmlns:mc="http://schemas.openxmlformats.org/markup-compatibility/2006" xmlns:wp14="http://schemas.microsoft.com/office/word/2010/wordprocessingDrawing" xmlns:w14="http://schemas.microsoft.com/office/word/2010/wordml" xmlns:w15="http://schemas.microsoft.com/office/word/2012/wordml" mc:Ignorable="w14 wp14 w15">
-  <w:p>
-    <w:pPr>
-      <w:pStyle w:val="Footer"/>
-      <w:jc w:val="end"/>
-      <w:rPr/>
-    </w:pPr>
-    <w:r>
-      <w:rPr/>
-      <w:fldChar w:fldCharType="begin"/>
-    </w:r>
-    <w:r>
-      <w:rPr/>
-      <w:instrText xml:space="preserve"> PAGE </w:instrText>
-    </w:r>
-    <w:r>
-      <w:rPr/>
-      <w:fldChar w:fldCharType="separate"/>
-    </w:r>
-    <w:r>
-      <w:rPr/>
-      <w:t>12</w:t>
-    </w:r>
-    <w:r>
-      <w:rPr/>
-      <w:fldChar w:fldCharType="end"/>
-    </w:r>
-  </w:p>
-</w:ftr>
-</file>
-
-<file path=word/footer12.xml><?xml version="1.0" encoding="utf-8"?>
-<w:ftr xmlns:o="urn:schemas-microsoft-com:office:office" xmlns:r="http://schemas.openxmlformats.org/officeDocument/2006/relationships" xmlns:v="urn:schemas-microsoft-com:vml" xmlns:w="http://schemas.openxmlformats.org/wordprocessingml/2006/main" xmlns:w10="urn:schemas-microsoft-com:office:word" xmlns:wp="http://schemas.openxmlformats.org/drawingml/2006/wordprocessingDrawing" xmlns:pic="http://schemas.openxmlformats.org/drawingml/2006/picture" xmlns:wps="http://schemas.microsoft.com/office/word/2010/wordprocessingShape" xmlns:wpg="http://schemas.microsoft.com/office/word/2010/wordprocessingGroup" xmlns:mc="http://schemas.openxmlformats.org/markup-compatibility/2006" xmlns:wp14="http://schemas.microsoft.com/office/word/2010/wordprocessingDrawing" xmlns:w14="http://schemas.microsoft.com/office/word/2010/wordml" xmlns:w15="http://schemas.microsoft.com/office/word/2012/wordml" mc:Ignorable="w14 wp14 w15">
-  <w:p>
-    <w:pPr>
-      <w:pStyle w:val="Footer"/>
-      <w:jc w:val="end"/>
-      <w:rPr/>
-    </w:pPr>
-    <w:r>
-      <w:rPr/>
-      <w:fldChar w:fldCharType="begin"/>
-    </w:r>
-    <w:r>
-      <w:rPr/>
-      <w:instrText xml:space="preserve"> PAGE </w:instrText>
-    </w:r>
-    <w:r>
-      <w:rPr/>
-      <w:fldChar w:fldCharType="separate"/>
-    </w:r>
-    <w:r>
-      <w:rPr/>
-      <w:t>12</w:t>
-    </w:r>
-    <w:r>
-      <w:rPr/>
-      <w:fldChar w:fldCharType="end"/>
-    </w:r>
-  </w:p>
+  <w:p xmlns:wp14="http://schemas.microsoft.com/office/word/2010/wordml" wp14:textId="77777777"/>
 </w:ftr>
 </file>
 
 <file path=word/footer2.xml><?xml version="1.0" encoding="utf-8"?>
 <w:ftr xmlns:o="urn:schemas-microsoft-com:office:office" xmlns:r="http://schemas.openxmlformats.org/officeDocument/2006/relationships" xmlns:v="urn:schemas-microsoft-com:vml" xmlns:w="http://schemas.openxmlformats.org/wordprocessingml/2006/main" xmlns:w10="urn:schemas-microsoft-com:office:word" xmlns:wp="http://schemas.openxmlformats.org/drawingml/2006/wordprocessingDrawing" xmlns:pic="http://schemas.openxmlformats.org/drawingml/2006/picture" xmlns:wps="http://schemas.microsoft.com/office/word/2010/wordprocessingShape" xmlns:wpg="http://schemas.microsoft.com/office/word/2010/wordprocessingGroup" xmlns:mc="http://schemas.openxmlformats.org/markup-compatibility/2006" xmlns:wp14="http://schemas.microsoft.com/office/word/2010/wordprocessingDrawing" xmlns:w14="http://schemas.microsoft.com/office/word/2010/wordml" xmlns:w15="http://schemas.microsoft.com/office/word/2012/wordml" mc:Ignorable="w14 wp14 w15">
-  <w:p>
+  <w:p xmlns:wp14="http://schemas.microsoft.com/office/word/2010/wordml" wp14:textId="77777777">
     <w:pPr>
       <w:pStyle w:val="Footer"/>
       <w:jc w:val="center"/>
@@ -2213,7 +3097,7 @@
 
 <file path=word/footer3.xml><?xml version="1.0" encoding="utf-8"?>
 <w:ftr xmlns:o="urn:schemas-microsoft-com:office:office" xmlns:r="http://schemas.openxmlformats.org/officeDocument/2006/relationships" xmlns:v="urn:schemas-microsoft-com:vml" xmlns:w="http://schemas.openxmlformats.org/wordprocessingml/2006/main" xmlns:w10="urn:schemas-microsoft-com:office:word" xmlns:wp="http://schemas.openxmlformats.org/drawingml/2006/wordprocessingDrawing" xmlns:pic="http://schemas.openxmlformats.org/drawingml/2006/picture" xmlns:wps="http://schemas.microsoft.com/office/word/2010/wordprocessingShape" xmlns:wpg="http://schemas.microsoft.com/office/word/2010/wordprocessingGroup" xmlns:mc="http://schemas.openxmlformats.org/markup-compatibility/2006" xmlns:wp14="http://schemas.microsoft.com/office/word/2010/wordprocessingDrawing" xmlns:w14="http://schemas.microsoft.com/office/word/2010/wordml" xmlns:w15="http://schemas.microsoft.com/office/word/2012/wordml" mc:Ignorable="w14 wp14 w15">
-  <w:p>
+  <w:p xmlns:wp14="http://schemas.microsoft.com/office/word/2010/wordml" wp14:textId="77777777">
     <w:pPr>
       <w:pStyle w:val="Footer"/>
       <w:jc w:val="center"/>
@@ -2228,7 +3112,7 @@
 
 <file path=word/footer4.xml><?xml version="1.0" encoding="utf-8"?>
 <w:ftr xmlns:o="urn:schemas-microsoft-com:office:office" xmlns:r="http://schemas.openxmlformats.org/officeDocument/2006/relationships" xmlns:v="urn:schemas-microsoft-com:vml" xmlns:w="http://schemas.openxmlformats.org/wordprocessingml/2006/main" xmlns:w10="urn:schemas-microsoft-com:office:word" xmlns:wp="http://schemas.openxmlformats.org/drawingml/2006/wordprocessingDrawing" xmlns:pic="http://schemas.openxmlformats.org/drawingml/2006/picture" xmlns:wps="http://schemas.microsoft.com/office/word/2010/wordprocessingShape" xmlns:wpg="http://schemas.microsoft.com/office/word/2010/wordprocessingGroup" xmlns:mc="http://schemas.openxmlformats.org/markup-compatibility/2006" xmlns:wp14="http://schemas.microsoft.com/office/word/2010/wordprocessingDrawing" xmlns:w14="http://schemas.microsoft.com/office/word/2010/wordml" xmlns:w15="http://schemas.microsoft.com/office/word/2012/wordml" mc:Ignorable="w14 wp14 w15">
-  <w:p>
+  <w:p xmlns:wp14="http://schemas.microsoft.com/office/word/2010/wordml" wp14:textId="77777777">
     <w:pPr>
       <w:pStyle w:val="Footer"/>
       <w:rPr/>
@@ -2242,7 +3126,7 @@
 
 <file path=word/footer5.xml><?xml version="1.0" encoding="utf-8"?>
 <w:ftr xmlns:o="urn:schemas-microsoft-com:office:office" xmlns:r="http://schemas.openxmlformats.org/officeDocument/2006/relationships" xmlns:v="urn:schemas-microsoft-com:vml" xmlns:w="http://schemas.openxmlformats.org/wordprocessingml/2006/main" xmlns:w10="urn:schemas-microsoft-com:office:word" xmlns:wp="http://schemas.openxmlformats.org/drawingml/2006/wordprocessingDrawing" xmlns:pic="http://schemas.openxmlformats.org/drawingml/2006/picture" xmlns:wps="http://schemas.microsoft.com/office/word/2010/wordprocessingShape" xmlns:wpg="http://schemas.microsoft.com/office/word/2010/wordprocessingGroup" xmlns:mc="http://schemas.openxmlformats.org/markup-compatibility/2006" xmlns:wp14="http://schemas.microsoft.com/office/word/2010/wordprocessingDrawing" xmlns:w14="http://schemas.microsoft.com/office/word/2010/wordml" xmlns:w15="http://schemas.microsoft.com/office/word/2012/wordml" mc:Ignorable="w14 wp14 w15">
-  <w:p>
+  <w:p xmlns:wp14="http://schemas.microsoft.com/office/word/2010/wordml" wp14:textId="77777777">
     <w:pPr>
       <w:pStyle w:val="Footer"/>
       <w:jc w:val="end"/>
@@ -2274,7 +3158,7 @@
 
 <file path=word/footer6.xml><?xml version="1.0" encoding="utf-8"?>
 <w:ftr xmlns:o="urn:schemas-microsoft-com:office:office" xmlns:r="http://schemas.openxmlformats.org/officeDocument/2006/relationships" xmlns:v="urn:schemas-microsoft-com:vml" xmlns:w="http://schemas.openxmlformats.org/wordprocessingml/2006/main" xmlns:w10="urn:schemas-microsoft-com:office:word" xmlns:wp="http://schemas.openxmlformats.org/drawingml/2006/wordprocessingDrawing" xmlns:pic="http://schemas.openxmlformats.org/drawingml/2006/picture" xmlns:wps="http://schemas.microsoft.com/office/word/2010/wordprocessingShape" xmlns:wpg="http://schemas.microsoft.com/office/word/2010/wordprocessingGroup" xmlns:mc="http://schemas.openxmlformats.org/markup-compatibility/2006" xmlns:wp14="http://schemas.microsoft.com/office/word/2010/wordprocessingDrawing" xmlns:w14="http://schemas.microsoft.com/office/word/2010/wordml" xmlns:w15="http://schemas.microsoft.com/office/word/2012/wordml" mc:Ignorable="w14 wp14 w15">
-  <w:p>
+  <w:p xmlns:wp14="http://schemas.microsoft.com/office/word/2010/wordml" wp14:textId="77777777">
     <w:pPr>
       <w:pStyle w:val="Footer"/>
       <w:jc w:val="end"/>
@@ -2306,7 +3190,7 @@
 
 <file path=word/footer7.xml><?xml version="1.0" encoding="utf-8"?>
 <w:ftr xmlns:o="urn:schemas-microsoft-com:office:office" xmlns:r="http://schemas.openxmlformats.org/officeDocument/2006/relationships" xmlns:v="urn:schemas-microsoft-com:vml" xmlns:w="http://schemas.openxmlformats.org/wordprocessingml/2006/main" xmlns:w10="urn:schemas-microsoft-com:office:word" xmlns:wp="http://schemas.openxmlformats.org/drawingml/2006/wordprocessingDrawing" xmlns:pic="http://schemas.openxmlformats.org/drawingml/2006/picture" xmlns:wps="http://schemas.microsoft.com/office/word/2010/wordprocessingShape" xmlns:wpg="http://schemas.microsoft.com/office/word/2010/wordprocessingGroup" xmlns:mc="http://schemas.openxmlformats.org/markup-compatibility/2006" xmlns:wp14="http://schemas.microsoft.com/office/word/2010/wordprocessingDrawing" xmlns:w14="http://schemas.microsoft.com/office/word/2010/wordml" xmlns:w15="http://schemas.microsoft.com/office/word/2012/wordml" mc:Ignorable="w14 wp14 w15">
-  <w:p>
+  <w:p xmlns:wp14="http://schemas.microsoft.com/office/word/2010/wordml" wp14:textId="77777777">
     <w:pPr>
       <w:pStyle w:val="Footer"/>
       <w:rPr/>
@@ -2320,7 +3204,7 @@
 
 <file path=word/footer8.xml><?xml version="1.0" encoding="utf-8"?>
 <w:ftr xmlns:o="urn:schemas-microsoft-com:office:office" xmlns:r="http://schemas.openxmlformats.org/officeDocument/2006/relationships" xmlns:v="urn:schemas-microsoft-com:vml" xmlns:w="http://schemas.openxmlformats.org/wordprocessingml/2006/main" xmlns:w10="urn:schemas-microsoft-com:office:word" xmlns:wp="http://schemas.openxmlformats.org/drawingml/2006/wordprocessingDrawing" xmlns:pic="http://schemas.openxmlformats.org/drawingml/2006/picture" xmlns:wps="http://schemas.microsoft.com/office/word/2010/wordprocessingShape" xmlns:wpg="http://schemas.microsoft.com/office/word/2010/wordprocessingGroup" xmlns:mc="http://schemas.openxmlformats.org/markup-compatibility/2006" xmlns:wp14="http://schemas.microsoft.com/office/word/2010/wordprocessingDrawing" xmlns:w14="http://schemas.microsoft.com/office/word/2010/wordml" xmlns:w15="http://schemas.microsoft.com/office/word/2012/wordml" mc:Ignorable="w14 wp14 w15">
-  <w:p>
+  <w:p xmlns:wp14="http://schemas.microsoft.com/office/word/2010/wordml" wp14:textId="77777777">
     <w:pPr>
       <w:pStyle w:val="Footer"/>
       <w:jc w:val="end"/>
@@ -2352,7 +3236,7 @@
 
 <file path=word/footer9.xml><?xml version="1.0" encoding="utf-8"?>
 <w:ftr xmlns:o="urn:schemas-microsoft-com:office:office" xmlns:r="http://schemas.openxmlformats.org/officeDocument/2006/relationships" xmlns:v="urn:schemas-microsoft-com:vml" xmlns:w="http://schemas.openxmlformats.org/wordprocessingml/2006/main" xmlns:w10="urn:schemas-microsoft-com:office:word" xmlns:wp="http://schemas.openxmlformats.org/drawingml/2006/wordprocessingDrawing" xmlns:pic="http://schemas.openxmlformats.org/drawingml/2006/picture" xmlns:wps="http://schemas.microsoft.com/office/word/2010/wordprocessingShape" xmlns:wpg="http://schemas.microsoft.com/office/word/2010/wordprocessingGroup" xmlns:mc="http://schemas.openxmlformats.org/markup-compatibility/2006" xmlns:wp14="http://schemas.microsoft.com/office/word/2010/wordprocessingDrawing" xmlns:w14="http://schemas.microsoft.com/office/word/2010/wordml" xmlns:w15="http://schemas.microsoft.com/office/word/2012/wordml" mc:Ignorable="w14 wp14 w15">
-  <w:p>
+  <w:p xmlns:wp14="http://schemas.microsoft.com/office/word/2010/wordml" wp14:textId="77777777">
     <w:pPr>
       <w:pStyle w:val="Footer"/>
       <w:jc w:val="end"/>
@@ -2384,7 +3268,7 @@
 
 <file path=word/header1.xml><?xml version="1.0" encoding="utf-8"?>
 <w:hdr xmlns:o="urn:schemas-microsoft-com:office:office" xmlns:r="http://schemas.openxmlformats.org/officeDocument/2006/relationships" xmlns:v="urn:schemas-microsoft-com:vml" xmlns:w="http://schemas.openxmlformats.org/wordprocessingml/2006/main" xmlns:w10="urn:schemas-microsoft-com:office:word" xmlns:wp="http://schemas.openxmlformats.org/drawingml/2006/wordprocessingDrawing" xmlns:pic="http://schemas.openxmlformats.org/drawingml/2006/picture" xmlns:wps="http://schemas.microsoft.com/office/word/2010/wordprocessingShape" xmlns:wpg="http://schemas.microsoft.com/office/word/2010/wordprocessingGroup" xmlns:mc="http://schemas.openxmlformats.org/markup-compatibility/2006" xmlns:wp14="http://schemas.microsoft.com/office/word/2010/wordprocessingDrawing" xmlns:w14="http://schemas.microsoft.com/office/word/2010/wordml" xmlns:w15="http://schemas.microsoft.com/office/word/2012/wordml" mc:Ignorable="w14 wp14 w15">
-  <w:p>
+  <w:p xmlns:wp14="http://schemas.microsoft.com/office/word/2010/wordml" wp14:textId="77777777">
     <w:pPr>
       <w:pStyle w:val="Header"/>
       <w:rPr/>
@@ -2398,7 +3282,7 @@
 
 <file path=word/header2.xml><?xml version="1.0" encoding="utf-8"?>
 <w:hdr xmlns:o="urn:schemas-microsoft-com:office:office" xmlns:r="http://schemas.openxmlformats.org/officeDocument/2006/relationships" xmlns:v="urn:schemas-microsoft-com:vml" xmlns:w="http://schemas.openxmlformats.org/wordprocessingml/2006/main" xmlns:w10="urn:schemas-microsoft-com:office:word" xmlns:wp="http://schemas.openxmlformats.org/drawingml/2006/wordprocessingDrawing" xmlns:pic="http://schemas.openxmlformats.org/drawingml/2006/picture" xmlns:wps="http://schemas.microsoft.com/office/word/2010/wordprocessingShape" xmlns:wpg="http://schemas.microsoft.com/office/word/2010/wordprocessingGroup" xmlns:mc="http://schemas.openxmlformats.org/markup-compatibility/2006" xmlns:wp14="http://schemas.microsoft.com/office/word/2010/wordprocessingDrawing" xmlns:w14="http://schemas.microsoft.com/office/word/2010/wordml" xmlns:w15="http://schemas.microsoft.com/office/word/2012/wordml" mc:Ignorable="w14 wp14 w15">
-  <w:p>
+  <w:p xmlns:wp14="http://schemas.microsoft.com/office/word/2010/wordml" wp14:textId="77777777">
     <w:pPr>
       <w:pStyle w:val="Header"/>
       <w:rPr/>
@@ -2407,11 +3291,11 @@
       <w:rPr/>
     </w:r>
   </w:p>
-  <w:p>
+  <w:p xmlns:wp14="http://schemas.microsoft.com/office/word/2010/wordml" wp14:textId="77777777">
     <w:pPr>
       <w:pStyle w:val="Header"/>
       <w:pBdr>
-        <w:bottom w:val="single" w:sz="2" w:space="1" w:color="000000"/>
+        <w:bottom w:val="single" w:color="000000" w:sz="2" w:space="1"/>
       </w:pBdr>
       <w:rPr/>
     </w:pPr>
@@ -2424,7 +3308,7 @@
 
 <file path=word/header3.xml><?xml version="1.0" encoding="utf-8"?>
 <w:hdr xmlns:o="urn:schemas-microsoft-com:office:office" xmlns:r="http://schemas.openxmlformats.org/officeDocument/2006/relationships" xmlns:v="urn:schemas-microsoft-com:vml" xmlns:w="http://schemas.openxmlformats.org/wordprocessingml/2006/main" xmlns:w10="urn:schemas-microsoft-com:office:word" xmlns:wp="http://schemas.openxmlformats.org/drawingml/2006/wordprocessingDrawing" xmlns:pic="http://schemas.openxmlformats.org/drawingml/2006/picture" xmlns:wps="http://schemas.microsoft.com/office/word/2010/wordprocessingShape" xmlns:wpg="http://schemas.microsoft.com/office/word/2010/wordprocessingGroup" xmlns:mc="http://schemas.openxmlformats.org/markup-compatibility/2006" xmlns:wp14="http://schemas.microsoft.com/office/word/2010/wordprocessingDrawing" xmlns:w14="http://schemas.microsoft.com/office/word/2010/wordml" xmlns:w15="http://schemas.microsoft.com/office/word/2012/wordml" mc:Ignorable="w14 wp14 w15">
-  <w:p>
+  <w:p xmlns:wp14="http://schemas.microsoft.com/office/word/2010/wordml" wp14:textId="77777777">
     <w:pPr>
       <w:pStyle w:val="Header"/>
       <w:rPr/>
@@ -2433,11 +3317,11 @@
       <w:rPr/>
     </w:r>
   </w:p>
-  <w:p>
+  <w:p xmlns:wp14="http://schemas.microsoft.com/office/word/2010/wordml" wp14:textId="77777777">
     <w:pPr>
       <w:pStyle w:val="Header"/>
       <w:pBdr>
-        <w:bottom w:val="single" w:sz="2" w:space="1" w:color="000000"/>
+        <w:bottom w:val="single" w:color="000000" w:sz="2" w:space="1"/>
       </w:pBdr>
       <w:rPr/>
     </w:pPr>
@@ -2450,7 +3334,7 @@
 
 <file path=word/header4.xml><?xml version="1.0" encoding="utf-8"?>
 <w:hdr xmlns:o="urn:schemas-microsoft-com:office:office" xmlns:r="http://schemas.openxmlformats.org/officeDocument/2006/relationships" xmlns:v="urn:schemas-microsoft-com:vml" xmlns:w="http://schemas.openxmlformats.org/wordprocessingml/2006/main" xmlns:w10="urn:schemas-microsoft-com:office:word" xmlns:wp="http://schemas.openxmlformats.org/drawingml/2006/wordprocessingDrawing" xmlns:pic="http://schemas.openxmlformats.org/drawingml/2006/picture" xmlns:wps="http://schemas.microsoft.com/office/word/2010/wordprocessingShape" xmlns:wpg="http://schemas.microsoft.com/office/word/2010/wordprocessingGroup" xmlns:mc="http://schemas.openxmlformats.org/markup-compatibility/2006" xmlns:wp14="http://schemas.microsoft.com/office/word/2010/wordprocessingDrawing" xmlns:w14="http://schemas.microsoft.com/office/word/2010/wordml" xmlns:w15="http://schemas.microsoft.com/office/word/2012/wordml" mc:Ignorable="w14 wp14 w15">
-  <w:p>
+  <w:p xmlns:wp14="http://schemas.microsoft.com/office/word/2010/wordml" wp14:textId="77777777">
     <w:pPr>
       <w:pStyle w:val="Header"/>
       <w:rPr/>
@@ -2464,7 +3348,7 @@
 
 <file path=word/header5.xml><?xml version="1.0" encoding="utf-8"?>
 <w:hdr xmlns:o="urn:schemas-microsoft-com:office:office" xmlns:r="http://schemas.openxmlformats.org/officeDocument/2006/relationships" xmlns:v="urn:schemas-microsoft-com:vml" xmlns:w="http://schemas.openxmlformats.org/wordprocessingml/2006/main" xmlns:w10="urn:schemas-microsoft-com:office:word" xmlns:wp="http://schemas.openxmlformats.org/drawingml/2006/wordprocessingDrawing" xmlns:pic="http://schemas.openxmlformats.org/drawingml/2006/picture" xmlns:wps="http://schemas.microsoft.com/office/word/2010/wordprocessingShape" xmlns:wpg="http://schemas.microsoft.com/office/word/2010/wordprocessingGroup" xmlns:mc="http://schemas.openxmlformats.org/markup-compatibility/2006" xmlns:wp14="http://schemas.microsoft.com/office/word/2010/wordprocessingDrawing" xmlns:w14="http://schemas.microsoft.com/office/word/2010/wordml" xmlns:w15="http://schemas.microsoft.com/office/word/2012/wordml" mc:Ignorable="w14 wp14 w15">
-  <w:p>
+  <w:p xmlns:wp14="http://schemas.microsoft.com/office/word/2010/wordml" wp14:textId="77777777">
     <w:pPr>
       <w:pStyle w:val="Header"/>
       <w:rPr/>
@@ -2473,15 +3357,15 @@
       <w:rPr/>
     </w:r>
   </w:p>
-  <w:p>
+  <w:p xmlns:wp14="http://schemas.microsoft.com/office/word/2010/wordml" wp14:textId="77777777">
     <w:pPr>
       <w:pStyle w:val="Header"/>
       <w:pBdr>
-        <w:bottom w:val="single" w:sz="2" w:space="1" w:color="000000"/>
+        <w:bottom w:val="single" w:color="000000" w:sz="2" w:space="1"/>
       </w:pBdr>
       <w:tabs>
         <w:tab w:val="clear" w:pos="4513"/>
-        <w:tab w:val="center" w:pos="4536" w:leader="none"/>
+        <w:tab w:val="center" w:leader="none" w:pos="4536"/>
       </w:tabs>
       <w:rPr/>
     </w:pPr>
@@ -2535,7 +3419,7 @@
 
 <file path=word/header6.xml><?xml version="1.0" encoding="utf-8"?>
 <w:hdr xmlns:o="urn:schemas-microsoft-com:office:office" xmlns:r="http://schemas.openxmlformats.org/officeDocument/2006/relationships" xmlns:v="urn:schemas-microsoft-com:vml" xmlns:w="http://schemas.openxmlformats.org/wordprocessingml/2006/main" xmlns:w10="urn:schemas-microsoft-com:office:word" xmlns:wp="http://schemas.openxmlformats.org/drawingml/2006/wordprocessingDrawing" xmlns:pic="http://schemas.openxmlformats.org/drawingml/2006/picture" xmlns:wps="http://schemas.microsoft.com/office/word/2010/wordprocessingShape" xmlns:wpg="http://schemas.microsoft.com/office/word/2010/wordprocessingGroup" xmlns:mc="http://schemas.openxmlformats.org/markup-compatibility/2006" xmlns:wp14="http://schemas.microsoft.com/office/word/2010/wordprocessingDrawing" xmlns:w14="http://schemas.microsoft.com/office/word/2010/wordml" xmlns:w15="http://schemas.microsoft.com/office/word/2012/wordml" mc:Ignorable="w14 wp14 w15">
-  <w:p>
+  <w:p xmlns:wp14="http://schemas.microsoft.com/office/word/2010/wordml" wp14:textId="77777777">
     <w:pPr>
       <w:pStyle w:val="Header"/>
       <w:rPr/>
@@ -2544,15 +3428,15 @@
       <w:rPr/>
     </w:r>
   </w:p>
-  <w:p>
+  <w:p xmlns:wp14="http://schemas.microsoft.com/office/word/2010/wordml" wp14:textId="77777777">
     <w:pPr>
       <w:pStyle w:val="Header"/>
       <w:pBdr>
-        <w:bottom w:val="single" w:sz="2" w:space="1" w:color="000000"/>
+        <w:bottom w:val="single" w:color="000000" w:sz="2" w:space="1"/>
       </w:pBdr>
       <w:tabs>
         <w:tab w:val="clear" w:pos="4513"/>
-        <w:tab w:val="center" w:pos="4536" w:leader="none"/>
+        <w:tab w:val="center" w:leader="none" w:pos="4536"/>
       </w:tabs>
       <w:rPr/>
     </w:pPr>
@@ -2732,6 +3616,7 @@
       </w:pPr>
       <w:rPr/>
     </w:lvl>
+    <w:nsid w:val="226b57c8"/>
   </w:abstractNum>
   <w:abstractNum w:abstractNumId="2">
     <w:lvl w:ilvl="0">
@@ -2851,6 +3736,7 @@
       </w:pPr>
       <w:rPr/>
     </w:lvl>
+    <w:nsid w:val="4fec917a"/>
   </w:abstractNum>
   <w:num w:numId="1">
     <w:abstractNumId w:val="1"/>
@@ -2862,11 +3748,11 @@
 </file>
 
 <file path=word/styles.xml><?xml version="1.0" encoding="utf-8"?>
-<w:styles xmlns:w="http://schemas.openxmlformats.org/wordprocessingml/2006/main" xmlns:w14="http://schemas.microsoft.com/office/word/2010/wordml" xmlns:mc="http://schemas.openxmlformats.org/markup-compatibility/2006" mc:Ignorable="w14">
+<w:styles xmlns:wp14="http://schemas.microsoft.com/office/word/2010/wordprocessingDrawing" xmlns:w="http://schemas.openxmlformats.org/wordprocessingml/2006/main" xmlns:w14="http://schemas.microsoft.com/office/word/2010/wordml" xmlns:mc="http://schemas.openxmlformats.org/markup-compatibility/2006" mc:Ignorable="w14 wp14">
   <w:docDefaults>
     <w:rPrDefault>
       <w:rPr>
-        <w:rFonts w:ascii="Aptos" w:hAnsi="Aptos" w:eastAsia="Aptos" w:cs="" w:asciiTheme="minorHAnsi" w:cstheme="minorBidi" w:eastAsiaTheme="minorHAnsi" w:hAnsiTheme="minorHAnsi"/>
+        <w:rFonts w:ascii="Aptos" w:hAnsi="Aptos" w:eastAsia="Aptos" w:cs="" w:asciiTheme="minorHAnsi" w:hAnsiTheme="minorHAnsi" w:eastAsiaTheme="minorHAnsi" w:cstheme="minorBidi"/>
         <w:kern w:val="2"/>
         <w:sz w:val="22"/>
         <w:szCs w:val="22"/>
@@ -3264,13 +4150,12 @@
     <w:rsid w:val="002127d5"/>
     <w:pPr>
       <w:widowControl/>
-      <w:suppressAutoHyphens w:val="true"/>
       <w:bidi w:val="0"/>
-      <w:spacing w:lineRule="auto" w:line="259" w:before="0" w:after="160"/>
+      <w:spacing w:before="0" w:after="160" w:line="259" w:lineRule="auto"/>
       <w:jc w:val="both"/>
     </w:pPr>
     <w:rPr>
-      <w:rFonts w:ascii="Proxima Nova Medium" w:hAnsi="Proxima Nova Medium" w:eastAsia="Aptos" w:cs="" w:cstheme="minorBidi" w:eastAsiaTheme="minorHAnsi"/>
+      <w:rFonts w:ascii="Proxima Nova Medium" w:hAnsi="Proxima Nova Medium" w:eastAsia="Aptos" w:cs="" w:eastAsiaTheme="minorHAnsi" w:cstheme="minorBidi"/>
       <w:color w:val="auto"/>
       <w:kern w:val="2"/>
       <w:sz w:val="22"/>
@@ -3294,7 +4179,7 @@
       <w:outlineLvl w:val="0"/>
     </w:pPr>
     <w:rPr>
-      <w:rFonts w:eastAsia="" w:cs="" w:cstheme="majorBidi" w:eastAsiaTheme="majorEastAsia"/>
+      <w:rFonts w:eastAsia="" w:cs="" w:eastAsiaTheme="majorEastAsia" w:cstheme="majorBidi"/>
       <w:b/>
       <w:sz w:val="40"/>
       <w:szCs w:val="40"/>
@@ -3320,7 +4205,7 @@
       <w:outlineLvl w:val="1"/>
     </w:pPr>
     <w:rPr>
-      <w:rFonts w:eastAsia="" w:cs="" w:cstheme="majorBidi" w:eastAsiaTheme="majorEastAsia"/>
+      <w:rFonts w:eastAsia="" w:cs="" w:eastAsiaTheme="majorEastAsia" w:cstheme="majorBidi"/>
       <w:b/>
       <w:sz w:val="32"/>
       <w:szCs w:val="32"/>
@@ -3346,7 +4231,7 @@
       <w:outlineLvl w:val="2"/>
     </w:pPr>
     <w:rPr>
-      <w:rFonts w:eastAsia="" w:cs="" w:cstheme="majorBidi" w:eastAsiaTheme="majorEastAsia"/>
+      <w:rFonts w:eastAsia="" w:cs="" w:eastAsiaTheme="majorEastAsia" w:cstheme="majorBidi"/>
       <w:sz w:val="28"/>
       <w:szCs w:val="28"/>
     </w:rPr>
@@ -3372,7 +4257,7 @@
       <w:outlineLvl w:val="3"/>
     </w:pPr>
     <w:rPr>
-      <w:rFonts w:eastAsia="" w:cs="" w:cstheme="majorBidi" w:eastAsiaTheme="majorEastAsia"/>
+      <w:rFonts w:eastAsia="" w:cs="" w:eastAsiaTheme="majorEastAsia" w:cstheme="majorBidi"/>
       <w:iCs/>
     </w:rPr>
   </w:style>
@@ -3397,8 +4282,8 @@
       <w:outlineLvl w:val="4"/>
     </w:pPr>
     <w:rPr>
-      <w:rFonts w:eastAsia="" w:cs="" w:cstheme="majorBidi" w:eastAsiaTheme="majorEastAsia"/>
-      <w:color w:themeColor="accent1" w:themeShade="bf" w:val="0F4761"/>
+      <w:rFonts w:eastAsia="" w:cs="" w:eastAsiaTheme="majorEastAsia" w:cstheme="majorBidi"/>
+      <w:color w:val="0F4761" w:themeColor="accent1" w:themeShade="bf"/>
     </w:rPr>
   </w:style>
   <w:style w:type="paragraph" w:styleId="Heading6">
@@ -3422,10 +4307,10 @@
       <w:outlineLvl w:val="5"/>
     </w:pPr>
     <w:rPr>
-      <w:rFonts w:eastAsia="" w:cs="" w:cstheme="majorBidi" w:eastAsiaTheme="majorEastAsia"/>
+      <w:rFonts w:eastAsia="" w:cs="" w:eastAsiaTheme="majorEastAsia" w:cstheme="majorBidi"/>
       <w:i/>
       <w:iCs/>
-      <w:color w:themeColor="text1" w:themeTint="a6" w:val="595959"/>
+      <w:color w:val="595959" w:themeColor="text1" w:themeTint="a6"/>
     </w:rPr>
   </w:style>
   <w:style w:type="paragraph" w:styleId="Heading7">
@@ -3449,8 +4334,8 @@
       <w:outlineLvl w:val="6"/>
     </w:pPr>
     <w:rPr>
-      <w:rFonts w:eastAsia="" w:cs="" w:cstheme="majorBidi" w:eastAsiaTheme="majorEastAsia"/>
-      <w:color w:themeColor="text1" w:themeTint="a6" w:val="595959"/>
+      <w:rFonts w:eastAsia="" w:cs="" w:eastAsiaTheme="majorEastAsia" w:cstheme="majorBidi"/>
+      <w:color w:val="595959" w:themeColor="text1" w:themeTint="a6"/>
     </w:rPr>
   </w:style>
   <w:style w:type="paragraph" w:styleId="Heading8">
@@ -3474,10 +4359,10 @@
       <w:outlineLvl w:val="7"/>
     </w:pPr>
     <w:rPr>
-      <w:rFonts w:eastAsia="" w:cs="" w:cstheme="majorBidi" w:eastAsiaTheme="majorEastAsia"/>
+      <w:rFonts w:eastAsia="" w:cs="" w:eastAsiaTheme="majorEastAsia" w:cstheme="majorBidi"/>
       <w:i/>
       <w:iCs/>
-      <w:color w:themeColor="text1" w:themeTint="d8" w:val="272727"/>
+      <w:color w:val="272727" w:themeColor="text1" w:themeTint="d8"/>
     </w:rPr>
   </w:style>
   <w:style w:type="paragraph" w:styleId="Heading9">
@@ -3501,8 +4386,8 @@
       <w:outlineLvl w:val="8"/>
     </w:pPr>
     <w:rPr>
-      <w:rFonts w:eastAsia="" w:cs="" w:cstheme="majorBidi" w:eastAsiaTheme="majorEastAsia"/>
-      <w:color w:themeColor="text1" w:themeTint="d8" w:val="272727"/>
+      <w:rFonts w:eastAsia="" w:cs="" w:eastAsiaTheme="majorEastAsia" w:cstheme="majorBidi"/>
+      <w:color w:val="272727" w:themeColor="text1" w:themeTint="d8"/>
     </w:rPr>
   </w:style>
   <w:style w:type="character" w:styleId="DefaultParagraphFont" w:default="1">
@@ -3521,7 +4406,7 @@
     <w:qFormat/>
     <w:rsid w:val="00f351c2"/>
     <w:rPr>
-      <w:rFonts w:ascii="Proxima Nova Medium" w:hAnsi="Proxima Nova Medium" w:eastAsia="" w:cs="" w:cstheme="majorBidi" w:eastAsiaTheme="majorEastAsia"/>
+      <w:rFonts w:ascii="Proxima Nova Medium" w:hAnsi="Proxima Nova Medium" w:eastAsia="" w:cs="" w:eastAsiaTheme="majorEastAsia" w:cstheme="majorBidi"/>
       <w:b/>
       <w:sz w:val="40"/>
       <w:szCs w:val="40"/>
@@ -3535,7 +4420,7 @@
     <w:qFormat/>
     <w:rsid w:val="00f351c2"/>
     <w:rPr>
-      <w:rFonts w:ascii="Proxima Nova Medium" w:hAnsi="Proxima Nova Medium" w:eastAsia="" w:cs="" w:cstheme="majorBidi" w:eastAsiaTheme="majorEastAsia"/>
+      <w:rFonts w:ascii="Proxima Nova Medium" w:hAnsi="Proxima Nova Medium" w:eastAsia="" w:cs="" w:eastAsiaTheme="majorEastAsia" w:cstheme="majorBidi"/>
       <w:b/>
       <w:sz w:val="32"/>
       <w:szCs w:val="32"/>
@@ -3549,7 +4434,7 @@
     <w:qFormat/>
     <w:rsid w:val="0074022a"/>
     <w:rPr>
-      <w:rFonts w:ascii="Proxima Nova Medium" w:hAnsi="Proxima Nova Medium" w:eastAsia="" w:cs="" w:cstheme="majorBidi" w:eastAsiaTheme="majorEastAsia"/>
+      <w:rFonts w:ascii="Proxima Nova Medium" w:hAnsi="Proxima Nova Medium" w:eastAsia="" w:cs="" w:eastAsiaTheme="majorEastAsia" w:cstheme="majorBidi"/>
       <w:sz w:val="28"/>
       <w:szCs w:val="28"/>
     </w:rPr>
@@ -3563,7 +4448,7 @@
     <w:qFormat/>
     <w:rsid w:val="00a1493a"/>
     <w:rPr>
-      <w:rFonts w:ascii="Proxima Nova Medium" w:hAnsi="Proxima Nova Medium" w:eastAsia="" w:cs="" w:cstheme="majorBidi" w:eastAsiaTheme="majorEastAsia"/>
+      <w:rFonts w:ascii="Proxima Nova Medium" w:hAnsi="Proxima Nova Medium" w:eastAsia="" w:cs="" w:eastAsiaTheme="majorEastAsia" w:cstheme="majorBidi"/>
       <w:iCs/>
     </w:rPr>
   </w:style>
@@ -3576,8 +4461,8 @@
     <w:qFormat/>
     <w:rsid w:val="006a7e05"/>
     <w:rPr>
-      <w:rFonts w:eastAsia="" w:cs="" w:cstheme="majorBidi" w:eastAsiaTheme="majorEastAsia"/>
-      <w:color w:themeColor="accent1" w:themeShade="bf" w:val="0F4761"/>
+      <w:rFonts w:eastAsia="" w:cs="" w:eastAsiaTheme="majorEastAsia" w:cstheme="majorBidi"/>
+      <w:color w:val="0F4761" w:themeColor="accent1" w:themeShade="bf"/>
     </w:rPr>
   </w:style>
   <w:style w:type="character" w:styleId="Heading6Char" w:customStyle="1">
@@ -3589,10 +4474,10 @@
     <w:qFormat/>
     <w:rsid w:val="006a7e05"/>
     <w:rPr>
-      <w:rFonts w:eastAsia="" w:cs="" w:cstheme="majorBidi" w:eastAsiaTheme="majorEastAsia"/>
+      <w:rFonts w:eastAsia="" w:cs="" w:eastAsiaTheme="majorEastAsia" w:cstheme="majorBidi"/>
       <w:i/>
       <w:iCs/>
-      <w:color w:themeColor="text1" w:themeTint="a6" w:val="595959"/>
+      <w:color w:val="595959" w:themeColor="text1" w:themeTint="a6"/>
     </w:rPr>
   </w:style>
   <w:style w:type="character" w:styleId="Heading7Char" w:customStyle="1">
@@ -3604,8 +4489,8 @@
     <w:qFormat/>
     <w:rsid w:val="006a7e05"/>
     <w:rPr>
-      <w:rFonts w:eastAsia="" w:cs="" w:cstheme="majorBidi" w:eastAsiaTheme="majorEastAsia"/>
-      <w:color w:themeColor="text1" w:themeTint="a6" w:val="595959"/>
+      <w:rFonts w:eastAsia="" w:cs="" w:eastAsiaTheme="majorEastAsia" w:cstheme="majorBidi"/>
+      <w:color w:val="595959" w:themeColor="text1" w:themeTint="a6"/>
     </w:rPr>
   </w:style>
   <w:style w:type="character" w:styleId="Heading8Char" w:customStyle="1">
@@ -3617,10 +4502,10 @@
     <w:qFormat/>
     <w:rsid w:val="006a7e05"/>
     <w:rPr>
-      <w:rFonts w:eastAsia="" w:cs="" w:cstheme="majorBidi" w:eastAsiaTheme="majorEastAsia"/>
+      <w:rFonts w:eastAsia="" w:cs="" w:eastAsiaTheme="majorEastAsia" w:cstheme="majorBidi"/>
       <w:i/>
       <w:iCs/>
-      <w:color w:themeColor="text1" w:themeTint="d8" w:val="272727"/>
+      <w:color w:val="272727" w:themeColor="text1" w:themeTint="d8"/>
     </w:rPr>
   </w:style>
   <w:style w:type="character" w:styleId="Heading9Char" w:customStyle="1">
@@ -3632,8 +4517,8 @@
     <w:qFormat/>
     <w:rsid w:val="006a7e05"/>
     <w:rPr>
-      <w:rFonts w:eastAsia="" w:cs="" w:cstheme="majorBidi" w:eastAsiaTheme="majorEastAsia"/>
-      <w:color w:themeColor="text1" w:themeTint="d8" w:val="272727"/>
+      <w:rFonts w:eastAsia="" w:cs="" w:eastAsiaTheme="majorEastAsia" w:cstheme="majorBidi"/>
+      <w:color w:val="272727" w:themeColor="text1" w:themeTint="d8"/>
     </w:rPr>
   </w:style>
   <w:style w:type="character" w:styleId="TitleChar" w:customStyle="1">
@@ -3644,7 +4529,7 @@
     <w:qFormat/>
     <w:rsid w:val="00a1493a"/>
     <w:rPr>
-      <w:rFonts w:ascii="Proxima Nova Medium" w:hAnsi="Proxima Nova Medium" w:eastAsia="" w:cs="" w:cstheme="majorBidi" w:eastAsiaTheme="majorEastAsia"/>
+      <w:rFonts w:ascii="Proxima Nova Medium" w:hAnsi="Proxima Nova Medium" w:eastAsia="" w:cs="" w:eastAsiaTheme="majorEastAsia" w:cstheme="majorBidi"/>
       <w:b/>
       <w:color w:val="00808B"/>
       <w:spacing w:val="-10"/>
@@ -3661,7 +4546,7 @@
     <w:qFormat/>
     <w:rsid w:val="00a1493a"/>
     <w:rPr>
-      <w:rFonts w:ascii="Proxima Nova Medium" w:hAnsi="Proxima Nova Medium" w:eastAsia="" w:cs="" w:cstheme="majorBidi" w:eastAsiaTheme="majorEastAsia"/>
+      <w:rFonts w:ascii="Proxima Nova Medium" w:hAnsi="Proxima Nova Medium" w:eastAsia="" w:cs="" w:eastAsiaTheme="majorEastAsia" w:cstheme="majorBidi"/>
       <w:spacing w:val="15"/>
       <w:sz w:val="28"/>
       <w:szCs w:val="28"/>
@@ -3727,7 +4612,7 @@
     <w:unhideWhenUsed/>
     <w:rsid w:val="00a55c2e"/>
     <w:rPr>
-      <w:color w:themeColor="hyperlink" w:val="467886"/>
+      <w:color w:val="467886" w:themeColor="hyperlink"/>
       <w:u w:val="single"/>
     </w:rPr>
   </w:style>
@@ -3741,7 +4626,7 @@
     <w:rsid w:val="00a55c2e"/>
     <w:rPr>
       <w:color w:val="605E5C"/>
-      <w:shd w:fill="E1DFDD" w:val="clear"/>
+      <w:shd w:val="clear" w:fill="E1DFDD"/>
     </w:rPr>
   </w:style>
   <w:style w:type="character" w:styleId="HeaderChar" w:customStyle="1">
@@ -3797,7 +4682,7 @@
     <w:rsid w:val="002127d5"/>
     <w:rPr>
       <w:smallCaps/>
-      <w:color w:themeColor="text1" w:val="000000"/>
+      <w:color w:val="000000" w:themeColor="text1"/>
     </w:rPr>
   </w:style>
   <w:style w:type="character" w:styleId="BookTitle">
@@ -3838,7 +4723,7 @@
     <w:name w:val="Body Text"/>
     <w:basedOn w:val="Normal"/>
     <w:pPr>
-      <w:spacing w:lineRule="auto" w:line="276" w:before="0" w:after="140"/>
+      <w:spacing w:before="0" w:after="140" w:line="276" w:lineRule="auto"/>
     </w:pPr>
     <w:rPr/>
   </w:style>
@@ -3855,17 +4740,16 @@
     <w:basedOn w:val="Normal"/>
     <w:next w:val="Normal"/>
     <w:uiPriority w:val="35"/>
-    <w:semiHidden/>
     <w:unhideWhenUsed/>
     <w:qFormat/>
     <w:rsid w:val="002127d5"/>
     <w:pPr>
-      <w:spacing w:lineRule="auto" w:line="240" w:before="0" w:after="200"/>
+      <w:spacing w:before="0" w:after="200" w:line="240" w:lineRule="auto"/>
     </w:pPr>
     <w:rPr>
       <w:i/>
       <w:iCs/>
-      <w:color w:themeColor="text1" w:val="000000"/>
+      <w:color w:val="000000" w:themeColor="text1"/>
       <w:sz w:val="18"/>
       <w:szCs w:val="18"/>
     </w:rPr>
@@ -3890,11 +4774,11 @@
     <w:qFormat/>
     <w:rsid w:val="00a1493a"/>
     <w:pPr>
-      <w:spacing w:lineRule="auto" w:line="240" w:before="0" w:after="80"/>
+      <w:spacing w:before="0" w:after="80" w:line="240" w:lineRule="auto"/>
       <w:contextualSpacing/>
     </w:pPr>
     <w:rPr>
-      <w:rFonts w:eastAsia="" w:cs="" w:cstheme="majorBidi" w:eastAsiaTheme="majorEastAsia"/>
+      <w:rFonts w:eastAsia="" w:cs="" w:eastAsiaTheme="majorEastAsia" w:cstheme="majorBidi"/>
       <w:b/>
       <w:color w:val="00808B"/>
       <w:spacing w:val="-10"/>
@@ -3913,7 +4797,7 @@
     <w:rsid w:val="00a1493a"/>
     <w:pPr/>
     <w:rPr>
-      <w:rFonts w:eastAsia="" w:cs="" w:cstheme="majorBidi" w:eastAsiaTheme="majorEastAsia"/>
+      <w:rFonts w:eastAsia="" w:cs="" w:eastAsiaTheme="majorEastAsia" w:cstheme="majorBidi"/>
       <w:spacing w:val="15"/>
       <w:sz w:val="28"/>
       <w:szCs w:val="28"/>
@@ -3959,8 +4843,8 @@
     <w:rsid w:val="002127d5"/>
     <w:pPr>
       <w:pBdr>
-        <w:top w:val="single" w:sz="4" w:space="10" w:color="0F4761" w:themeColor="accent1" w:themeShade="bf"/>
-        <w:bottom w:val="single" w:sz="4" w:space="10" w:color="0F4761" w:themeColor="accent1" w:themeShade="bf"/>
+        <w:top w:val="single" w:color="0F4761" w:themeColor="accent1" w:themeShade="bf" w:sz="4" w:space="10"/>
+        <w:bottom w:val="single" w:color="0F4761" w:themeColor="accent1" w:themeShade="bf" w:sz="4" w:space="10"/>
       </w:pBdr>
       <w:spacing w:before="360" w:after="360"/>
       <w:ind w:start="864" w:end="864"/>
@@ -3979,13 +4863,12 @@
     <w:rsid w:val="00a55c2e"/>
     <w:pPr>
       <w:widowControl/>
-      <w:suppressAutoHyphens w:val="true"/>
       <w:bidi w:val="0"/>
-      <w:spacing w:lineRule="auto" w:line="240" w:before="0" w:after="0"/>
+      <w:spacing w:before="0" w:after="0" w:line="240" w:lineRule="auto"/>
       <w:jc w:val="both"/>
     </w:pPr>
     <w:rPr>
-      <w:rFonts w:ascii="Proxima Nova Medium" w:hAnsi="Proxima Nova Medium" w:eastAsia="Aptos" w:cs="" w:cstheme="minorBidi" w:eastAsiaTheme="minorHAnsi"/>
+      <w:rFonts w:ascii="Proxima Nova Medium" w:hAnsi="Proxima Nova Medium" w:eastAsia="Aptos" w:cs="" w:eastAsiaTheme="minorHAnsi" w:cstheme="minorBidi"/>
       <w:color w:val="auto"/>
       <w:kern w:val="2"/>
       <w:sz w:val="22"/>
@@ -4011,10 +4894,10 @@
     <w:pPr>
       <w:tabs>
         <w:tab w:val="clear" w:pos="720"/>
-        <w:tab w:val="center" w:pos="4513" w:leader="none"/>
-        <w:tab w:val="right" w:pos="9026" w:leader="none"/>
+        <w:tab w:val="center" w:leader="none" w:pos="4513"/>
+        <w:tab w:val="right" w:leader="none" w:pos="9026"/>
       </w:tabs>
-      <w:spacing w:lineRule="auto" w:line="240" w:before="0" w:after="0"/>
+      <w:spacing w:before="0" w:after="0" w:line="240" w:lineRule="auto"/>
     </w:pPr>
     <w:rPr/>
   </w:style>
@@ -4028,10 +4911,10 @@
     <w:pPr>
       <w:tabs>
         <w:tab w:val="clear" w:pos="720"/>
-        <w:tab w:val="center" w:pos="4513" w:leader="none"/>
-        <w:tab w:val="right" w:pos="9026" w:leader="none"/>
+        <w:tab w:val="center" w:leader="none" w:pos="4513"/>
+        <w:tab w:val="right" w:leader="none" w:pos="9026"/>
       </w:tabs>
-      <w:spacing w:lineRule="auto" w:line="240" w:before="0" w:after="0"/>
+      <w:spacing w:before="0" w:after="0" w:line="240" w:lineRule="auto"/>
     </w:pPr>
     <w:rPr/>
   </w:style>
@@ -4112,7 +4995,6 @@
     <w:basedOn w:val="Normal"/>
     <w:next w:val="Normal"/>
     <w:uiPriority w:val="37"/>
-    <w:semiHidden/>
     <w:unhideWhenUsed/>
     <w:qFormat/>
     <w:rsid w:val="002127d5"/>
@@ -4157,6 +5039,13 @@
     <w:pPr/>
     <w:rPr/>
   </w:style>
+  <w:style w:type="paragraph" w:styleId="FrameContents">
+    <w:name w:val="Frame Contents"/>
+    <w:basedOn w:val="Normal"/>
+    <w:qFormat/>
+    <w:pPr/>
+    <w:rPr/>
+  </w:style>
   <w:style w:type="numbering" w:styleId="NoList" w:default="1">
     <w:name w:val="No List"/>
     <w:uiPriority w:val="99"/>
@@ -4170,7 +5059,7 @@
     <w:qFormat/>
     <w:rsid w:val="00d751f5"/>
   </w:style>
-  <w:style w:type="table" w:default="1" w:styleId="TableNormal">
+  <w:style w:type="table" w:styleId="TableNormal" w:default="1">
     <w:name w:val="Normal Table"/>
     <w:uiPriority w:val="99"/>
     <w:semiHidden/>
@@ -4203,7 +5092,7 @@
       </w:tblBorders>
     </w:tblPr>
   </w:style>
-  <w:style w:type="table" w:customStyle="1" w:styleId="AAGITableStyle">
+  <w:style w:type="table" w:styleId="AAGITableStyle" w:customStyle="1">
     <w:name w:val="AAGI Table Style"/>
     <w:basedOn w:val="TableNormal"/>
     <w:uiPriority w:val="99"/>
@@ -4412,11 +5301,33 @@
 </file>
 
 <file path=customXml/item1.xml><?xml version="1.0" encoding="utf-8"?>
-<b:Sources xmlns:b="http://schemas.openxmlformats.org/officeDocument/2006/bibliography" xmlns="http://schemas.openxmlformats.org/officeDocument/2006/bibliography" SelectedStyle="\APASixthEditionOfficeOnline.xsl" StyleName="APA" Version="6"/>
+<b:Sources xmlns:b="http://schemas.openxmlformats.org/officeDocument/2006/bibliography" xmlns="http://schemas.openxmlformats.org/officeDocument/2006/bibliography" SelectedStyle="\APASixthEditionOfficeOnline.xsl" StyleName="APA" Version="6">
+  <b:Source>
+    <b:Tag>Per24</b:Tag>
+    <b:SourceType>JournalArticle</b:SourceType>
+    <b:Guid>{A443AC97-F818-4623-AB13-CF3BEB545802}</b:Guid>
+    <b:Author>
+      <b:Author>
+        <b:NameList>
+          <b:Person>
+            <b:Last>Person</b:Last>
+            <b:First>M.</b:First>
+          </b:Person>
+        </b:NameList>
+      </b:Author>
+    </b:Author>
+    <b:Title>My article title goes here.</b:Title>
+    <b:Year>2024</b:Year>
+    <b:JournalName>My Journal</b:JournalName>
+    <b:Pages>pp. 12-34</b:Pages>
+    <b:Volume>13</b:Volume>
+    <b:RefOrder>1</b:RefOrder>
+  </b:Source>
+</b:Sources>
 </file>
 
 <file path=customXml/itemProps1.xml><?xml version="1.0" encoding="utf-8"?>
-<ds:datastoreItem xmlns:ds="http://schemas.openxmlformats.org/officeDocument/2006/customXml" ds:itemID="{C5902AB7-7299-492C-8233-D6FA0A4A35F8}">
+<ds:datastoreItem xmlns:ds="http://schemas.openxmlformats.org/officeDocument/2006/customXml" ds:itemID="{66F879C7-5B81-43EF-B337-BD67F7649EF6}">
   <ds:schemaRefs>
     <ds:schemaRef ds:uri="http://schemas.openxmlformats.org/officeDocument/2006/bibliography"/>
   </ds:schemaRefs>

</xml_diff>

<commit_message>
fix logo blocks in templates
</commit_message>
<xml_diff>
--- a/_extensions/aagi/docx-report/template.docx
+++ b/_extensions/aagi/docx-report/template.docx
@@ -1,6 +1,6 @@
 
 <file path=word/document.xml><?xml version="1.0" encoding="utf-8"?>
-<w:document xmlns:o="urn:schemas-microsoft-com:office:office" xmlns:r="http://schemas.openxmlformats.org/officeDocument/2006/relationships" xmlns:v="urn:schemas-microsoft-com:vml" xmlns:w="http://schemas.openxmlformats.org/wordprocessingml/2006/main" xmlns:w10="urn:schemas-microsoft-com:office:word" xmlns:wp="http://schemas.openxmlformats.org/drawingml/2006/wordprocessingDrawing" xmlns:pic="http://schemas.openxmlformats.org/drawingml/2006/picture" xmlns:wps="http://schemas.microsoft.com/office/word/2010/wordprocessingShape" xmlns:wpg="http://schemas.microsoft.com/office/word/2010/wordprocessingGroup" xmlns:mc="http://schemas.openxmlformats.org/markup-compatibility/2006" xmlns:wp14="http://schemas.microsoft.com/office/word/2010/wordprocessingDrawing" xmlns:w14="http://schemas.microsoft.com/office/word/2010/wordml" xmlns:w15="http://schemas.microsoft.com/office/word/2012/wordml" xmlns:a="http://schemas.openxmlformats.org/drawingml/2006/main" xmlns:asvg="http://schemas.microsoft.com/office/drawing/2016/SVG/main" mc:Ignorable="w14 wp14 w15">
+<w:document xmlns:o="urn:schemas-microsoft-com:office:office" xmlns:r="http://schemas.openxmlformats.org/officeDocument/2006/relationships" xmlns:v="urn:schemas-microsoft-com:vml" xmlns:w="http://schemas.openxmlformats.org/wordprocessingml/2006/main" xmlns:w10="urn:schemas-microsoft-com:office:word" xmlns:wp="http://schemas.openxmlformats.org/drawingml/2006/wordprocessingDrawing" xmlns:pic="http://schemas.openxmlformats.org/drawingml/2006/picture" xmlns:wps="http://schemas.microsoft.com/office/word/2010/wordprocessingShape" xmlns:wpg="http://schemas.microsoft.com/office/word/2010/wordprocessingGroup" xmlns:mc="http://schemas.openxmlformats.org/markup-compatibility/2006" xmlns:wp14="http://schemas.microsoft.com/office/word/2010/wordprocessingDrawing" xmlns:w14="http://schemas.microsoft.com/office/word/2010/wordml" xmlns:w15="http://schemas.microsoft.com/office/word/2012/wordml" xmlns:a="http://schemas.openxmlformats.org/drawingml/2006/main" xmlns:asvg="http://schemas.microsoft.com/office/drawing/2016/SVG/main" xmlns:a14="http://schemas.microsoft.com/office/drawing/2010/main" mc:Ignorable="w14 wp14 w15">
   <w:body>
     <w:p xmlns:wp14="http://schemas.microsoft.com/office/word/2010/wordml" wp14:textId="77777777">
       <w:pPr>
@@ -11,7 +11,7 @@
       <w:r>
         <w:rPr/>
         <w:drawing>
-          <wp:anchor xmlns:wp14="http://schemas.microsoft.com/office/word/2010/wordprocessingDrawing" distT="0" distB="0" distL="0" distR="0" simplePos="0" relativeHeight="5" behindDoc="0" locked="0" layoutInCell="1" allowOverlap="1" wp14:anchorId="428686F0" wp14:editId="7777777">
+          <wp:anchor xmlns:wp14="http://schemas.microsoft.com/office/word/2010/wordprocessingDrawing" distT="0" distB="0" distL="0" distR="0" simplePos="0" relativeHeight="5" behindDoc="0" locked="0" layoutInCell="1" allowOverlap="1" wp14:anchorId="18DFEAFD" wp14:editId="7777777">
             <wp:simplePos x="0" y="0"/>
             <wp:positionH relativeFrom="column">
               <wp:posOffset>1711325</wp:posOffset>
@@ -330,63 +330,9 @@
         <w:rPr/>
       </w:r>
     </w:p>
-    <w:p xmlns:wp14="http://schemas.microsoft.com/office/word/2010/wordml" wp14:textId="77777777">
-      <w:pPr>
-        <w:pStyle w:val="Normal"/>
-        <w:rPr/>
-      </w:pPr>
-      <w:r>
-        <w:rPr/>
-        <w:drawing>
-          <wp:anchor xmlns:wp14="http://schemas.microsoft.com/office/word/2010/wordprocessingDrawing" distT="0" distB="0" distL="0" distR="0" simplePos="0" relativeHeight="6" behindDoc="0" locked="0" layoutInCell="1" allowOverlap="1" wp14:anchorId="5E6F0FE6" wp14:editId="7777777">
-            <wp:simplePos x="0" y="0"/>
-            <wp:positionH relativeFrom="column">
-              <wp:posOffset>-882650</wp:posOffset>
-            </wp:positionH>
-            <wp:positionV relativeFrom="page">
-              <wp:posOffset>9592310</wp:posOffset>
-            </wp:positionV>
-            <wp:extent cx="7499350" cy="1067435"/>
-            <wp:effectExtent l="0" t="0" r="0" b="0"/>
-            <wp:wrapNone/>
-            <wp:docPr id="2" name="Picture 3" descr="A black and purple logo&#10;&#10;Description automatically generated"/>
-            <wp:cNvGraphicFramePr>
-              <a:graphicFrameLocks xmlns:a="http://schemas.openxmlformats.org/drawingml/2006/main" noChangeAspect="1"/>
-            </wp:cNvGraphicFramePr>
-            <a:graphic xmlns:a="http://schemas.openxmlformats.org/drawingml/2006/main">
-              <a:graphicData uri="http://schemas.openxmlformats.org/drawingml/2006/picture">
-                <pic:pic xmlns:pic="http://schemas.openxmlformats.org/drawingml/2006/picture">
-                  <pic:nvPicPr>
-                    <pic:cNvPr id="2" name="Picture 3" descr="A black and purple logo&#10;&#10;Description automatically generated"/>
-                    <pic:cNvPicPr>
-                      <a:picLocks noChangeAspect="1" noChangeArrowheads="1"/>
-                    </pic:cNvPicPr>
-                  </pic:nvPicPr>
-                  <pic:blipFill>
-                    <a:blip r:embed="rId4"/>
-                    <a:stretch>
-                      <a:fillRect/>
-                    </a:stretch>
-                  </pic:blipFill>
-                  <pic:spPr bwMode="auto">
-                    <a:xfrm>
-                      <a:off x="0" y="0"/>
-                      <a:ext cx="7499350" cy="1067435"/>
-                    </a:xfrm>
-                    <a:prstGeom prst="rect">
-                      <a:avLst/>
-                    </a:prstGeom>
-                    <a:noFill/>
-                  </pic:spPr>
-                </pic:pic>
-              </a:graphicData>
-            </a:graphic>
-          </wp:anchor>
-        </w:drawing>
-      </w:r>
-    </w:p>
-    <w:p xmlns:wp14="http://schemas.microsoft.com/office/word/2010/wordml" wp14:textId="77777777">
-      <w:pPr>
+    <w:p xmlns:wp14="http://schemas.microsoft.com/office/word/2010/wordml" wp14:textId="074B6431">
+      <w:pPr>
+        <w:pStyle w:val="Normal"/>
         <w:sectPr>
           <w:footerReference w:type="even" r:id="rId5"/>
           <w:footerReference w:type="default" r:id="rId6"/>
@@ -401,10 +347,53 @@
           <w:cols w:num="1"/>
         </w:sectPr>
       </w:pPr>
+      <w:r>
+        <w:drawing>
+          <wp:inline xmlns:wp14="http://schemas.microsoft.com/office/word/2010/wordprocessingDrawing" wp14:editId="2A10449E" wp14:anchorId="1B0AAC32">
+            <wp:extent cx="5724525" cy="676469"/>
+            <wp:effectExtent l="0" t="0" r="0" b="0"/>
+            <wp:docPr id="786749483" name="drawing"/>
+            <wp:cNvGraphicFramePr>
+              <a:graphicFrameLocks noChangeAspect="1"/>
+            </wp:cNvGraphicFramePr>
+            <a:graphic>
+              <a:graphicData xmlns:a="http://schemas.openxmlformats.org/drawingml/2006/main" uri="http://schemas.openxmlformats.org/drawingml/2006/picture">
+                <pic:pic xmlns:pic="http://schemas.openxmlformats.org/drawingml/2006/picture">
+                  <pic:nvPicPr>
+                    <pic:cNvPr id="786749483" name="Picture 786749483"/>
+                    <pic:cNvPicPr/>
+                  </pic:nvPicPr>
+                  <pic:blipFill>
+                    <a:blip xmlns:r="http://schemas.openxmlformats.org/officeDocument/2006/relationships" r:embed="rId1597277537">
+                      <a:extLst>
+                        <a:ext uri="{28A0092B-C50C-407E-A947-70E740481C1C}">
+                          <a14:useLocalDpi xmlns:a14="http://schemas.microsoft.com/office/drawing/2010/main"/>
+                        </a:ext>
+                      </a:extLst>
+                    </a:blip>
+                    <a:stretch>
+                      <a:fillRect/>
+                    </a:stretch>
+                  </pic:blipFill>
+                  <pic:spPr>
+                    <a:xfrm rot="0">
+                      <a:off x="0" y="0"/>
+                      <a:ext cx="5724525" cy="676469"/>
+                    </a:xfrm>
+                    <a:prstGeom prst="rect">
+                      <a:avLst/>
+                    </a:prstGeom>
+                  </pic:spPr>
+                </pic:pic>
+              </a:graphicData>
+            </a:graphic>
+          </wp:inline>
+        </w:drawing>
+      </w:r>
     </w:p>
     <w:sdt>
       <w:sdtPr>
-        <w:id w:val="766479596"/>
+        <w:id w:val="779352273"/>
         <w:docPartObj>
           <w:docPartGallery w:val="Table of Contents"/>
           <w:docPartUnique w:val="true"/>
@@ -1639,7 +1628,7 @@
       </w:r>
       <w:sdt>
         <w:sdtPr>
-          <w:id w:val="1360608322"/>
+          <w:id w:val="1748216628"/>
           <w:citation/>
         </w:sdtPr>
         <w:sdtContent>
@@ -1671,7 +1660,7 @@
       </w:r>
       <w:sdt>
         <w:sdtPr>
-          <w:id w:val="2077282405"/>
+          <w:id w:val="1360546068"/>
           <w:citation/>
         </w:sdtPr>
         <w:sdtContent>
@@ -2296,7 +2285,7 @@
             </w:drawing>
           </mc:Choice>
           <mc:Fallback>
-            <w:pict w14:anchorId="11940D62">
+            <w:pict w14:anchorId="4BF69924">
               <v:group id="shape_0" style="position:absolute;margin-left:0pt;margin-top:-66.05pt;width:451.3pt;height:65.3pt" alt="Group 1" coordsize="9026,1306" coordorigin="0,-1321">
                 <v:rect id="shape_0" style="position:absolute;left:0;top:-1321;width:9025;height:1305;mso-wrap-style:none;v-text-anchor:middle;mso-position-vertical:top" o:allowincell="f" fillcolor="#f2fcf9" stroked="f">
                   <v:fill type="solid" color2="#0d0306" o:detectmouseclick="t"/>
@@ -3616,7 +3605,7 @@
       </w:pPr>
       <w:rPr/>
     </w:lvl>
-    <w:nsid w:val="226b57c8"/>
+    <w:nsid w:val="78c4657a"/>
   </w:abstractNum>
   <w:abstractNum w:abstractNumId="2">
     <w:lvl w:ilvl="0">
@@ -3736,7 +3725,7 @@
       </w:pPr>
       <w:rPr/>
     </w:lvl>
-    <w:nsid w:val="4fec917a"/>
+    <w:nsid w:val="74ccf13a"/>
   </w:abstractNum>
   <w:num w:numId="1">
     <w:abstractNumId w:val="1"/>

</xml_diff>

<commit_message>
update MS Office template logo blocks
</commit_message>
<xml_diff>
--- a/_extensions/aagi/docx-report/template.docx
+++ b/_extensions/aagi/docx-report/template.docx
@@ -1,17 +1,17 @@
 
 <file path=word/document.xml><?xml version="1.0" encoding="utf-8"?>
-<w:document xmlns:o="urn:schemas-microsoft-com:office:office" xmlns:r="http://schemas.openxmlformats.org/officeDocument/2006/relationships" xmlns:v="urn:schemas-microsoft-com:vml" xmlns:w="http://schemas.openxmlformats.org/wordprocessingml/2006/main" xmlns:w10="urn:schemas-microsoft-com:office:word" xmlns:wp="http://schemas.openxmlformats.org/drawingml/2006/wordprocessingDrawing" xmlns:pic="http://schemas.openxmlformats.org/drawingml/2006/picture" xmlns:wps="http://schemas.microsoft.com/office/word/2010/wordprocessingShape" xmlns:wpg="http://schemas.microsoft.com/office/word/2010/wordprocessingGroup" xmlns:mc="http://schemas.openxmlformats.org/markup-compatibility/2006" xmlns:wp14="http://schemas.microsoft.com/office/word/2010/wordprocessingDrawing" xmlns:w14="http://schemas.microsoft.com/office/word/2010/wordml" xmlns:w15="http://schemas.microsoft.com/office/word/2012/wordml" xmlns:a="http://schemas.openxmlformats.org/drawingml/2006/main" xmlns:asvg="http://schemas.microsoft.com/office/drawing/2016/SVG/main" xmlns:a14="http://schemas.microsoft.com/office/drawing/2010/main" mc:Ignorable="w14 wp14 w15">
+<w:document xmlns:wpc="http://schemas.microsoft.com/office/word/2010/wordprocessingCanvas" xmlns:cx="http://schemas.microsoft.com/office/drawing/2014/chartex" xmlns:cx1="http://schemas.microsoft.com/office/drawing/2015/9/8/chartex" xmlns:cx2="http://schemas.microsoft.com/office/drawing/2015/10/21/chartex" xmlns:cx3="http://schemas.microsoft.com/office/drawing/2016/5/9/chartex" xmlns:cx4="http://schemas.microsoft.com/office/drawing/2016/5/10/chartex" xmlns:cx5="http://schemas.microsoft.com/office/drawing/2016/5/11/chartex" xmlns:cx6="http://schemas.microsoft.com/office/drawing/2016/5/12/chartex" xmlns:cx7="http://schemas.microsoft.com/office/drawing/2016/5/13/chartex" xmlns:cx8="http://schemas.microsoft.com/office/drawing/2016/5/14/chartex" xmlns:mc="http://schemas.openxmlformats.org/markup-compatibility/2006" xmlns:aink="http://schemas.microsoft.com/office/drawing/2016/ink" xmlns:am3d="http://schemas.microsoft.com/office/drawing/2017/model3d" xmlns:o="urn:schemas-microsoft-com:office:office" xmlns:oel="http://schemas.microsoft.com/office/2019/extlst" xmlns:r="http://schemas.openxmlformats.org/officeDocument/2006/relationships" xmlns:m="http://schemas.openxmlformats.org/officeDocument/2006/math" xmlns:v="urn:schemas-microsoft-com:vml" xmlns:wp14="http://schemas.microsoft.com/office/word/2010/wordprocessingDrawing" xmlns:wp="http://schemas.openxmlformats.org/drawingml/2006/wordprocessingDrawing" xmlns:w10="urn:schemas-microsoft-com:office:word" xmlns:w="http://schemas.openxmlformats.org/wordprocessingml/2006/main" xmlns:w14="http://schemas.microsoft.com/office/word/2010/wordml" xmlns:w15="http://schemas.microsoft.com/office/word/2012/wordml" xmlns:w16cex="http://schemas.microsoft.com/office/word/2018/wordml/cex" xmlns:w16cid="http://schemas.microsoft.com/office/word/2016/wordml/cid" xmlns:w16="http://schemas.microsoft.com/office/word/2018/wordml" xmlns:w16du="http://schemas.microsoft.com/office/word/2023/wordml/word16du" xmlns:w16sdtdh="http://schemas.microsoft.com/office/word/2020/wordml/sdtdatahash" xmlns:w16sdtfl="http://schemas.microsoft.com/office/word/2024/wordml/sdtformatlock" xmlns:w16se="http://schemas.microsoft.com/office/word/2015/wordml/symex" xmlns:wpg="http://schemas.microsoft.com/office/word/2010/wordprocessingGroup" xmlns:wpi="http://schemas.microsoft.com/office/word/2010/wordprocessingInk" xmlns:wne="http://schemas.microsoft.com/office/word/2006/wordml" xmlns:wps="http://schemas.microsoft.com/office/word/2010/wordprocessingShape" mc:Ignorable="w14 w15 w16se w16cid w16 w16cex w16sdtdh w16sdtfl w16du wp14">
   <w:body>
-    <w:p xmlns:wp14="http://schemas.microsoft.com/office/word/2010/wordml" wp14:textId="77777777">
-      <w:pPr>
-        <w:pStyle w:val="Normal"/>
+    <w:p>
+      <w:pPr>
         <w:jc w:val="center"/>
-        <w:rPr/>
-      </w:pPr>
-      <w:r>
-        <w:rPr/>
+      </w:pPr>
+      <w:r>
+        <w:rPr>
+          <w:noProof/>
+        </w:rPr>
         <w:drawing>
-          <wp:anchor xmlns:wp14="http://schemas.microsoft.com/office/word/2010/wordprocessingDrawing" distT="0" distB="0" distL="0" distR="0" simplePos="0" relativeHeight="5" behindDoc="0" locked="0" layoutInCell="1" allowOverlap="1" wp14:anchorId="18DFEAFD" wp14:editId="7777777">
+          <wp:anchor distT="0" distB="0" distL="0" distR="0" simplePos="0" relativeHeight="5" behindDoc="0" locked="0" layoutInCell="1" allowOverlap="1" wp14:anchorId="18DFEAFD" wp14:editId="07777777">
             <wp:simplePos x="0" y="0"/>
             <wp:positionH relativeFrom="column">
               <wp:posOffset>1711325</wp:posOffset>
@@ -36,7 +36,7 @@
                     </pic:cNvPicPr>
                   </pic:nvPicPr>
                   <pic:blipFill>
-                    <a:blip r:embed="rId2"/>
+                    <a:blip r:embed="rId8"/>
                     <a:stretch>
                       <a:fillRect/>
                     </a:stretch>
@@ -58,70 +58,24 @@
         </w:drawing>
       </w:r>
     </w:p>
-    <w:p xmlns:wp14="http://schemas.microsoft.com/office/word/2010/wordml" wp14:textId="77777777">
-      <w:pPr>
-        <w:pStyle w:val="Normal"/>
-        <w:rPr/>
-      </w:pPr>
-      <w:r>
-        <w:rPr/>
-      </w:r>
-    </w:p>
-    <w:p xmlns:wp14="http://schemas.microsoft.com/office/word/2010/wordml" wp14:textId="77777777">
-      <w:pPr>
-        <w:pStyle w:val="Normal"/>
-        <w:rPr/>
-      </w:pPr>
-      <w:r>
-        <w:rPr/>
-      </w:r>
-    </w:p>
-    <w:p xmlns:wp14="http://schemas.microsoft.com/office/word/2010/wordml" wp14:textId="77777777">
-      <w:pPr>
-        <w:pStyle w:val="Normal"/>
-        <w:rPr/>
-      </w:pPr>
-      <w:r>
-        <w:rPr/>
-      </w:r>
-    </w:p>
-    <w:p xmlns:wp14="http://schemas.microsoft.com/office/word/2010/wordml" wp14:textId="77777777">
-      <w:pPr>
-        <w:pStyle w:val="Normal"/>
-        <w:rPr/>
-      </w:pPr>
-      <w:r>
-        <w:rPr/>
-      </w:r>
-    </w:p>
-    <w:p xmlns:wp14="http://schemas.microsoft.com/office/word/2010/wordml" wp14:textId="77777777">
-      <w:pPr>
-        <w:pStyle w:val="Normal"/>
-        <w:rPr/>
-      </w:pPr>
-      <w:r>
-        <w:rPr/>
-      </w:r>
-    </w:p>
-    <w:p xmlns:wp14="http://schemas.microsoft.com/office/word/2010/wordml" wp14:textId="77777777">
-      <w:pPr>
-        <w:pStyle w:val="Normal"/>
+    <w:p/>
+    <w:p/>
+    <w:p/>
+    <w:p/>
+    <w:p/>
+    <w:p>
+      <w:pPr>
         <w:pBdr>
-          <w:bottom w:val="single" w:color="000000" w:sz="18" w:space="1"/>
+          <w:bottom w:val="single" w:sz="18" w:space="1" w:color="000000"/>
         </w:pBdr>
-        <w:jc w:val="end"/>
-        <w:rPr/>
-      </w:pPr>
-      <w:r>
-        <w:rPr/>
-      </w:r>
-    </w:p>
-    <w:p xmlns:wp14="http://schemas.microsoft.com/office/word/2010/wordml" wp14:textId="77777777">
+        <w:jc w:val="right"/>
+      </w:pPr>
+    </w:p>
+    <w:p>
       <w:pPr>
         <w:pStyle w:val="Title"/>
-        <w:spacing w:before="240" w:after="80"/>
-        <w:contextualSpacing/>
-        <w:jc w:val="end"/>
+        <w:spacing w:before="240"/>
+        <w:jc w:val="right"/>
         <w:rPr>
           <w:szCs w:val="48"/>
         </w:rPr>
@@ -133,10 +87,10 @@
         <w:t>Analytics for the Australian Grains Industry</w:t>
       </w:r>
     </w:p>
-    <w:p xmlns:wp14="http://schemas.microsoft.com/office/word/2010/wordml" wp14:textId="77777777">
+    <w:p>
       <w:pPr>
         <w:pStyle w:val="Title"/>
-        <w:jc w:val="end"/>
+        <w:jc w:val="right"/>
         <w:rPr>
           <w:szCs w:val="48"/>
         </w:rPr>
@@ -148,11 +102,11 @@
         <w:t>&lt;University Name&gt; (AAGI-&lt;XX&gt;)</w:t>
       </w:r>
     </w:p>
-    <w:p xmlns:wp14="http://schemas.microsoft.com/office/word/2010/wordml" wp14:textId="77777777">
+    <w:p>
       <w:pPr>
         <w:pStyle w:val="Title"/>
         <w:spacing w:line="360" w:lineRule="auto"/>
-        <w:jc w:val="end"/>
+        <w:jc w:val="right"/>
         <w:rPr>
           <w:szCs w:val="48"/>
         </w:rPr>
@@ -164,10 +118,10 @@
         <w:t>&lt;AAGI Program&gt; Report</w:t>
       </w:r>
     </w:p>
-    <w:p xmlns:wp14="http://schemas.microsoft.com/office/word/2010/wordml" wp14:textId="77777777">
+    <w:p>
       <w:pPr>
         <w:pStyle w:val="Title"/>
-        <w:jc w:val="end"/>
+        <w:jc w:val="right"/>
         <w:rPr>
           <w:color w:val="auto"/>
           <w:szCs w:val="48"/>
@@ -181,11 +135,11 @@
         <w:t>&lt;Informative title for report&gt;</w:t>
       </w:r>
     </w:p>
-    <w:p xmlns:wp14="http://schemas.microsoft.com/office/word/2010/wordml" wp14:textId="77777777">
+    <w:p>
       <w:pPr>
         <w:pStyle w:val="Title"/>
         <w:spacing w:line="360" w:lineRule="auto"/>
-        <w:jc w:val="end"/>
+        <w:jc w:val="right"/>
         <w:rPr>
           <w:color w:val="auto"/>
           <w:sz w:val="36"/>
@@ -201,14 +155,11 @@
         <w:t>Report for &lt;GRDC/AAGI Project Code&gt;</w:t>
       </w:r>
     </w:p>
-    <w:p xmlns:wp14="http://schemas.microsoft.com/office/word/2010/wordml" wp14:textId="77777777">
-      <w:pPr>
-        <w:pStyle w:val="Normal"/>
-        <w:jc w:val="end"/>
-        <w:rPr/>
-      </w:pPr>
-      <w:r>
-        <w:rPr/>
+    <w:p>
+      <w:pPr>
+        <w:jc w:val="right"/>
+      </w:pPr>
+      <w:r>
         <w:t xml:space="preserve">Prepared for: </w:t>
       </w:r>
       <w:r>
@@ -219,27 +170,19 @@
         <w:t>&lt;Client Name&gt;</w:t>
       </w:r>
       <w:r>
-        <w:rPr/>
         <w:t xml:space="preserve"> (&lt;Client Organisation&gt;)</w:t>
       </w:r>
       <w:r>
-        <w:rPr/>
         <w:br/>
-      </w:r>
-      <w:r>
-        <w:rPr/>
         <w:t>&lt;Name 2&gt; (&lt;Organisation 2&gt;)</w:t>
       </w:r>
     </w:p>
-    <w:p xmlns:wp14="http://schemas.microsoft.com/office/word/2010/wordml" wp14:textId="77777777">
-      <w:pPr>
-        <w:pStyle w:val="Normal"/>
-        <w:spacing w:before="240" w:after="160"/>
-        <w:jc w:val="end"/>
-        <w:rPr/>
-      </w:pPr>
-      <w:r>
-        <w:rPr/>
+    <w:p>
+      <w:pPr>
+        <w:spacing w:before="240"/>
+        <w:jc w:val="right"/>
+      </w:pPr>
+      <w:r>
         <w:t>Prepared by:</w:t>
       </w:r>
       <w:r>
@@ -257,30 +200,22 @@
         <w:br/>
       </w:r>
       <w:r>
-        <w:rPr/>
         <w:t>&lt;Name 2&gt;</w:t>
       </w:r>
       <w:r>
-        <w:rPr/>
         <w:br/>
-      </w:r>
-      <w:r>
-        <w:rPr/>
         <w:t>&lt;Name 3&gt;</w:t>
       </w:r>
     </w:p>
-    <w:p xmlns:wp14="http://schemas.microsoft.com/office/word/2010/wordml" wp14:textId="77777777">
-      <w:pPr>
-        <w:pStyle w:val="Normal"/>
+    <w:p>
+      <w:pPr>
         <w:spacing w:line="360" w:lineRule="auto"/>
-        <w:jc w:val="end"/>
-        <w:rPr/>
-      </w:pPr>
-      <w:r>
-        <w:rPr/>
+        <w:jc w:val="right"/>
+      </w:pPr>
+      <w:r>
         <w:t xml:space="preserve">Correspondence email: </w:t>
       </w:r>
-      <w:hyperlink r:id="rId3">
+      <w:hyperlink r:id="rId9">
         <w:r>
           <w:rPr>
             <w:rStyle w:val="Hyperlink"/>
@@ -290,84 +225,72 @@
         </w:r>
       </w:hyperlink>
     </w:p>
-    <w:p xmlns:wp14="http://schemas.microsoft.com/office/word/2010/wordml" wp14:textId="77777777">
-      <w:pPr>
-        <w:pStyle w:val="Normal"/>
+    <w:p>
+      <w:pPr>
         <w:pBdr>
-          <w:bottom w:val="single" w:color="000000" w:sz="18" w:space="1"/>
+          <w:bottom w:val="single" w:sz="18" w:space="1" w:color="000000"/>
         </w:pBdr>
-        <w:spacing w:before="240" w:after="160" w:line="276" w:lineRule="auto"/>
-        <w:jc w:val="end"/>
-        <w:rPr/>
-      </w:pPr>
-      <w:r>
-        <w:rPr/>
+        <w:spacing w:before="240" w:line="276" w:lineRule="auto"/>
+        <w:jc w:val="right"/>
+      </w:pPr>
+      <w:r>
         <w:fldChar w:fldCharType="begin"/>
       </w:r>
       <w:r>
-        <w:rPr/>
         <w:instrText xml:space="preserve"> SAVEDATE \@"d\ MMMM\ yyyy" </w:instrText>
       </w:r>
       <w:r>
-        <w:rPr/>
         <w:fldChar w:fldCharType="separate"/>
       </w:r>
       <w:r>
-        <w:rPr/>
-        <w:t>7 November 2025</w:t>
-      </w:r>
-      <w:r>
-        <w:rPr/>
+        <w:rPr>
+          <w:noProof/>
+        </w:rPr>
+        <w:t>5 April 2026</w:t>
+      </w:r>
+      <w:r>
         <w:fldChar w:fldCharType="end"/>
       </w:r>
     </w:p>
-    <w:p xmlns:wp14="http://schemas.microsoft.com/office/word/2010/wordml" wp14:textId="77777777">
-      <w:pPr>
-        <w:pStyle w:val="Normal"/>
-        <w:rPr/>
-      </w:pPr>
-      <w:r>
-        <w:rPr/>
-      </w:r>
-    </w:p>
-    <w:p xmlns:wp14="http://schemas.microsoft.com/office/word/2010/wordml" wp14:textId="074B6431">
-      <w:pPr>
-        <w:pStyle w:val="Normal"/>
+    <w:p/>
+    <w:p>
+      <w:pPr>
+        <w:jc w:val="center"/>
         <w:sectPr>
-          <w:footerReference w:type="even" r:id="rId5"/>
-          <w:footerReference w:type="default" r:id="rId6"/>
-          <w:footerReference w:type="first" r:id="rId7"/>
-          <w:type w:val="nextPage"/>
-          <w:pgSz w:w="11906" w:h="16838" w:orient="portrait"/>
+          <w:footerReference w:type="even" r:id="rId10"/>
+          <w:footerReference w:type="default" r:id="rId11"/>
+          <w:footerReference w:type="first" r:id="rId12"/>
+          <w:pgSz w:w="11906" w:h="16838"/>
           <w:pgMar w:top="1440" w:right="1440" w:bottom="1440" w:left="1440" w:header="0" w:footer="708" w:gutter="0"/>
-          <w:pgNumType w:fmt="decimal"/>
-          <w:formProt w:val="false"/>
-          <w:textDirection w:val="lrTb"/>
-          <w:docGrid w:type="default" w:linePitch="360" w:charSpace="0"/>
-          <w:cols w:num="1"/>
+          <w:cols w:space="720"/>
+          <w:formProt w:val="0"/>
+          <w:docGrid w:linePitch="360"/>
         </w:sectPr>
       </w:pPr>
       <w:r>
+        <w:rPr>
+          <w:noProof/>
+        </w:rPr>
         <w:drawing>
-          <wp:inline xmlns:wp14="http://schemas.microsoft.com/office/word/2010/wordprocessingDrawing" wp14:editId="2A10449E" wp14:anchorId="1B0AAC32">
-            <wp:extent cx="5724525" cy="676469"/>
+          <wp:inline distT="0" distB="0" distL="0" distR="0" wp14:anchorId="1B0AAC32" wp14:editId="0D4FB159">
+            <wp:extent cx="4536013" cy="676469"/>
             <wp:effectExtent l="0" t="0" r="0" b="0"/>
             <wp:docPr id="786749483" name="drawing"/>
             <wp:cNvGraphicFramePr>
-              <a:graphicFrameLocks noChangeAspect="1"/>
+              <a:graphicFrameLocks xmlns:a="http://schemas.openxmlformats.org/drawingml/2006/main" noChangeAspect="1"/>
             </wp:cNvGraphicFramePr>
-            <a:graphic>
-              <a:graphicData xmlns:a="http://schemas.openxmlformats.org/drawingml/2006/main" uri="http://schemas.openxmlformats.org/drawingml/2006/picture">
+            <a:graphic xmlns:a="http://schemas.openxmlformats.org/drawingml/2006/main">
+              <a:graphicData uri="http://schemas.openxmlformats.org/drawingml/2006/picture">
                 <pic:pic xmlns:pic="http://schemas.openxmlformats.org/drawingml/2006/picture">
                   <pic:nvPicPr>
-                    <pic:cNvPr id="786749483" name="Picture 786749483"/>
+                    <pic:cNvPr id="786749483" name="drawing"/>
                     <pic:cNvPicPr/>
                   </pic:nvPicPr>
                   <pic:blipFill>
-                    <a:blip xmlns:r="http://schemas.openxmlformats.org/officeDocument/2006/relationships" r:embed="rId1597277537">
+                    <a:blip r:embed="rId13" cstate="print">
                       <a:extLst>
                         <a:ext uri="{28A0092B-C50C-407E-A947-70E740481C1C}">
-                          <a14:useLocalDpi xmlns:a14="http://schemas.microsoft.com/office/drawing/2010/main"/>
+                          <a14:useLocalDpi xmlns:a14="http://schemas.microsoft.com/office/drawing/2010/main" val="0"/>
                         </a:ext>
                       </a:extLst>
                     </a:blip>
@@ -376,9 +299,9 @@
                     </a:stretch>
                   </pic:blipFill>
                   <pic:spPr>
-                    <a:xfrm rot="0">
+                    <a:xfrm>
                       <a:off x="0" y="0"/>
-                      <a:ext cx="5724525" cy="676469"/>
+                      <a:ext cx="4536013" cy="676469"/>
                     </a:xfrm>
                     <a:prstGeom prst="rect">
                       <a:avLst/>
@@ -396,13 +319,12 @@
         <w:id w:val="779352273"/>
         <w:docPartObj>
           <w:docPartGallery w:val="Table of Contents"/>
-          <w:docPartUnique w:val="true"/>
+          <w:docPartUnique/>
         </w:docPartObj>
       </w:sdtPr>
       <w:sdtContent>
-        <w:p xmlns:wp14="http://schemas.microsoft.com/office/word/2010/wordml" wp14:textId="77777777">
+        <w:p>
           <w:pPr>
-            <w:pStyle w:val="Normal"/>
             <w:rPr>
               <w:b/>
               <w:bCs/>
@@ -420,15 +342,14 @@
             <w:t>Contents</w:t>
           </w:r>
         </w:p>
-        <w:p xmlns:wp14="http://schemas.microsoft.com/office/word/2010/wordml" wp14:textId="77777777">
+        <w:p>
           <w:pPr>
             <w:pStyle w:val="TOC1"/>
             <w:tabs>
-              <w:tab w:val="clear" w:pos="720"/>
               <w:tab w:val="right" w:leader="dot" w:pos="9016"/>
             </w:tabs>
             <w:rPr>
-              <w:rFonts w:ascii="Aptos" w:hAnsi="Aptos" w:eastAsia="" w:asciiTheme="minorHAnsi" w:hAnsiTheme="minorHAnsi" w:eastAsiaTheme="minorEastAsia"/>
+              <w:rFonts w:asciiTheme="minorHAnsi" w:eastAsiaTheme="minorEastAsia" w:hAnsiTheme="minorHAnsi"/>
               <w:sz w:val="24"/>
               <w:szCs w:val="24"/>
               <w:lang w:eastAsia="en-AU"/>
@@ -447,7 +368,6 @@
           <w:r>
             <w:rPr>
               <w:rStyle w:val="IndexLink"/>
-              <w:webHidden/>
             </w:rPr>
             <w:fldChar w:fldCharType="separate"/>
           </w:r>
@@ -469,7 +389,12 @@
               <w:rPr>
                 <w:webHidden/>
               </w:rPr>
-              <w:instrText xml:space="preserve">PAGEREF _Toc213418598 \h</w:instrText>
+              <w:instrText>PAGEREF _Toc213418598 \h</w:instrText>
+            </w:r>
+            <w:r>
+              <w:rPr>
+                <w:webHidden/>
+              </w:rPr>
             </w:r>
             <w:r>
               <w:rPr>
@@ -480,15 +405,8 @@
             <w:r>
               <w:rPr>
                 <w:rStyle w:val="IndexLink"/>
-                <w:vanish w:val="false"/>
               </w:rPr>
               <w:tab/>
-            </w:r>
-            <w:r>
-              <w:rPr>
-                <w:rStyle w:val="IndexLink"/>
-                <w:vanish w:val="false"/>
-              </w:rPr>
               <w:t>2</w:t>
             </w:r>
             <w:r>
@@ -499,16 +417,15 @@
             </w:r>
           </w:hyperlink>
         </w:p>
-        <w:p xmlns:wp14="http://schemas.microsoft.com/office/word/2010/wordml" wp14:textId="77777777">
+        <w:p>
           <w:pPr>
             <w:pStyle w:val="TOC1"/>
             <w:tabs>
-              <w:tab w:val="clear" w:pos="720"/>
-              <w:tab w:val="left" w:leader="none" w:pos="440"/>
+              <w:tab w:val="left" w:pos="440"/>
               <w:tab w:val="right" w:leader="dot" w:pos="9016"/>
             </w:tabs>
             <w:rPr>
-              <w:rFonts w:ascii="Aptos" w:hAnsi="Aptos" w:eastAsia="" w:asciiTheme="minorHAnsi" w:hAnsiTheme="minorHAnsi" w:eastAsiaTheme="minorEastAsia"/>
+              <w:rFonts w:asciiTheme="minorHAnsi" w:eastAsiaTheme="minorEastAsia" w:hAnsiTheme="minorHAnsi"/>
               <w:sz w:val="24"/>
               <w:szCs w:val="24"/>
               <w:lang w:eastAsia="en-AU"/>
@@ -525,7 +442,7 @@
             <w:r>
               <w:rPr>
                 <w:rStyle w:val="IndexLink"/>
-                <w:rFonts w:ascii="Aptos" w:hAnsi="Aptos" w:eastAsia="" w:asciiTheme="minorHAnsi" w:hAnsiTheme="minorHAnsi" w:eastAsiaTheme="minorEastAsia"/>
+                <w:rFonts w:asciiTheme="minorHAnsi" w:eastAsiaTheme="minorEastAsia" w:hAnsiTheme="minorHAnsi"/>
                 <w:sz w:val="24"/>
                 <w:szCs w:val="24"/>
                 <w:lang w:eastAsia="en-AU"/>
@@ -548,7 +465,12 @@
               <w:rPr>
                 <w:webHidden/>
               </w:rPr>
-              <w:instrText xml:space="preserve">PAGEREF _Toc213418599 \h</w:instrText>
+              <w:instrText>PAGEREF _Toc213418599 \h</w:instrText>
+            </w:r>
+            <w:r>
+              <w:rPr>
+                <w:webHidden/>
+              </w:rPr>
             </w:r>
             <w:r>
               <w:rPr>
@@ -559,15 +481,8 @@
             <w:r>
               <w:rPr>
                 <w:rStyle w:val="IndexLink"/>
-                <w:vanish w:val="false"/>
               </w:rPr>
               <w:tab/>
-            </w:r>
-            <w:r>
-              <w:rPr>
-                <w:rStyle w:val="IndexLink"/>
-                <w:vanish w:val="false"/>
-              </w:rPr>
               <w:t>3</w:t>
             </w:r>
             <w:r>
@@ -578,15 +493,15 @@
             </w:r>
           </w:hyperlink>
         </w:p>
-        <w:p xmlns:wp14="http://schemas.microsoft.com/office/word/2010/wordml" wp14:textId="77777777">
+        <w:p>
           <w:pPr>
             <w:pStyle w:val="TOC2"/>
             <w:tabs>
-              <w:tab w:val="left" w:leader="none" w:pos="720"/>
+              <w:tab w:val="left" w:pos="720"/>
               <w:tab w:val="right" w:leader="dot" w:pos="9016"/>
             </w:tabs>
             <w:rPr>
-              <w:rFonts w:ascii="Aptos" w:hAnsi="Aptos" w:eastAsia="" w:asciiTheme="minorHAnsi" w:hAnsiTheme="minorHAnsi" w:eastAsiaTheme="minorEastAsia"/>
+              <w:rFonts w:asciiTheme="minorHAnsi" w:eastAsiaTheme="minorEastAsia" w:hAnsiTheme="minorHAnsi"/>
               <w:sz w:val="24"/>
               <w:szCs w:val="24"/>
               <w:lang w:eastAsia="en-AU"/>
@@ -603,7 +518,7 @@
             <w:r>
               <w:rPr>
                 <w:rStyle w:val="IndexLink"/>
-                <w:rFonts w:ascii="Aptos" w:hAnsi="Aptos" w:eastAsia="" w:asciiTheme="minorHAnsi" w:hAnsiTheme="minorHAnsi" w:eastAsiaTheme="minorEastAsia"/>
+                <w:rFonts w:asciiTheme="minorHAnsi" w:eastAsiaTheme="minorEastAsia" w:hAnsiTheme="minorHAnsi"/>
                 <w:sz w:val="24"/>
                 <w:szCs w:val="24"/>
                 <w:lang w:eastAsia="en-AU"/>
@@ -626,7 +541,12 @@
               <w:rPr>
                 <w:webHidden/>
               </w:rPr>
-              <w:instrText xml:space="preserve">PAGEREF _Toc213418600 \h</w:instrText>
+              <w:instrText>PAGEREF _Toc213418600 \h</w:instrText>
+            </w:r>
+            <w:r>
+              <w:rPr>
+                <w:webHidden/>
+              </w:rPr>
             </w:r>
             <w:r>
               <w:rPr>
@@ -637,15 +557,8 @@
             <w:r>
               <w:rPr>
                 <w:rStyle w:val="IndexLink"/>
-                <w:vanish w:val="false"/>
               </w:rPr>
               <w:tab/>
-            </w:r>
-            <w:r>
-              <w:rPr>
-                <w:rStyle w:val="IndexLink"/>
-                <w:vanish w:val="false"/>
-              </w:rPr>
               <w:t>3</w:t>
             </w:r>
             <w:r>
@@ -656,16 +569,15 @@
             </w:r>
           </w:hyperlink>
         </w:p>
-        <w:p xmlns:wp14="http://schemas.microsoft.com/office/word/2010/wordml" wp14:textId="77777777">
+        <w:p>
           <w:pPr>
             <w:pStyle w:val="TOC3"/>
             <w:tabs>
-              <w:tab w:val="clear" w:pos="720"/>
-              <w:tab w:val="left" w:leader="none" w:pos="1200"/>
+              <w:tab w:val="left" w:pos="1200"/>
               <w:tab w:val="right" w:leader="dot" w:pos="9016"/>
             </w:tabs>
             <w:rPr>
-              <w:rFonts w:ascii="Aptos" w:hAnsi="Aptos" w:eastAsia="" w:asciiTheme="minorHAnsi" w:hAnsiTheme="minorHAnsi" w:eastAsiaTheme="minorEastAsia"/>
+              <w:rFonts w:asciiTheme="minorHAnsi" w:eastAsiaTheme="minorEastAsia" w:hAnsiTheme="minorHAnsi"/>
               <w:sz w:val="24"/>
               <w:szCs w:val="24"/>
               <w:lang w:eastAsia="en-AU"/>
@@ -682,7 +594,7 @@
             <w:r>
               <w:rPr>
                 <w:rStyle w:val="IndexLink"/>
-                <w:rFonts w:ascii="Aptos" w:hAnsi="Aptos" w:eastAsia="" w:asciiTheme="minorHAnsi" w:hAnsiTheme="minorHAnsi" w:eastAsiaTheme="minorEastAsia"/>
+                <w:rFonts w:asciiTheme="minorHAnsi" w:eastAsiaTheme="minorEastAsia" w:hAnsiTheme="minorHAnsi"/>
                 <w:sz w:val="24"/>
                 <w:szCs w:val="24"/>
                 <w:lang w:eastAsia="en-AU"/>
@@ -705,7 +617,12 @@
               <w:rPr>
                 <w:webHidden/>
               </w:rPr>
-              <w:instrText xml:space="preserve">PAGEREF _Toc213418601 \h</w:instrText>
+              <w:instrText>PAGEREF _Toc213418601 \h</w:instrText>
+            </w:r>
+            <w:r>
+              <w:rPr>
+                <w:webHidden/>
+              </w:rPr>
             </w:r>
             <w:r>
               <w:rPr>
@@ -716,15 +633,8 @@
             <w:r>
               <w:rPr>
                 <w:rStyle w:val="IndexLink"/>
-                <w:vanish w:val="false"/>
               </w:rPr>
               <w:tab/>
-            </w:r>
-            <w:r>
-              <w:rPr>
-                <w:rStyle w:val="IndexLink"/>
-                <w:vanish w:val="false"/>
-              </w:rPr>
               <w:t>3</w:t>
             </w:r>
             <w:r>
@@ -735,16 +645,15 @@
             </w:r>
           </w:hyperlink>
         </w:p>
-        <w:p xmlns:wp14="http://schemas.microsoft.com/office/word/2010/wordml" wp14:textId="77777777">
+        <w:p>
           <w:pPr>
             <w:pStyle w:val="TOC1"/>
             <w:tabs>
-              <w:tab w:val="clear" w:pos="720"/>
-              <w:tab w:val="left" w:leader="none" w:pos="440"/>
+              <w:tab w:val="left" w:pos="440"/>
               <w:tab w:val="right" w:leader="dot" w:pos="9016"/>
             </w:tabs>
             <w:rPr>
-              <w:rFonts w:ascii="Aptos" w:hAnsi="Aptos" w:eastAsia="" w:asciiTheme="minorHAnsi" w:hAnsiTheme="minorHAnsi" w:eastAsiaTheme="minorEastAsia"/>
+              <w:rFonts w:asciiTheme="minorHAnsi" w:eastAsiaTheme="minorEastAsia" w:hAnsiTheme="minorHAnsi"/>
               <w:sz w:val="24"/>
               <w:szCs w:val="24"/>
               <w:lang w:eastAsia="en-AU"/>
@@ -761,7 +670,7 @@
             <w:r>
               <w:rPr>
                 <w:rStyle w:val="IndexLink"/>
-                <w:rFonts w:ascii="Aptos" w:hAnsi="Aptos" w:eastAsia="" w:asciiTheme="minorHAnsi" w:hAnsiTheme="minorHAnsi" w:eastAsiaTheme="minorEastAsia"/>
+                <w:rFonts w:asciiTheme="minorHAnsi" w:eastAsiaTheme="minorEastAsia" w:hAnsiTheme="minorHAnsi"/>
                 <w:sz w:val="24"/>
                 <w:szCs w:val="24"/>
                 <w:lang w:eastAsia="en-AU"/>
@@ -784,7 +693,12 @@
               <w:rPr>
                 <w:webHidden/>
               </w:rPr>
-              <w:instrText xml:space="preserve">PAGEREF _Toc213418602 \h</w:instrText>
+              <w:instrText>PAGEREF _Toc213418602 \h</w:instrText>
+            </w:r>
+            <w:r>
+              <w:rPr>
+                <w:webHidden/>
+              </w:rPr>
             </w:r>
             <w:r>
               <w:rPr>
@@ -795,15 +709,8 @@
             <w:r>
               <w:rPr>
                 <w:rStyle w:val="IndexLink"/>
-                <w:vanish w:val="false"/>
               </w:rPr>
               <w:tab/>
-            </w:r>
-            <w:r>
-              <w:rPr>
-                <w:rStyle w:val="IndexLink"/>
-                <w:vanish w:val="false"/>
-              </w:rPr>
               <w:t>4</w:t>
             </w:r>
             <w:r>
@@ -814,16 +721,15 @@
             </w:r>
           </w:hyperlink>
         </w:p>
-        <w:p xmlns:wp14="http://schemas.microsoft.com/office/word/2010/wordml" wp14:textId="77777777">
+        <w:p>
           <w:pPr>
             <w:pStyle w:val="TOC1"/>
             <w:tabs>
-              <w:tab w:val="clear" w:pos="720"/>
-              <w:tab w:val="left" w:leader="none" w:pos="440"/>
+              <w:tab w:val="left" w:pos="440"/>
               <w:tab w:val="right" w:leader="dot" w:pos="9016"/>
             </w:tabs>
             <w:rPr>
-              <w:rFonts w:ascii="Aptos" w:hAnsi="Aptos" w:eastAsia="" w:asciiTheme="minorHAnsi" w:hAnsiTheme="minorHAnsi" w:eastAsiaTheme="minorEastAsia"/>
+              <w:rFonts w:asciiTheme="minorHAnsi" w:eastAsiaTheme="minorEastAsia" w:hAnsiTheme="minorHAnsi"/>
               <w:sz w:val="24"/>
               <w:szCs w:val="24"/>
               <w:lang w:eastAsia="en-AU"/>
@@ -840,7 +746,7 @@
             <w:r>
               <w:rPr>
                 <w:rStyle w:val="IndexLink"/>
-                <w:rFonts w:ascii="Aptos" w:hAnsi="Aptos" w:eastAsia="" w:asciiTheme="minorHAnsi" w:hAnsiTheme="minorHAnsi" w:eastAsiaTheme="minorEastAsia"/>
+                <w:rFonts w:asciiTheme="minorHAnsi" w:eastAsiaTheme="minorEastAsia" w:hAnsiTheme="minorHAnsi"/>
                 <w:sz w:val="24"/>
                 <w:szCs w:val="24"/>
                 <w:lang w:eastAsia="en-AU"/>
@@ -863,7 +769,12 @@
               <w:rPr>
                 <w:webHidden/>
               </w:rPr>
-              <w:instrText xml:space="preserve">PAGEREF _Toc213418603 \h</w:instrText>
+              <w:instrText>PAGEREF _Toc213418603 \h</w:instrText>
+            </w:r>
+            <w:r>
+              <w:rPr>
+                <w:webHidden/>
+              </w:rPr>
             </w:r>
             <w:r>
               <w:rPr>
@@ -874,15 +785,8 @@
             <w:r>
               <w:rPr>
                 <w:rStyle w:val="IndexLink"/>
-                <w:vanish w:val="false"/>
               </w:rPr>
               <w:tab/>
-            </w:r>
-            <w:r>
-              <w:rPr>
-                <w:rStyle w:val="IndexLink"/>
-                <w:vanish w:val="false"/>
-              </w:rPr>
               <w:t>5</w:t>
             </w:r>
             <w:r>
@@ -893,16 +797,15 @@
             </w:r>
           </w:hyperlink>
         </w:p>
-        <w:p xmlns:wp14="http://schemas.microsoft.com/office/word/2010/wordml" wp14:textId="77777777">
+        <w:p>
           <w:pPr>
             <w:pStyle w:val="TOC1"/>
             <w:tabs>
-              <w:tab w:val="clear" w:pos="720"/>
-              <w:tab w:val="left" w:leader="none" w:pos="440"/>
+              <w:tab w:val="left" w:pos="440"/>
               <w:tab w:val="right" w:leader="dot" w:pos="9016"/>
             </w:tabs>
             <w:rPr>
-              <w:rFonts w:ascii="Aptos" w:hAnsi="Aptos" w:eastAsia="" w:asciiTheme="minorHAnsi" w:hAnsiTheme="minorHAnsi" w:eastAsiaTheme="minorEastAsia"/>
+              <w:rFonts w:asciiTheme="minorHAnsi" w:eastAsiaTheme="minorEastAsia" w:hAnsiTheme="minorHAnsi"/>
               <w:sz w:val="24"/>
               <w:szCs w:val="24"/>
               <w:lang w:eastAsia="en-AU"/>
@@ -919,7 +822,7 @@
             <w:r>
               <w:rPr>
                 <w:rStyle w:val="IndexLink"/>
-                <w:rFonts w:ascii="Aptos" w:hAnsi="Aptos" w:eastAsia="" w:asciiTheme="minorHAnsi" w:hAnsiTheme="minorHAnsi" w:eastAsiaTheme="minorEastAsia"/>
+                <w:rFonts w:asciiTheme="minorHAnsi" w:eastAsiaTheme="minorEastAsia" w:hAnsiTheme="minorHAnsi"/>
                 <w:sz w:val="24"/>
                 <w:szCs w:val="24"/>
                 <w:lang w:eastAsia="en-AU"/>
@@ -942,7 +845,12 @@
               <w:rPr>
                 <w:webHidden/>
               </w:rPr>
-              <w:instrText xml:space="preserve">PAGEREF _Toc213418604 \h</w:instrText>
+              <w:instrText>PAGEREF _Toc213418604 \h</w:instrText>
+            </w:r>
+            <w:r>
+              <w:rPr>
+                <w:webHidden/>
+              </w:rPr>
             </w:r>
             <w:r>
               <w:rPr>
@@ -953,15 +861,8 @@
             <w:r>
               <w:rPr>
                 <w:rStyle w:val="IndexLink"/>
-                <w:vanish w:val="false"/>
               </w:rPr>
               <w:tab/>
-            </w:r>
-            <w:r>
-              <w:rPr>
-                <w:rStyle w:val="IndexLink"/>
-                <w:vanish w:val="false"/>
-              </w:rPr>
               <w:t>6</w:t>
             </w:r>
             <w:r>
@@ -972,16 +873,15 @@
             </w:r>
           </w:hyperlink>
         </w:p>
-        <w:p xmlns:wp14="http://schemas.microsoft.com/office/word/2010/wordml" wp14:textId="77777777">
+        <w:p>
           <w:pPr>
             <w:pStyle w:val="TOC1"/>
             <w:tabs>
-              <w:tab w:val="clear" w:pos="720"/>
-              <w:tab w:val="left" w:leader="none" w:pos="440"/>
+              <w:tab w:val="left" w:pos="440"/>
               <w:tab w:val="right" w:leader="dot" w:pos="9016"/>
             </w:tabs>
             <w:rPr>
-              <w:rFonts w:ascii="Aptos" w:hAnsi="Aptos" w:eastAsia="" w:asciiTheme="minorHAnsi" w:hAnsiTheme="minorHAnsi" w:eastAsiaTheme="minorEastAsia"/>
+              <w:rFonts w:asciiTheme="minorHAnsi" w:eastAsiaTheme="minorEastAsia" w:hAnsiTheme="minorHAnsi"/>
               <w:sz w:val="24"/>
               <w:szCs w:val="24"/>
               <w:lang w:eastAsia="en-AU"/>
@@ -998,7 +898,7 @@
             <w:r>
               <w:rPr>
                 <w:rStyle w:val="IndexLink"/>
-                <w:rFonts w:ascii="Aptos" w:hAnsi="Aptos" w:eastAsia="" w:asciiTheme="minorHAnsi" w:hAnsiTheme="minorHAnsi" w:eastAsiaTheme="minorEastAsia"/>
+                <w:rFonts w:asciiTheme="minorHAnsi" w:eastAsiaTheme="minorEastAsia" w:hAnsiTheme="minorHAnsi"/>
                 <w:sz w:val="24"/>
                 <w:szCs w:val="24"/>
                 <w:lang w:eastAsia="en-AU"/>
@@ -1021,7 +921,12 @@
               <w:rPr>
                 <w:webHidden/>
               </w:rPr>
-              <w:instrText xml:space="preserve">PAGEREF _Toc213418605 \h</w:instrText>
+              <w:instrText>PAGEREF _Toc213418605 \h</w:instrText>
+            </w:r>
+            <w:r>
+              <w:rPr>
+                <w:webHidden/>
+              </w:rPr>
             </w:r>
             <w:r>
               <w:rPr>
@@ -1032,15 +937,8 @@
             <w:r>
               <w:rPr>
                 <w:rStyle w:val="IndexLink"/>
-                <w:vanish w:val="false"/>
               </w:rPr>
               <w:tab/>
-            </w:r>
-            <w:r>
-              <w:rPr>
-                <w:rStyle w:val="IndexLink"/>
-                <w:vanish w:val="false"/>
-              </w:rPr>
               <w:t>7</w:t>
             </w:r>
             <w:r>
@@ -1051,16 +949,15 @@
             </w:r>
           </w:hyperlink>
         </w:p>
-        <w:p xmlns:wp14="http://schemas.microsoft.com/office/word/2010/wordml" wp14:textId="77777777">
+        <w:p>
           <w:pPr>
             <w:pStyle w:val="TOC1"/>
             <w:tabs>
-              <w:tab w:val="clear" w:pos="720"/>
-              <w:tab w:val="left" w:leader="none" w:pos="440"/>
+              <w:tab w:val="left" w:pos="440"/>
               <w:tab w:val="right" w:leader="dot" w:pos="9016"/>
             </w:tabs>
             <w:rPr>
-              <w:rFonts w:ascii="Aptos" w:hAnsi="Aptos" w:eastAsia="" w:asciiTheme="minorHAnsi" w:hAnsiTheme="minorHAnsi" w:eastAsiaTheme="minorEastAsia"/>
+              <w:rFonts w:asciiTheme="minorHAnsi" w:eastAsiaTheme="minorEastAsia" w:hAnsiTheme="minorHAnsi"/>
               <w:sz w:val="24"/>
               <w:szCs w:val="24"/>
               <w:lang w:eastAsia="en-AU"/>
@@ -1077,7 +974,7 @@
             <w:r>
               <w:rPr>
                 <w:rStyle w:val="IndexLink"/>
-                <w:rFonts w:ascii="Aptos" w:hAnsi="Aptos" w:eastAsia="" w:asciiTheme="minorHAnsi" w:hAnsiTheme="minorHAnsi" w:eastAsiaTheme="minorEastAsia"/>
+                <w:rFonts w:asciiTheme="minorHAnsi" w:eastAsiaTheme="minorEastAsia" w:hAnsiTheme="minorHAnsi"/>
                 <w:sz w:val="24"/>
                 <w:szCs w:val="24"/>
                 <w:lang w:eastAsia="en-AU"/>
@@ -1100,7 +997,12 @@
               <w:rPr>
                 <w:webHidden/>
               </w:rPr>
-              <w:instrText xml:space="preserve">PAGEREF _Toc213418606 \h</w:instrText>
+              <w:instrText>PAGEREF _Toc213418606 \h</w:instrText>
+            </w:r>
+            <w:r>
+              <w:rPr>
+                <w:webHidden/>
+              </w:rPr>
             </w:r>
             <w:r>
               <w:rPr>
@@ -1111,15 +1013,8 @@
             <w:r>
               <w:rPr>
                 <w:rStyle w:val="IndexLink"/>
-                <w:vanish w:val="false"/>
               </w:rPr>
               <w:tab/>
-            </w:r>
-            <w:r>
-              <w:rPr>
-                <w:rStyle w:val="IndexLink"/>
-                <w:vanish w:val="false"/>
-              </w:rPr>
               <w:t>8</w:t>
             </w:r>
             <w:r>
@@ -1130,16 +1025,15 @@
             </w:r>
           </w:hyperlink>
         </w:p>
-        <w:p xmlns:wp14="http://schemas.microsoft.com/office/word/2010/wordml" wp14:textId="77777777">
+        <w:p>
           <w:pPr>
             <w:pStyle w:val="TOC1"/>
             <w:tabs>
-              <w:tab w:val="clear" w:pos="720"/>
-              <w:tab w:val="left" w:leader="none" w:pos="440"/>
+              <w:tab w:val="left" w:pos="440"/>
               <w:tab w:val="right" w:leader="dot" w:pos="9016"/>
             </w:tabs>
             <w:rPr>
-              <w:rFonts w:ascii="Aptos" w:hAnsi="Aptos" w:eastAsia="" w:asciiTheme="minorHAnsi" w:hAnsiTheme="minorHAnsi" w:eastAsiaTheme="minorEastAsia"/>
+              <w:rFonts w:asciiTheme="minorHAnsi" w:eastAsiaTheme="minorEastAsia" w:hAnsiTheme="minorHAnsi"/>
               <w:sz w:val="24"/>
               <w:szCs w:val="24"/>
               <w:lang w:eastAsia="en-AU"/>
@@ -1156,7 +1050,7 @@
             <w:r>
               <w:rPr>
                 <w:rStyle w:val="IndexLink"/>
-                <w:rFonts w:ascii="Aptos" w:hAnsi="Aptos" w:eastAsia="" w:asciiTheme="minorHAnsi" w:hAnsiTheme="minorHAnsi" w:eastAsiaTheme="minorEastAsia"/>
+                <w:rFonts w:asciiTheme="minorHAnsi" w:eastAsiaTheme="minorEastAsia" w:hAnsiTheme="minorHAnsi"/>
                 <w:sz w:val="24"/>
                 <w:szCs w:val="24"/>
                 <w:lang w:eastAsia="en-AU"/>
@@ -1179,7 +1073,12 @@
               <w:rPr>
                 <w:webHidden/>
               </w:rPr>
-              <w:instrText xml:space="preserve">PAGEREF _Toc213418607 \h</w:instrText>
+              <w:instrText>PAGEREF _Toc213418607 \h</w:instrText>
+            </w:r>
+            <w:r>
+              <w:rPr>
+                <w:webHidden/>
+              </w:rPr>
             </w:r>
             <w:r>
               <w:rPr>
@@ -1190,15 +1089,8 @@
             <w:r>
               <w:rPr>
                 <w:rStyle w:val="IndexLink"/>
-                <w:vanish w:val="false"/>
               </w:rPr>
               <w:tab/>
-            </w:r>
-            <w:r>
-              <w:rPr>
-                <w:rStyle w:val="IndexLink"/>
-                <w:vanish w:val="false"/>
-              </w:rPr>
               <w:t>9</w:t>
             </w:r>
             <w:r>
@@ -1209,16 +1101,15 @@
             </w:r>
           </w:hyperlink>
         </w:p>
-        <w:p xmlns:wp14="http://schemas.microsoft.com/office/word/2010/wordml" wp14:textId="77777777">
+        <w:p>
           <w:pPr>
             <w:pStyle w:val="TOC1"/>
             <w:tabs>
-              <w:tab w:val="clear" w:pos="720"/>
-              <w:tab w:val="left" w:leader="none" w:pos="440"/>
+              <w:tab w:val="left" w:pos="440"/>
               <w:tab w:val="right" w:leader="dot" w:pos="9016"/>
             </w:tabs>
             <w:rPr>
-              <w:rFonts w:ascii="Aptos" w:hAnsi="Aptos" w:eastAsia="" w:asciiTheme="minorHAnsi" w:hAnsiTheme="minorHAnsi" w:eastAsiaTheme="minorEastAsia"/>
+              <w:rFonts w:asciiTheme="minorHAnsi" w:eastAsiaTheme="minorEastAsia" w:hAnsiTheme="minorHAnsi"/>
               <w:sz w:val="24"/>
               <w:szCs w:val="24"/>
               <w:lang w:eastAsia="en-AU"/>
@@ -1235,7 +1126,7 @@
             <w:r>
               <w:rPr>
                 <w:rStyle w:val="IndexLink"/>
-                <w:rFonts w:ascii="Aptos" w:hAnsi="Aptos" w:eastAsia="" w:asciiTheme="minorHAnsi" w:hAnsiTheme="minorHAnsi" w:eastAsiaTheme="minorEastAsia"/>
+                <w:rFonts w:asciiTheme="minorHAnsi" w:eastAsiaTheme="minorEastAsia" w:hAnsiTheme="minorHAnsi"/>
                 <w:sz w:val="24"/>
                 <w:szCs w:val="24"/>
                 <w:lang w:eastAsia="en-AU"/>
@@ -1258,7 +1149,12 @@
               <w:rPr>
                 <w:webHidden/>
               </w:rPr>
-              <w:instrText xml:space="preserve">PAGEREF _Toc213418608 \h</w:instrText>
+              <w:instrText>PAGEREF _Toc213418608 \h</w:instrText>
+            </w:r>
+            <w:r>
+              <w:rPr>
+                <w:webHidden/>
+              </w:rPr>
             </w:r>
             <w:r>
               <w:rPr>
@@ -1269,15 +1165,8 @@
             <w:r>
               <w:rPr>
                 <w:rStyle w:val="IndexLink"/>
-                <w:vanish w:val="false"/>
               </w:rPr>
               <w:tab/>
-            </w:r>
-            <w:r>
-              <w:rPr>
-                <w:rStyle w:val="IndexLink"/>
-                <w:vanish w:val="false"/>
-              </w:rPr>
               <w:t>10</w:t>
             </w:r>
             <w:r>
@@ -1288,16 +1177,15 @@
             </w:r>
           </w:hyperlink>
         </w:p>
-        <w:p xmlns:wp14="http://schemas.microsoft.com/office/word/2010/wordml" wp14:textId="77777777">
+        <w:p>
           <w:pPr>
             <w:pStyle w:val="TOC1"/>
             <w:tabs>
-              <w:tab w:val="clear" w:pos="720"/>
-              <w:tab w:val="left" w:leader="none" w:pos="440"/>
+              <w:tab w:val="left" w:pos="440"/>
               <w:tab w:val="right" w:leader="dot" w:pos="9016"/>
             </w:tabs>
             <w:rPr>
-              <w:rFonts w:ascii="Aptos" w:hAnsi="Aptos" w:eastAsia="" w:asciiTheme="minorHAnsi" w:hAnsiTheme="minorHAnsi" w:eastAsiaTheme="minorEastAsia"/>
+              <w:rFonts w:asciiTheme="minorHAnsi" w:eastAsiaTheme="minorEastAsia" w:hAnsiTheme="minorHAnsi"/>
               <w:sz w:val="24"/>
               <w:szCs w:val="24"/>
               <w:lang w:eastAsia="en-AU"/>
@@ -1314,7 +1202,7 @@
             <w:r>
               <w:rPr>
                 <w:rStyle w:val="IndexLink"/>
-                <w:rFonts w:ascii="Aptos" w:hAnsi="Aptos" w:eastAsia="" w:asciiTheme="minorHAnsi" w:hAnsiTheme="minorHAnsi" w:eastAsiaTheme="minorEastAsia"/>
+                <w:rFonts w:asciiTheme="minorHAnsi" w:eastAsiaTheme="minorEastAsia" w:hAnsiTheme="minorHAnsi"/>
                 <w:sz w:val="24"/>
                 <w:szCs w:val="24"/>
                 <w:lang w:eastAsia="en-AU"/>
@@ -1337,7 +1225,12 @@
               <w:rPr>
                 <w:webHidden/>
               </w:rPr>
-              <w:instrText xml:space="preserve">PAGEREF _Toc213418609 \h</w:instrText>
+              <w:instrText>PAGEREF _Toc213418609 \h</w:instrText>
+            </w:r>
+            <w:r>
+              <w:rPr>
+                <w:webHidden/>
+              </w:rPr>
             </w:r>
             <w:r>
               <w:rPr>
@@ -1348,15 +1241,8 @@
             <w:r>
               <w:rPr>
                 <w:rStyle w:val="IndexLink"/>
-                <w:vanish w:val="false"/>
               </w:rPr>
               <w:tab/>
-            </w:r>
-            <w:r>
-              <w:rPr>
-                <w:rStyle w:val="IndexLink"/>
-                <w:vanish w:val="false"/>
-              </w:rPr>
               <w:t>11</w:t>
             </w:r>
             <w:r>
@@ -1367,16 +1253,15 @@
             </w:r>
           </w:hyperlink>
         </w:p>
-        <w:p xmlns:wp14="http://schemas.microsoft.com/office/word/2010/wordml" wp14:textId="77777777">
+        <w:p>
           <w:pPr>
             <w:pStyle w:val="TOC1"/>
             <w:tabs>
-              <w:tab w:val="clear" w:pos="720"/>
-              <w:tab w:val="left" w:leader="none" w:pos="440"/>
+              <w:tab w:val="left" w:pos="440"/>
               <w:tab w:val="right" w:leader="dot" w:pos="9016"/>
             </w:tabs>
             <w:rPr>
-              <w:rFonts w:ascii="Aptos" w:hAnsi="Aptos" w:eastAsia="" w:asciiTheme="minorHAnsi" w:hAnsiTheme="minorHAnsi" w:eastAsiaTheme="minorEastAsia"/>
+              <w:rFonts w:asciiTheme="minorHAnsi" w:eastAsiaTheme="minorEastAsia" w:hAnsiTheme="minorHAnsi"/>
               <w:sz w:val="24"/>
               <w:szCs w:val="24"/>
               <w:lang w:eastAsia="en-AU"/>
@@ -1393,7 +1278,7 @@
             <w:r>
               <w:rPr>
                 <w:rStyle w:val="IndexLink"/>
-                <w:rFonts w:ascii="Aptos" w:hAnsi="Aptos" w:eastAsia="" w:asciiTheme="minorHAnsi" w:hAnsiTheme="minorHAnsi" w:eastAsiaTheme="minorEastAsia"/>
+                <w:rFonts w:asciiTheme="minorHAnsi" w:eastAsiaTheme="minorEastAsia" w:hAnsiTheme="minorHAnsi"/>
                 <w:sz w:val="24"/>
                 <w:szCs w:val="24"/>
                 <w:lang w:eastAsia="en-AU"/>
@@ -1416,7 +1301,12 @@
               <w:rPr>
                 <w:webHidden/>
               </w:rPr>
-              <w:instrText xml:space="preserve">PAGEREF _Toc213418610 \h</w:instrText>
+              <w:instrText>PAGEREF _Toc213418610 \h</w:instrText>
+            </w:r>
+            <w:r>
+              <w:rPr>
+                <w:webHidden/>
+              </w:rPr>
             </w:r>
             <w:r>
               <w:rPr>
@@ -1427,15 +1317,8 @@
             <w:r>
               <w:rPr>
                 <w:rStyle w:val="IndexLink"/>
-                <w:vanish w:val="false"/>
               </w:rPr>
               <w:tab/>
-            </w:r>
-            <w:r>
-              <w:rPr>
-                <w:rStyle w:val="IndexLink"/>
-                <w:vanish w:val="false"/>
-              </w:rPr>
               <w:t>12</w:t>
             </w:r>
             <w:r>
@@ -1446,144 +1329,89 @@
             </w:r>
           </w:hyperlink>
         </w:p>
-        <w:p xmlns:wp14="http://schemas.microsoft.com/office/word/2010/wordml" wp14:textId="77777777">
-          <w:pPr>
-            <w:pStyle w:val="Normal"/>
-            <w:rPr/>
-          </w:pPr>
+        <w:p>
           <w:r>
-            <w:rPr/>
-          </w:r>
-          <w:r>
-            <w:rPr/>
             <w:fldChar w:fldCharType="end"/>
           </w:r>
         </w:p>
       </w:sdtContent>
     </w:sdt>
-    <w:p xmlns:wp14="http://schemas.microsoft.com/office/word/2010/wordml" wp14:textId="77777777">
-      <w:pPr>
-        <w:pStyle w:val="Normal"/>
-        <w:spacing w:before="0" w:after="160"/>
-        <w:rPr/>
+    <w:p>
+      <w:pPr>
         <w:sectPr>
-          <w:footerReference w:type="even" r:id="rId8"/>
-          <w:footerReference w:type="default" r:id="rId9"/>
-          <w:footerReference w:type="first" r:id="rId10"/>
-          <w:type w:val="nextPage"/>
-          <w:pgSz w:w="11906" w:h="16838" w:orient="portrait"/>
-          <w:pgMar w:top="1440" w:right="1440" w:bottom="1440" w:left="1440" w:header="0" w:footer="708" w:gutter="0"/>
-          <w:pgNumType w:fmt="decimal" w:start="1"/>
-          <w:formProt w:val="false"/>
-          <w:textDirection w:val="lrTb"/>
-          <w:docGrid w:type="default" w:linePitch="360" w:charSpace="0"/>
-          <w:cols w:num="1"/>
-        </w:sectPr>
-      </w:pPr>
-      <w:r>
-        <w:rPr/>
-      </w:r>
-    </w:p>
-    <w:p xmlns:wp14="http://schemas.microsoft.com/office/word/2010/wordml" wp14:textId="77777777">
-      <w:pPr>
-        <w:pStyle w:val="Heading1"/>
-        <w:rPr/>
-      </w:pPr>
-      <w:bookmarkStart w:name="_Toc213418598" w:id="0"/>
-      <w:r>
-        <w:rPr/>
-        <w:t>Executive Summary</w:t>
-      </w:r>
-      <w:bookmarkEnd w:id="0"/>
-    </w:p>
-    <w:p xmlns:wp14="http://schemas.microsoft.com/office/word/2010/wordml" wp14:textId="77777777">
-      <w:pPr>
-        <w:pStyle w:val="Normal"/>
-        <w:rPr/>
-      </w:pPr>
-      <w:r>
-        <w:rPr/>
-        <w:t>Executive summary goes here. Summarise the work that was provided by AAGI and the main results. (Try to limit this to a single page.)</w:t>
-      </w:r>
-    </w:p>
-    <w:p xmlns:wp14="http://schemas.microsoft.com/office/word/2010/wordml" wp14:textId="77777777">
-      <w:pPr>
-        <w:pStyle w:val="Normal"/>
-        <w:rPr/>
-      </w:pPr>
-      <w:r>
-        <w:rPr/>
-      </w:r>
-    </w:p>
-    <w:p xmlns:wp14="http://schemas.microsoft.com/office/word/2010/wordml" wp14:textId="77777777">
-      <w:pPr>
-        <w:pStyle w:val="Normal"/>
-        <w:spacing w:before="0" w:after="160"/>
-        <w:rPr/>
-        <w:sectPr>
-          <w:headerReference w:type="even" r:id="rId11"/>
-          <w:headerReference w:type="default" r:id="rId12"/>
-          <w:headerReference w:type="first" r:id="rId13"/>
           <w:footerReference w:type="even" r:id="rId14"/>
           <w:footerReference w:type="default" r:id="rId15"/>
           <w:footerReference w:type="first" r:id="rId16"/>
-          <w:type w:val="nextPage"/>
-          <w:pgSz w:w="11906" w:h="16838" w:orient="portrait"/>
+          <w:pgSz w:w="11906" w:h="16838"/>
+          <w:pgMar w:top="1440" w:right="1440" w:bottom="1440" w:left="1440" w:header="0" w:footer="708" w:gutter="0"/>
+          <w:pgNumType w:start="1"/>
+          <w:cols w:space="720"/>
+          <w:formProt w:val="0"/>
+          <w:docGrid w:linePitch="360"/>
+        </w:sectPr>
+      </w:pPr>
+    </w:p>
+    <w:p>
+      <w:pPr>
+        <w:pStyle w:val="Heading1"/>
+      </w:pPr>
+      <w:bookmarkStart w:id="0" w:name="_Toc213418598"/>
+      <w:r>
+        <w:lastRenderedPageBreak/>
+        <w:t>Executive Summary</w:t>
+      </w:r>
+      <w:bookmarkEnd w:id="0"/>
+    </w:p>
+    <w:p>
+      <w:r>
+        <w:t>Executive summary goes here. Summarise the work that was provided by AAGI and the main results. (Try to limit this to a single page.)</w:t>
+      </w:r>
+    </w:p>
+    <w:p/>
+    <w:p>
+      <w:pPr>
+        <w:sectPr>
+          <w:headerReference w:type="even" r:id="rId17"/>
+          <w:headerReference w:type="default" r:id="rId18"/>
+          <w:footerReference w:type="even" r:id="rId19"/>
+          <w:footerReference w:type="default" r:id="rId20"/>
+          <w:headerReference w:type="first" r:id="rId21"/>
+          <w:footerReference w:type="first" r:id="rId22"/>
+          <w:pgSz w:w="11906" w:h="16838"/>
           <w:pgMar w:top="1440" w:right="1440" w:bottom="1440" w:left="1440" w:header="708" w:footer="708" w:gutter="0"/>
-          <w:pgNumType w:fmt="decimal"/>
-          <w:formProt w:val="false"/>
-          <w:textDirection w:val="lrTb"/>
-          <w:docGrid w:type="default" w:linePitch="360" w:charSpace="0"/>
-          <w:cols w:num="1"/>
+          <w:cols w:space="720"/>
+          <w:formProt w:val="0"/>
+          <w:docGrid w:linePitch="360"/>
         </w:sectPr>
       </w:pPr>
-      <w:r>
-        <w:rPr/>
-      </w:r>
-    </w:p>
-    <w:p xmlns:wp14="http://schemas.microsoft.com/office/word/2010/wordml" wp14:textId="77777777">
+    </w:p>
+    <w:p>
       <w:pPr>
         <w:pStyle w:val="Heading1"/>
         <w:numPr>
           <w:ilvl w:val="0"/>
           <w:numId w:val="1"/>
         </w:numPr>
-        <w:rPr/>
-      </w:pPr>
-      <w:bookmarkStart w:name="_Toc213418599" w:id="1"/>
-      <w:r>
-        <w:rPr/>
+      </w:pPr>
+      <w:bookmarkStart w:id="1" w:name="_Toc213418599"/>
+      <w:r>
+        <w:lastRenderedPageBreak/>
         <w:t>Introduction</w:t>
       </w:r>
       <w:bookmarkEnd w:id="1"/>
     </w:p>
-    <w:p xmlns:wp14="http://schemas.microsoft.com/office/word/2010/wordml" wp14:textId="77777777">
-      <w:pPr>
-        <w:pStyle w:val="Normal"/>
-        <w:rPr/>
-      </w:pPr>
-      <w:r>
-        <w:rPr/>
+    <w:p>
+      <w:r>
         <w:t xml:space="preserve">The report body text goes here. </w:t>
       </w:r>
     </w:p>
-    <w:p xmlns:wp14="http://schemas.microsoft.com/office/word/2010/wordml" wp14:textId="77777777">
-      <w:pPr>
-        <w:pStyle w:val="Normal"/>
-        <w:rPr/>
-      </w:pPr>
-      <w:r>
-        <w:rPr/>
+    <w:p>
+      <w:r>
         <w:t>Note that the following section titles are provided as a guide, but feel free to modify them in any way that you like if they are not relevant to your work or if using a different set of titles enhances the readability of your report.</w:t>
       </w:r>
     </w:p>
-    <w:p xmlns:wp14="http://schemas.microsoft.com/office/word/2010/wordml" wp14:textId="77777777">
-      <w:pPr>
-        <w:pStyle w:val="Normal"/>
-        <w:rPr/>
-      </w:pPr>
-      <w:r>
-        <w:rPr/>
+    <w:p>
+      <w:r>
         <w:t>Use AAGI theme colours for emphasis (</w:t>
       </w:r>
       <w:r>
@@ -1593,7 +1421,6 @@
         <w:t>AAGI blue: #00808b</w:t>
       </w:r>
       <w:r>
-        <w:rPr/>
         <w:t xml:space="preserve">, </w:t>
       </w:r>
       <w:r>
@@ -1603,7 +1430,6 @@
         <w:t>AAGI green: #b6d438</w:t>
       </w:r>
       <w:r>
-        <w:rPr/>
         <w:t xml:space="preserve">, </w:t>
       </w:r>
       <w:r>
@@ -1613,17 +1439,11 @@
         <w:t>AAGI black: #414042</w:t>
       </w:r>
       <w:r>
-        <w:rPr/>
         <w:t>).</w:t>
       </w:r>
     </w:p>
-    <w:p xmlns:wp14="http://schemas.microsoft.com/office/word/2010/wordml" wp14:textId="77777777">
-      <w:pPr>
-        <w:pStyle w:val="Normal"/>
-        <w:rPr/>
-      </w:pPr>
-      <w:r>
-        <w:rPr/>
+    <w:p>
+      <w:r>
         <w:t xml:space="preserve">Use the built-in Word Citation manager to handle parenthetical citations, e.g., </w:t>
       </w:r>
       <w:sdt>
@@ -1633,29 +1453,23 @@
         </w:sdtPr>
         <w:sdtContent>
           <w:r>
-            <w:rPr/>
             <w:fldChar w:fldCharType="begin"/>
           </w:r>
           <w:r>
-            <w:rPr/>
             <w:instrText xml:space="preserve"> CITATION Per24 \l 3081 </w:instrText>
           </w:r>
           <w:r>
-            <w:rPr/>
             <w:fldChar w:fldCharType="separate"/>
           </w:r>
           <w:r>
-            <w:rPr/>
             <w:t>(Person, 2024)</w:t>
           </w:r>
           <w:r>
-            <w:rPr/>
             <w:fldChar w:fldCharType="end"/>
           </w:r>
         </w:sdtContent>
       </w:sdt>
       <w:r>
-        <w:rPr/>
         <w:t xml:space="preserve">, and in-text citations, e.g., Person </w:t>
       </w:r>
       <w:sdt>
@@ -1665,73 +1479,55 @@
         </w:sdtPr>
         <w:sdtContent>
           <w:r>
-            <w:rPr/>
             <w:fldChar w:fldCharType="begin"/>
           </w:r>
           <w:r>
-            <w:rPr/>
             <w:instrText xml:space="preserve">CITATION Per24 \n  \t  \l 3081 </w:instrText>
           </w:r>
           <w:r>
-            <w:rPr/>
             <w:fldChar w:fldCharType="separate"/>
           </w:r>
           <w:r>
-            <w:rPr/>
             <w:t>(2024)</w:t>
           </w:r>
           <w:r>
-            <w:rPr/>
             <w:fldChar w:fldCharType="end"/>
           </w:r>
         </w:sdtContent>
       </w:sdt>
       <w:r>
-        <w:rPr/>
         <w:t>.</w:t>
       </w:r>
     </w:p>
-    <w:p xmlns:wp14="http://schemas.microsoft.com/office/word/2010/wordml" wp14:textId="77777777">
-      <w:pPr>
-        <w:pStyle w:val="Normal"/>
-        <w:rPr/>
-      </w:pPr>
-      <w:r>
-        <w:rPr/>
+    <w:p>
+      <w:r>
         <w:t xml:space="preserve">A simple AAGI-themed table is the default new table created (via Insert → Table in the top ribbon), as shown in </w:t>
       </w:r>
       <w:r>
-        <w:rPr/>
         <w:fldChar w:fldCharType="begin"/>
       </w:r>
       <w:r>
-        <w:rPr/>
         <w:instrText xml:space="preserve"> REF _Ref213411494 \h </w:instrText>
       </w:r>
       <w:r>
-        <w:rPr/>
         <w:fldChar w:fldCharType="separate"/>
       </w:r>
       <w:r>
-        <w:rPr/>
         <w:t>Table 1</w:t>
       </w:r>
       <w:r>
-        <w:rPr/>
         <w:fldChar w:fldCharType="end"/>
       </w:r>
       <w:r>
-        <w:rPr/>
         <w:t>.</w:t>
       </w:r>
     </w:p>
-    <w:p xmlns:wp14="http://schemas.microsoft.com/office/word/2010/wordml" wp14:textId="77777777">
+    <w:p>
       <w:pPr>
         <w:pStyle w:val="Caption"/>
         <w:jc w:val="center"/>
-        <w:rPr/>
-      </w:pPr>
-      <w:bookmarkStart w:name="_Ref213411494" w:id="2"/>
+      </w:pPr>
+      <w:bookmarkStart w:id="2" w:name="_Ref213411494"/>
       <w:r>
         <w:rPr>
           <w:color w:val="00808B"/>
@@ -1776,7 +1572,6 @@
         <w:t>:</w:t>
       </w:r>
       <w:r>
-        <w:rPr/>
         <w:t xml:space="preserve"> An AAGI-themed table.</w:t>
       </w:r>
     </w:p>
@@ -1784,54 +1579,34 @@
       <w:tblPr>
         <w:tblStyle w:val="AAGITableStyle"/>
         <w:tblW w:w="9016" w:type="dxa"/>
-        <w:jc w:val="start"/>
-        <w:tblInd w:w="0" w:type="dxa"/>
         <w:tblLayout w:type="fixed"/>
-        <w:tblCellMar>
-          <w:top w:w="0" w:type="dxa"/>
-          <w:start w:w="108" w:type="dxa"/>
-          <w:bottom w:w="0" w:type="dxa"/>
-          <w:end w:w="108" w:type="dxa"/>
-        </w:tblCellMar>
-        <w:tblLook w:val="04a0" w:firstRow="1" w:lastRow="0" w:firstColumn="1" w:lastColumn="0" w:noHBand="0" w:noVBand="1"/>
+        <w:tblLook w:val="04A0" w:firstRow="1" w:lastRow="0" w:firstColumn="1" w:lastColumn="0" w:noHBand="0" w:noVBand="1"/>
       </w:tblPr>
       <w:tblGrid>
         <w:gridCol w:w="4508"/>
         <w:gridCol w:w="4508"/>
       </w:tblGrid>
-      <w:tr xmlns:wp14="http://schemas.microsoft.com/office/word/2010/wordml" wp14:textId="77777777">
+      <w:tr>
         <w:trPr>
           <w:cnfStyle w:val="100000000000" w:firstRow="1" w:lastRow="0" w:firstColumn="0" w:lastColumn="0" w:oddVBand="0" w:evenVBand="0" w:oddHBand="0" w:evenHBand="0" w:firstRowFirstColumn="0" w:firstRowLastColumn="0" w:lastRowFirstColumn="0" w:lastRowLastColumn="0"/>
         </w:trPr>
         <w:tc>
           <w:tcPr>
             <w:tcW w:w="4508" w:type="dxa"/>
-            <w:tcBorders/>
-            <w:shd w:val="clear" w:color="auto" w:fill="00808B"/>
           </w:tcPr>
-          <w:p wp14:textId="77777777">
+          <w:p>
             <w:pPr>
-              <w:pStyle w:val="Normal"/>
-              <w:widowControl/>
-              <w:spacing w:before="0" w:after="0" w:line="240" w:lineRule="auto"/>
-              <w:jc w:val="start"/>
-              <w:rPr>
-                <w:rFonts w:eastAsia="Aptos" w:cs=""/>
+              <w:spacing w:after="0" w:line="240" w:lineRule="auto"/>
+              <w:jc w:val="left"/>
+              <w:rPr>
+                <w:rFonts w:eastAsia="Aptos"/>
                 <w:color w:val="FFFFFF" w:themeColor="background1"/>
-                <w:kern w:val="2"/>
-                <w:sz w:val="22"/>
-                <w:szCs w:val="22"/>
-                <w:lang w:val="en-AU" w:eastAsia="en-US" w:bidi="ar-SA"/>
               </w:rPr>
             </w:pPr>
             <w:r>
               <w:rPr>
-                <w:rFonts w:eastAsia="Aptos" w:cs=""/>
+                <w:rFonts w:eastAsia="Aptos"/>
                 <w:color w:val="FFFFFF" w:themeColor="background1"/>
-                <w:kern w:val="2"/>
-                <w:sz w:val="22"/>
-                <w:szCs w:val="22"/>
-                <w:lang w:val="en-AU" w:eastAsia="en-US" w:bidi="ar-SA"/>
               </w:rPr>
               <w:t>Table Heading</w:t>
             </w:r>
@@ -1840,68 +1615,44 @@
         <w:tc>
           <w:tcPr>
             <w:tcW w:w="4508" w:type="dxa"/>
-            <w:tcBorders/>
-            <w:shd w:val="clear" w:color="auto" w:fill="00808B"/>
           </w:tcPr>
-          <w:p wp14:textId="77777777">
+          <w:p>
             <w:pPr>
-              <w:pStyle w:val="Normal"/>
-              <w:widowControl/>
-              <w:spacing w:before="0" w:after="0" w:line="240" w:lineRule="auto"/>
-              <w:jc w:val="start"/>
-              <w:rPr>
-                <w:rFonts w:eastAsia="Aptos" w:cs=""/>
+              <w:spacing w:after="0" w:line="240" w:lineRule="auto"/>
+              <w:jc w:val="left"/>
+              <w:rPr>
+                <w:rFonts w:eastAsia="Aptos"/>
                 <w:color w:val="FFFFFF" w:themeColor="background1"/>
-                <w:kern w:val="2"/>
-                <w:sz w:val="22"/>
-                <w:szCs w:val="22"/>
-                <w:lang w:val="en-AU" w:eastAsia="en-US" w:bidi="ar-SA"/>
               </w:rPr>
             </w:pPr>
             <w:r>
               <w:rPr>
-                <w:rFonts w:eastAsia="Aptos" w:cs=""/>
+                <w:rFonts w:eastAsia="Aptos"/>
                 <w:color w:val="FFFFFF" w:themeColor="background1"/>
-                <w:kern w:val="2"/>
-                <w:sz w:val="22"/>
-                <w:szCs w:val="22"/>
-                <w:lang w:val="en-AU" w:eastAsia="en-US" w:bidi="ar-SA"/>
               </w:rPr>
               <w:t>Next Heading</w:t>
             </w:r>
           </w:p>
         </w:tc>
       </w:tr>
-      <w:tr xmlns:wp14="http://schemas.microsoft.com/office/word/2010/wordml" wp14:textId="77777777">
-        <w:trPr/>
+      <w:tr>
         <w:tc>
           <w:tcPr>
             <w:tcW w:w="4508" w:type="dxa"/>
-            <w:tcBorders/>
           </w:tcPr>
-          <w:p wp14:textId="77777777">
+          <w:p>
             <w:pPr>
-              <w:pStyle w:val="Normal"/>
-              <w:widowControl/>
-              <w:spacing w:before="0" w:after="0" w:line="240" w:lineRule="auto"/>
-              <w:jc w:val="start"/>
-              <w:rPr>
-                <w:rFonts w:eastAsia="Aptos" w:cs=""/>
+              <w:spacing w:after="0" w:line="240" w:lineRule="auto"/>
+              <w:jc w:val="left"/>
+              <w:rPr>
+                <w:rFonts w:eastAsia="Aptos"/>
                 <w:color w:val="000000" w:themeColor="text1"/>
-                <w:kern w:val="2"/>
-                <w:sz w:val="22"/>
-                <w:szCs w:val="22"/>
-                <w:lang w:val="en-AU" w:eastAsia="en-US" w:bidi="ar-SA"/>
               </w:rPr>
             </w:pPr>
             <w:r>
               <w:rPr>
-                <w:rFonts w:eastAsia="Aptos" w:cs=""/>
+                <w:rFonts w:eastAsia="Aptos"/>
                 <w:color w:val="000000" w:themeColor="text1"/>
-                <w:kern w:val="2"/>
-                <w:sz w:val="22"/>
-                <w:szCs w:val="22"/>
-                <w:lang w:val="en-AU" w:eastAsia="en-US" w:bidi="ar-SA"/>
               </w:rPr>
               <w:t>blah</w:t>
             </w:r>
@@ -1910,138 +1661,78 @@
         <w:tc>
           <w:tcPr>
             <w:tcW w:w="4508" w:type="dxa"/>
-            <w:tcBorders/>
           </w:tcPr>
-          <w:p wp14:textId="77777777">
+          <w:p>
             <w:pPr>
-              <w:pStyle w:val="Normal"/>
-              <w:widowControl/>
-              <w:spacing w:before="0" w:after="0" w:line="240" w:lineRule="auto"/>
-              <w:jc w:val="start"/>
-              <w:rPr>
-                <w:rFonts w:eastAsia="Aptos" w:cs=""/>
+              <w:spacing w:after="0" w:line="240" w:lineRule="auto"/>
+              <w:jc w:val="left"/>
+              <w:rPr>
+                <w:rFonts w:eastAsia="Aptos"/>
                 <w:color w:val="000000" w:themeColor="text1"/>
-                <w:kern w:val="2"/>
-                <w:sz w:val="22"/>
-                <w:szCs w:val="22"/>
-                <w:lang w:val="en-AU" w:eastAsia="en-US" w:bidi="ar-SA"/>
               </w:rPr>
             </w:pPr>
             <w:r>
               <w:rPr>
-                <w:rFonts w:eastAsia="Aptos" w:cs=""/>
+                <w:rFonts w:eastAsia="Aptos"/>
                 <w:color w:val="000000" w:themeColor="text1"/>
-                <w:kern w:val="2"/>
-                <w:sz w:val="22"/>
-                <w:szCs w:val="22"/>
-                <w:lang w:val="en-AU" w:eastAsia="en-US" w:bidi="ar-SA"/>
               </w:rPr>
               <w:t>3</w:t>
             </w:r>
           </w:p>
         </w:tc>
       </w:tr>
-      <w:tr xmlns:wp14="http://schemas.microsoft.com/office/word/2010/wordml" wp14:textId="77777777">
-        <w:trPr/>
+      <w:tr>
         <w:tc>
           <w:tcPr>
             <w:tcW w:w="4508" w:type="dxa"/>
-            <w:tcBorders/>
           </w:tcPr>
-          <w:p wp14:textId="77777777">
+          <w:p>
             <w:pPr>
-              <w:pStyle w:val="Normal"/>
-              <w:widowControl/>
-              <w:spacing w:before="0" w:after="0" w:line="240" w:lineRule="auto"/>
-              <w:jc w:val="start"/>
-              <w:rPr>
-                <w:rFonts w:eastAsia="Aptos" w:cs=""/>
+              <w:spacing w:after="0" w:line="240" w:lineRule="auto"/>
+              <w:jc w:val="left"/>
+              <w:rPr>
+                <w:rFonts w:eastAsia="Aptos"/>
                 <w:color w:val="000000" w:themeColor="text1"/>
-                <w:kern w:val="2"/>
-                <w:sz w:val="22"/>
-                <w:szCs w:val="22"/>
-                <w:lang w:val="en-AU" w:eastAsia="en-US" w:bidi="ar-SA"/>
               </w:rPr>
             </w:pPr>
-            <w:r>
-              <w:rPr>
-                <w:rFonts w:eastAsia="Aptos" w:cs=""/>
-                <w:color w:val="000000" w:themeColor="text1"/>
-                <w:kern w:val="2"/>
-                <w:sz w:val="22"/>
-                <w:szCs w:val="22"/>
-                <w:lang w:val="en-AU" w:eastAsia="en-US" w:bidi="ar-SA"/>
-              </w:rPr>
-            </w:r>
           </w:p>
         </w:tc>
         <w:tc>
           <w:tcPr>
             <w:tcW w:w="4508" w:type="dxa"/>
-            <w:tcBorders/>
           </w:tcPr>
-          <w:p wp14:textId="77777777">
+          <w:p>
             <w:pPr>
-              <w:pStyle w:val="Normal"/>
-              <w:widowControl/>
-              <w:spacing w:before="0" w:after="0" w:line="240" w:lineRule="auto"/>
-              <w:jc w:val="start"/>
-              <w:rPr>
-                <w:rFonts w:eastAsia="Aptos" w:cs=""/>
+              <w:spacing w:after="0" w:line="240" w:lineRule="auto"/>
+              <w:jc w:val="left"/>
+              <w:rPr>
+                <w:rFonts w:eastAsia="Aptos"/>
                 <w:color w:val="000000" w:themeColor="text1"/>
-                <w:kern w:val="2"/>
-                <w:sz w:val="22"/>
-                <w:szCs w:val="22"/>
-                <w:lang w:val="en-AU" w:eastAsia="en-US" w:bidi="ar-SA"/>
               </w:rPr>
             </w:pPr>
-            <w:r>
-              <w:rPr>
-                <w:rFonts w:eastAsia="Aptos" w:cs=""/>
-                <w:color w:val="000000" w:themeColor="text1"/>
-                <w:kern w:val="2"/>
-                <w:sz w:val="22"/>
-                <w:szCs w:val="22"/>
-                <w:lang w:val="en-AU" w:eastAsia="en-US" w:bidi="ar-SA"/>
-              </w:rPr>
-            </w:r>
           </w:p>
         </w:tc>
       </w:tr>
     </w:tbl>
-    <w:p xmlns:wp14="http://schemas.microsoft.com/office/word/2010/wordml" wp14:textId="77777777">
-      <w:pPr>
-        <w:pStyle w:val="Normal"/>
-        <w:rPr/>
-      </w:pPr>
-      <w:r>
-        <w:rPr/>
-      </w:r>
-    </w:p>
-    <w:p xmlns:wp14="http://schemas.microsoft.com/office/word/2010/wordml" wp14:textId="77777777">
-      <w:pPr>
-        <w:pStyle w:val="Normal"/>
-        <w:rPr/>
-      </w:pPr>
-      <w:r>
-        <w:rPr/>
+    <w:p/>
+    <w:p>
+      <w:r>
         <w:t>You can use the following shape template for emphatic notes throughout the report if you like:</w:t>
       </w:r>
     </w:p>
-    <w:p xmlns:wp14="http://schemas.microsoft.com/office/word/2010/wordml" wp14:textId="77777777">
-      <w:pPr>
-        <w:pStyle w:val="Normal"/>
-        <w:rPr/>
-      </w:pPr>
-      <w:r>
-        <w:rPr/>
+    <w:p>
+      <w:r>
+        <w:rPr>
+          <w:noProof/>
+        </w:rPr>
         <mc:AlternateContent>
           <mc:Choice Requires="wpg">
             <w:drawing>
-              <wp:inline xmlns:wp14="http://schemas.microsoft.com/office/word/2010/wordprocessingDrawing" distT="0" distB="0" distL="0" distR="0" wp14:anchorId="1FA85554" wp14:editId="7777777">
+              <wp:inline distT="0" distB="0" distL="0" distR="0" wp14:anchorId="1FA85554" wp14:editId="07777777">
                 <wp:extent cx="5731510" cy="829310"/>
                 <wp:effectExtent l="0" t="0" r="2540" b="8890"/>
                 <wp:docPr id="3" name="Group 1"/>
+                <wp:cNvGraphicFramePr/>
                 <a:graphic xmlns:a="http://schemas.openxmlformats.org/drawingml/2006/main">
                   <a:graphicData uri="http://schemas.microsoft.com/office/word/2010/wordprocessingGroup">
                     <wpg:wgp>
@@ -2094,10 +1785,10 @@
                           <pic:cNvPicPr/>
                         </pic:nvPicPr>
                         <pic:blipFill>
-                          <a:blip r:embed="rId17">
+                          <a:blip r:embed="rId23">
                             <a:extLst>
                               <a:ext uri="{96DAC541-7B7A-43D3-8B79-37D633B846F1}">
-                                <asvg:svgBlip xmlns:asvg="http://schemas.microsoft.com/office/drawing/2016/SVG/main" r:embed="rId18"/>
+                                <asvg:svgBlip xmlns:asvg="http://schemas.microsoft.com/office/drawing/2016/SVG/main" r:embed="rId24"/>
                               </a:ext>
                             </a:extLst>
                           </a:blip>
@@ -2168,17 +1859,21 @@
                           </a:ln>
                         </wps:spPr>
                         <wps:style>
-                          <a:lnRef idx="0"/>
-                          <a:fillRef idx="0"/>
-                          <a:effectRef idx="0"/>
+                          <a:lnRef idx="0">
+                            <a:scrgbClr r="0" g="0" b="0"/>
+                          </a:lnRef>
+                          <a:fillRef idx="0">
+                            <a:scrgbClr r="0" g="0" b="0"/>
+                          </a:fillRef>
+                          <a:effectRef idx="0">
+                            <a:scrgbClr r="0" g="0" b="0"/>
+                          </a:effectRef>
                           <a:fontRef idx="minor"/>
                         </wps:style>
                         <wps:txbx>
                           <w:txbxContent>
-                            <w:p xmlns:wp14="http://schemas.microsoft.com/office/word/2010/wordml" wp14:textId="77777777">
+                            <w:p>
                               <w:pPr>
-                                <w:pStyle w:val="Normal"/>
-                                <w:spacing w:before="0" w:after="160"/>
                                 <w:rPr>
                                   <w:b/>
                                   <w:bCs/>
@@ -2217,24 +1912,21 @@
                           </a:ln>
                         </wps:spPr>
                         <wps:style>
-                          <a:lnRef idx="0"/>
-                          <a:fillRef idx="0"/>
-                          <a:effectRef idx="0"/>
+                          <a:lnRef idx="0">
+                            <a:scrgbClr r="0" g="0" b="0"/>
+                          </a:lnRef>
+                          <a:fillRef idx="0">
+                            <a:scrgbClr r="0" g="0" b="0"/>
+                          </a:fillRef>
+                          <a:effectRef idx="0">
+                            <a:scrgbClr r="0" g="0" b="0"/>
+                          </a:effectRef>
                           <a:fontRef idx="minor"/>
                         </wps:style>
                         <wps:txbx>
                           <w:txbxContent>
-                            <w:p xmlns:wp14="http://schemas.microsoft.com/office/word/2010/wordml" wp14:textId="77777777">
-                              <w:pPr>
-                                <w:pStyle w:val="Normal"/>
-                                <w:widowControl/>
-                                <w:bidi w:val="0"/>
-                                <w:spacing w:before="0" w:after="160" w:line="259" w:lineRule="auto"/>
-                                <w:jc w:val="both"/>
-                                <w:rPr/>
-                              </w:pPr>
+                            <w:p>
                               <w:r>
-                                <w:rPr/>
                                 <w:t>This is an example of a note.</w:t>
                               </w:r>
                             </w:p>
@@ -2284,7 +1976,7 @@
               </wp:inline>
             </w:drawing>
           </mc:Choice>
-          <mc:Fallback>
+          <mc:Fallback xmlns:wp14="http://schemas.microsoft.com/office/word/2010/wordml" xmlns:a14="http://schemas.microsoft.com/office/drawing/2010/main" xmlns:asvg="http://schemas.microsoft.com/office/drawing/2016/SVG/main" xmlns:a="http://schemas.openxmlformats.org/drawingml/2006/main" xmlns:pic="http://schemas.openxmlformats.org/drawingml/2006/picture">
             <w:pict w14:anchorId="4BF69924">
               <v:group id="shape_0" style="position:absolute;margin-left:0pt;margin-top:-66.05pt;width:451.3pt;height:65.3pt" alt="Group 1" coordsize="9026,1306" coordorigin="0,-1321">
                 <v:rect id="shape_0" style="position:absolute;left:0;top:-1321;width:9025;height:1305;mso-wrap-style:none;v-text-anchor:middle;mso-position-vertical:top" o:allowincell="f" fillcolor="#f2fcf9" stroked="f">
@@ -2312,7 +2004,7 @@
                   <o:lock v:ext="edit" aspectratio="t"/>
                 </v:shapetype>
                 <v:shape id="shape_0" style="position:absolute;left:150;top:-1269;width:367;height:367;mso-wrap-style:none;v-text-anchor:middle;mso-position-vertical:top" o:allowincell="f" stroked="f" type="_x0000_t75">
-                  <v:imagedata o:detectmouseclick="t" r:id="rId19"/>
+                  <v:imagedata o:detectmouseclick="t" r:id="rId25"/>
                   <v:stroke color="#3465a4" joinstyle="round" endcap="flat"/>
                   <w10:wrap type="square"/>
                 </v:shape>
@@ -2383,431 +2075,252 @@
         </mc:AlternateContent>
       </w:r>
     </w:p>
-    <w:p xmlns:wp14="http://schemas.microsoft.com/office/word/2010/wordml" wp14:textId="77777777">
-      <w:pPr>
-        <w:pStyle w:val="Normal"/>
-        <w:rPr/>
-      </w:pPr>
-      <w:r>
-        <w:rPr/>
-      </w:r>
-    </w:p>
-    <w:p xmlns:wp14="http://schemas.microsoft.com/office/word/2010/wordml" wp14:textId="77777777">
-      <w:pPr>
-        <w:pStyle w:val="Normal"/>
-        <w:rPr/>
-      </w:pPr>
-      <w:r>
-        <w:rPr/>
+    <w:p/>
+    <w:p>
+      <w:r>
         <w:t>In this Introduction section, outline the goals of the research project and any necessary background to provide contexts and rationale for the research/work.</w:t>
       </w:r>
     </w:p>
-    <w:p xmlns:wp14="http://schemas.microsoft.com/office/word/2010/wordml" wp14:textId="77777777">
-      <w:pPr>
-        <w:pStyle w:val="Normal"/>
-        <w:rPr/>
-      </w:pPr>
-      <w:r>
-        <w:rPr/>
-      </w:r>
-    </w:p>
-    <w:p xmlns:wp14="http://schemas.microsoft.com/office/word/2010/wordml" wp14:textId="77777777">
+    <w:p/>
+    <w:p>
       <w:pPr>
         <w:pStyle w:val="Heading2"/>
-        <w:rPr/>
-      </w:pPr>
-      <w:bookmarkStart w:name="_Toc213418600" w:id="3"/>
-      <w:r>
-        <w:rPr/>
+      </w:pPr>
+      <w:bookmarkStart w:id="3" w:name="_Toc213418600"/>
+      <w:r>
         <w:t>This is a subsection</w:t>
       </w:r>
       <w:bookmarkEnd w:id="3"/>
     </w:p>
-    <w:p xmlns:wp14="http://schemas.microsoft.com/office/word/2010/wordml" wp14:textId="77777777">
-      <w:pPr>
-        <w:pStyle w:val="Normal"/>
-        <w:rPr/>
-      </w:pPr>
-      <w:r>
-        <w:rPr/>
+    <w:p>
+      <w:r>
         <w:t>Use subsections (and subsubsections) as much as you like to help structure your content.</w:t>
       </w:r>
     </w:p>
-    <w:p xmlns:wp14="http://schemas.microsoft.com/office/word/2010/wordml" wp14:textId="77777777">
-      <w:pPr>
-        <w:pStyle w:val="Normal"/>
-        <w:rPr/>
-      </w:pPr>
-      <w:r>
-        <w:rPr/>
-      </w:r>
-    </w:p>
-    <w:p xmlns:wp14="http://schemas.microsoft.com/office/word/2010/wordml" wp14:textId="77777777">
+    <w:p/>
+    <w:p>
       <w:pPr>
         <w:pStyle w:val="Heading3"/>
-        <w:rPr/>
-      </w:pPr>
-      <w:bookmarkStart w:name="_Toc213418601" w:id="4"/>
-      <w:r>
-        <w:rPr/>
+      </w:pPr>
+      <w:bookmarkStart w:id="4" w:name="_Toc213418601"/>
+      <w:r>
         <w:t>This is a subsubsection</w:t>
       </w:r>
       <w:bookmarkEnd w:id="4"/>
     </w:p>
-    <w:p xmlns:wp14="http://schemas.microsoft.com/office/word/2010/wordml" wp14:textId="77777777">
-      <w:pPr>
-        <w:pStyle w:val="Normal"/>
-        <w:rPr/>
-      </w:pPr>
-      <w:r>
-        <w:rPr/>
-      </w:r>
-    </w:p>
-    <w:p xmlns:wp14="http://schemas.microsoft.com/office/word/2010/wordml" wp14:textId="77777777">
-      <w:pPr>
-        <w:pStyle w:val="Normal"/>
-        <w:rPr/>
-      </w:pPr>
-      <w:r>
-        <w:rPr/>
-      </w:r>
-    </w:p>
-    <w:p xmlns:wp14="http://schemas.microsoft.com/office/word/2010/wordml" wp14:textId="77777777">
-      <w:pPr>
-        <w:pStyle w:val="Normal"/>
-        <w:rPr/>
-      </w:pPr>
-      <w:r>
-        <w:rPr/>
-      </w:r>
+    <w:p/>
+    <w:p/>
+    <w:p>
       <w:r>
         <w:br w:type="page"/>
       </w:r>
     </w:p>
-    <w:p xmlns:wp14="http://schemas.microsoft.com/office/word/2010/wordml" wp14:textId="77777777">
+    <w:p>
       <w:pPr>
         <w:pStyle w:val="Heading1"/>
         <w:numPr>
           <w:ilvl w:val="0"/>
           <w:numId w:val="1"/>
         </w:numPr>
-        <w:rPr/>
-      </w:pPr>
-      <w:bookmarkStart w:name="_Toc213418602" w:id="5"/>
-      <w:r>
-        <w:rPr/>
+      </w:pPr>
+      <w:bookmarkStart w:id="5" w:name="_Toc213418602"/>
+      <w:r>
+        <w:lastRenderedPageBreak/>
         <w:t>Trial design</w:t>
       </w:r>
       <w:bookmarkEnd w:id="5"/>
     </w:p>
-    <w:p xmlns:wp14="http://schemas.microsoft.com/office/word/2010/wordml" wp14:textId="77777777">
-      <w:pPr>
-        <w:pStyle w:val="Normal"/>
-        <w:rPr/>
-      </w:pPr>
-      <w:r>
-        <w:rPr/>
-        <w:t>Include the trial layout, type, and the experimental design, such as treatments, number of replicates, blocking, etc. Include graphics and pictures where useful.</w:t>
-      </w:r>
-    </w:p>
-    <w:p xmlns:wp14="http://schemas.microsoft.com/office/word/2010/wordml" wp14:textId="77777777">
-      <w:pPr>
-        <w:pStyle w:val="Normal"/>
-        <w:rPr/>
-      </w:pPr>
-      <w:r>
-        <w:rPr/>
+    <w:p>
+      <w:r>
+        <w:t xml:space="preserve">Include the trial layout, type, and the experimental design, such as treatments, number of replicates, blocking, etc. Include graphics and pictures </w:t>
+      </w:r>
+      <w:proofErr w:type="gramStart"/>
+      <w:r>
+        <w:t>where</w:t>
+      </w:r>
+      <w:proofErr w:type="gramEnd"/>
+      <w:r>
+        <w:t xml:space="preserve"> useful.</w:t>
+      </w:r>
+    </w:p>
+    <w:p>
+      <w:r>
         <w:t>Make sure to include notes about any specific considerations that must be kept in mind for the type of trial (e.g., small plots, glasshouse experiments, genetics, breeding trials, OFE projects, bioinformatics projects, and so on).</w:t>
       </w:r>
     </w:p>
-    <w:p xmlns:wp14="http://schemas.microsoft.com/office/word/2010/wordml" wp14:textId="77777777">
-      <w:pPr>
-        <w:pStyle w:val="Normal"/>
-        <w:rPr/>
-      </w:pPr>
-      <w:r>
-        <w:rPr/>
-      </w:r>
-    </w:p>
-    <w:p xmlns:wp14="http://schemas.microsoft.com/office/word/2010/wordml" wp14:textId="77777777">
-      <w:pPr>
-        <w:pStyle w:val="Normal"/>
-        <w:rPr/>
-      </w:pPr>
-      <w:r>
-        <w:rPr/>
-      </w:r>
+    <w:p/>
+    <w:p>
       <w:r>
         <w:br w:type="page"/>
       </w:r>
     </w:p>
-    <w:p xmlns:wp14="http://schemas.microsoft.com/office/word/2010/wordml" wp14:textId="77777777">
+    <w:p>
       <w:pPr>
         <w:pStyle w:val="Heading1"/>
         <w:numPr>
           <w:ilvl w:val="0"/>
           <w:numId w:val="1"/>
         </w:numPr>
-        <w:rPr/>
-      </w:pPr>
-      <w:bookmarkStart w:name="_Toc213418603" w:id="6"/>
-      <w:r>
-        <w:rPr/>
+      </w:pPr>
+      <w:bookmarkStart w:id="6" w:name="_Toc213418603"/>
+      <w:r>
+        <w:lastRenderedPageBreak/>
         <w:t>Exploratory data analysis</w:t>
       </w:r>
       <w:bookmarkEnd w:id="6"/>
     </w:p>
-    <w:p xmlns:wp14="http://schemas.microsoft.com/office/word/2010/wordml" wp14:textId="77777777">
-      <w:pPr>
-        <w:pStyle w:val="Normal"/>
-        <w:rPr/>
-      </w:pPr>
-      <w:r>
-        <w:rPr/>
+    <w:p>
+      <w:r>
         <w:t>You can use a dedicated section here for the preliminary data exploration and dataset visualisation. This can be useful to aid in the interpretation of the data and graphs generated throughout the work, as well as for providing a rationale for the statistical methodologies used.</w:t>
       </w:r>
     </w:p>
-    <w:p xmlns:wp14="http://schemas.microsoft.com/office/word/2010/wordml" wp14:textId="77777777">
-      <w:pPr>
-        <w:pStyle w:val="Normal"/>
-        <w:rPr/>
-      </w:pPr>
-      <w:r>
-        <w:rPr/>
-      </w:r>
-    </w:p>
-    <w:p xmlns:wp14="http://schemas.microsoft.com/office/word/2010/wordml" wp14:textId="77777777">
-      <w:pPr>
-        <w:pStyle w:val="Normal"/>
-        <w:rPr/>
-      </w:pPr>
-      <w:r>
-        <w:rPr/>
-      </w:r>
+    <w:p/>
+    <w:p>
       <w:r>
         <w:br w:type="page"/>
       </w:r>
     </w:p>
-    <w:p xmlns:wp14="http://schemas.microsoft.com/office/word/2010/wordml" wp14:textId="77777777">
+    <w:p>
       <w:pPr>
         <w:pStyle w:val="Heading1"/>
         <w:numPr>
           <w:ilvl w:val="0"/>
           <w:numId w:val="1"/>
         </w:numPr>
-        <w:rPr/>
-      </w:pPr>
-      <w:bookmarkStart w:name="_Toc213418604" w:id="7"/>
-      <w:r>
-        <w:rPr/>
+      </w:pPr>
+      <w:bookmarkStart w:id="7" w:name="_Toc213418604"/>
+      <w:r>
+        <w:lastRenderedPageBreak/>
         <w:t>Methods</w:t>
       </w:r>
       <w:bookmarkEnd w:id="7"/>
     </w:p>
-    <w:p xmlns:wp14="http://schemas.microsoft.com/office/word/2010/wordml" wp14:textId="77777777">
-      <w:pPr>
-        <w:pStyle w:val="Normal"/>
-        <w:rPr/>
-      </w:pPr>
-      <w:r>
-        <w:rPr/>
+    <w:p>
+      <w:r>
         <w:t>Use this section to include a detailed description of the procedures and methodologies used for the analysis. Include versions/commits on developed pipelines, code scripts, and input/output details as relevant.</w:t>
       </w:r>
     </w:p>
-    <w:p xmlns:wp14="http://schemas.microsoft.com/office/word/2010/wordml" wp14:textId="77777777">
-      <w:pPr>
-        <w:pStyle w:val="Normal"/>
-        <w:rPr/>
-      </w:pPr>
-      <w:r>
-        <w:rPr/>
+    <w:p>
+      <w:r>
         <w:t>Detail also the approach taken for the data analysis work here (or in a separate section).</w:t>
       </w:r>
     </w:p>
-    <w:p xmlns:wp14="http://schemas.microsoft.com/office/word/2010/wordml" wp14:textId="77777777">
-      <w:pPr>
-        <w:pStyle w:val="Normal"/>
-        <w:rPr/>
-      </w:pPr>
-      <w:r>
-        <w:rPr/>
-      </w:r>
-    </w:p>
-    <w:p xmlns:wp14="http://schemas.microsoft.com/office/word/2010/wordml" wp14:textId="77777777">
-      <w:pPr>
-        <w:pStyle w:val="Normal"/>
-        <w:rPr/>
-      </w:pPr>
-      <w:r>
-        <w:rPr/>
-      </w:r>
+    <w:p/>
+    <w:p>
       <w:r>
         <w:br w:type="page"/>
       </w:r>
     </w:p>
-    <w:p xmlns:wp14="http://schemas.microsoft.com/office/word/2010/wordml" wp14:textId="77777777">
+    <w:p>
       <w:pPr>
         <w:pStyle w:val="Heading1"/>
         <w:numPr>
           <w:ilvl w:val="0"/>
           <w:numId w:val="1"/>
         </w:numPr>
-        <w:rPr/>
-      </w:pPr>
-      <w:bookmarkStart w:name="_Toc213418605" w:id="8"/>
-      <w:r>
-        <w:rPr/>
+      </w:pPr>
+      <w:bookmarkStart w:id="8" w:name="_Toc213418605"/>
+      <w:r>
+        <w:lastRenderedPageBreak/>
         <w:t>Results and discussion</w:t>
       </w:r>
       <w:bookmarkEnd w:id="8"/>
     </w:p>
-    <w:p xmlns:wp14="http://schemas.microsoft.com/office/word/2010/wordml" wp14:textId="77777777">
-      <w:pPr>
-        <w:pStyle w:val="Normal"/>
-        <w:rPr/>
-      </w:pPr>
-      <w:r>
-        <w:rPr/>
-        <w:t>Include all of the results of the analytical work, and discuss the findings and their implications with respect to the research question.</w:t>
-      </w:r>
-    </w:p>
-    <w:p xmlns:wp14="http://schemas.microsoft.com/office/word/2010/wordml" wp14:textId="77777777">
-      <w:pPr>
-        <w:pStyle w:val="Normal"/>
-        <w:rPr/>
-      </w:pPr>
-      <w:r>
-        <w:rPr/>
-      </w:r>
-    </w:p>
-    <w:p xmlns:wp14="http://schemas.microsoft.com/office/word/2010/wordml" wp14:textId="77777777">
-      <w:pPr>
-        <w:pStyle w:val="Normal"/>
-        <w:rPr/>
-      </w:pPr>
-      <w:r>
-        <w:rPr/>
-      </w:r>
+    <w:p>
+      <w:r>
+        <w:t xml:space="preserve">Include </w:t>
+      </w:r>
+      <w:proofErr w:type="gramStart"/>
+      <w:r>
+        <w:t>all of</w:t>
+      </w:r>
+      <w:proofErr w:type="gramEnd"/>
+      <w:r>
+        <w:t xml:space="preserve"> the results of the analytical </w:t>
+      </w:r>
+      <w:proofErr w:type="gramStart"/>
+      <w:r>
+        <w:t>work, and</w:t>
+      </w:r>
+      <w:proofErr w:type="gramEnd"/>
+      <w:r>
+        <w:t xml:space="preserve"> discuss the findings and their implications with respect to the research question.</w:t>
+      </w:r>
+    </w:p>
+    <w:p/>
+    <w:p>
       <w:r>
         <w:br w:type="page"/>
       </w:r>
     </w:p>
-    <w:p xmlns:wp14="http://schemas.microsoft.com/office/word/2010/wordml" wp14:textId="77777777">
+    <w:p>
       <w:pPr>
         <w:pStyle w:val="Heading1"/>
         <w:numPr>
           <w:ilvl w:val="0"/>
           <w:numId w:val="1"/>
         </w:numPr>
-        <w:rPr/>
-      </w:pPr>
-      <w:bookmarkStart w:name="_Toc213418606" w:id="9"/>
-      <w:r>
-        <w:rPr/>
+      </w:pPr>
+      <w:bookmarkStart w:id="9" w:name="_Toc213418606"/>
+      <w:r>
+        <w:lastRenderedPageBreak/>
         <w:t>Datasets and metadata</w:t>
       </w:r>
       <w:bookmarkEnd w:id="9"/>
     </w:p>
-    <w:p xmlns:wp14="http://schemas.microsoft.com/office/word/2010/wordml" wp14:textId="77777777">
-      <w:pPr>
-        <w:pStyle w:val="Normal"/>
-        <w:rPr/>
-      </w:pPr>
-      <w:r>
-        <w:rPr/>
+    <w:p>
+      <w:r>
         <w:t>(Optional) Where useful, include descriptions of the datasets relevant to this research, including links and DOIs to enable findability of these datasets. (Often for GRDC projects these will have associated metadata entries in the GRDC Data Catalogue, which can be linked where appropriate.)</w:t>
       </w:r>
     </w:p>
-    <w:p xmlns:wp14="http://schemas.microsoft.com/office/word/2010/wordml" wp14:textId="77777777">
-      <w:pPr>
-        <w:pStyle w:val="Normal"/>
-        <w:rPr/>
-      </w:pPr>
-      <w:r>
-        <w:rPr/>
+    <w:p>
+      <w:r>
         <w:t>Where you have publicly available code on GitHub associated with the analytics (e.g., pipelines), you can include git commit numbers and tags. Including md5/sha256 checksums for input data and outputs is also useful for research reproducibility.</w:t>
       </w:r>
     </w:p>
-    <w:p xmlns:wp14="http://schemas.microsoft.com/office/word/2010/wordml" wp14:textId="77777777">
-      <w:pPr>
-        <w:pStyle w:val="Normal"/>
-        <w:rPr/>
-      </w:pPr>
-      <w:r>
-        <w:rPr/>
-      </w:r>
-    </w:p>
-    <w:p xmlns:wp14="http://schemas.microsoft.com/office/word/2010/wordml" wp14:textId="77777777">
-      <w:pPr>
-        <w:pStyle w:val="Normal"/>
-        <w:rPr/>
-      </w:pPr>
-      <w:r>
-        <w:rPr/>
-      </w:r>
+    <w:p/>
+    <w:p>
       <w:r>
         <w:br w:type="page"/>
       </w:r>
     </w:p>
-    <w:p xmlns:wp14="http://schemas.microsoft.com/office/word/2010/wordml" wp14:textId="77777777">
+    <w:p>
       <w:pPr>
         <w:pStyle w:val="Heading1"/>
         <w:numPr>
           <w:ilvl w:val="0"/>
           <w:numId w:val="1"/>
         </w:numPr>
-        <w:rPr/>
-      </w:pPr>
-      <w:bookmarkStart w:name="_Toc213418607" w:id="10"/>
-      <w:r>
-        <w:rPr/>
+      </w:pPr>
+      <w:bookmarkStart w:id="10" w:name="_Toc213418607"/>
+      <w:r>
+        <w:lastRenderedPageBreak/>
         <w:t>Trial location maps</w:t>
       </w:r>
       <w:bookmarkEnd w:id="10"/>
     </w:p>
-    <w:p xmlns:wp14="http://schemas.microsoft.com/office/word/2010/wordml" wp14:textId="77777777">
-      <w:pPr>
-        <w:pStyle w:val="Normal"/>
-        <w:rPr/>
-      </w:pPr>
-      <w:r>
-        <w:rPr/>
+    <w:p>
+      <w:r>
         <w:t>(Optional) Include if relevant to the project.</w:t>
       </w:r>
     </w:p>
-    <w:p xmlns:wp14="http://schemas.microsoft.com/office/word/2010/wordml" wp14:textId="77777777">
-      <w:pPr>
-        <w:pStyle w:val="Normal"/>
-        <w:rPr/>
-      </w:pPr>
-      <w:r>
-        <w:rPr/>
-      </w:r>
-    </w:p>
-    <w:p xmlns:wp14="http://schemas.microsoft.com/office/word/2010/wordml" wp14:textId="77777777">
-      <w:pPr>
-        <w:pStyle w:val="Normal"/>
-        <w:rPr/>
-      </w:pPr>
-      <w:r>
-        <w:rPr/>
-      </w:r>
+    <w:p/>
+    <w:p>
       <w:r>
         <w:br w:type="page"/>
       </w:r>
     </w:p>
-    <w:p xmlns:wp14="http://schemas.microsoft.com/office/word/2010/wordml" wp14:textId="77777777">
+    <w:p>
       <w:pPr>
         <w:pStyle w:val="Heading1"/>
         <w:numPr>
           <w:ilvl w:val="0"/>
           <w:numId w:val="1"/>
         </w:numPr>
-        <w:rPr/>
-      </w:pPr>
-      <w:bookmarkStart w:name="_Toc213418608" w:id="11"/>
-      <w:r>
-        <w:rPr/>
+      </w:pPr>
+      <w:bookmarkStart w:id="11" w:name="_Toc213418608"/>
+      <w:r>
+        <w:lastRenderedPageBreak/>
         <w:t>References</w:t>
       </w:r>
       <w:bookmarkEnd w:id="11"/>
@@ -2815,15 +2328,12 @@
     <w:sdt>
       <w:sdtPr>
         <w:id w:val="-573587230"/>
-        <w:placeholder>
-          <w:docPart w:val="DefaultPlaceholder_1081868574"/>
-        </w:placeholder>
       </w:sdtPr>
       <w:sdtContent>
-        <w:p xmlns:wp14="http://schemas.microsoft.com/office/word/2010/wordml" wp14:textId="77777777">
+        <w:p>
           <w:pPr>
             <w:pStyle w:val="Bibliography"/>
-            <w:ind w:start="720" w:hanging="720"/>
+            <w:ind w:left="720" w:hanging="720"/>
             <w:rPr>
               <w:kern w:val="0"/>
               <w:sz w:val="24"/>
@@ -2835,15 +2345,12 @@
             <w:fldChar w:fldCharType="begin"/>
           </w:r>
           <w:r>
-            <w:rPr/>
             <w:instrText xml:space="preserve"> BIBLIOGRAPHY </w:instrText>
           </w:r>
           <w:r>
-            <w:rPr/>
             <w:fldChar w:fldCharType="separate"/>
           </w:r>
           <w:r>
-            <w:rPr/>
             <w:t xml:space="preserve">Person, M. (2024). My article title goes here. </w:t>
           </w:r>
           <w:r>
@@ -2854,209 +2361,142 @@
             <w:t>My Journal, 13</w:t>
           </w:r>
           <w:r>
-            <w:rPr/>
             <w:t>, pp. 12-34.</w:t>
           </w:r>
         </w:p>
-        <w:p xmlns:wp14="http://schemas.microsoft.com/office/word/2010/wordml" wp14:textId="77777777">
-          <w:pPr>
-            <w:pStyle w:val="Normal"/>
-            <w:rPr/>
-          </w:pPr>
+        <w:p>
           <w:r>
-            <w:rPr/>
-          </w:r>
-          <w:r>
-            <w:rPr/>
             <w:fldChar w:fldCharType="end"/>
           </w:r>
         </w:p>
       </w:sdtContent>
     </w:sdt>
-    <w:p xmlns:wp14="http://schemas.microsoft.com/office/word/2010/wordml" wp14:textId="77777777">
-      <w:pPr>
-        <w:pStyle w:val="Normal"/>
-        <w:rPr/>
-      </w:pPr>
-      <w:r>
-        <w:rPr/>
-      </w:r>
-    </w:p>
-    <w:p xmlns:wp14="http://schemas.microsoft.com/office/word/2010/wordml" wp14:textId="77777777">
-      <w:pPr>
-        <w:pStyle w:val="Normal"/>
-        <w:rPr/>
-      </w:pPr>
-      <w:r>
-        <w:rPr/>
-      </w:r>
-    </w:p>
-    <w:p xmlns:wp14="http://schemas.microsoft.com/office/word/2010/wordml" wp14:textId="77777777">
-      <w:pPr>
-        <w:pStyle w:val="Normal"/>
-        <w:rPr/>
-      </w:pPr>
-      <w:r>
-        <w:rPr/>
-      </w:r>
+    <w:p/>
+    <w:p/>
+    <w:p>
       <w:r>
         <w:br w:type="page"/>
       </w:r>
     </w:p>
-    <w:p xmlns:wp14="http://schemas.microsoft.com/office/word/2010/wordml" wp14:textId="77777777">
+    <w:p>
       <w:pPr>
         <w:pStyle w:val="Heading1"/>
         <w:numPr>
           <w:ilvl w:val="0"/>
           <w:numId w:val="2"/>
         </w:numPr>
-        <w:rPr/>
-      </w:pPr>
-      <w:bookmarkStart w:name="_Toc213418609" w:id="12"/>
-      <w:r>
-        <w:rPr/>
+      </w:pPr>
+      <w:bookmarkStart w:id="12" w:name="_Toc213418609"/>
+      <w:r>
+        <w:lastRenderedPageBreak/>
         <w:t>This is an appendix</w:t>
       </w:r>
       <w:bookmarkEnd w:id="12"/>
     </w:p>
-    <w:p xmlns:wp14="http://schemas.microsoft.com/office/word/2010/wordml" wp14:textId="77777777">
-      <w:pPr>
-        <w:pStyle w:val="Normal"/>
-        <w:rPr/>
-      </w:pPr>
-      <w:r>
-        <w:rPr/>
+    <w:p>
+      <w:r>
         <w:t>Include Appendices at the end of the report as necessary, to contain any additional supporting information of interest.</w:t>
       </w:r>
     </w:p>
-    <w:p xmlns:wp14="http://schemas.microsoft.com/office/word/2010/wordml" wp14:textId="77777777">
-      <w:pPr>
-        <w:pStyle w:val="Normal"/>
-        <w:rPr/>
-      </w:pPr>
-      <w:r>
-        <w:rPr/>
-      </w:r>
-    </w:p>
-    <w:p xmlns:wp14="http://schemas.microsoft.com/office/word/2010/wordml" wp14:textId="77777777">
-      <w:pPr>
-        <w:pStyle w:val="Normal"/>
-        <w:rPr/>
-      </w:pPr>
-      <w:r>
-        <w:rPr/>
-      </w:r>
+    <w:p/>
+    <w:p>
       <w:r>
         <w:br w:type="page"/>
       </w:r>
     </w:p>
-    <w:p xmlns:wp14="http://schemas.microsoft.com/office/word/2010/wordml" wp14:textId="77777777">
+    <w:p>
       <w:pPr>
         <w:pStyle w:val="Heading1"/>
         <w:numPr>
           <w:ilvl w:val="0"/>
           <w:numId w:val="2"/>
         </w:numPr>
-        <w:rPr/>
-      </w:pPr>
-      <w:bookmarkStart w:name="_Toc213418610" w:id="13"/>
-      <w:r>
-        <w:rPr/>
+      </w:pPr>
+      <w:bookmarkStart w:id="13" w:name="_Toc213418610"/>
+      <w:r>
+        <w:lastRenderedPageBreak/>
         <w:t>This is another appendix</w:t>
       </w:r>
       <w:bookmarkEnd w:id="13"/>
     </w:p>
-    <w:p xmlns:wp14="http://schemas.microsoft.com/office/word/2010/wordml" wp14:textId="77777777">
-      <w:pPr>
-        <w:pStyle w:val="Normal"/>
-        <w:rPr/>
-      </w:pPr>
-      <w:r>
-        <w:rPr/>
+    <w:p>
+      <w:r>
         <w:t xml:space="preserve">Include as many appendices as you like. </w:t>
       </w:r>
     </w:p>
-    <w:p xmlns:wp14="http://schemas.microsoft.com/office/word/2010/wordml" wp14:textId="77777777">
-      <w:pPr>
-        <w:pStyle w:val="Normal"/>
-        <w:rPr/>
-      </w:pPr>
-      <w:r>
-        <w:rPr/>
-      </w:r>
-    </w:p>
-    <w:p xmlns:wp14="http://schemas.microsoft.com/office/word/2010/wordml" wp14:textId="77777777">
-      <w:pPr>
-        <w:pStyle w:val="Normal"/>
-        <w:widowControl/>
-        <w:bidi w:val="0"/>
-        <w:spacing w:before="0" w:after="160" w:line="259" w:lineRule="auto"/>
-        <w:jc w:val="both"/>
-        <w:rPr/>
-      </w:pPr>
-      <w:r>
-        <w:rPr/>
-      </w:r>
-    </w:p>
+    <w:p/>
+    <w:p/>
     <w:sectPr>
-      <w:headerReference w:type="even" r:id="rId20"/>
-      <w:headerReference w:type="default" r:id="rId21"/>
-      <w:headerReference w:type="first" r:id="rId22"/>
-      <w:footerReference w:type="default" r:id="rId23"/>
-      <w:footerReference w:type="first" r:id="rId24"/>
-      <w:type w:val="nextPage"/>
-      <w:pgSz w:w="11906" w:h="16838" w:orient="portrait"/>
+      <w:headerReference w:type="even" r:id="rId26"/>
+      <w:headerReference w:type="default" r:id="rId27"/>
+      <w:footerReference w:type="default" r:id="rId28"/>
+      <w:headerReference w:type="first" r:id="rId29"/>
+      <w:footerReference w:type="first" r:id="rId30"/>
+      <w:pgSz w:w="11906" w:h="16838"/>
       <w:pgMar w:top="1440" w:right="1440" w:bottom="1440" w:left="1440" w:header="708" w:footer="708" w:gutter="0"/>
-      <w:pgNumType w:fmt="decimal"/>
-      <w:formProt w:val="false"/>
-      <w:textDirection w:val="lrTb"/>
-      <w:docGrid w:type="default" w:linePitch="360" w:charSpace="0"/>
-      <w:cols w:num="1"/>
+      <w:cols w:space="720"/>
+      <w:formProt w:val="0"/>
+      <w:docGrid w:linePitch="360"/>
     </w:sectPr>
   </w:body>
 </w:document>
 </file>
 
+<file path=word/endnotes.xml><?xml version="1.0" encoding="utf-8"?>
+<w:endnotes xmlns:wpc="http://schemas.microsoft.com/office/word/2010/wordprocessingCanvas" xmlns:cx="http://schemas.microsoft.com/office/drawing/2014/chartex" xmlns:cx1="http://schemas.microsoft.com/office/drawing/2015/9/8/chartex" xmlns:cx2="http://schemas.microsoft.com/office/drawing/2015/10/21/chartex" xmlns:cx3="http://schemas.microsoft.com/office/drawing/2016/5/9/chartex" xmlns:cx4="http://schemas.microsoft.com/office/drawing/2016/5/10/chartex" xmlns:cx5="http://schemas.microsoft.com/office/drawing/2016/5/11/chartex" xmlns:cx6="http://schemas.microsoft.com/office/drawing/2016/5/12/chartex" xmlns:cx7="http://schemas.microsoft.com/office/drawing/2016/5/13/chartex" xmlns:cx8="http://schemas.microsoft.com/office/drawing/2016/5/14/chartex" xmlns:mc="http://schemas.openxmlformats.org/markup-compatibility/2006" xmlns:aink="http://schemas.microsoft.com/office/drawing/2016/ink" xmlns:am3d="http://schemas.microsoft.com/office/drawing/2017/model3d" xmlns:o="urn:schemas-microsoft-com:office:office" xmlns:oel="http://schemas.microsoft.com/office/2019/extlst" xmlns:r="http://schemas.openxmlformats.org/officeDocument/2006/relationships" xmlns:m="http://schemas.openxmlformats.org/officeDocument/2006/math" xmlns:v="urn:schemas-microsoft-com:vml" xmlns:wp14="http://schemas.microsoft.com/office/word/2010/wordprocessingDrawing" xmlns:wp="http://schemas.openxmlformats.org/drawingml/2006/wordprocessingDrawing" xmlns:w10="urn:schemas-microsoft-com:office:word" xmlns:w="http://schemas.openxmlformats.org/wordprocessingml/2006/main" xmlns:w14="http://schemas.microsoft.com/office/word/2010/wordml" xmlns:w15="http://schemas.microsoft.com/office/word/2012/wordml" xmlns:w16cex="http://schemas.microsoft.com/office/word/2018/wordml/cex" xmlns:w16cid="http://schemas.microsoft.com/office/word/2016/wordml/cid" xmlns:w16="http://schemas.microsoft.com/office/word/2018/wordml" xmlns:w16du="http://schemas.microsoft.com/office/word/2023/wordml/word16du" xmlns:w16sdtdh="http://schemas.microsoft.com/office/word/2020/wordml/sdtdatahash" xmlns:w16sdtfl="http://schemas.microsoft.com/office/word/2024/wordml/sdtformatlock" xmlns:w16se="http://schemas.microsoft.com/office/word/2015/wordml/symex" xmlns:wpg="http://schemas.microsoft.com/office/word/2010/wordprocessingGroup" xmlns:wpi="http://schemas.microsoft.com/office/word/2010/wordprocessingInk" xmlns:wne="http://schemas.microsoft.com/office/word/2006/wordml" xmlns:wps="http://schemas.microsoft.com/office/word/2010/wordprocessingShape" mc:Ignorable="w14 w15 w16se w16cid w16 w16cex w16sdtdh w16sdtfl w16du wp14">
+  <w:endnote w:type="separator" w:id="-1">
+    <w:p>
+      <w:pPr>
+        <w:spacing w:after="0" w:line="240" w:lineRule="auto"/>
+      </w:pPr>
+      <w:r>
+        <w:separator/>
+      </w:r>
+    </w:p>
+  </w:endnote>
+  <w:endnote w:type="continuationSeparator" w:id="0">
+    <w:p>
+      <w:pPr>
+        <w:spacing w:after="0" w:line="240" w:lineRule="auto"/>
+      </w:pPr>
+      <w:r>
+        <w:continuationSeparator/>
+      </w:r>
+    </w:p>
+  </w:endnote>
+</w:endnotes>
+</file>
+
 <file path=word/footer1.xml><?xml version="1.0" encoding="utf-8"?>
-<w:ftr xmlns:o="urn:schemas-microsoft-com:office:office" xmlns:r="http://schemas.openxmlformats.org/officeDocument/2006/relationships" xmlns:v="urn:schemas-microsoft-com:vml" xmlns:w="http://schemas.openxmlformats.org/wordprocessingml/2006/main" xmlns:w10="urn:schemas-microsoft-com:office:word" xmlns:wp="http://schemas.openxmlformats.org/drawingml/2006/wordprocessingDrawing" xmlns:pic="http://schemas.openxmlformats.org/drawingml/2006/picture" xmlns:wps="http://schemas.microsoft.com/office/word/2010/wordprocessingShape" xmlns:wpg="http://schemas.microsoft.com/office/word/2010/wordprocessingGroup" xmlns:mc="http://schemas.openxmlformats.org/markup-compatibility/2006" xmlns:wp14="http://schemas.microsoft.com/office/word/2010/wordprocessingDrawing" xmlns:w14="http://schemas.microsoft.com/office/word/2010/wordml" xmlns:w15="http://schemas.microsoft.com/office/word/2012/wordml" mc:Ignorable="w14 wp14 w15">
-  <w:p xmlns:wp14="http://schemas.microsoft.com/office/word/2010/wordml" wp14:textId="77777777">
+<w:ftr xmlns:wpc="http://schemas.microsoft.com/office/word/2010/wordprocessingCanvas" xmlns:cx="http://schemas.microsoft.com/office/drawing/2014/chartex" xmlns:cx1="http://schemas.microsoft.com/office/drawing/2015/9/8/chartex" xmlns:cx2="http://schemas.microsoft.com/office/drawing/2015/10/21/chartex" xmlns:cx3="http://schemas.microsoft.com/office/drawing/2016/5/9/chartex" xmlns:cx4="http://schemas.microsoft.com/office/drawing/2016/5/10/chartex" xmlns:cx5="http://schemas.microsoft.com/office/drawing/2016/5/11/chartex" xmlns:cx6="http://schemas.microsoft.com/office/drawing/2016/5/12/chartex" xmlns:cx7="http://schemas.microsoft.com/office/drawing/2016/5/13/chartex" xmlns:cx8="http://schemas.microsoft.com/office/drawing/2016/5/14/chartex" xmlns:mc="http://schemas.openxmlformats.org/markup-compatibility/2006" xmlns:aink="http://schemas.microsoft.com/office/drawing/2016/ink" xmlns:am3d="http://schemas.microsoft.com/office/drawing/2017/model3d" xmlns:o="urn:schemas-microsoft-com:office:office" xmlns:oel="http://schemas.microsoft.com/office/2019/extlst" xmlns:r="http://schemas.openxmlformats.org/officeDocument/2006/relationships" xmlns:m="http://schemas.openxmlformats.org/officeDocument/2006/math" xmlns:v="urn:schemas-microsoft-com:vml" xmlns:wp14="http://schemas.microsoft.com/office/word/2010/wordprocessingDrawing" xmlns:wp="http://schemas.openxmlformats.org/drawingml/2006/wordprocessingDrawing" xmlns:w10="urn:schemas-microsoft-com:office:word" xmlns:w="http://schemas.openxmlformats.org/wordprocessingml/2006/main" xmlns:w14="http://schemas.microsoft.com/office/word/2010/wordml" xmlns:w15="http://schemas.microsoft.com/office/word/2012/wordml" xmlns:w16cex="http://schemas.microsoft.com/office/word/2018/wordml/cex" xmlns:w16cid="http://schemas.microsoft.com/office/word/2016/wordml/cid" xmlns:w16="http://schemas.microsoft.com/office/word/2018/wordml" xmlns:w16du="http://schemas.microsoft.com/office/word/2023/wordml/word16du" xmlns:w16sdtdh="http://schemas.microsoft.com/office/word/2020/wordml/sdtdatahash" xmlns:w16sdtfl="http://schemas.microsoft.com/office/word/2024/wordml/sdtformatlock" xmlns:w16se="http://schemas.microsoft.com/office/word/2015/wordml/symex" xmlns:wpg="http://schemas.microsoft.com/office/word/2010/wordprocessingGroup" xmlns:wpi="http://schemas.microsoft.com/office/word/2010/wordprocessingInk" xmlns:wne="http://schemas.microsoft.com/office/word/2006/wordml" xmlns:wps="http://schemas.microsoft.com/office/word/2010/wordprocessingShape" mc:Ignorable="w14 w15 w16se w16cid w16 w16cex w16sdtdh w16sdtfl w16du wp14">
+  <w:p>
     <w:pPr>
       <w:pStyle w:val="Footer"/>
-      <w:rPr/>
     </w:pPr>
-    <w:r>
-      <w:rPr/>
-    </w:r>
   </w:p>
 </w:ftr>
 </file>
 
 <file path=word/footer10.xml><?xml version="1.0" encoding="utf-8"?>
-<w:ftr xmlns:o="urn:schemas-microsoft-com:office:office" xmlns:r="http://schemas.openxmlformats.org/officeDocument/2006/relationships" xmlns:v="urn:schemas-microsoft-com:vml" xmlns:w="http://schemas.openxmlformats.org/wordprocessingml/2006/main" xmlns:w10="urn:schemas-microsoft-com:office:word" xmlns:wp="http://schemas.openxmlformats.org/drawingml/2006/wordprocessingDrawing" xmlns:pic="http://schemas.openxmlformats.org/drawingml/2006/picture" xmlns:wps="http://schemas.microsoft.com/office/word/2010/wordprocessingShape" xmlns:wpg="http://schemas.microsoft.com/office/word/2010/wordprocessingGroup" xmlns:mc="http://schemas.openxmlformats.org/markup-compatibility/2006" xmlns:wp14="http://schemas.microsoft.com/office/word/2010/wordprocessingDrawing" xmlns:w14="http://schemas.microsoft.com/office/word/2010/wordml" xmlns:w15="http://schemas.microsoft.com/office/word/2012/wordml" mc:Ignorable="w14 wp14 w15">
-  <w:p xmlns:wp14="http://schemas.microsoft.com/office/word/2010/wordml" wp14:textId="77777777">
+<w:ftr xmlns:wpc="http://schemas.microsoft.com/office/word/2010/wordprocessingCanvas" xmlns:cx="http://schemas.microsoft.com/office/drawing/2014/chartex" xmlns:cx1="http://schemas.microsoft.com/office/drawing/2015/9/8/chartex" xmlns:cx2="http://schemas.microsoft.com/office/drawing/2015/10/21/chartex" xmlns:cx3="http://schemas.microsoft.com/office/drawing/2016/5/9/chartex" xmlns:cx4="http://schemas.microsoft.com/office/drawing/2016/5/10/chartex" xmlns:cx5="http://schemas.microsoft.com/office/drawing/2016/5/11/chartex" xmlns:cx6="http://schemas.microsoft.com/office/drawing/2016/5/12/chartex" xmlns:cx7="http://schemas.microsoft.com/office/drawing/2016/5/13/chartex" xmlns:cx8="http://schemas.microsoft.com/office/drawing/2016/5/14/chartex" xmlns:mc="http://schemas.openxmlformats.org/markup-compatibility/2006" xmlns:aink="http://schemas.microsoft.com/office/drawing/2016/ink" xmlns:am3d="http://schemas.microsoft.com/office/drawing/2017/model3d" xmlns:o="urn:schemas-microsoft-com:office:office" xmlns:oel="http://schemas.microsoft.com/office/2019/extlst" xmlns:r="http://schemas.openxmlformats.org/officeDocument/2006/relationships" xmlns:m="http://schemas.openxmlformats.org/officeDocument/2006/math" xmlns:v="urn:schemas-microsoft-com:vml" xmlns:wp14="http://schemas.microsoft.com/office/word/2010/wordprocessingDrawing" xmlns:wp="http://schemas.openxmlformats.org/drawingml/2006/wordprocessingDrawing" xmlns:w10="urn:schemas-microsoft-com:office:word" xmlns:w="http://schemas.openxmlformats.org/wordprocessingml/2006/main" xmlns:w14="http://schemas.microsoft.com/office/word/2010/wordml" xmlns:w15="http://schemas.microsoft.com/office/word/2012/wordml" xmlns:w16cex="http://schemas.microsoft.com/office/word/2018/wordml/cex" xmlns:w16cid="http://schemas.microsoft.com/office/word/2016/wordml/cid" xmlns:w16="http://schemas.microsoft.com/office/word/2018/wordml" xmlns:w16du="http://schemas.microsoft.com/office/word/2023/wordml/word16du" xmlns:w16sdtdh="http://schemas.microsoft.com/office/word/2020/wordml/sdtdatahash" xmlns:w16sdtfl="http://schemas.microsoft.com/office/word/2024/wordml/sdtformatlock" xmlns:w16se="http://schemas.microsoft.com/office/word/2015/wordml/symex" xmlns:wpg="http://schemas.microsoft.com/office/word/2010/wordprocessingGroup" xmlns:wpi="http://schemas.microsoft.com/office/word/2010/wordprocessingInk" xmlns:wne="http://schemas.microsoft.com/office/word/2006/wordml" xmlns:wps="http://schemas.microsoft.com/office/word/2010/wordprocessingShape" mc:Ignorable="w14 w15 w16se w16cid w16 w16cex w16sdtdh w16sdtfl w16du wp14">
+  <w:p>
     <w:pPr>
       <w:pStyle w:val="Footer"/>
-      <w:jc w:val="end"/>
-      <w:rPr/>
+      <w:jc w:val="right"/>
     </w:pPr>
     <w:r>
-      <w:rPr/>
       <w:fldChar w:fldCharType="begin"/>
     </w:r>
     <w:r>
-      <w:rPr/>
       <w:instrText xml:space="preserve"> PAGE </w:instrText>
     </w:r>
     <w:r>
-      <w:rPr/>
       <w:fldChar w:fldCharType="separate"/>
     </w:r>
     <w:r>
-      <w:rPr/>
       <w:t>12</w:t>
     </w:r>
     <w:r>
-      <w:rPr/>
       <w:fldChar w:fldCharType="end"/>
     </w:r>
   </w:p>
@@ -3064,81 +2504,63 @@
 </file>
 
 <file path=word/footer11.xml><?xml version="1.0" encoding="utf-8"?>
-<w:ftr xmlns:o="urn:schemas-microsoft-com:office:office" xmlns:r="http://schemas.openxmlformats.org/officeDocument/2006/relationships" xmlns:v="urn:schemas-microsoft-com:vml" xmlns:w="http://schemas.openxmlformats.org/wordprocessingml/2006/main" xmlns:w10="urn:schemas-microsoft-com:office:word" xmlns:wp="http://schemas.openxmlformats.org/drawingml/2006/wordprocessingDrawing" xmlns:pic="http://schemas.openxmlformats.org/drawingml/2006/picture" xmlns:wps="http://schemas.microsoft.com/office/word/2010/wordprocessingShape" xmlns:wpg="http://schemas.microsoft.com/office/word/2010/wordprocessingGroup" xmlns:mc="http://schemas.openxmlformats.org/markup-compatibility/2006" xmlns:wp14="http://schemas.microsoft.com/office/word/2010/wordprocessingDrawing" xmlns:w14="http://schemas.microsoft.com/office/word/2010/wordml" xmlns:w15="http://schemas.microsoft.com/office/word/2012/wordml" mc:Ignorable="w14 wp14 w15">
-  <w:p xmlns:wp14="http://schemas.microsoft.com/office/word/2010/wordml" wp14:textId="77777777"/>
+<w:ftr xmlns:wpc="http://schemas.microsoft.com/office/word/2010/wordprocessingCanvas" xmlns:cx="http://schemas.microsoft.com/office/drawing/2014/chartex" xmlns:cx1="http://schemas.microsoft.com/office/drawing/2015/9/8/chartex" xmlns:cx2="http://schemas.microsoft.com/office/drawing/2015/10/21/chartex" xmlns:cx3="http://schemas.microsoft.com/office/drawing/2016/5/9/chartex" xmlns:cx4="http://schemas.microsoft.com/office/drawing/2016/5/10/chartex" xmlns:cx5="http://schemas.microsoft.com/office/drawing/2016/5/11/chartex" xmlns:cx6="http://schemas.microsoft.com/office/drawing/2016/5/12/chartex" xmlns:cx7="http://schemas.microsoft.com/office/drawing/2016/5/13/chartex" xmlns:cx8="http://schemas.microsoft.com/office/drawing/2016/5/14/chartex" xmlns:mc="http://schemas.openxmlformats.org/markup-compatibility/2006" xmlns:aink="http://schemas.microsoft.com/office/drawing/2016/ink" xmlns:am3d="http://schemas.microsoft.com/office/drawing/2017/model3d" xmlns:o="urn:schemas-microsoft-com:office:office" xmlns:oel="http://schemas.microsoft.com/office/2019/extlst" xmlns:r="http://schemas.openxmlformats.org/officeDocument/2006/relationships" xmlns:m="http://schemas.openxmlformats.org/officeDocument/2006/math" xmlns:v="urn:schemas-microsoft-com:vml" xmlns:wp14="http://schemas.microsoft.com/office/word/2010/wordprocessingDrawing" xmlns:wp="http://schemas.openxmlformats.org/drawingml/2006/wordprocessingDrawing" xmlns:w10="urn:schemas-microsoft-com:office:word" xmlns:w="http://schemas.openxmlformats.org/wordprocessingml/2006/main" xmlns:w14="http://schemas.microsoft.com/office/word/2010/wordml" xmlns:w15="http://schemas.microsoft.com/office/word/2012/wordml" xmlns:w16cex="http://schemas.microsoft.com/office/word/2018/wordml/cex" xmlns:w16cid="http://schemas.microsoft.com/office/word/2016/wordml/cid" xmlns:w16="http://schemas.microsoft.com/office/word/2018/wordml" xmlns:w16du="http://schemas.microsoft.com/office/word/2023/wordml/word16du" xmlns:w16sdtdh="http://schemas.microsoft.com/office/word/2020/wordml/sdtdatahash" xmlns:w16sdtfl="http://schemas.microsoft.com/office/word/2024/wordml/sdtformatlock" xmlns:w16se="http://schemas.microsoft.com/office/word/2015/wordml/symex" xmlns:wpg="http://schemas.microsoft.com/office/word/2010/wordprocessingGroup" xmlns:wpi="http://schemas.microsoft.com/office/word/2010/wordprocessingInk" xmlns:wne="http://schemas.microsoft.com/office/word/2006/wordml" xmlns:wps="http://schemas.microsoft.com/office/word/2010/wordprocessingShape" mc:Ignorable="w14 w15 w16se w16cid w16 w16cex w16sdtdh w16sdtfl w16du wp14">
+  <w:p/>
 </w:ftr>
 </file>
 
 <file path=word/footer2.xml><?xml version="1.0" encoding="utf-8"?>
-<w:ftr xmlns:o="urn:schemas-microsoft-com:office:office" xmlns:r="http://schemas.openxmlformats.org/officeDocument/2006/relationships" xmlns:v="urn:schemas-microsoft-com:vml" xmlns:w="http://schemas.openxmlformats.org/wordprocessingml/2006/main" xmlns:w10="urn:schemas-microsoft-com:office:word" xmlns:wp="http://schemas.openxmlformats.org/drawingml/2006/wordprocessingDrawing" xmlns:pic="http://schemas.openxmlformats.org/drawingml/2006/picture" xmlns:wps="http://schemas.microsoft.com/office/word/2010/wordprocessingShape" xmlns:wpg="http://schemas.microsoft.com/office/word/2010/wordprocessingGroup" xmlns:mc="http://schemas.openxmlformats.org/markup-compatibility/2006" xmlns:wp14="http://schemas.microsoft.com/office/word/2010/wordprocessingDrawing" xmlns:w14="http://schemas.microsoft.com/office/word/2010/wordml" xmlns:w15="http://schemas.microsoft.com/office/word/2012/wordml" mc:Ignorable="w14 wp14 w15">
-  <w:p xmlns:wp14="http://schemas.microsoft.com/office/word/2010/wordml" wp14:textId="77777777">
+<w:ftr xmlns:wpc="http://schemas.microsoft.com/office/word/2010/wordprocessingCanvas" xmlns:cx="http://schemas.microsoft.com/office/drawing/2014/chartex" xmlns:cx1="http://schemas.microsoft.com/office/drawing/2015/9/8/chartex" xmlns:cx2="http://schemas.microsoft.com/office/drawing/2015/10/21/chartex" xmlns:cx3="http://schemas.microsoft.com/office/drawing/2016/5/9/chartex" xmlns:cx4="http://schemas.microsoft.com/office/drawing/2016/5/10/chartex" xmlns:cx5="http://schemas.microsoft.com/office/drawing/2016/5/11/chartex" xmlns:cx6="http://schemas.microsoft.com/office/drawing/2016/5/12/chartex" xmlns:cx7="http://schemas.microsoft.com/office/drawing/2016/5/13/chartex" xmlns:cx8="http://schemas.microsoft.com/office/drawing/2016/5/14/chartex" xmlns:mc="http://schemas.openxmlformats.org/markup-compatibility/2006" xmlns:aink="http://schemas.microsoft.com/office/drawing/2016/ink" xmlns:am3d="http://schemas.microsoft.com/office/drawing/2017/model3d" xmlns:o="urn:schemas-microsoft-com:office:office" xmlns:oel="http://schemas.microsoft.com/office/2019/extlst" xmlns:r="http://schemas.openxmlformats.org/officeDocument/2006/relationships" xmlns:m="http://schemas.openxmlformats.org/officeDocument/2006/math" xmlns:v="urn:schemas-microsoft-com:vml" xmlns:wp14="http://schemas.microsoft.com/office/word/2010/wordprocessingDrawing" xmlns:wp="http://schemas.openxmlformats.org/drawingml/2006/wordprocessingDrawing" xmlns:w10="urn:schemas-microsoft-com:office:word" xmlns:w="http://schemas.openxmlformats.org/wordprocessingml/2006/main" xmlns:w14="http://schemas.microsoft.com/office/word/2010/wordml" xmlns:w15="http://schemas.microsoft.com/office/word/2012/wordml" xmlns:w16cex="http://schemas.microsoft.com/office/word/2018/wordml/cex" xmlns:w16cid="http://schemas.microsoft.com/office/word/2016/wordml/cid" xmlns:w16="http://schemas.microsoft.com/office/word/2018/wordml" xmlns:w16du="http://schemas.microsoft.com/office/word/2023/wordml/word16du" xmlns:w16sdtdh="http://schemas.microsoft.com/office/word/2020/wordml/sdtdatahash" xmlns:w16sdtfl="http://schemas.microsoft.com/office/word/2024/wordml/sdtformatlock" xmlns:w16se="http://schemas.microsoft.com/office/word/2015/wordml/symex" xmlns:wpg="http://schemas.microsoft.com/office/word/2010/wordprocessingGroup" xmlns:wpi="http://schemas.microsoft.com/office/word/2010/wordprocessingInk" xmlns:wne="http://schemas.microsoft.com/office/word/2006/wordml" xmlns:wps="http://schemas.microsoft.com/office/word/2010/wordprocessingShape" mc:Ignorable="w14 w15 w16se w16cid w16 w16cex w16sdtdh w16sdtfl w16du wp14">
+  <w:p>
     <w:pPr>
       <w:pStyle w:val="Footer"/>
       <w:jc w:val="center"/>
-      <w:rPr/>
     </w:pPr>
-    <w:r>
-      <w:rPr/>
-    </w:r>
   </w:p>
 </w:ftr>
 </file>
 
 <file path=word/footer3.xml><?xml version="1.0" encoding="utf-8"?>
-<w:ftr xmlns:o="urn:schemas-microsoft-com:office:office" xmlns:r="http://schemas.openxmlformats.org/officeDocument/2006/relationships" xmlns:v="urn:schemas-microsoft-com:vml" xmlns:w="http://schemas.openxmlformats.org/wordprocessingml/2006/main" xmlns:w10="urn:schemas-microsoft-com:office:word" xmlns:wp="http://schemas.openxmlformats.org/drawingml/2006/wordprocessingDrawing" xmlns:pic="http://schemas.openxmlformats.org/drawingml/2006/picture" xmlns:wps="http://schemas.microsoft.com/office/word/2010/wordprocessingShape" xmlns:wpg="http://schemas.microsoft.com/office/word/2010/wordprocessingGroup" xmlns:mc="http://schemas.openxmlformats.org/markup-compatibility/2006" xmlns:wp14="http://schemas.microsoft.com/office/word/2010/wordprocessingDrawing" xmlns:w14="http://schemas.microsoft.com/office/word/2010/wordml" xmlns:w15="http://schemas.microsoft.com/office/word/2012/wordml" mc:Ignorable="w14 wp14 w15">
-  <w:p xmlns:wp14="http://schemas.microsoft.com/office/word/2010/wordml" wp14:textId="77777777">
+<w:ftr xmlns:wpc="http://schemas.microsoft.com/office/word/2010/wordprocessingCanvas" xmlns:cx="http://schemas.microsoft.com/office/drawing/2014/chartex" xmlns:cx1="http://schemas.microsoft.com/office/drawing/2015/9/8/chartex" xmlns:cx2="http://schemas.microsoft.com/office/drawing/2015/10/21/chartex" xmlns:cx3="http://schemas.microsoft.com/office/drawing/2016/5/9/chartex" xmlns:cx4="http://schemas.microsoft.com/office/drawing/2016/5/10/chartex" xmlns:cx5="http://schemas.microsoft.com/office/drawing/2016/5/11/chartex" xmlns:cx6="http://schemas.microsoft.com/office/drawing/2016/5/12/chartex" xmlns:cx7="http://schemas.microsoft.com/office/drawing/2016/5/13/chartex" xmlns:cx8="http://schemas.microsoft.com/office/drawing/2016/5/14/chartex" xmlns:mc="http://schemas.openxmlformats.org/markup-compatibility/2006" xmlns:aink="http://schemas.microsoft.com/office/drawing/2016/ink" xmlns:am3d="http://schemas.microsoft.com/office/drawing/2017/model3d" xmlns:o="urn:schemas-microsoft-com:office:office" xmlns:oel="http://schemas.microsoft.com/office/2019/extlst" xmlns:r="http://schemas.openxmlformats.org/officeDocument/2006/relationships" xmlns:m="http://schemas.openxmlformats.org/officeDocument/2006/math" xmlns:v="urn:schemas-microsoft-com:vml" xmlns:wp14="http://schemas.microsoft.com/office/word/2010/wordprocessingDrawing" xmlns:wp="http://schemas.openxmlformats.org/drawingml/2006/wordprocessingDrawing" xmlns:w10="urn:schemas-microsoft-com:office:word" xmlns:w="http://schemas.openxmlformats.org/wordprocessingml/2006/main" xmlns:w14="http://schemas.microsoft.com/office/word/2010/wordml" xmlns:w15="http://schemas.microsoft.com/office/word/2012/wordml" xmlns:w16cex="http://schemas.microsoft.com/office/word/2018/wordml/cex" xmlns:w16cid="http://schemas.microsoft.com/office/word/2016/wordml/cid" xmlns:w16="http://schemas.microsoft.com/office/word/2018/wordml" xmlns:w16du="http://schemas.microsoft.com/office/word/2023/wordml/word16du" xmlns:w16sdtdh="http://schemas.microsoft.com/office/word/2020/wordml/sdtdatahash" xmlns:w16sdtfl="http://schemas.microsoft.com/office/word/2024/wordml/sdtformatlock" xmlns:w16se="http://schemas.microsoft.com/office/word/2015/wordml/symex" xmlns:wpg="http://schemas.microsoft.com/office/word/2010/wordprocessingGroup" xmlns:wpi="http://schemas.microsoft.com/office/word/2010/wordprocessingInk" xmlns:wne="http://schemas.microsoft.com/office/word/2006/wordml" xmlns:wps="http://schemas.microsoft.com/office/word/2010/wordprocessingShape" mc:Ignorable="w14 w15 w16se w16cid w16 w16cex w16sdtdh w16sdtfl w16du wp14">
+  <w:p>
     <w:pPr>
       <w:pStyle w:val="Footer"/>
       <w:jc w:val="center"/>
-      <w:rPr/>
     </w:pPr>
-    <w:r>
-      <w:rPr/>
-    </w:r>
   </w:p>
 </w:ftr>
 </file>
 
 <file path=word/footer4.xml><?xml version="1.0" encoding="utf-8"?>
-<w:ftr xmlns:o="urn:schemas-microsoft-com:office:office" xmlns:r="http://schemas.openxmlformats.org/officeDocument/2006/relationships" xmlns:v="urn:schemas-microsoft-com:vml" xmlns:w="http://schemas.openxmlformats.org/wordprocessingml/2006/main" xmlns:w10="urn:schemas-microsoft-com:office:word" xmlns:wp="http://schemas.openxmlformats.org/drawingml/2006/wordprocessingDrawing" xmlns:pic="http://schemas.openxmlformats.org/drawingml/2006/picture" xmlns:wps="http://schemas.microsoft.com/office/word/2010/wordprocessingShape" xmlns:wpg="http://schemas.microsoft.com/office/word/2010/wordprocessingGroup" xmlns:mc="http://schemas.openxmlformats.org/markup-compatibility/2006" xmlns:wp14="http://schemas.microsoft.com/office/word/2010/wordprocessingDrawing" xmlns:w14="http://schemas.microsoft.com/office/word/2010/wordml" xmlns:w15="http://schemas.microsoft.com/office/word/2012/wordml" mc:Ignorable="w14 wp14 w15">
-  <w:p xmlns:wp14="http://schemas.microsoft.com/office/word/2010/wordml" wp14:textId="77777777">
+<w:ftr xmlns:wpc="http://schemas.microsoft.com/office/word/2010/wordprocessingCanvas" xmlns:cx="http://schemas.microsoft.com/office/drawing/2014/chartex" xmlns:cx1="http://schemas.microsoft.com/office/drawing/2015/9/8/chartex" xmlns:cx2="http://schemas.microsoft.com/office/drawing/2015/10/21/chartex" xmlns:cx3="http://schemas.microsoft.com/office/drawing/2016/5/9/chartex" xmlns:cx4="http://schemas.microsoft.com/office/drawing/2016/5/10/chartex" xmlns:cx5="http://schemas.microsoft.com/office/drawing/2016/5/11/chartex" xmlns:cx6="http://schemas.microsoft.com/office/drawing/2016/5/12/chartex" xmlns:cx7="http://schemas.microsoft.com/office/drawing/2016/5/13/chartex" xmlns:cx8="http://schemas.microsoft.com/office/drawing/2016/5/14/chartex" xmlns:mc="http://schemas.openxmlformats.org/markup-compatibility/2006" xmlns:aink="http://schemas.microsoft.com/office/drawing/2016/ink" xmlns:am3d="http://schemas.microsoft.com/office/drawing/2017/model3d" xmlns:o="urn:schemas-microsoft-com:office:office" xmlns:oel="http://schemas.microsoft.com/office/2019/extlst" xmlns:r="http://schemas.openxmlformats.org/officeDocument/2006/relationships" xmlns:m="http://schemas.openxmlformats.org/officeDocument/2006/math" xmlns:v="urn:schemas-microsoft-com:vml" xmlns:wp14="http://schemas.microsoft.com/office/word/2010/wordprocessingDrawing" xmlns:wp="http://schemas.openxmlformats.org/drawingml/2006/wordprocessingDrawing" xmlns:w10="urn:schemas-microsoft-com:office:word" xmlns:w="http://schemas.openxmlformats.org/wordprocessingml/2006/main" xmlns:w14="http://schemas.microsoft.com/office/word/2010/wordml" xmlns:w15="http://schemas.microsoft.com/office/word/2012/wordml" xmlns:w16cex="http://schemas.microsoft.com/office/word/2018/wordml/cex" xmlns:w16cid="http://schemas.microsoft.com/office/word/2016/wordml/cid" xmlns:w16="http://schemas.microsoft.com/office/word/2018/wordml" xmlns:w16du="http://schemas.microsoft.com/office/word/2023/wordml/word16du" xmlns:w16sdtdh="http://schemas.microsoft.com/office/word/2020/wordml/sdtdatahash" xmlns:w16sdtfl="http://schemas.microsoft.com/office/word/2024/wordml/sdtformatlock" xmlns:w16se="http://schemas.microsoft.com/office/word/2015/wordml/symex" xmlns:wpg="http://schemas.microsoft.com/office/word/2010/wordprocessingGroup" xmlns:wpi="http://schemas.microsoft.com/office/word/2010/wordprocessingInk" xmlns:wne="http://schemas.microsoft.com/office/word/2006/wordml" xmlns:wps="http://schemas.microsoft.com/office/word/2010/wordprocessingShape" mc:Ignorable="w14 w15 w16se w16cid w16 w16cex w16sdtdh w16sdtfl w16du wp14">
+  <w:p>
     <w:pPr>
       <w:pStyle w:val="Footer"/>
-      <w:rPr/>
     </w:pPr>
-    <w:r>
-      <w:rPr/>
-    </w:r>
   </w:p>
 </w:ftr>
 </file>
 
 <file path=word/footer5.xml><?xml version="1.0" encoding="utf-8"?>
-<w:ftr xmlns:o="urn:schemas-microsoft-com:office:office" xmlns:r="http://schemas.openxmlformats.org/officeDocument/2006/relationships" xmlns:v="urn:schemas-microsoft-com:vml" xmlns:w="http://schemas.openxmlformats.org/wordprocessingml/2006/main" xmlns:w10="urn:schemas-microsoft-com:office:word" xmlns:wp="http://schemas.openxmlformats.org/drawingml/2006/wordprocessingDrawing" xmlns:pic="http://schemas.openxmlformats.org/drawingml/2006/picture" xmlns:wps="http://schemas.microsoft.com/office/word/2010/wordprocessingShape" xmlns:wpg="http://schemas.microsoft.com/office/word/2010/wordprocessingGroup" xmlns:mc="http://schemas.openxmlformats.org/markup-compatibility/2006" xmlns:wp14="http://schemas.microsoft.com/office/word/2010/wordprocessingDrawing" xmlns:w14="http://schemas.microsoft.com/office/word/2010/wordml" xmlns:w15="http://schemas.microsoft.com/office/word/2012/wordml" mc:Ignorable="w14 wp14 w15">
-  <w:p xmlns:wp14="http://schemas.microsoft.com/office/word/2010/wordml" wp14:textId="77777777">
+<w:ftr xmlns:wpc="http://schemas.microsoft.com/office/word/2010/wordprocessingCanvas" xmlns:cx="http://schemas.microsoft.com/office/drawing/2014/chartex" xmlns:cx1="http://schemas.microsoft.com/office/drawing/2015/9/8/chartex" xmlns:cx2="http://schemas.microsoft.com/office/drawing/2015/10/21/chartex" xmlns:cx3="http://schemas.microsoft.com/office/drawing/2016/5/9/chartex" xmlns:cx4="http://schemas.microsoft.com/office/drawing/2016/5/10/chartex" xmlns:cx5="http://schemas.microsoft.com/office/drawing/2016/5/11/chartex" xmlns:cx6="http://schemas.microsoft.com/office/drawing/2016/5/12/chartex" xmlns:cx7="http://schemas.microsoft.com/office/drawing/2016/5/13/chartex" xmlns:cx8="http://schemas.microsoft.com/office/drawing/2016/5/14/chartex" xmlns:mc="http://schemas.openxmlformats.org/markup-compatibility/2006" xmlns:aink="http://schemas.microsoft.com/office/drawing/2016/ink" xmlns:am3d="http://schemas.microsoft.com/office/drawing/2017/model3d" xmlns:o="urn:schemas-microsoft-com:office:office" xmlns:oel="http://schemas.microsoft.com/office/2019/extlst" xmlns:r="http://schemas.openxmlformats.org/officeDocument/2006/relationships" xmlns:m="http://schemas.openxmlformats.org/officeDocument/2006/math" xmlns:v="urn:schemas-microsoft-com:vml" xmlns:wp14="http://schemas.microsoft.com/office/word/2010/wordprocessingDrawing" xmlns:wp="http://schemas.openxmlformats.org/drawingml/2006/wordprocessingDrawing" xmlns:w10="urn:schemas-microsoft-com:office:word" xmlns:w="http://schemas.openxmlformats.org/wordprocessingml/2006/main" xmlns:w14="http://schemas.microsoft.com/office/word/2010/wordml" xmlns:w15="http://schemas.microsoft.com/office/word/2012/wordml" xmlns:w16cex="http://schemas.microsoft.com/office/word/2018/wordml/cex" xmlns:w16cid="http://schemas.microsoft.com/office/word/2016/wordml/cid" xmlns:w16="http://schemas.microsoft.com/office/word/2018/wordml" xmlns:w16du="http://schemas.microsoft.com/office/word/2023/wordml/word16du" xmlns:w16sdtdh="http://schemas.microsoft.com/office/word/2020/wordml/sdtdatahash" xmlns:w16sdtfl="http://schemas.microsoft.com/office/word/2024/wordml/sdtformatlock" xmlns:w16se="http://schemas.microsoft.com/office/word/2015/wordml/symex" xmlns:wpg="http://schemas.microsoft.com/office/word/2010/wordprocessingGroup" xmlns:wpi="http://schemas.microsoft.com/office/word/2010/wordprocessingInk" xmlns:wne="http://schemas.microsoft.com/office/word/2006/wordml" xmlns:wps="http://schemas.microsoft.com/office/word/2010/wordprocessingShape" mc:Ignorable="w14 w15 w16se w16cid w16 w16cex w16sdtdh w16sdtfl w16du wp14">
+  <w:p>
     <w:pPr>
       <w:pStyle w:val="Footer"/>
-      <w:jc w:val="end"/>
-      <w:rPr/>
+      <w:jc w:val="right"/>
     </w:pPr>
     <w:r>
-      <w:rPr/>
       <w:fldChar w:fldCharType="begin"/>
     </w:r>
     <w:r>
-      <w:rPr/>
       <w:instrText xml:space="preserve"> PAGE </w:instrText>
     </w:r>
     <w:r>
-      <w:rPr/>
       <w:fldChar w:fldCharType="separate"/>
     </w:r>
     <w:r>
-      <w:rPr/>
       <w:t>1</w:t>
     </w:r>
     <w:r>
-      <w:rPr/>
       <w:fldChar w:fldCharType="end"/>
     </w:r>
   </w:p>
@@ -3146,31 +2568,25 @@
 </file>
 
 <file path=word/footer6.xml><?xml version="1.0" encoding="utf-8"?>
-<w:ftr xmlns:o="urn:schemas-microsoft-com:office:office" xmlns:r="http://schemas.openxmlformats.org/officeDocument/2006/relationships" xmlns:v="urn:schemas-microsoft-com:vml" xmlns:w="http://schemas.openxmlformats.org/wordprocessingml/2006/main" xmlns:w10="urn:schemas-microsoft-com:office:word" xmlns:wp="http://schemas.openxmlformats.org/drawingml/2006/wordprocessingDrawing" xmlns:pic="http://schemas.openxmlformats.org/drawingml/2006/picture" xmlns:wps="http://schemas.microsoft.com/office/word/2010/wordprocessingShape" xmlns:wpg="http://schemas.microsoft.com/office/word/2010/wordprocessingGroup" xmlns:mc="http://schemas.openxmlformats.org/markup-compatibility/2006" xmlns:wp14="http://schemas.microsoft.com/office/word/2010/wordprocessingDrawing" xmlns:w14="http://schemas.microsoft.com/office/word/2010/wordml" xmlns:w15="http://schemas.microsoft.com/office/word/2012/wordml" mc:Ignorable="w14 wp14 w15">
-  <w:p xmlns:wp14="http://schemas.microsoft.com/office/word/2010/wordml" wp14:textId="77777777">
+<w:ftr xmlns:wpc="http://schemas.microsoft.com/office/word/2010/wordprocessingCanvas" xmlns:cx="http://schemas.microsoft.com/office/drawing/2014/chartex" xmlns:cx1="http://schemas.microsoft.com/office/drawing/2015/9/8/chartex" xmlns:cx2="http://schemas.microsoft.com/office/drawing/2015/10/21/chartex" xmlns:cx3="http://schemas.microsoft.com/office/drawing/2016/5/9/chartex" xmlns:cx4="http://schemas.microsoft.com/office/drawing/2016/5/10/chartex" xmlns:cx5="http://schemas.microsoft.com/office/drawing/2016/5/11/chartex" xmlns:cx6="http://schemas.microsoft.com/office/drawing/2016/5/12/chartex" xmlns:cx7="http://schemas.microsoft.com/office/drawing/2016/5/13/chartex" xmlns:cx8="http://schemas.microsoft.com/office/drawing/2016/5/14/chartex" xmlns:mc="http://schemas.openxmlformats.org/markup-compatibility/2006" xmlns:aink="http://schemas.microsoft.com/office/drawing/2016/ink" xmlns:am3d="http://schemas.microsoft.com/office/drawing/2017/model3d" xmlns:o="urn:schemas-microsoft-com:office:office" xmlns:oel="http://schemas.microsoft.com/office/2019/extlst" xmlns:r="http://schemas.openxmlformats.org/officeDocument/2006/relationships" xmlns:m="http://schemas.openxmlformats.org/officeDocument/2006/math" xmlns:v="urn:schemas-microsoft-com:vml" xmlns:wp14="http://schemas.microsoft.com/office/word/2010/wordprocessingDrawing" xmlns:wp="http://schemas.openxmlformats.org/drawingml/2006/wordprocessingDrawing" xmlns:w10="urn:schemas-microsoft-com:office:word" xmlns:w="http://schemas.openxmlformats.org/wordprocessingml/2006/main" xmlns:w14="http://schemas.microsoft.com/office/word/2010/wordml" xmlns:w15="http://schemas.microsoft.com/office/word/2012/wordml" xmlns:w16cex="http://schemas.microsoft.com/office/word/2018/wordml/cex" xmlns:w16cid="http://schemas.microsoft.com/office/word/2016/wordml/cid" xmlns:w16="http://schemas.microsoft.com/office/word/2018/wordml" xmlns:w16du="http://schemas.microsoft.com/office/word/2023/wordml/word16du" xmlns:w16sdtdh="http://schemas.microsoft.com/office/word/2020/wordml/sdtdatahash" xmlns:w16sdtfl="http://schemas.microsoft.com/office/word/2024/wordml/sdtformatlock" xmlns:w16se="http://schemas.microsoft.com/office/word/2015/wordml/symex" xmlns:wpg="http://schemas.microsoft.com/office/word/2010/wordprocessingGroup" xmlns:wpi="http://schemas.microsoft.com/office/word/2010/wordprocessingInk" xmlns:wne="http://schemas.microsoft.com/office/word/2006/wordml" xmlns:wps="http://schemas.microsoft.com/office/word/2010/wordprocessingShape" mc:Ignorable="w14 w15 w16se w16cid w16 w16cex w16sdtdh w16sdtfl w16du wp14">
+  <w:p>
     <w:pPr>
       <w:pStyle w:val="Footer"/>
-      <w:jc w:val="end"/>
-      <w:rPr/>
+      <w:jc w:val="right"/>
     </w:pPr>
     <w:r>
-      <w:rPr/>
       <w:fldChar w:fldCharType="begin"/>
     </w:r>
     <w:r>
-      <w:rPr/>
       <w:instrText xml:space="preserve"> PAGE </w:instrText>
     </w:r>
     <w:r>
-      <w:rPr/>
       <w:fldChar w:fldCharType="separate"/>
     </w:r>
     <w:r>
-      <w:rPr/>
       <w:t>1</w:t>
     </w:r>
     <w:r>
-      <w:rPr/>
       <w:fldChar w:fldCharType="end"/>
     </w:r>
   </w:p>
@@ -3178,45 +2594,35 @@
 </file>
 
 <file path=word/footer7.xml><?xml version="1.0" encoding="utf-8"?>
-<w:ftr xmlns:o="urn:schemas-microsoft-com:office:office" xmlns:r="http://schemas.openxmlformats.org/officeDocument/2006/relationships" xmlns:v="urn:schemas-microsoft-com:vml" xmlns:w="http://schemas.openxmlformats.org/wordprocessingml/2006/main" xmlns:w10="urn:schemas-microsoft-com:office:word" xmlns:wp="http://schemas.openxmlformats.org/drawingml/2006/wordprocessingDrawing" xmlns:pic="http://schemas.openxmlformats.org/drawingml/2006/picture" xmlns:wps="http://schemas.microsoft.com/office/word/2010/wordprocessingShape" xmlns:wpg="http://schemas.microsoft.com/office/word/2010/wordprocessingGroup" xmlns:mc="http://schemas.openxmlformats.org/markup-compatibility/2006" xmlns:wp14="http://schemas.microsoft.com/office/word/2010/wordprocessingDrawing" xmlns:w14="http://schemas.microsoft.com/office/word/2010/wordml" xmlns:w15="http://schemas.microsoft.com/office/word/2012/wordml" mc:Ignorable="w14 wp14 w15">
-  <w:p xmlns:wp14="http://schemas.microsoft.com/office/word/2010/wordml" wp14:textId="77777777">
+<w:ftr xmlns:wpc="http://schemas.microsoft.com/office/word/2010/wordprocessingCanvas" xmlns:cx="http://schemas.microsoft.com/office/drawing/2014/chartex" xmlns:cx1="http://schemas.microsoft.com/office/drawing/2015/9/8/chartex" xmlns:cx2="http://schemas.microsoft.com/office/drawing/2015/10/21/chartex" xmlns:cx3="http://schemas.microsoft.com/office/drawing/2016/5/9/chartex" xmlns:cx4="http://schemas.microsoft.com/office/drawing/2016/5/10/chartex" xmlns:cx5="http://schemas.microsoft.com/office/drawing/2016/5/11/chartex" xmlns:cx6="http://schemas.microsoft.com/office/drawing/2016/5/12/chartex" xmlns:cx7="http://schemas.microsoft.com/office/drawing/2016/5/13/chartex" xmlns:cx8="http://schemas.microsoft.com/office/drawing/2016/5/14/chartex" xmlns:mc="http://schemas.openxmlformats.org/markup-compatibility/2006" xmlns:aink="http://schemas.microsoft.com/office/drawing/2016/ink" xmlns:am3d="http://schemas.microsoft.com/office/drawing/2017/model3d" xmlns:o="urn:schemas-microsoft-com:office:office" xmlns:oel="http://schemas.microsoft.com/office/2019/extlst" xmlns:r="http://schemas.openxmlformats.org/officeDocument/2006/relationships" xmlns:m="http://schemas.openxmlformats.org/officeDocument/2006/math" xmlns:v="urn:schemas-microsoft-com:vml" xmlns:wp14="http://schemas.microsoft.com/office/word/2010/wordprocessingDrawing" xmlns:wp="http://schemas.openxmlformats.org/drawingml/2006/wordprocessingDrawing" xmlns:w10="urn:schemas-microsoft-com:office:word" xmlns:w="http://schemas.openxmlformats.org/wordprocessingml/2006/main" xmlns:w14="http://schemas.microsoft.com/office/word/2010/wordml" xmlns:w15="http://schemas.microsoft.com/office/word/2012/wordml" xmlns:w16cex="http://schemas.microsoft.com/office/word/2018/wordml/cex" xmlns:w16cid="http://schemas.microsoft.com/office/word/2016/wordml/cid" xmlns:w16="http://schemas.microsoft.com/office/word/2018/wordml" xmlns:w16du="http://schemas.microsoft.com/office/word/2023/wordml/word16du" xmlns:w16sdtdh="http://schemas.microsoft.com/office/word/2020/wordml/sdtdatahash" xmlns:w16sdtfl="http://schemas.microsoft.com/office/word/2024/wordml/sdtformatlock" xmlns:w16se="http://schemas.microsoft.com/office/word/2015/wordml/symex" xmlns:wpg="http://schemas.microsoft.com/office/word/2010/wordprocessingGroup" xmlns:wpi="http://schemas.microsoft.com/office/word/2010/wordprocessingInk" xmlns:wne="http://schemas.microsoft.com/office/word/2006/wordml" xmlns:wps="http://schemas.microsoft.com/office/word/2010/wordprocessingShape" mc:Ignorable="w14 w15 w16se w16cid w16 w16cex w16sdtdh w16sdtfl w16du wp14">
+  <w:p>
     <w:pPr>
       <w:pStyle w:val="Footer"/>
-      <w:rPr/>
     </w:pPr>
-    <w:r>
-      <w:rPr/>
-    </w:r>
   </w:p>
 </w:ftr>
 </file>
 
 <file path=word/footer8.xml><?xml version="1.0" encoding="utf-8"?>
-<w:ftr xmlns:o="urn:schemas-microsoft-com:office:office" xmlns:r="http://schemas.openxmlformats.org/officeDocument/2006/relationships" xmlns:v="urn:schemas-microsoft-com:vml" xmlns:w="http://schemas.openxmlformats.org/wordprocessingml/2006/main" xmlns:w10="urn:schemas-microsoft-com:office:word" xmlns:wp="http://schemas.openxmlformats.org/drawingml/2006/wordprocessingDrawing" xmlns:pic="http://schemas.openxmlformats.org/drawingml/2006/picture" xmlns:wps="http://schemas.microsoft.com/office/word/2010/wordprocessingShape" xmlns:wpg="http://schemas.microsoft.com/office/word/2010/wordprocessingGroup" xmlns:mc="http://schemas.openxmlformats.org/markup-compatibility/2006" xmlns:wp14="http://schemas.microsoft.com/office/word/2010/wordprocessingDrawing" xmlns:w14="http://schemas.microsoft.com/office/word/2010/wordml" xmlns:w15="http://schemas.microsoft.com/office/word/2012/wordml" mc:Ignorable="w14 wp14 w15">
-  <w:p xmlns:wp14="http://schemas.microsoft.com/office/word/2010/wordml" wp14:textId="77777777">
+<w:ftr xmlns:wpc="http://schemas.microsoft.com/office/word/2010/wordprocessingCanvas" xmlns:cx="http://schemas.microsoft.com/office/drawing/2014/chartex" xmlns:cx1="http://schemas.microsoft.com/office/drawing/2015/9/8/chartex" xmlns:cx2="http://schemas.microsoft.com/office/drawing/2015/10/21/chartex" xmlns:cx3="http://schemas.microsoft.com/office/drawing/2016/5/9/chartex" xmlns:cx4="http://schemas.microsoft.com/office/drawing/2016/5/10/chartex" xmlns:cx5="http://schemas.microsoft.com/office/drawing/2016/5/11/chartex" xmlns:cx6="http://schemas.microsoft.com/office/drawing/2016/5/12/chartex" xmlns:cx7="http://schemas.microsoft.com/office/drawing/2016/5/13/chartex" xmlns:cx8="http://schemas.microsoft.com/office/drawing/2016/5/14/chartex" xmlns:mc="http://schemas.openxmlformats.org/markup-compatibility/2006" xmlns:aink="http://schemas.microsoft.com/office/drawing/2016/ink" xmlns:am3d="http://schemas.microsoft.com/office/drawing/2017/model3d" xmlns:o="urn:schemas-microsoft-com:office:office" xmlns:oel="http://schemas.microsoft.com/office/2019/extlst" xmlns:r="http://schemas.openxmlformats.org/officeDocument/2006/relationships" xmlns:m="http://schemas.openxmlformats.org/officeDocument/2006/math" xmlns:v="urn:schemas-microsoft-com:vml" xmlns:wp14="http://schemas.microsoft.com/office/word/2010/wordprocessingDrawing" xmlns:wp="http://schemas.openxmlformats.org/drawingml/2006/wordprocessingDrawing" xmlns:w10="urn:schemas-microsoft-com:office:word" xmlns:w="http://schemas.openxmlformats.org/wordprocessingml/2006/main" xmlns:w14="http://schemas.microsoft.com/office/word/2010/wordml" xmlns:w15="http://schemas.microsoft.com/office/word/2012/wordml" xmlns:w16cex="http://schemas.microsoft.com/office/word/2018/wordml/cex" xmlns:w16cid="http://schemas.microsoft.com/office/word/2016/wordml/cid" xmlns:w16="http://schemas.microsoft.com/office/word/2018/wordml" xmlns:w16du="http://schemas.microsoft.com/office/word/2023/wordml/word16du" xmlns:w16sdtdh="http://schemas.microsoft.com/office/word/2020/wordml/sdtdatahash" xmlns:w16sdtfl="http://schemas.microsoft.com/office/word/2024/wordml/sdtformatlock" xmlns:w16se="http://schemas.microsoft.com/office/word/2015/wordml/symex" xmlns:wpg="http://schemas.microsoft.com/office/word/2010/wordprocessingGroup" xmlns:wpi="http://schemas.microsoft.com/office/word/2010/wordprocessingInk" xmlns:wne="http://schemas.microsoft.com/office/word/2006/wordml" xmlns:wps="http://schemas.microsoft.com/office/word/2010/wordprocessingShape" mc:Ignorable="w14 w15 w16se w16cid w16 w16cex w16sdtdh w16sdtfl w16du wp14">
+  <w:p>
     <w:pPr>
       <w:pStyle w:val="Footer"/>
-      <w:jc w:val="end"/>
-      <w:rPr/>
+      <w:jc w:val="right"/>
     </w:pPr>
     <w:r>
-      <w:rPr/>
       <w:fldChar w:fldCharType="begin"/>
     </w:r>
     <w:r>
-      <w:rPr/>
       <w:instrText xml:space="preserve"> PAGE </w:instrText>
     </w:r>
     <w:r>
-      <w:rPr/>
       <w:fldChar w:fldCharType="separate"/>
     </w:r>
     <w:r>
-      <w:rPr/>
       <w:t>2</w:t>
     </w:r>
     <w:r>
-      <w:rPr/>
       <w:fldChar w:fldCharType="end"/>
     </w:r>
   </w:p>
@@ -3224,524 +2630,440 @@
 </file>
 
 <file path=word/footer9.xml><?xml version="1.0" encoding="utf-8"?>
-<w:ftr xmlns:o="urn:schemas-microsoft-com:office:office" xmlns:r="http://schemas.openxmlformats.org/officeDocument/2006/relationships" xmlns:v="urn:schemas-microsoft-com:vml" xmlns:w="http://schemas.openxmlformats.org/wordprocessingml/2006/main" xmlns:w10="urn:schemas-microsoft-com:office:word" xmlns:wp="http://schemas.openxmlformats.org/drawingml/2006/wordprocessingDrawing" xmlns:pic="http://schemas.openxmlformats.org/drawingml/2006/picture" xmlns:wps="http://schemas.microsoft.com/office/word/2010/wordprocessingShape" xmlns:wpg="http://schemas.microsoft.com/office/word/2010/wordprocessingGroup" xmlns:mc="http://schemas.openxmlformats.org/markup-compatibility/2006" xmlns:wp14="http://schemas.microsoft.com/office/word/2010/wordprocessingDrawing" xmlns:w14="http://schemas.microsoft.com/office/word/2010/wordml" xmlns:w15="http://schemas.microsoft.com/office/word/2012/wordml" mc:Ignorable="w14 wp14 w15">
-  <w:p xmlns:wp14="http://schemas.microsoft.com/office/word/2010/wordml" wp14:textId="77777777">
+<w:ftr xmlns:wpc="http://schemas.microsoft.com/office/word/2010/wordprocessingCanvas" xmlns:cx="http://schemas.microsoft.com/office/drawing/2014/chartex" xmlns:cx1="http://schemas.microsoft.com/office/drawing/2015/9/8/chartex" xmlns:cx2="http://schemas.microsoft.com/office/drawing/2015/10/21/chartex" xmlns:cx3="http://schemas.microsoft.com/office/drawing/2016/5/9/chartex" xmlns:cx4="http://schemas.microsoft.com/office/drawing/2016/5/10/chartex" xmlns:cx5="http://schemas.microsoft.com/office/drawing/2016/5/11/chartex" xmlns:cx6="http://schemas.microsoft.com/office/drawing/2016/5/12/chartex" xmlns:cx7="http://schemas.microsoft.com/office/drawing/2016/5/13/chartex" xmlns:cx8="http://schemas.microsoft.com/office/drawing/2016/5/14/chartex" xmlns:mc="http://schemas.openxmlformats.org/markup-compatibility/2006" xmlns:aink="http://schemas.microsoft.com/office/drawing/2016/ink" xmlns:am3d="http://schemas.microsoft.com/office/drawing/2017/model3d" xmlns:o="urn:schemas-microsoft-com:office:office" xmlns:oel="http://schemas.microsoft.com/office/2019/extlst" xmlns:r="http://schemas.openxmlformats.org/officeDocument/2006/relationships" xmlns:m="http://schemas.openxmlformats.org/officeDocument/2006/math" xmlns:v="urn:schemas-microsoft-com:vml" xmlns:wp14="http://schemas.microsoft.com/office/word/2010/wordprocessingDrawing" xmlns:wp="http://schemas.openxmlformats.org/drawingml/2006/wordprocessingDrawing" xmlns:w10="urn:schemas-microsoft-com:office:word" xmlns:w="http://schemas.openxmlformats.org/wordprocessingml/2006/main" xmlns:w14="http://schemas.microsoft.com/office/word/2010/wordml" xmlns:w15="http://schemas.microsoft.com/office/word/2012/wordml" xmlns:w16cex="http://schemas.microsoft.com/office/word/2018/wordml/cex" xmlns:w16cid="http://schemas.microsoft.com/office/word/2016/wordml/cid" xmlns:w16="http://schemas.microsoft.com/office/word/2018/wordml" xmlns:w16du="http://schemas.microsoft.com/office/word/2023/wordml/word16du" xmlns:w16sdtdh="http://schemas.microsoft.com/office/word/2020/wordml/sdtdatahash" xmlns:w16sdtfl="http://schemas.microsoft.com/office/word/2024/wordml/sdtformatlock" xmlns:w16se="http://schemas.microsoft.com/office/word/2015/wordml/symex" xmlns:wpg="http://schemas.microsoft.com/office/word/2010/wordprocessingGroup" xmlns:wpi="http://schemas.microsoft.com/office/word/2010/wordprocessingInk" xmlns:wne="http://schemas.microsoft.com/office/word/2006/wordml" xmlns:wps="http://schemas.microsoft.com/office/word/2010/wordprocessingShape" mc:Ignorable="w14 w15 w16se w16cid w16 w16cex w16sdtdh w16sdtfl w16du wp14">
+  <w:p>
     <w:pPr>
       <w:pStyle w:val="Footer"/>
-      <w:jc w:val="end"/>
-      <w:rPr/>
+      <w:jc w:val="right"/>
     </w:pPr>
     <w:r>
-      <w:rPr/>
       <w:fldChar w:fldCharType="begin"/>
     </w:r>
     <w:r>
-      <w:rPr/>
       <w:instrText xml:space="preserve"> PAGE </w:instrText>
     </w:r>
     <w:r>
-      <w:rPr/>
       <w:fldChar w:fldCharType="separate"/>
     </w:r>
     <w:r>
-      <w:rPr/>
       <w:t>2</w:t>
     </w:r>
     <w:r>
-      <w:rPr/>
       <w:fldChar w:fldCharType="end"/>
     </w:r>
   </w:p>
 </w:ftr>
 </file>
 
+<file path=word/footnotes.xml><?xml version="1.0" encoding="utf-8"?>
+<w:footnotes xmlns:wpc="http://schemas.microsoft.com/office/word/2010/wordprocessingCanvas" xmlns:cx="http://schemas.microsoft.com/office/drawing/2014/chartex" xmlns:cx1="http://schemas.microsoft.com/office/drawing/2015/9/8/chartex" xmlns:cx2="http://schemas.microsoft.com/office/drawing/2015/10/21/chartex" xmlns:cx3="http://schemas.microsoft.com/office/drawing/2016/5/9/chartex" xmlns:cx4="http://schemas.microsoft.com/office/drawing/2016/5/10/chartex" xmlns:cx5="http://schemas.microsoft.com/office/drawing/2016/5/11/chartex" xmlns:cx6="http://schemas.microsoft.com/office/drawing/2016/5/12/chartex" xmlns:cx7="http://schemas.microsoft.com/office/drawing/2016/5/13/chartex" xmlns:cx8="http://schemas.microsoft.com/office/drawing/2016/5/14/chartex" xmlns:mc="http://schemas.openxmlformats.org/markup-compatibility/2006" xmlns:aink="http://schemas.microsoft.com/office/drawing/2016/ink" xmlns:am3d="http://schemas.microsoft.com/office/drawing/2017/model3d" xmlns:o="urn:schemas-microsoft-com:office:office" xmlns:oel="http://schemas.microsoft.com/office/2019/extlst" xmlns:r="http://schemas.openxmlformats.org/officeDocument/2006/relationships" xmlns:m="http://schemas.openxmlformats.org/officeDocument/2006/math" xmlns:v="urn:schemas-microsoft-com:vml" xmlns:wp14="http://schemas.microsoft.com/office/word/2010/wordprocessingDrawing" xmlns:wp="http://schemas.openxmlformats.org/drawingml/2006/wordprocessingDrawing" xmlns:w10="urn:schemas-microsoft-com:office:word" xmlns:w="http://schemas.openxmlformats.org/wordprocessingml/2006/main" xmlns:w14="http://schemas.microsoft.com/office/word/2010/wordml" xmlns:w15="http://schemas.microsoft.com/office/word/2012/wordml" xmlns:w16cex="http://schemas.microsoft.com/office/word/2018/wordml/cex" xmlns:w16cid="http://schemas.microsoft.com/office/word/2016/wordml/cid" xmlns:w16="http://schemas.microsoft.com/office/word/2018/wordml" xmlns:w16du="http://schemas.microsoft.com/office/word/2023/wordml/word16du" xmlns:w16sdtdh="http://schemas.microsoft.com/office/word/2020/wordml/sdtdatahash" xmlns:w16sdtfl="http://schemas.microsoft.com/office/word/2024/wordml/sdtformatlock" xmlns:w16se="http://schemas.microsoft.com/office/word/2015/wordml/symex" xmlns:wpg="http://schemas.microsoft.com/office/word/2010/wordprocessingGroup" xmlns:wpi="http://schemas.microsoft.com/office/word/2010/wordprocessingInk" xmlns:wne="http://schemas.microsoft.com/office/word/2006/wordml" xmlns:wps="http://schemas.microsoft.com/office/word/2010/wordprocessingShape" mc:Ignorable="w14 w15 w16se w16cid w16 w16cex w16sdtdh w16sdtfl w16du wp14">
+  <w:footnote w:type="separator" w:id="-1">
+    <w:p>
+      <w:pPr>
+        <w:spacing w:after="0" w:line="240" w:lineRule="auto"/>
+      </w:pPr>
+      <w:r>
+        <w:separator/>
+      </w:r>
+    </w:p>
+  </w:footnote>
+  <w:footnote w:type="continuationSeparator" w:id="0">
+    <w:p>
+      <w:pPr>
+        <w:spacing w:after="0" w:line="240" w:lineRule="auto"/>
+      </w:pPr>
+      <w:r>
+        <w:continuationSeparator/>
+      </w:r>
+    </w:p>
+  </w:footnote>
+</w:footnotes>
+</file>
+
 <file path=word/header1.xml><?xml version="1.0" encoding="utf-8"?>
-<w:hdr xmlns:o="urn:schemas-microsoft-com:office:office" xmlns:r="http://schemas.openxmlformats.org/officeDocument/2006/relationships" xmlns:v="urn:schemas-microsoft-com:vml" xmlns:w="http://schemas.openxmlformats.org/wordprocessingml/2006/main" xmlns:w10="urn:schemas-microsoft-com:office:word" xmlns:wp="http://schemas.openxmlformats.org/drawingml/2006/wordprocessingDrawing" xmlns:pic="http://schemas.openxmlformats.org/drawingml/2006/picture" xmlns:wps="http://schemas.microsoft.com/office/word/2010/wordprocessingShape" xmlns:wpg="http://schemas.microsoft.com/office/word/2010/wordprocessingGroup" xmlns:mc="http://schemas.openxmlformats.org/markup-compatibility/2006" xmlns:wp14="http://schemas.microsoft.com/office/word/2010/wordprocessingDrawing" xmlns:w14="http://schemas.microsoft.com/office/word/2010/wordml" xmlns:w15="http://schemas.microsoft.com/office/word/2012/wordml" mc:Ignorable="w14 wp14 w15">
-  <w:p xmlns:wp14="http://schemas.microsoft.com/office/word/2010/wordml" wp14:textId="77777777">
+<w:hdr xmlns:wpc="http://schemas.microsoft.com/office/word/2010/wordprocessingCanvas" xmlns:cx="http://schemas.microsoft.com/office/drawing/2014/chartex" xmlns:cx1="http://schemas.microsoft.com/office/drawing/2015/9/8/chartex" xmlns:cx2="http://schemas.microsoft.com/office/drawing/2015/10/21/chartex" xmlns:cx3="http://schemas.microsoft.com/office/drawing/2016/5/9/chartex" xmlns:cx4="http://schemas.microsoft.com/office/drawing/2016/5/10/chartex" xmlns:cx5="http://schemas.microsoft.com/office/drawing/2016/5/11/chartex" xmlns:cx6="http://schemas.microsoft.com/office/drawing/2016/5/12/chartex" xmlns:cx7="http://schemas.microsoft.com/office/drawing/2016/5/13/chartex" xmlns:cx8="http://schemas.microsoft.com/office/drawing/2016/5/14/chartex" xmlns:mc="http://schemas.openxmlformats.org/markup-compatibility/2006" xmlns:aink="http://schemas.microsoft.com/office/drawing/2016/ink" xmlns:am3d="http://schemas.microsoft.com/office/drawing/2017/model3d" xmlns:o="urn:schemas-microsoft-com:office:office" xmlns:oel="http://schemas.microsoft.com/office/2019/extlst" xmlns:r="http://schemas.openxmlformats.org/officeDocument/2006/relationships" xmlns:m="http://schemas.openxmlformats.org/officeDocument/2006/math" xmlns:v="urn:schemas-microsoft-com:vml" xmlns:wp14="http://schemas.microsoft.com/office/word/2010/wordprocessingDrawing" xmlns:wp="http://schemas.openxmlformats.org/drawingml/2006/wordprocessingDrawing" xmlns:w10="urn:schemas-microsoft-com:office:word" xmlns:w="http://schemas.openxmlformats.org/wordprocessingml/2006/main" xmlns:w14="http://schemas.microsoft.com/office/word/2010/wordml" xmlns:w15="http://schemas.microsoft.com/office/word/2012/wordml" xmlns:w16cex="http://schemas.microsoft.com/office/word/2018/wordml/cex" xmlns:w16cid="http://schemas.microsoft.com/office/word/2016/wordml/cid" xmlns:w16="http://schemas.microsoft.com/office/word/2018/wordml" xmlns:w16du="http://schemas.microsoft.com/office/word/2023/wordml/word16du" xmlns:w16sdtdh="http://schemas.microsoft.com/office/word/2020/wordml/sdtdatahash" xmlns:w16sdtfl="http://schemas.microsoft.com/office/word/2024/wordml/sdtformatlock" xmlns:w16se="http://schemas.microsoft.com/office/word/2015/wordml/symex" xmlns:wpg="http://schemas.microsoft.com/office/word/2010/wordprocessingGroup" xmlns:wpi="http://schemas.microsoft.com/office/word/2010/wordprocessingInk" xmlns:wne="http://schemas.microsoft.com/office/word/2006/wordml" xmlns:wps="http://schemas.microsoft.com/office/word/2010/wordprocessingShape" mc:Ignorable="w14 w15 w16se w16cid w16 w16cex w16sdtdh w16sdtfl w16du wp14">
+  <w:p>
     <w:pPr>
       <w:pStyle w:val="Header"/>
-      <w:rPr/>
     </w:pPr>
-    <w:r>
-      <w:rPr/>
-    </w:r>
   </w:p>
 </w:hdr>
 </file>
 
 <file path=word/header2.xml><?xml version="1.0" encoding="utf-8"?>
-<w:hdr xmlns:o="urn:schemas-microsoft-com:office:office" xmlns:r="http://schemas.openxmlformats.org/officeDocument/2006/relationships" xmlns:v="urn:schemas-microsoft-com:vml" xmlns:w="http://schemas.openxmlformats.org/wordprocessingml/2006/main" xmlns:w10="urn:schemas-microsoft-com:office:word" xmlns:wp="http://schemas.openxmlformats.org/drawingml/2006/wordprocessingDrawing" xmlns:pic="http://schemas.openxmlformats.org/drawingml/2006/picture" xmlns:wps="http://schemas.microsoft.com/office/word/2010/wordprocessingShape" xmlns:wpg="http://schemas.microsoft.com/office/word/2010/wordprocessingGroup" xmlns:mc="http://schemas.openxmlformats.org/markup-compatibility/2006" xmlns:wp14="http://schemas.microsoft.com/office/word/2010/wordprocessingDrawing" xmlns:w14="http://schemas.microsoft.com/office/word/2010/wordml" xmlns:w15="http://schemas.microsoft.com/office/word/2012/wordml" mc:Ignorable="w14 wp14 w15">
-  <w:p xmlns:wp14="http://schemas.microsoft.com/office/word/2010/wordml" wp14:textId="77777777">
+<w:hdr xmlns:wpc="http://schemas.microsoft.com/office/word/2010/wordprocessingCanvas" xmlns:cx="http://schemas.microsoft.com/office/drawing/2014/chartex" xmlns:cx1="http://schemas.microsoft.com/office/drawing/2015/9/8/chartex" xmlns:cx2="http://schemas.microsoft.com/office/drawing/2015/10/21/chartex" xmlns:cx3="http://schemas.microsoft.com/office/drawing/2016/5/9/chartex" xmlns:cx4="http://schemas.microsoft.com/office/drawing/2016/5/10/chartex" xmlns:cx5="http://schemas.microsoft.com/office/drawing/2016/5/11/chartex" xmlns:cx6="http://schemas.microsoft.com/office/drawing/2016/5/12/chartex" xmlns:cx7="http://schemas.microsoft.com/office/drawing/2016/5/13/chartex" xmlns:cx8="http://schemas.microsoft.com/office/drawing/2016/5/14/chartex" xmlns:mc="http://schemas.openxmlformats.org/markup-compatibility/2006" xmlns:aink="http://schemas.microsoft.com/office/drawing/2016/ink" xmlns:am3d="http://schemas.microsoft.com/office/drawing/2017/model3d" xmlns:o="urn:schemas-microsoft-com:office:office" xmlns:oel="http://schemas.microsoft.com/office/2019/extlst" xmlns:r="http://schemas.openxmlformats.org/officeDocument/2006/relationships" xmlns:m="http://schemas.openxmlformats.org/officeDocument/2006/math" xmlns:v="urn:schemas-microsoft-com:vml" xmlns:wp14="http://schemas.microsoft.com/office/word/2010/wordprocessingDrawing" xmlns:wp="http://schemas.openxmlformats.org/drawingml/2006/wordprocessingDrawing" xmlns:w10="urn:schemas-microsoft-com:office:word" xmlns:w="http://schemas.openxmlformats.org/wordprocessingml/2006/main" xmlns:w14="http://schemas.microsoft.com/office/word/2010/wordml" xmlns:w15="http://schemas.microsoft.com/office/word/2012/wordml" xmlns:w16cex="http://schemas.microsoft.com/office/word/2018/wordml/cex" xmlns:w16cid="http://schemas.microsoft.com/office/word/2016/wordml/cid" xmlns:w16="http://schemas.microsoft.com/office/word/2018/wordml" xmlns:w16du="http://schemas.microsoft.com/office/word/2023/wordml/word16du" xmlns:w16sdtdh="http://schemas.microsoft.com/office/word/2020/wordml/sdtdatahash" xmlns:w16sdtfl="http://schemas.microsoft.com/office/word/2024/wordml/sdtformatlock" xmlns:w16se="http://schemas.microsoft.com/office/word/2015/wordml/symex" xmlns:wpg="http://schemas.microsoft.com/office/word/2010/wordprocessingGroup" xmlns:wpi="http://schemas.microsoft.com/office/word/2010/wordprocessingInk" xmlns:wne="http://schemas.microsoft.com/office/word/2006/wordml" xmlns:wps="http://schemas.microsoft.com/office/word/2010/wordprocessingShape" mc:Ignorable="w14 w15 w16se w16cid w16 w16cex w16sdtdh w16sdtfl w16du wp14">
+  <w:p>
     <w:pPr>
       <w:pStyle w:val="Header"/>
-      <w:rPr/>
     </w:pPr>
-    <w:r>
-      <w:rPr/>
-    </w:r>
   </w:p>
-  <w:p xmlns:wp14="http://schemas.microsoft.com/office/word/2010/wordml" wp14:textId="77777777">
+  <w:p>
     <w:pPr>
       <w:pStyle w:val="Header"/>
       <w:pBdr>
-        <w:bottom w:val="single" w:color="000000" w:sz="2" w:space="1"/>
+        <w:bottom w:val="single" w:sz="2" w:space="1" w:color="000000"/>
       </w:pBdr>
-      <w:rPr/>
     </w:pPr>
-    <w:r>
-      <w:rPr/>
-    </w:r>
   </w:p>
 </w:hdr>
 </file>
 
 <file path=word/header3.xml><?xml version="1.0" encoding="utf-8"?>
-<w:hdr xmlns:o="urn:schemas-microsoft-com:office:office" xmlns:r="http://schemas.openxmlformats.org/officeDocument/2006/relationships" xmlns:v="urn:schemas-microsoft-com:vml" xmlns:w="http://schemas.openxmlformats.org/wordprocessingml/2006/main" xmlns:w10="urn:schemas-microsoft-com:office:word" xmlns:wp="http://schemas.openxmlformats.org/drawingml/2006/wordprocessingDrawing" xmlns:pic="http://schemas.openxmlformats.org/drawingml/2006/picture" xmlns:wps="http://schemas.microsoft.com/office/word/2010/wordprocessingShape" xmlns:wpg="http://schemas.microsoft.com/office/word/2010/wordprocessingGroup" xmlns:mc="http://schemas.openxmlformats.org/markup-compatibility/2006" xmlns:wp14="http://schemas.microsoft.com/office/word/2010/wordprocessingDrawing" xmlns:w14="http://schemas.microsoft.com/office/word/2010/wordml" xmlns:w15="http://schemas.microsoft.com/office/word/2012/wordml" mc:Ignorable="w14 wp14 w15">
-  <w:p xmlns:wp14="http://schemas.microsoft.com/office/word/2010/wordml" wp14:textId="77777777">
+<w:hdr xmlns:wpc="http://schemas.microsoft.com/office/word/2010/wordprocessingCanvas" xmlns:cx="http://schemas.microsoft.com/office/drawing/2014/chartex" xmlns:cx1="http://schemas.microsoft.com/office/drawing/2015/9/8/chartex" xmlns:cx2="http://schemas.microsoft.com/office/drawing/2015/10/21/chartex" xmlns:cx3="http://schemas.microsoft.com/office/drawing/2016/5/9/chartex" xmlns:cx4="http://schemas.microsoft.com/office/drawing/2016/5/10/chartex" xmlns:cx5="http://schemas.microsoft.com/office/drawing/2016/5/11/chartex" xmlns:cx6="http://schemas.microsoft.com/office/drawing/2016/5/12/chartex" xmlns:cx7="http://schemas.microsoft.com/office/drawing/2016/5/13/chartex" xmlns:cx8="http://schemas.microsoft.com/office/drawing/2016/5/14/chartex" xmlns:mc="http://schemas.openxmlformats.org/markup-compatibility/2006" xmlns:aink="http://schemas.microsoft.com/office/drawing/2016/ink" xmlns:am3d="http://schemas.microsoft.com/office/drawing/2017/model3d" xmlns:o="urn:schemas-microsoft-com:office:office" xmlns:oel="http://schemas.microsoft.com/office/2019/extlst" xmlns:r="http://schemas.openxmlformats.org/officeDocument/2006/relationships" xmlns:m="http://schemas.openxmlformats.org/officeDocument/2006/math" xmlns:v="urn:schemas-microsoft-com:vml" xmlns:wp14="http://schemas.microsoft.com/office/word/2010/wordprocessingDrawing" xmlns:wp="http://schemas.openxmlformats.org/drawingml/2006/wordprocessingDrawing" xmlns:w10="urn:schemas-microsoft-com:office:word" xmlns:w="http://schemas.openxmlformats.org/wordprocessingml/2006/main" xmlns:w14="http://schemas.microsoft.com/office/word/2010/wordml" xmlns:w15="http://schemas.microsoft.com/office/word/2012/wordml" xmlns:w16cex="http://schemas.microsoft.com/office/word/2018/wordml/cex" xmlns:w16cid="http://schemas.microsoft.com/office/word/2016/wordml/cid" xmlns:w16="http://schemas.microsoft.com/office/word/2018/wordml" xmlns:w16du="http://schemas.microsoft.com/office/word/2023/wordml/word16du" xmlns:w16sdtdh="http://schemas.microsoft.com/office/word/2020/wordml/sdtdatahash" xmlns:w16sdtfl="http://schemas.microsoft.com/office/word/2024/wordml/sdtformatlock" xmlns:w16se="http://schemas.microsoft.com/office/word/2015/wordml/symex" xmlns:wpg="http://schemas.microsoft.com/office/word/2010/wordprocessingGroup" xmlns:wpi="http://schemas.microsoft.com/office/word/2010/wordprocessingInk" xmlns:wne="http://schemas.microsoft.com/office/word/2006/wordml" xmlns:wps="http://schemas.microsoft.com/office/word/2010/wordprocessingShape" mc:Ignorable="w14 w15 w16se w16cid w16 w16cex w16sdtdh w16sdtfl w16du wp14">
+  <w:p>
     <w:pPr>
       <w:pStyle w:val="Header"/>
-      <w:rPr/>
     </w:pPr>
-    <w:r>
-      <w:rPr/>
-    </w:r>
   </w:p>
-  <w:p xmlns:wp14="http://schemas.microsoft.com/office/word/2010/wordml" wp14:textId="77777777">
+  <w:p>
     <w:pPr>
       <w:pStyle w:val="Header"/>
       <w:pBdr>
-        <w:bottom w:val="single" w:color="000000" w:sz="2" w:space="1"/>
+        <w:bottom w:val="single" w:sz="2" w:space="1" w:color="000000"/>
       </w:pBdr>
-      <w:rPr/>
     </w:pPr>
-    <w:r>
-      <w:rPr/>
-    </w:r>
   </w:p>
 </w:hdr>
 </file>
 
 <file path=word/header4.xml><?xml version="1.0" encoding="utf-8"?>
-<w:hdr xmlns:o="urn:schemas-microsoft-com:office:office" xmlns:r="http://schemas.openxmlformats.org/officeDocument/2006/relationships" xmlns:v="urn:schemas-microsoft-com:vml" xmlns:w="http://schemas.openxmlformats.org/wordprocessingml/2006/main" xmlns:w10="urn:schemas-microsoft-com:office:word" xmlns:wp="http://schemas.openxmlformats.org/drawingml/2006/wordprocessingDrawing" xmlns:pic="http://schemas.openxmlformats.org/drawingml/2006/picture" xmlns:wps="http://schemas.microsoft.com/office/word/2010/wordprocessingShape" xmlns:wpg="http://schemas.microsoft.com/office/word/2010/wordprocessingGroup" xmlns:mc="http://schemas.openxmlformats.org/markup-compatibility/2006" xmlns:wp14="http://schemas.microsoft.com/office/word/2010/wordprocessingDrawing" xmlns:w14="http://schemas.microsoft.com/office/word/2010/wordml" xmlns:w15="http://schemas.microsoft.com/office/word/2012/wordml" mc:Ignorable="w14 wp14 w15">
-  <w:p xmlns:wp14="http://schemas.microsoft.com/office/word/2010/wordml" wp14:textId="77777777">
+<w:hdr xmlns:wpc="http://schemas.microsoft.com/office/word/2010/wordprocessingCanvas" xmlns:cx="http://schemas.microsoft.com/office/drawing/2014/chartex" xmlns:cx1="http://schemas.microsoft.com/office/drawing/2015/9/8/chartex" xmlns:cx2="http://schemas.microsoft.com/office/drawing/2015/10/21/chartex" xmlns:cx3="http://schemas.microsoft.com/office/drawing/2016/5/9/chartex" xmlns:cx4="http://schemas.microsoft.com/office/drawing/2016/5/10/chartex" xmlns:cx5="http://schemas.microsoft.com/office/drawing/2016/5/11/chartex" xmlns:cx6="http://schemas.microsoft.com/office/drawing/2016/5/12/chartex" xmlns:cx7="http://schemas.microsoft.com/office/drawing/2016/5/13/chartex" xmlns:cx8="http://schemas.microsoft.com/office/drawing/2016/5/14/chartex" xmlns:mc="http://schemas.openxmlformats.org/markup-compatibility/2006" xmlns:aink="http://schemas.microsoft.com/office/drawing/2016/ink" xmlns:am3d="http://schemas.microsoft.com/office/drawing/2017/model3d" xmlns:o="urn:schemas-microsoft-com:office:office" xmlns:oel="http://schemas.microsoft.com/office/2019/extlst" xmlns:r="http://schemas.openxmlformats.org/officeDocument/2006/relationships" xmlns:m="http://schemas.openxmlformats.org/officeDocument/2006/math" xmlns:v="urn:schemas-microsoft-com:vml" xmlns:wp14="http://schemas.microsoft.com/office/word/2010/wordprocessingDrawing" xmlns:wp="http://schemas.openxmlformats.org/drawingml/2006/wordprocessingDrawing" xmlns:w10="urn:schemas-microsoft-com:office:word" xmlns:w="http://schemas.openxmlformats.org/wordprocessingml/2006/main" xmlns:w14="http://schemas.microsoft.com/office/word/2010/wordml" xmlns:w15="http://schemas.microsoft.com/office/word/2012/wordml" xmlns:w16cex="http://schemas.microsoft.com/office/word/2018/wordml/cex" xmlns:w16cid="http://schemas.microsoft.com/office/word/2016/wordml/cid" xmlns:w16="http://schemas.microsoft.com/office/word/2018/wordml" xmlns:w16du="http://schemas.microsoft.com/office/word/2023/wordml/word16du" xmlns:w16sdtdh="http://schemas.microsoft.com/office/word/2020/wordml/sdtdatahash" xmlns:w16sdtfl="http://schemas.microsoft.com/office/word/2024/wordml/sdtformatlock" xmlns:w16se="http://schemas.microsoft.com/office/word/2015/wordml/symex" xmlns:wpg="http://schemas.microsoft.com/office/word/2010/wordprocessingGroup" xmlns:wpi="http://schemas.microsoft.com/office/word/2010/wordprocessingInk" xmlns:wne="http://schemas.microsoft.com/office/word/2006/wordml" xmlns:wps="http://schemas.microsoft.com/office/word/2010/wordprocessingShape" mc:Ignorable="w14 w15 w16se w16cid w16 w16cex w16sdtdh w16sdtfl w16du wp14">
+  <w:p>
     <w:pPr>
       <w:pStyle w:val="Header"/>
-      <w:rPr/>
     </w:pPr>
-    <w:r>
-      <w:rPr/>
-    </w:r>
   </w:p>
 </w:hdr>
 </file>
 
 <file path=word/header5.xml><?xml version="1.0" encoding="utf-8"?>
-<w:hdr xmlns:o="urn:schemas-microsoft-com:office:office" xmlns:r="http://schemas.openxmlformats.org/officeDocument/2006/relationships" xmlns:v="urn:schemas-microsoft-com:vml" xmlns:w="http://schemas.openxmlformats.org/wordprocessingml/2006/main" xmlns:w10="urn:schemas-microsoft-com:office:word" xmlns:wp="http://schemas.openxmlformats.org/drawingml/2006/wordprocessingDrawing" xmlns:pic="http://schemas.openxmlformats.org/drawingml/2006/picture" xmlns:wps="http://schemas.microsoft.com/office/word/2010/wordprocessingShape" xmlns:wpg="http://schemas.microsoft.com/office/word/2010/wordprocessingGroup" xmlns:mc="http://schemas.openxmlformats.org/markup-compatibility/2006" xmlns:wp14="http://schemas.microsoft.com/office/word/2010/wordprocessingDrawing" xmlns:w14="http://schemas.microsoft.com/office/word/2010/wordml" xmlns:w15="http://schemas.microsoft.com/office/word/2012/wordml" mc:Ignorable="w14 wp14 w15">
-  <w:p xmlns:wp14="http://schemas.microsoft.com/office/word/2010/wordml" wp14:textId="77777777">
+<w:hdr xmlns:wpc="http://schemas.microsoft.com/office/word/2010/wordprocessingCanvas" xmlns:cx="http://schemas.microsoft.com/office/drawing/2014/chartex" xmlns:cx1="http://schemas.microsoft.com/office/drawing/2015/9/8/chartex" xmlns:cx2="http://schemas.microsoft.com/office/drawing/2015/10/21/chartex" xmlns:cx3="http://schemas.microsoft.com/office/drawing/2016/5/9/chartex" xmlns:cx4="http://schemas.microsoft.com/office/drawing/2016/5/10/chartex" xmlns:cx5="http://schemas.microsoft.com/office/drawing/2016/5/11/chartex" xmlns:cx6="http://schemas.microsoft.com/office/drawing/2016/5/12/chartex" xmlns:cx7="http://schemas.microsoft.com/office/drawing/2016/5/13/chartex" xmlns:cx8="http://schemas.microsoft.com/office/drawing/2016/5/14/chartex" xmlns:mc="http://schemas.openxmlformats.org/markup-compatibility/2006" xmlns:aink="http://schemas.microsoft.com/office/drawing/2016/ink" xmlns:am3d="http://schemas.microsoft.com/office/drawing/2017/model3d" xmlns:o="urn:schemas-microsoft-com:office:office" xmlns:oel="http://schemas.microsoft.com/office/2019/extlst" xmlns:r="http://schemas.openxmlformats.org/officeDocument/2006/relationships" xmlns:m="http://schemas.openxmlformats.org/officeDocument/2006/math" xmlns:v="urn:schemas-microsoft-com:vml" xmlns:wp14="http://schemas.microsoft.com/office/word/2010/wordprocessingDrawing" xmlns:wp="http://schemas.openxmlformats.org/drawingml/2006/wordprocessingDrawing" xmlns:w10="urn:schemas-microsoft-com:office:word" xmlns:w="http://schemas.openxmlformats.org/wordprocessingml/2006/main" xmlns:w14="http://schemas.microsoft.com/office/word/2010/wordml" xmlns:w15="http://schemas.microsoft.com/office/word/2012/wordml" xmlns:w16cex="http://schemas.microsoft.com/office/word/2018/wordml/cex" xmlns:w16cid="http://schemas.microsoft.com/office/word/2016/wordml/cid" xmlns:w16="http://schemas.microsoft.com/office/word/2018/wordml" xmlns:w16du="http://schemas.microsoft.com/office/word/2023/wordml/word16du" xmlns:w16sdtdh="http://schemas.microsoft.com/office/word/2020/wordml/sdtdatahash" xmlns:w16sdtfl="http://schemas.microsoft.com/office/word/2024/wordml/sdtformatlock" xmlns:w16se="http://schemas.microsoft.com/office/word/2015/wordml/symex" xmlns:wpg="http://schemas.microsoft.com/office/word/2010/wordprocessingGroup" xmlns:wpi="http://schemas.microsoft.com/office/word/2010/wordprocessingInk" xmlns:wne="http://schemas.microsoft.com/office/word/2006/wordml" xmlns:wps="http://schemas.microsoft.com/office/word/2010/wordprocessingShape" mc:Ignorable="w14 w15 w16se w16cid w16 w16cex w16sdtdh w16sdtfl w16du wp14">
+  <w:p>
     <w:pPr>
       <w:pStyle w:val="Header"/>
-      <w:rPr/>
     </w:pPr>
-    <w:r>
-      <w:rPr/>
-    </w:r>
   </w:p>
-  <w:p xmlns:wp14="http://schemas.microsoft.com/office/word/2010/wordml" wp14:textId="77777777">
+  <w:p>
     <w:pPr>
       <w:pStyle w:val="Header"/>
       <w:pBdr>
-        <w:bottom w:val="single" w:color="000000" w:sz="2" w:space="1"/>
+        <w:bottom w:val="single" w:sz="2" w:space="1" w:color="000000"/>
       </w:pBdr>
       <w:tabs>
         <w:tab w:val="clear" w:pos="4513"/>
-        <w:tab w:val="center" w:leader="none" w:pos="4536"/>
+        <w:tab w:val="center" w:pos="4536"/>
       </w:tabs>
-      <w:rPr/>
     </w:pPr>
+    <w:fldSimple w:instr=" STYLEREF &quot;heading 1&quot; \n ">
+      <w:r>
+        <w:rPr>
+          <w:noProof/>
+        </w:rPr>
+        <w:t>5</w:t>
+      </w:r>
+    </w:fldSimple>
     <w:r>
-      <w:rPr/>
-      <w:fldChar w:fldCharType="begin"/>
-    </w:r>
-    <w:r>
-      <w:rPr/>
-      <w:instrText xml:space="preserve"> STYLEREF "heading 1" \n </w:instrText>
-    </w:r>
-    <w:r>
-      <w:rPr/>
-      <w:fldChar w:fldCharType="separate"/>
-    </w:r>
-    <w:r>
-      <w:rPr/>
-      <w:t>B</w:t>
-    </w:r>
-    <w:r>
-      <w:rPr/>
-      <w:fldChar w:fldCharType="end"/>
-    </w:r>
-    <w:r>
-      <w:rPr/>
       <w:t xml:space="preserve">   </w:t>
     </w:r>
-    <w:r>
-      <w:rPr/>
-      <w:fldChar w:fldCharType="begin"/>
-    </w:r>
-    <w:r>
-      <w:rPr/>
-      <w:instrText xml:space="preserve"> STYLEREF "heading 1" </w:instrText>
-    </w:r>
-    <w:r>
-      <w:rPr/>
-      <w:fldChar w:fldCharType="separate"/>
-    </w:r>
-    <w:r>
-      <w:rPr/>
-      <w:t>This is another appendix</w:t>
-    </w:r>
-    <w:r>
-      <w:rPr/>
-      <w:fldChar w:fldCharType="end"/>
-    </w:r>
+    <w:fldSimple w:instr=" STYLEREF &quot;heading 1&quot; ">
+      <w:r>
+        <w:rPr>
+          <w:noProof/>
+        </w:rPr>
+        <w:t>Results and discussion</w:t>
+      </w:r>
+    </w:fldSimple>
   </w:p>
 </w:hdr>
 </file>
 
 <file path=word/header6.xml><?xml version="1.0" encoding="utf-8"?>
-<w:hdr xmlns:o="urn:schemas-microsoft-com:office:office" xmlns:r="http://schemas.openxmlformats.org/officeDocument/2006/relationships" xmlns:v="urn:schemas-microsoft-com:vml" xmlns:w="http://schemas.openxmlformats.org/wordprocessingml/2006/main" xmlns:w10="urn:schemas-microsoft-com:office:word" xmlns:wp="http://schemas.openxmlformats.org/drawingml/2006/wordprocessingDrawing" xmlns:pic="http://schemas.openxmlformats.org/drawingml/2006/picture" xmlns:wps="http://schemas.microsoft.com/office/word/2010/wordprocessingShape" xmlns:wpg="http://schemas.microsoft.com/office/word/2010/wordprocessingGroup" xmlns:mc="http://schemas.openxmlformats.org/markup-compatibility/2006" xmlns:wp14="http://schemas.microsoft.com/office/word/2010/wordprocessingDrawing" xmlns:w14="http://schemas.microsoft.com/office/word/2010/wordml" xmlns:w15="http://schemas.microsoft.com/office/word/2012/wordml" mc:Ignorable="w14 wp14 w15">
-  <w:p xmlns:wp14="http://schemas.microsoft.com/office/word/2010/wordml" wp14:textId="77777777">
+<w:hdr xmlns:wpc="http://schemas.microsoft.com/office/word/2010/wordprocessingCanvas" xmlns:cx="http://schemas.microsoft.com/office/drawing/2014/chartex" xmlns:cx1="http://schemas.microsoft.com/office/drawing/2015/9/8/chartex" xmlns:cx2="http://schemas.microsoft.com/office/drawing/2015/10/21/chartex" xmlns:cx3="http://schemas.microsoft.com/office/drawing/2016/5/9/chartex" xmlns:cx4="http://schemas.microsoft.com/office/drawing/2016/5/10/chartex" xmlns:cx5="http://schemas.microsoft.com/office/drawing/2016/5/11/chartex" xmlns:cx6="http://schemas.microsoft.com/office/drawing/2016/5/12/chartex" xmlns:cx7="http://schemas.microsoft.com/office/drawing/2016/5/13/chartex" xmlns:cx8="http://schemas.microsoft.com/office/drawing/2016/5/14/chartex" xmlns:mc="http://schemas.openxmlformats.org/markup-compatibility/2006" xmlns:aink="http://schemas.microsoft.com/office/drawing/2016/ink" xmlns:am3d="http://schemas.microsoft.com/office/drawing/2017/model3d" xmlns:o="urn:schemas-microsoft-com:office:office" xmlns:oel="http://schemas.microsoft.com/office/2019/extlst" xmlns:r="http://schemas.openxmlformats.org/officeDocument/2006/relationships" xmlns:m="http://schemas.openxmlformats.org/officeDocument/2006/math" xmlns:v="urn:schemas-microsoft-com:vml" xmlns:wp14="http://schemas.microsoft.com/office/word/2010/wordprocessingDrawing" xmlns:wp="http://schemas.openxmlformats.org/drawingml/2006/wordprocessingDrawing" xmlns:w10="urn:schemas-microsoft-com:office:word" xmlns:w="http://schemas.openxmlformats.org/wordprocessingml/2006/main" xmlns:w14="http://schemas.microsoft.com/office/word/2010/wordml" xmlns:w15="http://schemas.microsoft.com/office/word/2012/wordml" xmlns:w16cex="http://schemas.microsoft.com/office/word/2018/wordml/cex" xmlns:w16cid="http://schemas.microsoft.com/office/word/2016/wordml/cid" xmlns:w16="http://schemas.microsoft.com/office/word/2018/wordml" xmlns:w16du="http://schemas.microsoft.com/office/word/2023/wordml/word16du" xmlns:w16sdtdh="http://schemas.microsoft.com/office/word/2020/wordml/sdtdatahash" xmlns:w16sdtfl="http://schemas.microsoft.com/office/word/2024/wordml/sdtformatlock" xmlns:w16se="http://schemas.microsoft.com/office/word/2015/wordml/symex" xmlns:wpg="http://schemas.microsoft.com/office/word/2010/wordprocessingGroup" xmlns:wpi="http://schemas.microsoft.com/office/word/2010/wordprocessingInk" xmlns:wne="http://schemas.microsoft.com/office/word/2006/wordml" xmlns:wps="http://schemas.microsoft.com/office/word/2010/wordprocessingShape" mc:Ignorable="w14 w15 w16se w16cid w16 w16cex w16sdtdh w16sdtfl w16du wp14">
+  <w:p>
     <w:pPr>
       <w:pStyle w:val="Header"/>
-      <w:rPr/>
     </w:pPr>
-    <w:r>
-      <w:rPr/>
-    </w:r>
   </w:p>
-  <w:p xmlns:wp14="http://schemas.microsoft.com/office/word/2010/wordml" wp14:textId="77777777">
+  <w:p>
     <w:pPr>
       <w:pStyle w:val="Header"/>
       <w:pBdr>
-        <w:bottom w:val="single" w:color="000000" w:sz="2" w:space="1"/>
+        <w:bottom w:val="single" w:sz="2" w:space="1" w:color="000000"/>
       </w:pBdr>
       <w:tabs>
         <w:tab w:val="clear" w:pos="4513"/>
-        <w:tab w:val="center" w:leader="none" w:pos="4536"/>
+        <w:tab w:val="center" w:pos="4536"/>
       </w:tabs>
-      <w:rPr/>
     </w:pPr>
+    <w:fldSimple w:instr=" STYLEREF &quot;heading 1&quot; \n ">
+      <w:r>
+        <w:t>B</w:t>
+      </w:r>
+    </w:fldSimple>
     <w:r>
-      <w:rPr/>
-      <w:fldChar w:fldCharType="begin"/>
-    </w:r>
-    <w:r>
-      <w:rPr/>
-      <w:instrText xml:space="preserve"> STYLEREF "heading 1" \n </w:instrText>
-    </w:r>
-    <w:r>
-      <w:rPr/>
-      <w:fldChar w:fldCharType="separate"/>
-    </w:r>
-    <w:r>
-      <w:rPr/>
-      <w:t>B</w:t>
-    </w:r>
-    <w:r>
-      <w:rPr/>
-      <w:fldChar w:fldCharType="end"/>
-    </w:r>
-    <w:r>
-      <w:rPr/>
       <w:t xml:space="preserve">   </w:t>
     </w:r>
-    <w:r>
-      <w:rPr/>
-      <w:fldChar w:fldCharType="begin"/>
-    </w:r>
-    <w:r>
-      <w:rPr/>
-      <w:instrText xml:space="preserve"> STYLEREF "heading 1" </w:instrText>
-    </w:r>
-    <w:r>
-      <w:rPr/>
-      <w:fldChar w:fldCharType="separate"/>
-    </w:r>
-    <w:r>
-      <w:rPr/>
-      <w:t>This is another appendix</w:t>
-    </w:r>
-    <w:r>
-      <w:rPr/>
-      <w:fldChar w:fldCharType="end"/>
-    </w:r>
+    <w:fldSimple w:instr=" STYLEREF &quot;heading 1&quot; ">
+      <w:r>
+        <w:t>This is another appendix</w:t>
+      </w:r>
+    </w:fldSimple>
   </w:p>
 </w:hdr>
 </file>
 
 <file path=word/numbering.xml><?xml version="1.0" encoding="utf-8"?>
-<w:numbering xmlns:w="http://schemas.openxmlformats.org/wordprocessingml/2006/main" xmlns:o="urn:schemas-microsoft-com:office:office" xmlns:r="http://schemas.openxmlformats.org/officeDocument/2006/relationships" xmlns:v="urn:schemas-microsoft-com:vml" xmlns:mc="http://schemas.openxmlformats.org/markup-compatibility/2006" xmlns:w14="http://schemas.microsoft.com/office/word/2010/wordml" mc:Ignorable="w14">
-  <w:abstractNum w:abstractNumId="1">
+<w:numbering xmlns:wpc="http://schemas.microsoft.com/office/word/2010/wordprocessingCanvas" xmlns:cx="http://schemas.microsoft.com/office/drawing/2014/chartex" xmlns:cx1="http://schemas.microsoft.com/office/drawing/2015/9/8/chartex" xmlns:cx2="http://schemas.microsoft.com/office/drawing/2015/10/21/chartex" xmlns:cx3="http://schemas.microsoft.com/office/drawing/2016/5/9/chartex" xmlns:cx4="http://schemas.microsoft.com/office/drawing/2016/5/10/chartex" xmlns:cx5="http://schemas.microsoft.com/office/drawing/2016/5/11/chartex" xmlns:cx6="http://schemas.microsoft.com/office/drawing/2016/5/12/chartex" xmlns:cx7="http://schemas.microsoft.com/office/drawing/2016/5/13/chartex" xmlns:cx8="http://schemas.microsoft.com/office/drawing/2016/5/14/chartex" xmlns:mc="http://schemas.openxmlformats.org/markup-compatibility/2006" xmlns:aink="http://schemas.microsoft.com/office/drawing/2016/ink" xmlns:am3d="http://schemas.microsoft.com/office/drawing/2017/model3d" xmlns:o="urn:schemas-microsoft-com:office:office" xmlns:oel="http://schemas.microsoft.com/office/2019/extlst" xmlns:r="http://schemas.openxmlformats.org/officeDocument/2006/relationships" xmlns:m="http://schemas.openxmlformats.org/officeDocument/2006/math" xmlns:v="urn:schemas-microsoft-com:vml" xmlns:wp14="http://schemas.microsoft.com/office/word/2010/wordprocessingDrawing" xmlns:wp="http://schemas.openxmlformats.org/drawingml/2006/wordprocessingDrawing" xmlns:w10="urn:schemas-microsoft-com:office:word" xmlns:w="http://schemas.openxmlformats.org/wordprocessingml/2006/main" xmlns:w14="http://schemas.microsoft.com/office/word/2010/wordml" xmlns:w15="http://schemas.microsoft.com/office/word/2012/wordml" xmlns:w16cex="http://schemas.microsoft.com/office/word/2018/wordml/cex" xmlns:w16cid="http://schemas.microsoft.com/office/word/2016/wordml/cid" xmlns:w16="http://schemas.microsoft.com/office/word/2018/wordml" xmlns:w16du="http://schemas.microsoft.com/office/word/2023/wordml/word16du" xmlns:w16sdtdh="http://schemas.microsoft.com/office/word/2020/wordml/sdtdatahash" xmlns:w16sdtfl="http://schemas.microsoft.com/office/word/2024/wordml/sdtformatlock" xmlns:w16se="http://schemas.microsoft.com/office/word/2015/wordml/symex" xmlns:wpg="http://schemas.microsoft.com/office/word/2010/wordprocessingGroup" xmlns:wpi="http://schemas.microsoft.com/office/word/2010/wordprocessingInk" xmlns:wne="http://schemas.microsoft.com/office/word/2006/wordml" xmlns:wps="http://schemas.microsoft.com/office/word/2010/wordprocessingShape" mc:Ignorable="w14 w15 w16se w16cid w16 w16cex w16sdtdh w16sdtfl w16du wp14">
+  <w:abstractNum w:abstractNumId="0" w15:restartNumberingAfterBreak="0">
+    <w:nsid w:val="74CCF13A"/>
+    <w:multiLevelType w:val="multilevel"/>
+    <w:tmpl w:val="36D28ACE"/>
+    <w:lvl w:ilvl="0">
+      <w:start w:val="1"/>
+      <w:numFmt w:val="upperLetter"/>
+      <w:lvlText w:val="%1"/>
+      <w:lvlJc w:val="left"/>
+      <w:pPr>
+        <w:tabs>
+          <w:tab w:val="num" w:pos="0"/>
+        </w:tabs>
+        <w:ind w:left="432" w:hanging="432"/>
+      </w:pPr>
+    </w:lvl>
+    <w:lvl w:ilvl="1">
+      <w:start w:val="1"/>
+      <w:numFmt w:val="decimal"/>
+      <w:lvlText w:val="%1.%2"/>
+      <w:lvlJc w:val="left"/>
+      <w:pPr>
+        <w:tabs>
+          <w:tab w:val="num" w:pos="0"/>
+        </w:tabs>
+        <w:ind w:left="576" w:hanging="576"/>
+      </w:pPr>
+    </w:lvl>
+    <w:lvl w:ilvl="2">
+      <w:start w:val="1"/>
+      <w:numFmt w:val="decimal"/>
+      <w:lvlText w:val="%1.%2.%3"/>
+      <w:lvlJc w:val="left"/>
+      <w:pPr>
+        <w:tabs>
+          <w:tab w:val="num" w:pos="0"/>
+        </w:tabs>
+        <w:ind w:left="720" w:hanging="720"/>
+      </w:pPr>
+    </w:lvl>
+    <w:lvl w:ilvl="3">
+      <w:start w:val="1"/>
+      <w:numFmt w:val="decimal"/>
+      <w:lvlText w:val="%1.%2.%3.%4"/>
+      <w:lvlJc w:val="left"/>
+      <w:pPr>
+        <w:tabs>
+          <w:tab w:val="num" w:pos="0"/>
+        </w:tabs>
+        <w:ind w:left="864" w:hanging="864"/>
+      </w:pPr>
+    </w:lvl>
+    <w:lvl w:ilvl="4">
+      <w:start w:val="1"/>
+      <w:numFmt w:val="decimal"/>
+      <w:lvlText w:val="%1.%2.%3.%4.%5"/>
+      <w:lvlJc w:val="left"/>
+      <w:pPr>
+        <w:tabs>
+          <w:tab w:val="num" w:pos="0"/>
+        </w:tabs>
+        <w:ind w:left="1008" w:hanging="1008"/>
+      </w:pPr>
+    </w:lvl>
+    <w:lvl w:ilvl="5">
+      <w:start w:val="1"/>
+      <w:numFmt w:val="decimal"/>
+      <w:lvlText w:val="%1.%2.%3.%4.%5.%6"/>
+      <w:lvlJc w:val="left"/>
+      <w:pPr>
+        <w:tabs>
+          <w:tab w:val="num" w:pos="0"/>
+        </w:tabs>
+        <w:ind w:left="1152" w:hanging="1152"/>
+      </w:pPr>
+    </w:lvl>
+    <w:lvl w:ilvl="6">
+      <w:start w:val="1"/>
+      <w:numFmt w:val="decimal"/>
+      <w:lvlText w:val="%1.%2.%3.%4.%5.%6.%7"/>
+      <w:lvlJc w:val="left"/>
+      <w:pPr>
+        <w:tabs>
+          <w:tab w:val="num" w:pos="0"/>
+        </w:tabs>
+        <w:ind w:left="1296" w:hanging="1296"/>
+      </w:pPr>
+    </w:lvl>
+    <w:lvl w:ilvl="7">
+      <w:start w:val="1"/>
+      <w:numFmt w:val="decimal"/>
+      <w:lvlText w:val="%1.%2.%3.%4.%5.%6.%7.%8"/>
+      <w:lvlJc w:val="left"/>
+      <w:pPr>
+        <w:tabs>
+          <w:tab w:val="num" w:pos="0"/>
+        </w:tabs>
+        <w:ind w:left="1440" w:hanging="1440"/>
+      </w:pPr>
+    </w:lvl>
+    <w:lvl w:ilvl="8">
+      <w:start w:val="1"/>
+      <w:numFmt w:val="decimal"/>
+      <w:lvlText w:val="%1.%2.%3.%4.%5.%6.%7.%8.%9"/>
+      <w:lvlJc w:val="left"/>
+      <w:pPr>
+        <w:tabs>
+          <w:tab w:val="num" w:pos="0"/>
+        </w:tabs>
+        <w:ind w:left="1584" w:hanging="1584"/>
+      </w:pPr>
+    </w:lvl>
+  </w:abstractNum>
+  <w:abstractNum w:abstractNumId="1" w15:restartNumberingAfterBreak="0">
+    <w:nsid w:val="78C4657A"/>
+    <w:multiLevelType w:val="multilevel"/>
+    <w:tmpl w:val="92CE7664"/>
     <w:lvl w:ilvl="0">
       <w:start w:val="1"/>
       <w:numFmt w:val="decimal"/>
+      <w:pStyle w:val="TOCHeading"/>
       <w:lvlText w:val="%1"/>
-      <w:lvlJc w:val="start"/>
+      <w:lvlJc w:val="left"/>
       <w:pPr>
         <w:tabs>
           <w:tab w:val="num" w:pos="0"/>
         </w:tabs>
-        <w:ind w:start="432" w:hanging="432"/>
-      </w:pPr>
-      <w:rPr/>
+        <w:ind w:left="432" w:hanging="432"/>
+      </w:pPr>
     </w:lvl>
     <w:lvl w:ilvl="1">
       <w:start w:val="1"/>
       <w:numFmt w:val="decimal"/>
       <w:pStyle w:val="Heading2"/>
       <w:lvlText w:val="%1.%2"/>
-      <w:lvlJc w:val="start"/>
+      <w:lvlJc w:val="left"/>
       <w:pPr>
         <w:tabs>
           <w:tab w:val="num" w:pos="0"/>
         </w:tabs>
-        <w:ind w:start="576" w:hanging="576"/>
-      </w:pPr>
-      <w:rPr/>
+        <w:ind w:left="576" w:hanging="576"/>
+      </w:pPr>
     </w:lvl>
     <w:lvl w:ilvl="2">
       <w:start w:val="1"/>
       <w:numFmt w:val="decimal"/>
       <w:pStyle w:val="Heading3"/>
       <w:lvlText w:val="%1.%2.%3"/>
-      <w:lvlJc w:val="start"/>
+      <w:lvlJc w:val="left"/>
       <w:pPr>
         <w:tabs>
           <w:tab w:val="num" w:pos="0"/>
         </w:tabs>
-        <w:ind w:start="720" w:hanging="720"/>
-      </w:pPr>
-      <w:rPr/>
+        <w:ind w:left="720" w:hanging="720"/>
+      </w:pPr>
     </w:lvl>
     <w:lvl w:ilvl="3">
       <w:start w:val="1"/>
       <w:numFmt w:val="decimal"/>
       <w:pStyle w:val="Heading4"/>
       <w:lvlText w:val="%1.%2.%3.%4"/>
-      <w:lvlJc w:val="start"/>
+      <w:lvlJc w:val="left"/>
       <w:pPr>
         <w:tabs>
           <w:tab w:val="num" w:pos="0"/>
         </w:tabs>
-        <w:ind w:start="864" w:hanging="864"/>
-      </w:pPr>
-      <w:rPr/>
+        <w:ind w:left="864" w:hanging="864"/>
+      </w:pPr>
     </w:lvl>
     <w:lvl w:ilvl="4">
       <w:start w:val="1"/>
       <w:numFmt w:val="decimal"/>
       <w:pStyle w:val="Heading5"/>
       <w:lvlText w:val="%1.%2.%3.%4.%5"/>
-      <w:lvlJc w:val="start"/>
+      <w:lvlJc w:val="left"/>
       <w:pPr>
         <w:tabs>
           <w:tab w:val="num" w:pos="0"/>
         </w:tabs>
-        <w:ind w:start="1008" w:hanging="1008"/>
-      </w:pPr>
-      <w:rPr/>
+        <w:ind w:left="1008" w:hanging="1008"/>
+      </w:pPr>
     </w:lvl>
     <w:lvl w:ilvl="5">
       <w:start w:val="1"/>
       <w:numFmt w:val="decimal"/>
       <w:pStyle w:val="Heading6"/>
       <w:lvlText w:val="%1.%2.%3.%4.%5.%6"/>
-      <w:lvlJc w:val="start"/>
+      <w:lvlJc w:val="left"/>
       <w:pPr>
         <w:tabs>
           <w:tab w:val="num" w:pos="0"/>
         </w:tabs>
-        <w:ind w:start="1152" w:hanging="1152"/>
-      </w:pPr>
-      <w:rPr/>
+        <w:ind w:left="1152" w:hanging="1152"/>
+      </w:pPr>
     </w:lvl>
     <w:lvl w:ilvl="6">
       <w:start w:val="1"/>
       <w:numFmt w:val="decimal"/>
       <w:pStyle w:val="Heading7"/>
       <w:lvlText w:val="%1.%2.%3.%4.%5.%6.%7"/>
-      <w:lvlJc w:val="start"/>
+      <w:lvlJc w:val="left"/>
       <w:pPr>
         <w:tabs>
           <w:tab w:val="num" w:pos="0"/>
         </w:tabs>
-        <w:ind w:start="1296" w:hanging="1296"/>
-      </w:pPr>
-      <w:rPr/>
+        <w:ind w:left="1296" w:hanging="1296"/>
+      </w:pPr>
     </w:lvl>
     <w:lvl w:ilvl="7">
       <w:start w:val="1"/>
       <w:numFmt w:val="decimal"/>
       <w:pStyle w:val="Heading8"/>
       <w:lvlText w:val="%1.%2.%3.%4.%5.%6.%7.%8"/>
-      <w:lvlJc w:val="start"/>
+      <w:lvlJc w:val="left"/>
       <w:pPr>
         <w:tabs>
           <w:tab w:val="num" w:pos="0"/>
         </w:tabs>
-        <w:ind w:start="1440" w:hanging="1440"/>
-      </w:pPr>
-      <w:rPr/>
+        <w:ind w:left="1440" w:hanging="1440"/>
+      </w:pPr>
     </w:lvl>
     <w:lvl w:ilvl="8">
       <w:start w:val="1"/>
       <w:numFmt w:val="decimal"/>
       <w:pStyle w:val="Heading9"/>
       <w:lvlText w:val="%1.%2.%3.%4.%5.%6.%7.%8.%9"/>
-      <w:lvlJc w:val="start"/>
+      <w:lvlJc w:val="left"/>
       <w:pPr>
         <w:tabs>
           <w:tab w:val="num" w:pos="0"/>
         </w:tabs>
-        <w:ind w:start="1584" w:hanging="1584"/>
-      </w:pPr>
-      <w:rPr/>
+        <w:ind w:left="1584" w:hanging="1584"/>
+      </w:pPr>
     </w:lvl>
-    <w:nsid w:val="78c4657a"/>
   </w:abstractNum>
-  <w:abstractNum w:abstractNumId="2">
-    <w:lvl w:ilvl="0">
-      <w:start w:val="1"/>
-      <w:numFmt w:val="upperLetter"/>
-      <w:lvlText w:val="%1"/>
-      <w:lvlJc w:val="start"/>
-      <w:pPr>
-        <w:tabs>
-          <w:tab w:val="num" w:pos="0"/>
-        </w:tabs>
-        <w:ind w:start="432" w:hanging="432"/>
-      </w:pPr>
-      <w:rPr/>
-    </w:lvl>
-    <w:lvl w:ilvl="1">
-      <w:start w:val="1"/>
-      <w:numFmt w:val="decimal"/>
-      <w:lvlText w:val="%1.%2"/>
-      <w:lvlJc w:val="start"/>
-      <w:pPr>
-        <w:tabs>
-          <w:tab w:val="num" w:pos="0"/>
-        </w:tabs>
-        <w:ind w:start="576" w:hanging="576"/>
-      </w:pPr>
-      <w:rPr/>
-    </w:lvl>
-    <w:lvl w:ilvl="2">
-      <w:start w:val="1"/>
-      <w:numFmt w:val="decimal"/>
-      <w:lvlText w:val="%1.%2.%3"/>
-      <w:lvlJc w:val="start"/>
-      <w:pPr>
-        <w:tabs>
-          <w:tab w:val="num" w:pos="0"/>
-        </w:tabs>
-        <w:ind w:start="720" w:hanging="720"/>
-      </w:pPr>
-      <w:rPr/>
-    </w:lvl>
-    <w:lvl w:ilvl="3">
-      <w:start w:val="1"/>
-      <w:numFmt w:val="decimal"/>
-      <w:lvlText w:val="%1.%2.%3.%4"/>
-      <w:lvlJc w:val="start"/>
-      <w:pPr>
-        <w:tabs>
-          <w:tab w:val="num" w:pos="0"/>
-        </w:tabs>
-        <w:ind w:start="864" w:hanging="864"/>
-      </w:pPr>
-      <w:rPr/>
-    </w:lvl>
-    <w:lvl w:ilvl="4">
-      <w:start w:val="1"/>
-      <w:numFmt w:val="decimal"/>
-      <w:lvlText w:val="%1.%2.%3.%4.%5"/>
-      <w:lvlJc w:val="start"/>
-      <w:pPr>
-        <w:tabs>
-          <w:tab w:val="num" w:pos="0"/>
-        </w:tabs>
-        <w:ind w:start="1008" w:hanging="1008"/>
-      </w:pPr>
-      <w:rPr/>
-    </w:lvl>
-    <w:lvl w:ilvl="5">
-      <w:start w:val="1"/>
-      <w:numFmt w:val="decimal"/>
-      <w:lvlText w:val="%1.%2.%3.%4.%5.%6"/>
-      <w:lvlJc w:val="start"/>
-      <w:pPr>
-        <w:tabs>
-          <w:tab w:val="num" w:pos="0"/>
-        </w:tabs>
-        <w:ind w:start="1152" w:hanging="1152"/>
-      </w:pPr>
-      <w:rPr/>
-    </w:lvl>
-    <w:lvl w:ilvl="6">
-      <w:start w:val="1"/>
-      <w:numFmt w:val="decimal"/>
-      <w:lvlText w:val="%1.%2.%3.%4.%5.%6.%7"/>
-      <w:lvlJc w:val="start"/>
-      <w:pPr>
-        <w:tabs>
-          <w:tab w:val="num" w:pos="0"/>
-        </w:tabs>
-        <w:ind w:start="1296" w:hanging="1296"/>
-      </w:pPr>
-      <w:rPr/>
-    </w:lvl>
-    <w:lvl w:ilvl="7">
-      <w:start w:val="1"/>
-      <w:numFmt w:val="decimal"/>
-      <w:lvlText w:val="%1.%2.%3.%4.%5.%6.%7.%8"/>
-      <w:lvlJc w:val="start"/>
-      <w:pPr>
-        <w:tabs>
-          <w:tab w:val="num" w:pos="0"/>
-        </w:tabs>
-        <w:ind w:start="1440" w:hanging="1440"/>
-      </w:pPr>
-      <w:rPr/>
-    </w:lvl>
-    <w:lvl w:ilvl="8">
-      <w:start w:val="1"/>
-      <w:numFmt w:val="decimal"/>
-      <w:lvlText w:val="%1.%2.%3.%4.%5.%6.%7.%8.%9"/>
-      <w:lvlJc w:val="start"/>
-      <w:pPr>
-        <w:tabs>
-          <w:tab w:val="num" w:pos="0"/>
-        </w:tabs>
-        <w:ind w:start="1584" w:hanging="1584"/>
-      </w:pPr>
-      <w:rPr/>
-    </w:lvl>
-    <w:nsid w:val="74ccf13a"/>
-  </w:abstractNum>
-  <w:num w:numId="1">
+  <w:num w:numId="1" w16cid:durableId="1439372155">
     <w:abstractNumId w:val="1"/>
   </w:num>
-  <w:num w:numId="2">
-    <w:abstractNumId w:val="2"/>
+  <w:num w:numId="2" w16cid:durableId="770975954">
+    <w:abstractNumId w:val="0"/>
   </w:num>
 </w:numbering>
 </file>
 
 <file path=word/styles.xml><?xml version="1.0" encoding="utf-8"?>
-<w:styles xmlns:wp14="http://schemas.microsoft.com/office/word/2010/wordprocessingDrawing" xmlns:w="http://schemas.openxmlformats.org/wordprocessingml/2006/main" xmlns:w14="http://schemas.microsoft.com/office/word/2010/wordml" xmlns:mc="http://schemas.openxmlformats.org/markup-compatibility/2006" mc:Ignorable="w14 wp14">
+<w:styles xmlns:mc="http://schemas.openxmlformats.org/markup-compatibility/2006" xmlns:r="http://schemas.openxmlformats.org/officeDocument/2006/relationships" xmlns:w="http://schemas.openxmlformats.org/wordprocessingml/2006/main" xmlns:w14="http://schemas.microsoft.com/office/word/2010/wordml" xmlns:w15="http://schemas.microsoft.com/office/word/2012/wordml" xmlns:w16cex="http://schemas.microsoft.com/office/word/2018/wordml/cex" xmlns:w16cid="http://schemas.microsoft.com/office/word/2016/wordml/cid" xmlns:w16="http://schemas.microsoft.com/office/word/2018/wordml" xmlns:w16du="http://schemas.microsoft.com/office/word/2023/wordml/word16du" xmlns:w16sdtdh="http://schemas.microsoft.com/office/word/2020/wordml/sdtdatahash" xmlns:w16sdtfl="http://schemas.microsoft.com/office/word/2024/wordml/sdtformatlock" xmlns:w16se="http://schemas.microsoft.com/office/word/2015/wordml/symex" mc:Ignorable="w14 w15 w16se w16cid w16 w16cex w16sdtdh w16sdtfl w16du">
   <w:docDefaults>
     <w:rPrDefault>
       <w:rPr>
-        <w:rFonts w:ascii="Aptos" w:hAnsi="Aptos" w:eastAsia="Aptos" w:cs="" w:asciiTheme="minorHAnsi" w:hAnsiTheme="minorHAnsi" w:eastAsiaTheme="minorHAnsi" w:cstheme="minorBidi"/>
+        <w:rFonts w:asciiTheme="minorHAnsi" w:eastAsiaTheme="minorHAnsi" w:hAnsiTheme="minorHAnsi" w:cstheme="minorBidi"/>
         <w:kern w:val="2"/>
         <w:sz w:val="22"/>
         <w:szCs w:val="22"/>
@@ -3751,21 +3073,21 @@
     </w:rPrDefault>
     <w:pPrDefault>
       <w:pPr>
-        <w:suppressAutoHyphens w:val="true"/>
+        <w:suppressAutoHyphens/>
       </w:pPr>
     </w:pPrDefault>
   </w:docDefaults>
   <w:latentStyles w:defLockedState="0" w:defUIPriority="99" w:defSemiHidden="0" w:defUnhideWhenUsed="0" w:defQFormat="0" w:count="376">
     <w:lsdException w:name="Normal" w:uiPriority="0" w:qFormat="1"/>
     <w:lsdException w:name="heading 1" w:uiPriority="9" w:qFormat="1"/>
-    <w:lsdException w:name="heading 2" w:uiPriority="9" w:semiHidden="1" w:unhideWhenUsed="1" w:qFormat="1"/>
-    <w:lsdException w:name="heading 3" w:uiPriority="9" w:semiHidden="1" w:unhideWhenUsed="1" w:qFormat="1"/>
-    <w:lsdException w:name="heading 4" w:uiPriority="9" w:semiHidden="1" w:unhideWhenUsed="1" w:qFormat="1"/>
-    <w:lsdException w:name="heading 5" w:uiPriority="9" w:semiHidden="1" w:unhideWhenUsed="1" w:qFormat="1"/>
-    <w:lsdException w:name="heading 6" w:uiPriority="9" w:semiHidden="1" w:unhideWhenUsed="1" w:qFormat="1"/>
-    <w:lsdException w:name="heading 7" w:uiPriority="9" w:semiHidden="1" w:unhideWhenUsed="1" w:qFormat="1"/>
-    <w:lsdException w:name="heading 8" w:uiPriority="9" w:semiHidden="1" w:unhideWhenUsed="1" w:qFormat="1"/>
-    <w:lsdException w:name="heading 9" w:uiPriority="9" w:semiHidden="1" w:unhideWhenUsed="1" w:qFormat="1"/>
+    <w:lsdException w:name="heading 2" w:semiHidden="1" w:uiPriority="9" w:unhideWhenUsed="1" w:qFormat="1"/>
+    <w:lsdException w:name="heading 3" w:semiHidden="1" w:uiPriority="9" w:unhideWhenUsed="1" w:qFormat="1"/>
+    <w:lsdException w:name="heading 4" w:semiHidden="1" w:uiPriority="9" w:unhideWhenUsed="1" w:qFormat="1"/>
+    <w:lsdException w:name="heading 5" w:semiHidden="1" w:uiPriority="9" w:unhideWhenUsed="1" w:qFormat="1"/>
+    <w:lsdException w:name="heading 6" w:semiHidden="1" w:uiPriority="9" w:unhideWhenUsed="1" w:qFormat="1"/>
+    <w:lsdException w:name="heading 7" w:semiHidden="1" w:uiPriority="9" w:unhideWhenUsed="1" w:qFormat="1"/>
+    <w:lsdException w:name="heading 8" w:semiHidden="1" w:uiPriority="9" w:unhideWhenUsed="1" w:qFormat="1"/>
+    <w:lsdException w:name="heading 9" w:semiHidden="1" w:uiPriority="9" w:unhideWhenUsed="1" w:qFormat="1"/>
     <w:lsdException w:name="index 1" w:semiHidden="1" w:unhideWhenUsed="1"/>
     <w:lsdException w:name="index 2" w:semiHidden="1" w:unhideWhenUsed="1"/>
     <w:lsdException w:name="index 3" w:semiHidden="1" w:unhideWhenUsed="1"/>
@@ -3775,22 +3097,22 @@
     <w:lsdException w:name="index 7" w:semiHidden="1" w:unhideWhenUsed="1"/>
     <w:lsdException w:name="index 8" w:semiHidden="1" w:unhideWhenUsed="1"/>
     <w:lsdException w:name="index 9" w:semiHidden="1" w:unhideWhenUsed="1"/>
-    <w:lsdException w:name="toc 1" w:uiPriority="39" w:semiHidden="1" w:unhideWhenUsed="1"/>
-    <w:lsdException w:name="toc 2" w:uiPriority="39" w:semiHidden="1" w:unhideWhenUsed="1"/>
-    <w:lsdException w:name="toc 3" w:uiPriority="39" w:semiHidden="1" w:unhideWhenUsed="1"/>
-    <w:lsdException w:name="toc 4" w:uiPriority="39" w:semiHidden="1" w:unhideWhenUsed="1"/>
-    <w:lsdException w:name="toc 5" w:uiPriority="39" w:semiHidden="1" w:unhideWhenUsed="1"/>
-    <w:lsdException w:name="toc 6" w:uiPriority="39" w:semiHidden="1" w:unhideWhenUsed="1"/>
-    <w:lsdException w:name="toc 7" w:uiPriority="39" w:semiHidden="1" w:unhideWhenUsed="1"/>
-    <w:lsdException w:name="toc 8" w:uiPriority="39" w:semiHidden="1" w:unhideWhenUsed="1"/>
-    <w:lsdException w:name="toc 9" w:uiPriority="39" w:semiHidden="1" w:unhideWhenUsed="1"/>
+    <w:lsdException w:name="toc 1" w:semiHidden="1" w:uiPriority="39" w:unhideWhenUsed="1"/>
+    <w:lsdException w:name="toc 2" w:semiHidden="1" w:uiPriority="39" w:unhideWhenUsed="1"/>
+    <w:lsdException w:name="toc 3" w:semiHidden="1" w:uiPriority="39" w:unhideWhenUsed="1"/>
+    <w:lsdException w:name="toc 4" w:semiHidden="1" w:uiPriority="39" w:unhideWhenUsed="1"/>
+    <w:lsdException w:name="toc 5" w:semiHidden="1" w:uiPriority="39" w:unhideWhenUsed="1"/>
+    <w:lsdException w:name="toc 6" w:semiHidden="1" w:uiPriority="39" w:unhideWhenUsed="1"/>
+    <w:lsdException w:name="toc 7" w:semiHidden="1" w:uiPriority="39" w:unhideWhenUsed="1"/>
+    <w:lsdException w:name="toc 8" w:semiHidden="1" w:uiPriority="39" w:unhideWhenUsed="1"/>
+    <w:lsdException w:name="toc 9" w:semiHidden="1" w:uiPriority="39" w:unhideWhenUsed="1"/>
     <w:lsdException w:name="Normal Indent" w:semiHidden="1" w:unhideWhenUsed="1"/>
     <w:lsdException w:name="footnote text" w:semiHidden="1" w:unhideWhenUsed="1"/>
     <w:lsdException w:name="annotation text" w:semiHidden="1" w:unhideWhenUsed="1"/>
     <w:lsdException w:name="header" w:semiHidden="1" w:unhideWhenUsed="1"/>
     <w:lsdException w:name="footer" w:semiHidden="1" w:unhideWhenUsed="1"/>
     <w:lsdException w:name="index heading" w:semiHidden="1" w:unhideWhenUsed="1"/>
-    <w:lsdException w:name="caption" w:uiPriority="35" w:semiHidden="1" w:unhideWhenUsed="1" w:qFormat="1"/>
+    <w:lsdException w:name="caption" w:semiHidden="1" w:uiPriority="35" w:unhideWhenUsed="1" w:qFormat="1"/>
     <w:lsdException w:name="table of figures" w:semiHidden="1" w:unhideWhenUsed="1"/>
     <w:lsdException w:name="envelope address" w:semiHidden="1" w:unhideWhenUsed="1"/>
     <w:lsdException w:name="envelope return" w:semiHidden="1" w:unhideWhenUsed="1"/>
@@ -3821,7 +3143,7 @@
     <w:lsdException w:name="Title" w:uiPriority="10" w:qFormat="1"/>
     <w:lsdException w:name="Closing" w:semiHidden="1" w:unhideWhenUsed="1"/>
     <w:lsdException w:name="Signature" w:semiHidden="1" w:unhideWhenUsed="1"/>
-    <w:lsdException w:name="Default Paragraph Font" w:uiPriority="1" w:semiHidden="1" w:unhideWhenUsed="1"/>
+    <w:lsdException w:name="Default Paragraph Font" w:semiHidden="1" w:uiPriority="1" w:unhideWhenUsed="1"/>
     <w:lsdException w:name="Body Text" w:semiHidden="1" w:unhideWhenUsed="1"/>
     <w:lsdException w:name="Body Text Indent" w:semiHidden="1" w:unhideWhenUsed="1"/>
     <w:lsdException w:name="List Continue" w:semiHidden="1" w:unhideWhenUsed="1"/>
@@ -4021,8 +3343,8 @@
     <w:lsdException w:name="Subtle Reference" w:uiPriority="31" w:qFormat="1"/>
     <w:lsdException w:name="Intense Reference" w:uiPriority="32" w:qFormat="1"/>
     <w:lsdException w:name="Book Title" w:uiPriority="33" w:qFormat="1"/>
-    <w:lsdException w:name="Bibliography" w:uiPriority="37" w:semiHidden="1" w:unhideWhenUsed="1"/>
-    <w:lsdException w:name="TOC Heading" w:uiPriority="39" w:semiHidden="1" w:unhideWhenUsed="1" w:qFormat="1"/>
+    <w:lsdException w:name="Bibliography" w:semiHidden="1" w:uiPriority="37" w:unhideWhenUsed="1"/>
+    <w:lsdException w:name="TOC Heading" w:semiHidden="1" w:uiPriority="39" w:unhideWhenUsed="1" w:qFormat="1"/>
     <w:lsdException w:name="Plain Table 1" w:uiPriority="41"/>
     <w:lsdException w:name="Plain Table 2" w:uiPriority="42"/>
     <w:lsdException w:name="Plain Table 3" w:uiPriority="43"/>
@@ -4133,24 +3455,16 @@
     <w:lsdException w:name="Unresolved Mention" w:semiHidden="1" w:unhideWhenUsed="1"/>
     <w:lsdException w:name="Smart Link" w:semiHidden="1" w:unhideWhenUsed="1"/>
   </w:latentStyles>
-  <w:style w:type="paragraph" w:styleId="Normal" w:default="1">
+  <w:style w:type="paragraph" w:default="1" w:styleId="Normal">
     <w:name w:val="Normal"/>
     <w:qFormat/>
-    <w:rsid w:val="002127d5"/>
+    <w:rsid w:val="002127D5"/>
     <w:pPr>
-      <w:widowControl/>
-      <w:bidi w:val="0"/>
-      <w:spacing w:before="0" w:after="160" w:line="259" w:lineRule="auto"/>
+      <w:spacing w:after="160" w:line="259" w:lineRule="auto"/>
       <w:jc w:val="both"/>
     </w:pPr>
     <w:rPr>
-      <w:rFonts w:ascii="Proxima Nova Medium" w:hAnsi="Proxima Nova Medium" w:eastAsia="Aptos" w:cs="" w:eastAsiaTheme="minorHAnsi" w:cstheme="minorBidi"/>
-      <w:color w:val="auto"/>
-      <w:kern w:val="2"/>
-      <w:sz w:val="22"/>
-      <w:szCs w:val="22"/>
-      <w:lang w:val="en-AU" w:eastAsia="en-US" w:bidi="ar-SA"/>
-      <w14:ligatures w14:val="standardContextual"/>
+      <w:rFonts w:ascii="Proxima Nova Medium" w:hAnsi="Proxima Nova Medium"/>
     </w:rPr>
   </w:style>
   <w:style w:type="paragraph" w:styleId="Heading1">
@@ -4160,15 +3474,15 @@
     <w:link w:val="Heading1Char"/>
     <w:uiPriority w:val="9"/>
     <w:qFormat/>
-    <w:rsid w:val="00f351c2"/>
+    <w:rsid w:val="00F351C2"/>
     <w:pPr>
-      <w:keepNext w:val="true"/>
+      <w:keepNext/>
       <w:keepLines/>
       <w:spacing w:before="360" w:after="80"/>
       <w:outlineLvl w:val="0"/>
     </w:pPr>
     <w:rPr>
-      <w:rFonts w:eastAsia="" w:cs="" w:eastAsiaTheme="majorEastAsia" w:cstheme="majorBidi"/>
+      <w:rFonts w:eastAsiaTheme="majorEastAsia" w:cstheme="majorBidi"/>
       <w:b/>
       <w:sz w:val="40"/>
       <w:szCs w:val="40"/>
@@ -4182,9 +3496,9 @@
     <w:uiPriority w:val="9"/>
     <w:unhideWhenUsed/>
     <w:qFormat/>
-    <w:rsid w:val="00f351c2"/>
+    <w:rsid w:val="00F351C2"/>
     <w:pPr>
-      <w:keepNext w:val="true"/>
+      <w:keepNext/>
       <w:keepLines/>
       <w:numPr>
         <w:ilvl w:val="1"/>
@@ -4194,7 +3508,7 @@
       <w:outlineLvl w:val="1"/>
     </w:pPr>
     <w:rPr>
-      <w:rFonts w:eastAsia="" w:cs="" w:eastAsiaTheme="majorEastAsia" w:cstheme="majorBidi"/>
+      <w:rFonts w:eastAsiaTheme="majorEastAsia" w:cstheme="majorBidi"/>
       <w:b/>
       <w:sz w:val="32"/>
       <w:szCs w:val="32"/>
@@ -4208,9 +3522,9 @@
     <w:uiPriority w:val="9"/>
     <w:unhideWhenUsed/>
     <w:qFormat/>
-    <w:rsid w:val="0074022a"/>
+    <w:rsid w:val="0074022A"/>
     <w:pPr>
-      <w:keepNext w:val="true"/>
+      <w:keepNext/>
       <w:keepLines/>
       <w:numPr>
         <w:ilvl w:val="2"/>
@@ -4220,7 +3534,7 @@
       <w:outlineLvl w:val="2"/>
     </w:pPr>
     <w:rPr>
-      <w:rFonts w:eastAsia="" w:cs="" w:eastAsiaTheme="majorEastAsia" w:cstheme="majorBidi"/>
+      <w:rFonts w:eastAsiaTheme="majorEastAsia" w:cstheme="majorBidi"/>
       <w:sz w:val="28"/>
       <w:szCs w:val="28"/>
     </w:rPr>
@@ -4234,9 +3548,9 @@
     <w:semiHidden/>
     <w:unhideWhenUsed/>
     <w:qFormat/>
-    <w:rsid w:val="00a1493a"/>
+    <w:rsid w:val="00A1493A"/>
     <w:pPr>
-      <w:keepNext w:val="true"/>
+      <w:keepNext/>
       <w:keepLines/>
       <w:numPr>
         <w:ilvl w:val="3"/>
@@ -4246,7 +3560,7 @@
       <w:outlineLvl w:val="3"/>
     </w:pPr>
     <w:rPr>
-      <w:rFonts w:eastAsia="" w:cs="" w:eastAsiaTheme="majorEastAsia" w:cstheme="majorBidi"/>
+      <w:rFonts w:eastAsiaTheme="majorEastAsia" w:cstheme="majorBidi"/>
       <w:iCs/>
     </w:rPr>
   </w:style>
@@ -4259,9 +3573,9 @@
     <w:semiHidden/>
     <w:unhideWhenUsed/>
     <w:qFormat/>
-    <w:rsid w:val="006a7e05"/>
+    <w:rsid w:val="006A7E05"/>
     <w:pPr>
-      <w:keepNext w:val="true"/>
+      <w:keepNext/>
       <w:keepLines/>
       <w:numPr>
         <w:ilvl w:val="4"/>
@@ -4271,8 +3585,8 @@
       <w:outlineLvl w:val="4"/>
     </w:pPr>
     <w:rPr>
-      <w:rFonts w:eastAsia="" w:cs="" w:eastAsiaTheme="majorEastAsia" w:cstheme="majorBidi"/>
-      <w:color w:val="0F4761" w:themeColor="accent1" w:themeShade="bf"/>
+      <w:rFonts w:eastAsiaTheme="majorEastAsia" w:cstheme="majorBidi"/>
+      <w:color w:val="0F4761" w:themeColor="accent1" w:themeShade="BF"/>
     </w:rPr>
   </w:style>
   <w:style w:type="paragraph" w:styleId="Heading6">
@@ -4284,9 +3598,9 @@
     <w:semiHidden/>
     <w:unhideWhenUsed/>
     <w:qFormat/>
-    <w:rsid w:val="006a7e05"/>
+    <w:rsid w:val="006A7E05"/>
     <w:pPr>
-      <w:keepNext w:val="true"/>
+      <w:keepNext/>
       <w:keepLines/>
       <w:numPr>
         <w:ilvl w:val="5"/>
@@ -4296,10 +3610,10 @@
       <w:outlineLvl w:val="5"/>
     </w:pPr>
     <w:rPr>
-      <w:rFonts w:eastAsia="" w:cs="" w:eastAsiaTheme="majorEastAsia" w:cstheme="majorBidi"/>
+      <w:rFonts w:eastAsiaTheme="majorEastAsia" w:cstheme="majorBidi"/>
       <w:i/>
       <w:iCs/>
-      <w:color w:val="595959" w:themeColor="text1" w:themeTint="a6"/>
+      <w:color w:val="595959" w:themeColor="text1" w:themeTint="A6"/>
     </w:rPr>
   </w:style>
   <w:style w:type="paragraph" w:styleId="Heading7">
@@ -4311,9 +3625,9 @@
     <w:semiHidden/>
     <w:unhideWhenUsed/>
     <w:qFormat/>
-    <w:rsid w:val="006a7e05"/>
+    <w:rsid w:val="006A7E05"/>
     <w:pPr>
-      <w:keepNext w:val="true"/>
+      <w:keepNext/>
       <w:keepLines/>
       <w:numPr>
         <w:ilvl w:val="6"/>
@@ -4323,8 +3637,8 @@
       <w:outlineLvl w:val="6"/>
     </w:pPr>
     <w:rPr>
-      <w:rFonts w:eastAsia="" w:cs="" w:eastAsiaTheme="majorEastAsia" w:cstheme="majorBidi"/>
-      <w:color w:val="595959" w:themeColor="text1" w:themeTint="a6"/>
+      <w:rFonts w:eastAsiaTheme="majorEastAsia" w:cstheme="majorBidi"/>
+      <w:color w:val="595959" w:themeColor="text1" w:themeTint="A6"/>
     </w:rPr>
   </w:style>
   <w:style w:type="paragraph" w:styleId="Heading8">
@@ -4336,22 +3650,22 @@
     <w:semiHidden/>
     <w:unhideWhenUsed/>
     <w:qFormat/>
-    <w:rsid w:val="006a7e05"/>
+    <w:rsid w:val="006A7E05"/>
     <w:pPr>
-      <w:keepNext w:val="true"/>
+      <w:keepNext/>
       <w:keepLines/>
       <w:numPr>
         <w:ilvl w:val="7"/>
         <w:numId w:val="1"/>
       </w:numPr>
-      <w:spacing w:before="0" w:after="0"/>
+      <w:spacing w:after="0"/>
       <w:outlineLvl w:val="7"/>
     </w:pPr>
     <w:rPr>
-      <w:rFonts w:eastAsia="" w:cs="" w:eastAsiaTheme="majorEastAsia" w:cstheme="majorBidi"/>
+      <w:rFonts w:eastAsiaTheme="majorEastAsia" w:cstheme="majorBidi"/>
       <w:i/>
       <w:iCs/>
-      <w:color w:val="272727" w:themeColor="text1" w:themeTint="d8"/>
+      <w:color w:val="272727" w:themeColor="text1" w:themeTint="D8"/>
     </w:rPr>
   </w:style>
   <w:style w:type="paragraph" w:styleId="Heading9">
@@ -4363,162 +3677,181 @@
     <w:semiHidden/>
     <w:unhideWhenUsed/>
     <w:qFormat/>
-    <w:rsid w:val="006a7e05"/>
+    <w:rsid w:val="006A7E05"/>
     <w:pPr>
-      <w:keepNext w:val="true"/>
+      <w:keepNext/>
       <w:keepLines/>
       <w:numPr>
         <w:ilvl w:val="8"/>
         <w:numId w:val="1"/>
       </w:numPr>
-      <w:spacing w:before="0" w:after="0"/>
+      <w:spacing w:after="0"/>
       <w:outlineLvl w:val="8"/>
     </w:pPr>
     <w:rPr>
-      <w:rFonts w:eastAsia="" w:cs="" w:eastAsiaTheme="majorEastAsia" w:cstheme="majorBidi"/>
-      <w:color w:val="272727" w:themeColor="text1" w:themeTint="d8"/>
+      <w:rFonts w:eastAsiaTheme="majorEastAsia" w:cstheme="majorBidi"/>
+      <w:color w:val="272727" w:themeColor="text1" w:themeTint="D8"/>
     </w:rPr>
   </w:style>
-  <w:style w:type="character" w:styleId="DefaultParagraphFont" w:default="1">
+  <w:style w:type="character" w:default="1" w:styleId="DefaultParagraphFont">
     <w:name w:val="Default Paragraph Font"/>
     <w:uiPriority w:val="1"/>
     <w:semiHidden/>
     <w:unhideWhenUsed/>
-    <w:qFormat/>
-    <w:rPr/>
-  </w:style>
-  <w:style w:type="character" w:styleId="Heading1Char" w:customStyle="1">
+  </w:style>
+  <w:style w:type="table" w:default="1" w:styleId="TableNormal">
+    <w:name w:val="Normal Table"/>
+    <w:uiPriority w:val="99"/>
+    <w:semiHidden/>
+    <w:unhideWhenUsed/>
+    <w:tblPr>
+      <w:tblInd w:w="0" w:type="dxa"/>
+      <w:tblCellMar>
+        <w:top w:w="0" w:type="dxa"/>
+        <w:left w:w="108" w:type="dxa"/>
+        <w:bottom w:w="0" w:type="dxa"/>
+        <w:right w:w="108" w:type="dxa"/>
+      </w:tblCellMar>
+    </w:tblPr>
+  </w:style>
+  <w:style w:type="numbering" w:default="1" w:styleId="NoList">
+    <w:name w:val="No List"/>
+    <w:uiPriority w:val="99"/>
+    <w:semiHidden/>
+    <w:unhideWhenUsed/>
+  </w:style>
+  <w:style w:type="character" w:customStyle="1" w:styleId="Heading1Char">
     <w:name w:val="Heading 1 Char"/>
     <w:basedOn w:val="DefaultParagraphFont"/>
     <w:link w:val="Heading1"/>
     <w:uiPriority w:val="9"/>
     <w:qFormat/>
-    <w:rsid w:val="00f351c2"/>
+    <w:rsid w:val="00F351C2"/>
     <w:rPr>
-      <w:rFonts w:ascii="Proxima Nova Medium" w:hAnsi="Proxima Nova Medium" w:eastAsia="" w:cs="" w:eastAsiaTheme="majorEastAsia" w:cstheme="majorBidi"/>
+      <w:rFonts w:ascii="Proxima Nova Medium" w:eastAsiaTheme="majorEastAsia" w:hAnsi="Proxima Nova Medium" w:cstheme="majorBidi"/>
       <w:b/>
       <w:sz w:val="40"/>
       <w:szCs w:val="40"/>
     </w:rPr>
   </w:style>
-  <w:style w:type="character" w:styleId="Heading2Char" w:customStyle="1">
+  <w:style w:type="character" w:customStyle="1" w:styleId="Heading2Char">
     <w:name w:val="Heading 2 Char"/>
     <w:basedOn w:val="DefaultParagraphFont"/>
     <w:link w:val="Heading2"/>
     <w:uiPriority w:val="9"/>
     <w:qFormat/>
-    <w:rsid w:val="00f351c2"/>
+    <w:rsid w:val="00F351C2"/>
     <w:rPr>
-      <w:rFonts w:ascii="Proxima Nova Medium" w:hAnsi="Proxima Nova Medium" w:eastAsia="" w:cs="" w:eastAsiaTheme="majorEastAsia" w:cstheme="majorBidi"/>
+      <w:rFonts w:ascii="Proxima Nova Medium" w:eastAsiaTheme="majorEastAsia" w:hAnsi="Proxima Nova Medium" w:cstheme="majorBidi"/>
       <w:b/>
       <w:sz w:val="32"/>
       <w:szCs w:val="32"/>
     </w:rPr>
   </w:style>
-  <w:style w:type="character" w:styleId="Heading3Char" w:customStyle="1">
+  <w:style w:type="character" w:customStyle="1" w:styleId="Heading3Char">
     <w:name w:val="Heading 3 Char"/>
     <w:basedOn w:val="DefaultParagraphFont"/>
     <w:link w:val="Heading3"/>
     <w:uiPriority w:val="9"/>
     <w:qFormat/>
-    <w:rsid w:val="0074022a"/>
+    <w:rsid w:val="0074022A"/>
     <w:rPr>
-      <w:rFonts w:ascii="Proxima Nova Medium" w:hAnsi="Proxima Nova Medium" w:eastAsia="" w:cs="" w:eastAsiaTheme="majorEastAsia" w:cstheme="majorBidi"/>
+      <w:rFonts w:ascii="Proxima Nova Medium" w:eastAsiaTheme="majorEastAsia" w:hAnsi="Proxima Nova Medium" w:cstheme="majorBidi"/>
       <w:sz w:val="28"/>
       <w:szCs w:val="28"/>
     </w:rPr>
   </w:style>
-  <w:style w:type="character" w:styleId="Heading4Char" w:customStyle="1">
+  <w:style w:type="character" w:customStyle="1" w:styleId="Heading4Char">
     <w:name w:val="Heading 4 Char"/>
     <w:basedOn w:val="DefaultParagraphFont"/>
     <w:link w:val="Heading4"/>
     <w:uiPriority w:val="9"/>
     <w:semiHidden/>
     <w:qFormat/>
-    <w:rsid w:val="00a1493a"/>
+    <w:rsid w:val="00A1493A"/>
     <w:rPr>
-      <w:rFonts w:ascii="Proxima Nova Medium" w:hAnsi="Proxima Nova Medium" w:eastAsia="" w:cs="" w:eastAsiaTheme="majorEastAsia" w:cstheme="majorBidi"/>
+      <w:rFonts w:ascii="Proxima Nova Medium" w:eastAsiaTheme="majorEastAsia" w:hAnsi="Proxima Nova Medium" w:cstheme="majorBidi"/>
       <w:iCs/>
     </w:rPr>
   </w:style>
-  <w:style w:type="character" w:styleId="Heading5Char" w:customStyle="1">
+  <w:style w:type="character" w:customStyle="1" w:styleId="Heading5Char">
     <w:name w:val="Heading 5 Char"/>
     <w:basedOn w:val="DefaultParagraphFont"/>
     <w:link w:val="Heading5"/>
     <w:uiPriority w:val="9"/>
     <w:semiHidden/>
     <w:qFormat/>
-    <w:rsid w:val="006a7e05"/>
+    <w:rsid w:val="006A7E05"/>
     <w:rPr>
-      <w:rFonts w:eastAsia="" w:cs="" w:eastAsiaTheme="majorEastAsia" w:cstheme="majorBidi"/>
-      <w:color w:val="0F4761" w:themeColor="accent1" w:themeShade="bf"/>
+      <w:rFonts w:eastAsiaTheme="majorEastAsia" w:cstheme="majorBidi"/>
+      <w:color w:val="0F4761" w:themeColor="accent1" w:themeShade="BF"/>
     </w:rPr>
   </w:style>
-  <w:style w:type="character" w:styleId="Heading6Char" w:customStyle="1">
+  <w:style w:type="character" w:customStyle="1" w:styleId="Heading6Char">
     <w:name w:val="Heading 6 Char"/>
     <w:basedOn w:val="DefaultParagraphFont"/>
     <w:link w:val="Heading6"/>
     <w:uiPriority w:val="9"/>
     <w:semiHidden/>
     <w:qFormat/>
-    <w:rsid w:val="006a7e05"/>
+    <w:rsid w:val="006A7E05"/>
     <w:rPr>
-      <w:rFonts w:eastAsia="" w:cs="" w:eastAsiaTheme="majorEastAsia" w:cstheme="majorBidi"/>
+      <w:rFonts w:eastAsiaTheme="majorEastAsia" w:cstheme="majorBidi"/>
       <w:i/>
       <w:iCs/>
-      <w:color w:val="595959" w:themeColor="text1" w:themeTint="a6"/>
+      <w:color w:val="595959" w:themeColor="text1" w:themeTint="A6"/>
     </w:rPr>
   </w:style>
-  <w:style w:type="character" w:styleId="Heading7Char" w:customStyle="1">
+  <w:style w:type="character" w:customStyle="1" w:styleId="Heading7Char">
     <w:name w:val="Heading 7 Char"/>
     <w:basedOn w:val="DefaultParagraphFont"/>
     <w:link w:val="Heading7"/>
     <w:uiPriority w:val="9"/>
     <w:semiHidden/>
     <w:qFormat/>
-    <w:rsid w:val="006a7e05"/>
+    <w:rsid w:val="006A7E05"/>
     <w:rPr>
-      <w:rFonts w:eastAsia="" w:cs="" w:eastAsiaTheme="majorEastAsia" w:cstheme="majorBidi"/>
-      <w:color w:val="595959" w:themeColor="text1" w:themeTint="a6"/>
+      <w:rFonts w:eastAsiaTheme="majorEastAsia" w:cstheme="majorBidi"/>
+      <w:color w:val="595959" w:themeColor="text1" w:themeTint="A6"/>
     </w:rPr>
   </w:style>
-  <w:style w:type="character" w:styleId="Heading8Char" w:customStyle="1">
+  <w:style w:type="character" w:customStyle="1" w:styleId="Heading8Char">
     <w:name w:val="Heading 8 Char"/>
     <w:basedOn w:val="DefaultParagraphFont"/>
     <w:link w:val="Heading8"/>
     <w:uiPriority w:val="9"/>
     <w:semiHidden/>
     <w:qFormat/>
-    <w:rsid w:val="006a7e05"/>
+    <w:rsid w:val="006A7E05"/>
     <w:rPr>
-      <w:rFonts w:eastAsia="" w:cs="" w:eastAsiaTheme="majorEastAsia" w:cstheme="majorBidi"/>
+      <w:rFonts w:eastAsiaTheme="majorEastAsia" w:cstheme="majorBidi"/>
       <w:i/>
       <w:iCs/>
-      <w:color w:val="272727" w:themeColor="text1" w:themeTint="d8"/>
+      <w:color w:val="272727" w:themeColor="text1" w:themeTint="D8"/>
     </w:rPr>
   </w:style>
-  <w:style w:type="character" w:styleId="Heading9Char" w:customStyle="1">
+  <w:style w:type="character" w:customStyle="1" w:styleId="Heading9Char">
     <w:name w:val="Heading 9 Char"/>
     <w:basedOn w:val="DefaultParagraphFont"/>
     <w:link w:val="Heading9"/>
     <w:uiPriority w:val="9"/>
     <w:semiHidden/>
     <w:qFormat/>
-    <w:rsid w:val="006a7e05"/>
+    <w:rsid w:val="006A7E05"/>
     <w:rPr>
-      <w:rFonts w:eastAsia="" w:cs="" w:eastAsiaTheme="majorEastAsia" w:cstheme="majorBidi"/>
-      <w:color w:val="272727" w:themeColor="text1" w:themeTint="d8"/>
+      <w:rFonts w:eastAsiaTheme="majorEastAsia" w:cstheme="majorBidi"/>
+      <w:color w:val="272727" w:themeColor="text1" w:themeTint="D8"/>
     </w:rPr>
   </w:style>
-  <w:style w:type="character" w:styleId="TitleChar" w:customStyle="1">
+  <w:style w:type="character" w:customStyle="1" w:styleId="TitleChar">
     <w:name w:val="Title Char"/>
     <w:basedOn w:val="DefaultParagraphFont"/>
     <w:link w:val="Title"/>
     <w:uiPriority w:val="10"/>
     <w:qFormat/>
-    <w:rsid w:val="00a1493a"/>
+    <w:rsid w:val="00A1493A"/>
     <w:rPr>
-      <w:rFonts w:ascii="Proxima Nova Medium" w:hAnsi="Proxima Nova Medium" w:eastAsia="" w:cs="" w:eastAsiaTheme="majorEastAsia" w:cstheme="majorBidi"/>
+      <w:rFonts w:ascii="Proxima Nova Medium" w:eastAsiaTheme="majorEastAsia" w:hAnsi="Proxima Nova Medium" w:cstheme="majorBidi"/>
       <w:b/>
       <w:color w:val="00808B"/>
       <w:spacing w:val="-10"/>
@@ -4527,27 +3860,27 @@
       <w:szCs w:val="56"/>
     </w:rPr>
   </w:style>
-  <w:style w:type="character" w:styleId="SubtitleChar" w:customStyle="1">
+  <w:style w:type="character" w:customStyle="1" w:styleId="SubtitleChar">
     <w:name w:val="Subtitle Char"/>
     <w:basedOn w:val="DefaultParagraphFont"/>
     <w:link w:val="Subtitle"/>
     <w:uiPriority w:val="11"/>
     <w:qFormat/>
-    <w:rsid w:val="00a1493a"/>
+    <w:rsid w:val="00A1493A"/>
     <w:rPr>
-      <w:rFonts w:ascii="Proxima Nova Medium" w:hAnsi="Proxima Nova Medium" w:eastAsia="" w:cs="" w:eastAsiaTheme="majorEastAsia" w:cstheme="majorBidi"/>
+      <w:rFonts w:ascii="Proxima Nova Medium" w:eastAsiaTheme="majorEastAsia" w:hAnsi="Proxima Nova Medium" w:cstheme="majorBidi"/>
       <w:spacing w:val="15"/>
       <w:sz w:val="28"/>
       <w:szCs w:val="28"/>
     </w:rPr>
   </w:style>
-  <w:style w:type="character" w:styleId="QuoteChar" w:customStyle="1">
+  <w:style w:type="character" w:customStyle="1" w:styleId="QuoteChar">
     <w:name w:val="Quote Char"/>
     <w:basedOn w:val="DefaultParagraphFont"/>
     <w:link w:val="Quote"/>
     <w:uiPriority w:val="29"/>
     <w:qFormat/>
-    <w:rsid w:val="002127d5"/>
+    <w:rsid w:val="002127D5"/>
     <w:rPr>
       <w:rFonts w:ascii="Proxima Nova Medium" w:hAnsi="Proxima Nova Medium"/>
       <w:i/>
@@ -4559,20 +3892,20 @@
     <w:basedOn w:val="DefaultParagraphFont"/>
     <w:uiPriority w:val="21"/>
     <w:qFormat/>
-    <w:rsid w:val="002127d5"/>
+    <w:rsid w:val="002127D5"/>
     <w:rPr>
       <w:i/>
       <w:iCs/>
       <w:color w:val="00808B"/>
     </w:rPr>
   </w:style>
-  <w:style w:type="character" w:styleId="IntenseQuoteChar" w:customStyle="1">
+  <w:style w:type="character" w:customStyle="1" w:styleId="IntenseQuoteChar">
     <w:name w:val="Intense Quote Char"/>
     <w:basedOn w:val="DefaultParagraphFont"/>
     <w:link w:val="IntenseQuote"/>
     <w:uiPriority w:val="30"/>
     <w:qFormat/>
-    <w:rsid w:val="002127d5"/>
+    <w:rsid w:val="002127D5"/>
     <w:rPr>
       <w:rFonts w:ascii="Proxima Nova Medium" w:hAnsi="Proxima Nova Medium"/>
       <w:i/>
@@ -4585,7 +3918,7 @@
     <w:basedOn w:val="DefaultParagraphFont"/>
     <w:uiPriority w:val="32"/>
     <w:qFormat/>
-    <w:rsid w:val="002127d5"/>
+    <w:rsid w:val="002127D5"/>
     <w:rPr>
       <w:b/>
       <w:bCs/>
@@ -4599,7 +3932,7 @@
     <w:basedOn w:val="DefaultParagraphFont"/>
     <w:uiPriority w:val="99"/>
     <w:unhideWhenUsed/>
-    <w:rsid w:val="00a55c2e"/>
+    <w:rsid w:val="00A55C2E"/>
     <w:rPr>
       <w:color w:val="467886" w:themeColor="hyperlink"/>
       <w:u w:val="single"/>
@@ -4612,30 +3945,30 @@
     <w:semiHidden/>
     <w:unhideWhenUsed/>
     <w:qFormat/>
-    <w:rsid w:val="00a55c2e"/>
+    <w:rsid w:val="00A55C2E"/>
     <w:rPr>
       <w:color w:val="605E5C"/>
-      <w:shd w:val="clear" w:fill="E1DFDD"/>
+      <w:shd w:val="clear" w:color="auto" w:fill="E1DFDD"/>
     </w:rPr>
   </w:style>
-  <w:style w:type="character" w:styleId="HeaderChar" w:customStyle="1">
+  <w:style w:type="character" w:customStyle="1" w:styleId="HeaderChar">
     <w:name w:val="Header Char"/>
     <w:basedOn w:val="DefaultParagraphFont"/>
     <w:link w:val="Header"/>
     <w:uiPriority w:val="99"/>
     <w:qFormat/>
-    <w:rsid w:val="00a471d4"/>
+    <w:rsid w:val="00A471D4"/>
     <w:rPr>
       <w:rFonts w:ascii="Proxima Nova Medium" w:hAnsi="Proxima Nova Medium"/>
     </w:rPr>
   </w:style>
-  <w:style w:type="character" w:styleId="FooterChar" w:customStyle="1">
+  <w:style w:type="character" w:customStyle="1" w:styleId="FooterChar">
     <w:name w:val="Footer Char"/>
     <w:basedOn w:val="DefaultParagraphFont"/>
     <w:link w:val="Footer"/>
     <w:uiPriority w:val="99"/>
     <w:qFormat/>
-    <w:rsid w:val="00a471d4"/>
+    <w:rsid w:val="00A471D4"/>
     <w:rPr>
       <w:rFonts w:ascii="Proxima Nova Medium" w:hAnsi="Proxima Nova Medium"/>
     </w:rPr>
@@ -4645,7 +3978,7 @@
     <w:basedOn w:val="DefaultParagraphFont"/>
     <w:uiPriority w:val="19"/>
     <w:qFormat/>
-    <w:rsid w:val="00a1493a"/>
+    <w:rsid w:val="00A1493A"/>
     <w:rPr>
       <w:i/>
       <w:iCs/>
@@ -4657,7 +3990,7 @@
     <w:basedOn w:val="DefaultParagraphFont"/>
     <w:uiPriority w:val="22"/>
     <w:qFormat/>
-    <w:rsid w:val="002127d5"/>
+    <w:rsid w:val="002127D5"/>
     <w:rPr>
       <w:b/>
       <w:bCs/>
@@ -4668,7 +4001,7 @@
     <w:basedOn w:val="DefaultParagraphFont"/>
     <w:uiPriority w:val="31"/>
     <w:qFormat/>
-    <w:rsid w:val="002127d5"/>
+    <w:rsid w:val="002127D5"/>
     <w:rPr>
       <w:smallCaps/>
       <w:color w:val="000000" w:themeColor="text1"/>
@@ -4679,7 +4012,7 @@
     <w:basedOn w:val="DefaultParagraphFont"/>
     <w:uiPriority w:val="33"/>
     <w:qFormat/>
-    <w:rsid w:val="002127d5"/>
+    <w:rsid w:val="002127D5"/>
     <w:rPr>
       <w:b/>
       <w:bCs/>
@@ -4688,22 +4021,21 @@
       <w:spacing w:val="5"/>
     </w:rPr>
   </w:style>
-  <w:style w:type="character" w:styleId="IndexLink">
+  <w:style w:type="character" w:customStyle="1" w:styleId="IndexLink">
     <w:name w:val="Index Link"/>
     <w:qFormat/>
-    <w:rPr/>
-  </w:style>
-  <w:style w:type="paragraph" w:styleId="Heading">
+  </w:style>
+  <w:style w:type="paragraph" w:customStyle="1" w:styleId="Heading">
     <w:name w:val="Heading"/>
     <w:basedOn w:val="Normal"/>
     <w:next w:val="BodyText"/>
     <w:qFormat/>
     <w:pPr>
-      <w:keepNext w:val="true"/>
+      <w:keepNext/>
       <w:spacing w:before="240" w:after="120"/>
     </w:pPr>
     <w:rPr>
-      <w:rFonts w:ascii="Liberation Sans" w:hAnsi="Liberation Sans" w:eastAsia="Arial Unicode MS" w:cs="Arial Unicode MS"/>
+      <w:rFonts w:ascii="Liberation Sans" w:eastAsia="Arial Unicode MS" w:hAnsi="Liberation Sans" w:cs="Arial Unicode MS"/>
       <w:sz w:val="28"/>
       <w:szCs w:val="28"/>
     </w:rPr>
@@ -4712,14 +4044,12 @@
     <w:name w:val="Body Text"/>
     <w:basedOn w:val="Normal"/>
     <w:pPr>
-      <w:spacing w:before="0" w:after="140" w:line="276" w:lineRule="auto"/>
+      <w:spacing w:after="140" w:line="276" w:lineRule="auto"/>
     </w:pPr>
-    <w:rPr/>
   </w:style>
   <w:style w:type="paragraph" w:styleId="List">
     <w:name w:val="List"/>
     <w:basedOn w:val="BodyText"/>
-    <w:pPr/>
     <w:rPr>
       <w:rFonts w:cs="Arial Unicode MS"/>
     </w:rPr>
@@ -4731,9 +4061,9 @@
     <w:uiPriority w:val="35"/>
     <w:unhideWhenUsed/>
     <w:qFormat/>
-    <w:rsid w:val="002127d5"/>
+    <w:rsid w:val="002127D5"/>
     <w:pPr>
-      <w:spacing w:before="0" w:after="200" w:line="240" w:lineRule="auto"/>
+      <w:spacing w:after="200" w:line="240" w:lineRule="auto"/>
     </w:pPr>
     <w:rPr>
       <w:i/>
@@ -4743,7 +4073,7 @@
       <w:szCs w:val="18"/>
     </w:rPr>
   </w:style>
-  <w:style w:type="paragraph" w:styleId="Index">
+  <w:style w:type="paragraph" w:customStyle="1" w:styleId="Index">
     <w:name w:val="Index"/>
     <w:basedOn w:val="Normal"/>
     <w:qFormat/>
@@ -4761,17 +4091,16 @@
     <w:link w:val="TitleChar"/>
     <w:uiPriority w:val="10"/>
     <w:qFormat/>
-    <w:rsid w:val="00a1493a"/>
+    <w:rsid w:val="00A1493A"/>
     <w:pPr>
-      <w:spacing w:before="0" w:after="80" w:line="240" w:lineRule="auto"/>
+      <w:spacing w:after="80" w:line="240" w:lineRule="auto"/>
       <w:contextualSpacing/>
     </w:pPr>
     <w:rPr>
-      <w:rFonts w:eastAsia="" w:cs="" w:eastAsiaTheme="majorEastAsia" w:cstheme="majorBidi"/>
+      <w:rFonts w:eastAsiaTheme="majorEastAsia" w:cstheme="majorBidi"/>
       <w:b/>
       <w:color w:val="00808B"/>
       <w:spacing w:val="-10"/>
-      <w:kern w:val="2"/>
       <w:sz w:val="48"/>
       <w:szCs w:val="56"/>
     </w:rPr>
@@ -4783,10 +4112,9 @@
     <w:link w:val="SubtitleChar"/>
     <w:uiPriority w:val="11"/>
     <w:qFormat/>
-    <w:rsid w:val="00a1493a"/>
-    <w:pPr/>
+    <w:rsid w:val="00A1493A"/>
     <w:rPr>
-      <w:rFonts w:eastAsia="" w:cs="" w:eastAsiaTheme="majorEastAsia" w:cstheme="majorBidi"/>
+      <w:rFonts w:eastAsiaTheme="majorEastAsia" w:cstheme="majorBidi"/>
       <w:spacing w:val="15"/>
       <w:sz w:val="28"/>
       <w:szCs w:val="28"/>
@@ -4799,9 +4127,9 @@
     <w:link w:val="QuoteChar"/>
     <w:uiPriority w:val="29"/>
     <w:qFormat/>
-    <w:rsid w:val="002127d5"/>
+    <w:rsid w:val="002127D5"/>
     <w:pPr>
-      <w:spacing w:before="160" w:after="160"/>
+      <w:spacing w:before="160"/>
       <w:jc w:val="center"/>
     </w:pPr>
     <w:rPr>
@@ -4814,13 +4142,11 @@
     <w:basedOn w:val="Normal"/>
     <w:uiPriority w:val="34"/>
     <w:qFormat/>
-    <w:rsid w:val="006a7e05"/>
+    <w:rsid w:val="006A7E05"/>
     <w:pPr>
-      <w:spacing w:before="0" w:after="160"/>
-      <w:ind w:start="720"/>
+      <w:ind w:left="720"/>
       <w:contextualSpacing/>
     </w:pPr>
-    <w:rPr/>
   </w:style>
   <w:style w:type="paragraph" w:styleId="IntenseQuote">
     <w:name w:val="Intense Quote"/>
@@ -4829,14 +4155,14 @@
     <w:link w:val="IntenseQuoteChar"/>
     <w:uiPriority w:val="30"/>
     <w:qFormat/>
-    <w:rsid w:val="002127d5"/>
+    <w:rsid w:val="002127D5"/>
     <w:pPr>
       <w:pBdr>
-        <w:top w:val="single" w:color="0F4761" w:themeColor="accent1" w:themeShade="bf" w:sz="4" w:space="10"/>
-        <w:bottom w:val="single" w:color="0F4761" w:themeColor="accent1" w:themeShade="bf" w:sz="4" w:space="10"/>
+        <w:top w:val="single" w:sz="4" w:space="10" w:color="0F4761" w:themeColor="accent1" w:themeShade="BF"/>
+        <w:bottom w:val="single" w:sz="4" w:space="10" w:color="0F4761" w:themeColor="accent1" w:themeShade="BF"/>
       </w:pBdr>
       <w:spacing w:before="360" w:after="360"/>
-      <w:ind w:start="864" w:end="864"/>
+      <w:ind w:left="864" w:right="864"/>
       <w:jc w:val="center"/>
     </w:pPr>
     <w:rPr>
@@ -4849,29 +4175,18 @@
     <w:name w:val="No Spacing"/>
     <w:uiPriority w:val="1"/>
     <w:qFormat/>
-    <w:rsid w:val="00a55c2e"/>
+    <w:rsid w:val="00A55C2E"/>
     <w:pPr>
-      <w:widowControl/>
-      <w:bidi w:val="0"/>
-      <w:spacing w:before="0" w:after="0" w:line="240" w:lineRule="auto"/>
       <w:jc w:val="both"/>
     </w:pPr>
     <w:rPr>
-      <w:rFonts w:ascii="Proxima Nova Medium" w:hAnsi="Proxima Nova Medium" w:eastAsia="Aptos" w:cs="" w:eastAsiaTheme="minorHAnsi" w:cstheme="minorBidi"/>
-      <w:color w:val="auto"/>
-      <w:kern w:val="2"/>
-      <w:sz w:val="22"/>
-      <w:szCs w:val="22"/>
-      <w:lang w:val="en-AU" w:eastAsia="en-US" w:bidi="ar-SA"/>
-      <w14:ligatures w14:val="standardContextual"/>
+      <w:rFonts w:ascii="Proxima Nova Medium" w:hAnsi="Proxima Nova Medium"/>
     </w:rPr>
   </w:style>
-  <w:style w:type="paragraph" w:styleId="HeaderandFooter">
+  <w:style w:type="paragraph" w:customStyle="1" w:styleId="HeaderandFooter">
     <w:name w:val="Header and Footer"/>
     <w:basedOn w:val="Normal"/>
     <w:qFormat/>
-    <w:pPr/>
-    <w:rPr/>
   </w:style>
   <w:style w:type="paragraph" w:styleId="Header">
     <w:name w:val="header"/>
@@ -4879,16 +4194,14 @@
     <w:link w:val="HeaderChar"/>
     <w:uiPriority w:val="99"/>
     <w:unhideWhenUsed/>
-    <w:rsid w:val="00a471d4"/>
+    <w:rsid w:val="00A471D4"/>
     <w:pPr>
       <w:tabs>
-        <w:tab w:val="clear" w:pos="720"/>
-        <w:tab w:val="center" w:leader="none" w:pos="4513"/>
-        <w:tab w:val="right" w:leader="none" w:pos="9026"/>
+        <w:tab w:val="center" w:pos="4513"/>
+        <w:tab w:val="right" w:pos="9026"/>
       </w:tabs>
-      <w:spacing w:before="0" w:after="0" w:line="240" w:lineRule="auto"/>
+      <w:spacing w:after="0" w:line="240" w:lineRule="auto"/>
     </w:pPr>
-    <w:rPr/>
   </w:style>
   <w:style w:type="paragraph" w:styleId="Footer">
     <w:name w:val="footer"/>
@@ -4896,22 +4209,18 @@
     <w:link w:val="FooterChar"/>
     <w:uiPriority w:val="99"/>
     <w:unhideWhenUsed/>
-    <w:rsid w:val="00a471d4"/>
+    <w:rsid w:val="00A471D4"/>
     <w:pPr>
       <w:tabs>
-        <w:tab w:val="clear" w:pos="720"/>
-        <w:tab w:val="center" w:leader="none" w:pos="4513"/>
-        <w:tab w:val="right" w:leader="none" w:pos="9026"/>
+        <w:tab w:val="center" w:pos="4513"/>
+        <w:tab w:val="right" w:pos="9026"/>
       </w:tabs>
-      <w:spacing w:before="0" w:after="0" w:line="240" w:lineRule="auto"/>
+      <w:spacing w:after="0" w:line="240" w:lineRule="auto"/>
     </w:pPr>
-    <w:rPr/>
   </w:style>
   <w:style w:type="paragraph" w:styleId="IndexHeading">
     <w:name w:val="index heading"/>
     <w:basedOn w:val="Heading"/>
-    <w:pPr/>
-    <w:rPr/>
   </w:style>
   <w:style w:type="paragraph" w:styleId="TOCHeading">
     <w:name w:val="TOC Heading"/>
@@ -4920,17 +4229,16 @@
     <w:uiPriority w:val="39"/>
     <w:unhideWhenUsed/>
     <w:qFormat/>
-    <w:rsid w:val="002127d5"/>
+    <w:rsid w:val="002127D5"/>
     <w:pPr>
       <w:numPr>
-        <w:ilvl w:val="0"/>
         <w:numId w:val="1"/>
       </w:numPr>
       <w:spacing w:before="240" w:after="0"/>
       <w:outlineLvl w:val="9"/>
     </w:pPr>
     <w:rPr>
-      <w:b w:val="false"/>
+      <w:b w:val="0"/>
       <w:kern w:val="0"/>
       <w:sz w:val="32"/>
       <w:szCs w:val="32"/>
@@ -4945,11 +4253,10 @@
     <w:autoRedefine/>
     <w:uiPriority w:val="39"/>
     <w:unhideWhenUsed/>
-    <w:rsid w:val="00f351c2"/>
+    <w:rsid w:val="00F351C2"/>
     <w:pPr>
-      <w:spacing w:before="0" w:after="100"/>
+      <w:spacing w:after="100"/>
     </w:pPr>
-    <w:rPr/>
   </w:style>
   <w:style w:type="paragraph" w:styleId="TOC2">
     <w:name w:val="toc 2"/>
@@ -4958,12 +4265,11 @@
     <w:autoRedefine/>
     <w:uiPriority w:val="39"/>
     <w:unhideWhenUsed/>
-    <w:rsid w:val="0074022a"/>
+    <w:rsid w:val="0074022A"/>
     <w:pPr>
-      <w:spacing w:before="0" w:after="100"/>
-      <w:ind w:start="220"/>
+      <w:spacing w:after="100"/>
+      <w:ind w:left="220"/>
     </w:pPr>
-    <w:rPr/>
   </w:style>
   <w:style w:type="paragraph" w:styleId="TOC3">
     <w:name w:val="toc 3"/>
@@ -4972,12 +4278,11 @@
     <w:autoRedefine/>
     <w:uiPriority w:val="39"/>
     <w:unhideWhenUsed/>
-    <w:rsid w:val="0074022a"/>
+    <w:rsid w:val="0074022A"/>
     <w:pPr>
-      <w:spacing w:before="0" w:after="100"/>
-      <w:ind w:start="440"/>
+      <w:spacing w:after="100"/>
+      <w:ind w:left="440"/>
     </w:pPr>
-    <w:rPr/>
   </w:style>
   <w:style w:type="paragraph" w:styleId="Bibliography">
     <w:name w:val="Bibliography"/>
@@ -4986,126 +4291,83 @@
     <w:uiPriority w:val="37"/>
     <w:unhideWhenUsed/>
     <w:qFormat/>
-    <w:rsid w:val="002127d5"/>
+    <w:rsid w:val="002127D5"/>
     <w:pPr>
-      <w:jc w:val="start"/>
+      <w:jc w:val="left"/>
     </w:pPr>
-    <w:rPr/>
   </w:style>
   <w:style w:type="paragraph" w:styleId="TOC4">
     <w:name w:val="toc 4"/>
     <w:basedOn w:val="Index"/>
-    <w:pPr/>
-    <w:rPr/>
   </w:style>
   <w:style w:type="paragraph" w:styleId="TOC5">
     <w:name w:val="toc 5"/>
     <w:basedOn w:val="Index"/>
-    <w:pPr/>
-    <w:rPr/>
   </w:style>
   <w:style w:type="paragraph" w:styleId="TOC6">
     <w:name w:val="toc 6"/>
     <w:basedOn w:val="Index"/>
-    <w:pPr/>
-    <w:rPr/>
   </w:style>
   <w:style w:type="paragraph" w:styleId="TOC7">
     <w:name w:val="toc 7"/>
     <w:basedOn w:val="Index"/>
-    <w:pPr/>
-    <w:rPr/>
   </w:style>
   <w:style w:type="paragraph" w:styleId="TOC8">
     <w:name w:val="toc 8"/>
     <w:basedOn w:val="Index"/>
-    <w:pPr/>
-    <w:rPr/>
   </w:style>
   <w:style w:type="paragraph" w:styleId="TOC9">
     <w:name w:val="toc 9"/>
     <w:basedOn w:val="Index"/>
-    <w:pPr/>
-    <w:rPr/>
-  </w:style>
-  <w:style w:type="paragraph" w:styleId="FrameContents">
+  </w:style>
+  <w:style w:type="paragraph" w:customStyle="1" w:styleId="FrameContents">
     <w:name w:val="Frame Contents"/>
     <w:basedOn w:val="Normal"/>
     <w:qFormat/>
-    <w:pPr/>
-    <w:rPr/>
-  </w:style>
-  <w:style w:type="numbering" w:styleId="NoList" w:default="1">
-    <w:name w:val="No List"/>
-    <w:uiPriority w:val="99"/>
-    <w:semiHidden/>
-    <w:unhideWhenUsed/>
-    <w:qFormat/>
-  </w:style>
-  <w:style w:type="numbering" w:styleId="Style11" w:customStyle="1">
+  </w:style>
+  <w:style w:type="numbering" w:customStyle="1" w:styleId="Style1">
     <w:name w:val="Style1"/>
     <w:uiPriority w:val="99"/>
     <w:qFormat/>
-    <w:rsid w:val="00d751f5"/>
-  </w:style>
-  <w:style w:type="table" w:styleId="TableNormal" w:default="1">
-    <w:name w:val="Normal Table"/>
-    <w:uiPriority w:val="99"/>
-    <w:semiHidden/>
-    <w:unhideWhenUsed/>
-    <w:tblPr>
-      <w:tblCellMar>
-        <w:top w:w="0" w:type="dxa"/>
-        <w:left w:w="108" w:type="dxa"/>
-        <w:bottom w:w="0" w:type="dxa"/>
-        <w:right w:w="108" w:type="dxa"/>
-      </w:tblCellMar>
-    </w:tblPr>
+    <w:rsid w:val="00D751F5"/>
   </w:style>
   <w:style w:type="table" w:styleId="TableGrid">
     <w:name w:val="Table Grid"/>
     <w:basedOn w:val="TableNormal"/>
     <w:uiPriority w:val="39"/>
-    <w:rsid w:val="00a1493a"/>
-    <w:pPr>
-      <w:spacing w:after="0" w:line="240" w:lineRule="auto"/>
-    </w:pPr>
+    <w:rsid w:val="00A1493A"/>
     <w:tblPr>
       <w:tblBorders>
-        <w:top w:val="single" w:color="auto" w:sz="4" w:space="0"/>
-        <w:left w:val="single" w:color="auto" w:sz="4" w:space="0"/>
-        <w:bottom w:val="single" w:color="auto" w:sz="4" w:space="0"/>
-        <w:right w:val="single" w:color="auto" w:sz="4" w:space="0"/>
-        <w:insideH w:val="single" w:color="auto" w:sz="4" w:space="0"/>
-        <w:insideV w:val="single" w:color="auto" w:sz="4" w:space="0"/>
+        <w:top w:val="single" w:sz="4" w:space="0" w:color="auto"/>
+        <w:left w:val="single" w:sz="4" w:space="0" w:color="auto"/>
+        <w:bottom w:val="single" w:sz="4" w:space="0" w:color="auto"/>
+        <w:right w:val="single" w:sz="4" w:space="0" w:color="auto"/>
+        <w:insideH w:val="single" w:sz="4" w:space="0" w:color="auto"/>
+        <w:insideV w:val="single" w:sz="4" w:space="0" w:color="auto"/>
       </w:tblBorders>
     </w:tblPr>
   </w:style>
-  <w:style w:type="table" w:styleId="AAGITableStyle" w:customStyle="1">
+  <w:style w:type="table" w:customStyle="1" w:styleId="AAGITableStyle">
     <w:name w:val="AAGI Table Style"/>
     <w:basedOn w:val="TableNormal"/>
     <w:uiPriority w:val="99"/>
-    <w:rsid w:val="00a1493a"/>
-    <w:pPr>
-      <w:spacing w:after="0" w:line="240" w:lineRule="auto"/>
-      <w:jc w:val="left"/>
-    </w:pPr>
+    <w:rsid w:val="00A1493A"/>
     <w:rPr>
       <w:color w:val="000000" w:themeColor="text1"/>
     </w:rPr>
     <w:tblPr>
       <w:tblBorders>
-        <w:top w:val="single" w:color="auto" w:sz="4" w:space="0"/>
-        <w:left w:val="single" w:color="auto" w:sz="4" w:space="0"/>
-        <w:bottom w:val="single" w:color="auto" w:sz="4" w:space="0"/>
-        <w:right w:val="single" w:color="auto" w:sz="4" w:space="0"/>
-        <w:insideH w:val="single" w:color="auto" w:sz="4" w:space="0"/>
-        <w:insideV w:val="single" w:color="auto" w:sz="4" w:space="0"/>
+        <w:top w:val="single" w:sz="4" w:space="0" w:color="auto"/>
+        <w:left w:val="single" w:sz="4" w:space="0" w:color="auto"/>
+        <w:bottom w:val="single" w:sz="4" w:space="0" w:color="auto"/>
+        <w:right w:val="single" w:sz="4" w:space="0" w:color="auto"/>
+        <w:insideH w:val="single" w:sz="4" w:space="0" w:color="auto"/>
+        <w:insideV w:val="single" w:sz="4" w:space="0" w:color="auto"/>
       </w:tblBorders>
     </w:tblPr>
     <w:tblStylePr w:type="firstRow">
       <w:rPr>
-        <w:color w:val="ffffff" w:themeColor="background1"/>
+        <w:color w:val="FFFFFF" w:themeColor="background1"/>
         <w:sz w:val="22"/>
       </w:rPr>
       <w:tblPr/>
@@ -5118,7 +4380,7 @@
 </file>
 
 <file path=word/theme/theme1.xml><?xml version="1.0" encoding="utf-8"?>
-<a:theme xmlns:a="http://schemas.openxmlformats.org/drawingml/2006/main" xmlns:r="http://schemas.openxmlformats.org/officeDocument/2006/relationships" name="Office Theme">
+<a:theme xmlns:a="http://schemas.openxmlformats.org/drawingml/2006/main" name="Office Theme">
   <a:themeElements>
     <a:clrScheme name="Office">
       <a:dk1>
@@ -5160,12 +4422,12 @@
     </a:clrScheme>
     <a:fontScheme name="Office">
       <a:majorFont>
-        <a:latin typeface="Aptos Display" panose="02110004020202020204" pitchFamily="0" charset="1"/>
+        <a:latin typeface="Aptos Display" panose="02110004020202020204"/>
         <a:ea typeface=""/>
         <a:cs typeface=""/>
       </a:majorFont>
       <a:minorFont>
-        <a:latin typeface="Aptos" panose="02110004020202020204" pitchFamily="0" charset="1"/>
+        <a:latin typeface="Aptos" panose="02110004020202020204"/>
         <a:ea typeface=""/>
         <a:cs typeface=""/>
       </a:minorFont>
@@ -5197,7 +4459,7 @@
             </a:gs>
           </a:gsLst>
           <a:lin ang="5400000" scaled="0"/>
-          <a:tileRect l="0" t="0" r="0" b="0"/>
+          <a:tileRect/>
         </a:gradFill>
         <a:gradFill>
           <a:gsLst>
@@ -5221,7 +4483,7 @@
             </a:gs>
           </a:gsLst>
           <a:lin ang="5400000" scaled="0"/>
-          <a:tileRect l="0" t="0" r="0" b="0"/>
+          <a:tileRect/>
         </a:gradFill>
       </a:fillStyleLst>
       <a:lnStyleLst>
@@ -5281,11 +4543,13 @@
             </a:gs>
           </a:gsLst>
           <a:lin ang="5400000" scaled="0"/>
-          <a:tileRect l="0" t="0" r="0" b="0"/>
+          <a:tileRect/>
         </a:gradFill>
       </a:bgFillStyleLst>
     </a:fmtScheme>
   </a:themeElements>
+  <a:objectDefaults/>
+  <a:extraClrSchemeLst/>
 </a:theme>
 </file>
 

</xml_diff>